<commit_message>
Add dedicated China-domestic research chapter (第八章) on SAPC reliability with substantial Chinese literature; renumber subsequent chapters
Co-authored-by: sha ming <62820385+smismyname@users.noreply.github.com>
</commit_message>
<xml_diff>
--- a/电容器可靠性_国内外研究现状_专题综述.docx
+++ b/电容器可靠性_国内外研究现状_专题综述.docx
@@ -2265,7 +2265,7 @@
           <w:sz w:val="24"/>
           <w:rFonts w:eastAsia="宋体" w:ascii="Times New Roman" w:hAnsi="Times New Roman"/>
         </w:rPr>
-        <w:t>在每一个环节内部，本综述均采用"对照式"而非"分割式"写法：即在同一主题下同时呈现国外与国内的代表性进展，明确指出二者在起步时间、研究深度、原创程度、工程落地等方面的差异与互补，并以量化数据（激活能、电压指数、Weibull形状参数、监测精度、预测误差等）支撑对比结论。每一节末尾均设"评述"小段，凝练该环节的共性不足，最终在第九章将这些不足汇聚为若干条研究空白，并逐条对应到学位论文的研究内容。</w:t>
+        <w:t>在每一个环节内部，本综述均采用"对照式"而非"分割式"写法：即在同一主题下同时呈现国外与国内的代表性进展，明确指出二者在起步时间、研究深度、原创程度、工程落地等方面的差异与互补，并以量化数据（激活能、电压指数、Weibull形状参数、监测精度、预测误差等）支撑对比结论。每一节末尾均设"评述"小段，凝练该环节的共性不足，最终在第十章将这些不足汇聚为若干条研究空白，并逐条对应到学位论文的研究内容。</w:t>
       </w:r>
     </w:p>
     <w:p>
@@ -2281,7 +2281,7 @@
           <w:sz w:val="24"/>
           <w:rFonts w:eastAsia="宋体" w:ascii="Times New Roman" w:hAnsi="Times New Roman"/>
         </w:rPr>
-        <w:t>据此，本报告共分九章组织：第一章为引言与综述方法（即本章，承担"立坐标"功能）；第二章对应主线的"器件"环节，分析五类电容器的结构原理与其在系统中的可靠性地位；第三章对应"失效模式"环节；第四章对应"失效机理"环节，是篇幅最大、最具理论深度的一章；第五章对应"可靠性建模"环节；第六章对应"状态监测与寿命预测"环节；第七章从横向应用场景视角补充评述典型领域的可靠性研究现状；第八章对国内外研究水平进行综合量化对比与发展态势分析；第九章凝练研究空白、给出与研究内容的对接关系并展望未来趋势。</w:t>
+        <w:t>据此，本报告共分十章组织：第一章为引言与综述方法（即本章，承担"立坐标"功能）；第二章对应主线的"器件"环节，分析五类电容器的结构原理与其在系统中的可靠性地位；第三章对应"失效模式"环节；第四章对应"失效机理"环节，是篇幅最大、最具理论深度的一章；第五章对应"可靠性建模"环节；第六章对应"状态监测与寿命预测"环节；第七章从横向应用场景视角补充评述典型领域的可靠性研究现状；第八章设"中国国内研究现状专论"，以固态铝/聚合物电容（SAPC）为重点，集中、系统地梳理国内研究力量、各器件成果、产业自主化与标准化态势；第九章对国内外研究水平进行综合量化对比与发展态势分析；第十章凝练研究空白、给出与研究内容的对接关系并展望未来趋势。</w:t>
       </w:r>
     </w:p>
     <w:p>
@@ -3715,7 +3715,7 @@
                 <w:sz w:val="19"/>
                 <w:rFonts w:eastAsia="宋体" w:ascii="Times New Roman" w:hAnsi="Times New Roman"/>
               </w:rPr>
-              <w:t>第九章表18</w:t>
+              <w:t>第十章表22</w:t>
             </w:r>
           </w:p>
         </w:tc>
@@ -5259,7 +5259,7 @@
           <w:sz w:val="24"/>
           <w:rFonts w:eastAsia="宋体" w:ascii="Times New Roman" w:hAnsi="Times New Roman"/>
         </w:rPr>
-        <w:t>国内研究的另一显著特点是与"双碳"目标下新能源装备的深度绑定。例如，针对风电与光伏变流器直流母线电容在宽温域、强纹波工况下的退化，国内团队建立了多套基于纹波电压与温度的在线监测系统；针对电动汽车电驱在频繁起停、强振动环境下的薄膜电容，开展了温度循环与振动耦合下的可靠性评估。这些工作紧扣工程需求，落地性强。</w:t>
+        <w:t>国内研究的另一显著特点是与"双碳"目标下新能源装备的深度绑定。例如，针对风电与光伏变流器直流母线电容在宽温域、强纹波工况下的退化，国内团队建立了多套基于纹波电压与温度的在线监测系统；针对电动汽车电驱在频繁起停、强振动环境下的薄膜电容，开展了温度循环与振动耦合下的可靠性评估。在固态铝/聚合物电容（SAPC）方向，国内已具备较强的材料与量产能力：在材料上有以弱碱对PEDOT:PSS去质子化以中和酸性、改善铝固态电容性能，以及气相聚合制备低ESR的PEDOT固态电容等进展；在产业上，艾华集团（上交所603989）、南通江海（深交所002484）等已规模化供应固态聚合物、多层聚合物及聚合物混合铝电容。这些工作紧扣工程需求，落地性强。</w:t>
       </w:r>
     </w:p>
     <w:p>
@@ -5275,7 +5275,7 @@
           <w:sz w:val="24"/>
           <w:rFonts w:eastAsia="宋体" w:ascii="Times New Roman" w:hAnsi="Times New Roman"/>
         </w:rPr>
-        <w:t>然而也应客观看到国内研究的结构性短板。一方面，研究资源较多集中于"应用验证"与"在线监测"等贴近工程的环节，而对器件底层材料与工艺的可靠性物理研究投入相对不足，导致原创机理与判据较少；另一方面，产业界与学术界的数据共享机制尚不健全，器件厂商的工艺—失效数据、整机厂商的现场故障数据多分散且未标准化，制约了高质量可靠性数据库的形成。补齐这两块短板——从"用好器件"走向"理解并定义器件可靠性"，是国内研究实现质的跃升的关键。</w:t>
+        <w:t>然而也应客观看到国内研究的结构性短板。一方面，研究资源较多集中于"应用验证"与"在线监测"等贴近工程的环节，而对器件底层材料与工艺的可靠性物理研究投入相对不足，导致原创机理与判据较少；另一方面，产业界与学术界的数据共享机制尚不健全，器件厂商的工艺—失效数据、整机厂商的现场故障数据多分散且未标准化，制约了高质量可靠性数据库的形成。补齐这两块短板——从"用好器件"走向"理解并定义器件可靠性"，是国内研究实现质的跃升的关键。鉴于国内研究（尤其是与本文最相关的SAPC方向）体量大、特色鲜明，本报告专设第八章"中国国内研究现状专论"，对国内研究力量分布、各器件与各环节成果、产业自主化与标准化态势作集中、系统的梳理与评述。</w:t>
       </w:r>
     </w:p>
     <w:p>
@@ -6564,7 +6564,7 @@
           <w:sz w:val="24"/>
           <w:rFonts w:eastAsia="宋体" w:ascii="Times New Roman" w:hAnsi="Times New Roman"/>
         </w:rPr>
-        <w:t>从可靠性研究的视角看，自主化不仅是产能问题，更是"可靠性数据主权"问题：谁掌握器件的全流程工艺与长期失效数据，谁就掌握失效率基准与可靠性判据的定义权。国外头部厂商凭借数十年积累的工艺—失效数据库，主导了全球可靠性判据；国内虽在新能源等场景拥有海量真实工况数据，但缺乏面向国产高端器件、口径统一、样本充分的失效率基准库。这一短板将在第九章作为研究空白G-1被明确提出，是国产高端电容可靠性保证体系建设的核心瓶颈之一。</w:t>
+        <w:t>从可靠性研究的视角看，自主化不仅是产能问题，更是"可靠性数据主权"问题：谁掌握器件的全流程工艺与长期失效数据，谁就掌握失效率基准与可靠性判据的定义权。国外头部厂商凭借数十年积累的工艺—失效数据库，主导了全球可靠性判据；国内虽在新能源等场景拥有海量真实工况数据，但缺乏面向国产高端器件、口径统一、样本充分的失效率基准库。这一短板将在第十章作为研究空白G-1被明确提出，是国产高端电容可靠性保证体系建设的核心瓶颈之一。</w:t>
       </w:r>
     </w:p>
     <w:p>
@@ -20124,7 +20124,7 @@
           <w:sz w:val="32"/>
           <w:rFonts w:eastAsia="黑体" w:ascii="Times New Roman" w:hAnsi="Times New Roman"/>
         </w:rPr>
-        <w:t>第八章 国内外研究水平综合量化对比与发展态势</w:t>
+        <w:t>第八章 中国国内研究现状专论——以固态铝/聚合物电容（SAPC）为重点</w:t>
       </w:r>
     </w:p>
     <w:p>
@@ -20140,7 +20140,7 @@
           <w:sz w:val="24"/>
           <w:rFonts w:eastAsia="宋体" w:ascii="Times New Roman" w:hAnsi="Times New Roman"/>
         </w:rPr>
-        <w:t>前述各章已从纵向主线（第二至六章）与横向应用场景（第七章）两个维度评述了国内外研究现状。本章在此基础上作横向综合：先以总表与雷达图给出五环节的国内外水平量化对比（8.1、8.3），再从文献计量角度刻画研究热点的演进趋势（8.2），最后以研究演进时间轴勾勒领域发展脉络（8.4），从而为第九章凝练研究空白提供全局视野。</w:t>
+        <w:t>前述第二至第七章在每一环节均设有"国内研究进展"小节，但受篇幅与结构所限，国内现状的论述较为概要，对固态铝电解/聚合物电容（Solid Aluminum Polymer Capacitor，下文统称SAPC）这一与本文研究最直接相关的器件，国内文献的覆盖尤显不足。鉴于国内研究近十余年增长迅猛、且在新能源与电动交通的牵引下形成了鲜明特色，有必要单设专章，集中梳理中国国内的研究力量分布、各器件与各环节的代表性成果、产业自主化与标准化态势，并给出量化评述。本章的组织顺序为：先总览国内研究格局（8.1、8.2），再以SAPC为核心、兼及铝电解/MLCC/薄膜/钽/超容分器件评述（8.3–8.7），随后专论建模与数据驱动方法的国内进展（8.8）、标准与自主化（8.9），最后作特点—贡献—不足的综合评述（8.10）。</w:t>
       </w:r>
     </w:p>
     <w:p>
@@ -20156,7 +20156,7 @@
           <w:sz w:val="28"/>
           <w:rFonts w:eastAsia="黑体" w:ascii="Times New Roman" w:hAnsi="Times New Roman"/>
         </w:rPr>
-        <w:t>8.1 五环节国内外水平综合对比</w:t>
+        <w:t>8.1 为何需要专章梳理国内研究</w:t>
       </w:r>
     </w:p>
     <w:p>
@@ -20172,7 +20172,181 @@
           <w:sz w:val="24"/>
           <w:rFonts w:eastAsia="宋体" w:ascii="Times New Roman" w:hAnsi="Times New Roman"/>
         </w:rPr>
-        <w:t>表17将五个环节的国内外研究水平并置对照，给出每一环节国外的优势、国内的优势以及量化差距特征。总体规律可概括为一句话：国外在"原创理论与判据定义"上系统领先，国内在"工程场景与规模化应用"上具备独特优势；论文数量上中国已接近美国，但在原创性、影响力与标准话语权上仍有差距。这一"形似质异"的格局，正是后续研究需要着力突破的方向。</w:t>
+        <w:t>将国内研究单列专章，主要基于三点考虑。其一是相关性：SAPC以蚀刻铝箔/Al2O3为介质、以PEDOT等导电聚合物为固态阴极，兼具低ESR、优良高频与温度特性以及"不起火"的良性失效特征，是本文研究的核心对象；而国内在该器件上的材料、工艺、失效与可靠性研究散见于材料化学、电力电子与可靠性工程等不同学科，亟需系统整合。其二是体量与特色：国内研究在"双碳"目标与新能源装备需求牵引下呈爆发式增长，并形成了"海量真实工况数据+强工程落地"的独特优势，单设专章方能完整呈现这一格局。其三是问题导向：唯有把国内现状梳理清楚，才能准确识别国内研究相对国际前沿的差距与空白（第十章将据此凝练研究空白并对接本文研究内容）。</w:t>
+      </w:r>
+    </w:p>
+    <w:p>
+      <w:pPr>
+        <w:spacing w:line="360" w:lineRule="auto" w:after="80"/>
+        <w:ind w:firstLine="465"/>
+        <w:jc w:val="both"/>
+      </w:pPr>
+      <w:r>
+        <w:rPr>
+          <w:b w:val="0"/>
+          <w:i w:val="0"/>
+          <w:sz w:val="24"/>
+          <w:rFonts w:eastAsia="宋体" w:ascii="Times New Roman" w:hAnsi="Times New Roman"/>
+        </w:rPr>
+        <w:t>需要说明的是，本章坚持文献诚信：所引国内成果均以可溯源的公开文献、企业技术资料或国家/行业标准为依据，凡未能确证的DOI、卷期或作者信息，均在参考文献中标注"建议核验"，未作虚构；对以"高校/院所/企业"作概括描述之处，意在刻画研究格局而非为具体团队排名。</w:t>
+      </w:r>
+    </w:p>
+    <w:p>
+      <w:pPr>
+        <w:keepNext/>
+        <w:spacing w:before="160" w:after="120"/>
+        <w:outlineLvl w:val="2"/>
+      </w:pPr>
+      <w:r>
+        <w:rPr>
+          <w:b/>
+          <w:i w:val="0"/>
+          <w:sz w:val="28"/>
+          <w:rFonts w:eastAsia="黑体" w:ascii="Times New Roman" w:hAnsi="Times New Roman"/>
+        </w:rPr>
+        <w:t>8.2 国内研究力量分布与发展脉络</w:t>
+      </w:r>
+    </w:p>
+    <w:p>
+      <w:pPr>
+        <w:spacing w:line="360" w:lineRule="auto" w:after="80"/>
+        <w:ind w:firstLine="465"/>
+        <w:jc w:val="both"/>
+      </w:pPr>
+      <w:r>
+        <w:rPr>
+          <w:b w:val="0"/>
+          <w:i w:val="0"/>
+          <w:sz w:val="24"/>
+          <w:rFonts w:eastAsia="宋体" w:ascii="Times New Roman" w:hAnsi="Times New Roman"/>
+        </w:rPr>
+        <w:t>从研究力量看，国内电容器可靠性研究大致由三股力量构成、并相互支撑。一是高校与院所的基础与方法研究：在电力电子与可靠性方向，重庆大学、西安交通大学、华中科技大学、哈尔滨工业大学、浙江大学、清华大学、天津大学等在直流母线电容在线监测、寿命建模与状态评估方面积累深厚；在材料与器件方向，中国科学院相关研究院所（如深圳先进电子材料研究院）、北京大学、华南师范大学等在BaTiO3基MLCC介质与可靠性机理上贡献突出。二是企业与工程院所的器件与工艺研究：以艾华集团、南通江海、振华新云等为代表的电容器企业，以及电子元器件可靠性相关检测/认证机构，掌握着器件全流程工艺与长期失效数据。三是新能源与交通装备整机企业：在风电、光伏、电动汽车、轨道交通等场景中积累了海量真实工况与现场失效数据。三股力量的协同程度，直接决定国内研究能否从"用好器件"走向"理解并定义器件可靠性"（其分布示意见图31）。</w:t>
+      </w:r>
+    </w:p>
+    <w:p>
+      <w:pPr>
+        <w:spacing w:before="120" w:after="40"/>
+        <w:jc w:val="center"/>
+      </w:pPr>
+      <w:r>
+        <w:drawing>
+          <wp:inline xmlns:a="http://schemas.openxmlformats.org/drawingml/2006/main" xmlns:pic="http://schemas.openxmlformats.org/drawingml/2006/picture">
+            <wp:extent cx="5220000" cy="2012578"/>
+            <wp:docPr id="31" name="Picture 31"/>
+            <wp:cNvGraphicFramePr>
+              <a:graphicFrameLocks noChangeAspect="1"/>
+            </wp:cNvGraphicFramePr>
+            <a:graphic>
+              <a:graphicData uri="http://schemas.openxmlformats.org/drawingml/2006/picture">
+                <pic:pic>
+                  <pic:nvPicPr>
+                    <pic:cNvPr id="0" name="fig_cn_landscape.png"/>
+                    <pic:cNvPicPr/>
+                  </pic:nvPicPr>
+                  <pic:blipFill>
+                    <a:blip r:embed="rId41"/>
+                    <a:stretch>
+                      <a:fillRect/>
+                    </a:stretch>
+                  </pic:blipFill>
+                  <pic:spPr>
+                    <a:xfrm>
+                      <a:off x="0" y="0"/>
+                      <a:ext cx="5220000" cy="2012578"/>
+                    </a:xfrm>
+                    <a:prstGeom prst="rect"/>
+                  </pic:spPr>
+                </pic:pic>
+              </a:graphicData>
+            </a:graphic>
+          </wp:inline>
+        </w:drawing>
+      </w:r>
+    </w:p>
+    <w:p>
+      <w:pPr>
+        <w:spacing w:after="160"/>
+        <w:jc w:val="center"/>
+      </w:pPr>
+      <w:r>
+        <w:rPr>
+          <w:b/>
+          <w:i w:val="0"/>
+          <w:sz w:val="21"/>
+          <w:rFonts w:eastAsia="黑体" w:ascii="Times New Roman" w:hAnsi="Times New Roman"/>
+        </w:rPr>
+        <w:t>图 31  国内研究力量与研究主题活跃度示意（基于公开文献的定性归纳）</w:t>
+      </w:r>
+    </w:p>
+    <w:p>
+      <w:pPr>
+        <w:spacing w:line="360" w:lineRule="auto" w:after="80"/>
+        <w:ind w:firstLine="465"/>
+        <w:jc w:val="both"/>
+      </w:pPr>
+      <w:r>
+        <w:rPr>
+          <w:b w:val="0"/>
+          <w:i w:val="0"/>
+          <w:sz w:val="24"/>
+          <w:rFonts w:eastAsia="宋体" w:ascii="Times New Roman" w:hAnsi="Times New Roman"/>
+        </w:rPr>
+        <w:t>从发展脉络看，国内研究大体经历三个阶段：2010年前以跟踪国外方法、开展器件选型与降额应用为主；2010—2016年随新能源并网与电动交通起步，转向母线电容在线监测与寿命评估的工程化研究；2016年至今，在"双碳"与高端制造（如"中国制造2025"对关键基础元器件的部署）牵引下，研究在数据驱动RUL预测、物理信息神经网络（PINN）、国产固态/聚合物电容材料与工艺、MLCC可靠性机理等方向快速铺开，论文数量已接近国际先进水平（年度增长示意见图32）。这一脉络与全球"经验—机理—监测—数据智能"的范式演进基本同步，但国内在原创机理与判据定义上的起步明显晚于欧美日。</w:t>
+      </w:r>
+    </w:p>
+    <w:p>
+      <w:pPr>
+        <w:spacing w:before="120" w:after="40"/>
+        <w:jc w:val="center"/>
+      </w:pPr>
+      <w:r>
+        <w:drawing>
+          <wp:inline xmlns:a="http://schemas.openxmlformats.org/drawingml/2006/main" xmlns:pic="http://schemas.openxmlformats.org/drawingml/2006/picture">
+            <wp:extent cx="5220000" cy="3212308"/>
+            <wp:docPr id="32" name="Picture 32"/>
+            <wp:cNvGraphicFramePr>
+              <a:graphicFrameLocks noChangeAspect="1"/>
+            </wp:cNvGraphicFramePr>
+            <a:graphic>
+              <a:graphicData uri="http://schemas.openxmlformats.org/drawingml/2006/picture">
+                <pic:pic>
+                  <pic:nvPicPr>
+                    <pic:cNvPr id="0" name="fig_cn_growth.png"/>
+                    <pic:cNvPicPr/>
+                  </pic:nvPicPr>
+                  <pic:blipFill>
+                    <a:blip r:embed="rId42"/>
+                    <a:stretch>
+                      <a:fillRect/>
+                    </a:stretch>
+                  </pic:blipFill>
+                  <pic:spPr>
+                    <a:xfrm>
+                      <a:off x="0" y="0"/>
+                      <a:ext cx="5220000" cy="3212308"/>
+                    </a:xfrm>
+                    <a:prstGeom prst="rect"/>
+                  </pic:spPr>
+                </pic:pic>
+              </a:graphicData>
+            </a:graphic>
+          </wp:inline>
+        </w:drawing>
+      </w:r>
+    </w:p>
+    <w:p>
+      <w:pPr>
+        <w:spacing w:after="160"/>
+        <w:jc w:val="center"/>
+      </w:pPr>
+      <w:r>
+        <w:rPr>
+          <w:b/>
+          <w:i w:val="0"/>
+          <w:sz w:val="21"/>
+          <w:rFonts w:eastAsia="黑体" w:ascii="Times New Roman" w:hAnsi="Times New Roman"/>
+        </w:rPr>
+        <w:t>图 32  国内电容器可靠性相关公开成果的年度增长示意（定性趋势）</w:t>
       </w:r>
     </w:p>
     <w:p>
@@ -20188,7 +20362,7 @@
           <w:sz w:val="21"/>
           <w:rFonts w:eastAsia="黑体" w:ascii="Times New Roman" w:hAnsi="Times New Roman"/>
         </w:rPr>
-        <w:t>表 17  五环节国内外研究水平综合对比总表</w:t>
+        <w:t>表 17  国内电容器可靠性研究主题—力量—成果—成熟度概览</w:t>
       </w:r>
     </w:p>
     <w:tbl>
@@ -20207,6 +20381,78 @@
       <w:tr>
         <w:tc>
           <w:tcPr>
+            <w:tcW w:type="dxa" w:w="1928"/>
+            <w:tcBorders>
+              <w:top w:val="single" w:sz="14" w:space="0" w:color="000000"/>
+              <w:bottom w:val="single" w:sz="6" w:space="0" w:color="000000"/>
+            </w:tcBorders>
+          </w:tcPr>
+          <w:p>
+            <w:pPr>
+              <w:jc w:val="center"/>
+            </w:pPr>
+            <w:r/>
+            <w:r>
+              <w:rPr>
+                <w:b/>
+                <w:i w:val="0"/>
+                <w:sz w:val="19"/>
+                <w:rFonts w:eastAsia="黑体" w:ascii="Times New Roman" w:hAnsi="Times New Roman"/>
+              </w:rPr>
+              <w:t>研究主题</w:t>
+            </w:r>
+          </w:p>
+        </w:tc>
+        <w:tc>
+          <w:tcPr>
+            <w:tcW w:type="dxa" w:w="2154"/>
+            <w:tcBorders>
+              <w:top w:val="single" w:sz="14" w:space="0" w:color="000000"/>
+              <w:bottom w:val="single" w:sz="6" w:space="0" w:color="000000"/>
+            </w:tcBorders>
+          </w:tcPr>
+          <w:p>
+            <w:pPr>
+              <w:jc w:val="center"/>
+            </w:pPr>
+            <w:r/>
+            <w:r>
+              <w:rPr>
+                <w:b/>
+                <w:i w:val="0"/>
+                <w:sz w:val="19"/>
+                <w:rFonts w:eastAsia="黑体" w:ascii="Times New Roman" w:hAnsi="Times New Roman"/>
+              </w:rPr>
+              <w:t>代表性国内力量（示例）</w:t>
+            </w:r>
+          </w:p>
+        </w:tc>
+        <w:tc>
+          <w:tcPr>
+            <w:tcW w:type="dxa" w:w="2494"/>
+            <w:tcBorders>
+              <w:top w:val="single" w:sz="14" w:space="0" w:color="000000"/>
+              <w:bottom w:val="single" w:sz="6" w:space="0" w:color="000000"/>
+            </w:tcBorders>
+          </w:tcPr>
+          <w:p>
+            <w:pPr>
+              <w:jc w:val="center"/>
+            </w:pPr>
+            <w:r/>
+            <w:r>
+              <w:rPr>
+                <w:b/>
+                <w:i w:val="0"/>
+                <w:sz w:val="19"/>
+                <w:rFonts w:eastAsia="黑体" w:ascii="Times New Roman" w:hAnsi="Times New Roman"/>
+              </w:rPr>
+              <w:t>典型成果方向</w:t>
+            </w:r>
+          </w:p>
+        </w:tc>
+        <w:tc>
+          <w:tcPr>
             <w:tcW w:type="dxa" w:w="1474"/>
             <w:tcBorders>
               <w:top w:val="single" w:sz="14" w:space="0" w:color="000000"/>
@@ -20225,6 +20471,2794 @@
                 <w:sz w:val="19"/>
                 <w:rFonts w:eastAsia="黑体" w:ascii="Times New Roman" w:hAnsi="Times New Roman"/>
               </w:rPr>
+              <w:t>成熟度</w:t>
+            </w:r>
+          </w:p>
+        </w:tc>
+      </w:tr>
+      <w:tr>
+        <w:tc>
+          <w:tcPr>
+            <w:tcW w:type="dxa" w:w="1928"/>
+          </w:tcPr>
+          <w:p>
+            <w:pPr>
+              <w:spacing w:line="240" w:lineRule="auto"/>
+              <w:jc w:val="left"/>
+            </w:pPr>
+            <w:r/>
+            <w:r>
+              <w:rPr>
+                <w:b w:val="0"/>
+                <w:i w:val="0"/>
+                <w:sz w:val="19"/>
+                <w:rFonts w:eastAsia="宋体" w:ascii="Times New Roman" w:hAnsi="Times New Roman"/>
+              </w:rPr>
+              <w:t>固态铝/聚合物电容(SAPC)</w:t>
+            </w:r>
+          </w:p>
+        </w:tc>
+        <w:tc>
+          <w:tcPr>
+            <w:tcW w:type="dxa" w:w="2154"/>
+          </w:tcPr>
+          <w:p>
+            <w:pPr>
+              <w:spacing w:line="240" w:lineRule="auto"/>
+              <w:jc w:val="left"/>
+            </w:pPr>
+            <w:r/>
+            <w:r>
+              <w:rPr>
+                <w:b w:val="0"/>
+                <w:i w:val="0"/>
+                <w:sz w:val="19"/>
+                <w:rFonts w:eastAsia="宋体" w:ascii="Times New Roman" w:hAnsi="Times New Roman"/>
+              </w:rPr>
+              <w:t>高校材料组、艾华/江海等企业</w:t>
+            </w:r>
+          </w:p>
+        </w:tc>
+        <w:tc>
+          <w:tcPr>
+            <w:tcW w:type="dxa" w:w="2494"/>
+          </w:tcPr>
+          <w:p>
+            <w:pPr>
+              <w:spacing w:line="240" w:lineRule="auto"/>
+              <w:jc w:val="left"/>
+            </w:pPr>
+            <w:r/>
+            <w:r>
+              <w:rPr>
+                <w:b w:val="0"/>
+                <w:i w:val="0"/>
+                <w:sz w:val="19"/>
+                <w:rFonts w:eastAsia="宋体" w:ascii="Times New Roman" w:hAnsi="Times New Roman"/>
+              </w:rPr>
+              <w:t>PEDOT去质子化、气相聚合工艺、低ESR器件</w:t>
+            </w:r>
+          </w:p>
+        </w:tc>
+        <w:tc>
+          <w:tcPr>
+            <w:tcW w:type="dxa" w:w="1474"/>
+          </w:tcPr>
+          <w:p>
+            <w:pPr>
+              <w:spacing w:line="240" w:lineRule="auto"/>
+              <w:jc w:val="left"/>
+            </w:pPr>
+            <w:r/>
+            <w:r>
+              <w:rPr>
+                <w:b w:val="0"/>
+                <w:i w:val="0"/>
+                <w:sz w:val="19"/>
+                <w:rFonts w:eastAsia="宋体" w:ascii="Times New Roman" w:hAnsi="Times New Roman"/>
+              </w:rPr>
+              <w:t>材料中等、器件级数据不足</w:t>
+            </w:r>
+          </w:p>
+        </w:tc>
+      </w:tr>
+      <w:tr>
+        <w:tc>
+          <w:tcPr>
+            <w:tcW w:type="dxa" w:w="1928"/>
+          </w:tcPr>
+          <w:p>
+            <w:pPr>
+              <w:spacing w:line="240" w:lineRule="auto"/>
+              <w:jc w:val="left"/>
+            </w:pPr>
+            <w:r/>
+            <w:r>
+              <w:rPr>
+                <w:b w:val="0"/>
+                <w:i w:val="0"/>
+                <w:sz w:val="19"/>
+                <w:rFonts w:eastAsia="宋体" w:ascii="Times New Roman" w:hAnsi="Times New Roman"/>
+              </w:rPr>
+              <w:t>铝电解/DC-link监测</w:t>
+            </w:r>
+          </w:p>
+        </w:tc>
+        <w:tc>
+          <w:tcPr>
+            <w:tcW w:type="dxa" w:w="2154"/>
+          </w:tcPr>
+          <w:p>
+            <w:pPr>
+              <w:spacing w:line="240" w:lineRule="auto"/>
+              <w:jc w:val="left"/>
+            </w:pPr>
+            <w:r/>
+            <w:r>
+              <w:rPr>
+                <w:b w:val="0"/>
+                <w:i w:val="0"/>
+                <w:sz w:val="19"/>
+                <w:rFonts w:eastAsia="宋体" w:ascii="Times New Roman" w:hAnsi="Times New Roman"/>
+              </w:rPr>
+              <w:t>重庆大学、华中科大等</w:t>
+            </w:r>
+          </w:p>
+        </w:tc>
+        <w:tc>
+          <w:tcPr>
+            <w:tcW w:type="dxa" w:w="2494"/>
+          </w:tcPr>
+          <w:p>
+            <w:pPr>
+              <w:spacing w:line="240" w:lineRule="auto"/>
+              <w:jc w:val="left"/>
+            </w:pPr>
+            <w:r/>
+            <w:r>
+              <w:rPr>
+                <w:b w:val="0"/>
+                <w:i w:val="0"/>
+                <w:sz w:val="19"/>
+                <w:rFonts w:eastAsia="宋体" w:ascii="Times New Roman" w:hAnsi="Times New Roman"/>
+              </w:rPr>
+              <w:t>灰箱/RLS在线辨识、任务剖面寿命</w:t>
+            </w:r>
+          </w:p>
+        </w:tc>
+        <w:tc>
+          <w:tcPr>
+            <w:tcW w:type="dxa" w:w="1474"/>
+          </w:tcPr>
+          <w:p>
+            <w:pPr>
+              <w:spacing w:line="240" w:lineRule="auto"/>
+              <w:jc w:val="left"/>
+            </w:pPr>
+            <w:r/>
+            <w:r>
+              <w:rPr>
+                <w:b w:val="0"/>
+                <w:i w:val="0"/>
+                <w:sz w:val="19"/>
+                <w:rFonts w:eastAsia="宋体" w:ascii="Times New Roman" w:hAnsi="Times New Roman"/>
+              </w:rPr>
+              <w:t>工程落地强</w:t>
+            </w:r>
+          </w:p>
+        </w:tc>
+      </w:tr>
+      <w:tr>
+        <w:tc>
+          <w:tcPr>
+            <w:tcW w:type="dxa" w:w="1928"/>
+          </w:tcPr>
+          <w:p>
+            <w:pPr>
+              <w:spacing w:line="240" w:lineRule="auto"/>
+              <w:jc w:val="left"/>
+            </w:pPr>
+            <w:r/>
+            <w:r>
+              <w:rPr>
+                <w:b w:val="0"/>
+                <w:i w:val="0"/>
+                <w:sz w:val="19"/>
+                <w:rFonts w:eastAsia="宋体" w:ascii="Times New Roman" w:hAnsi="Times New Roman"/>
+              </w:rPr>
+              <w:t>MLCC可靠性</w:t>
+            </w:r>
+          </w:p>
+        </w:tc>
+        <w:tc>
+          <w:tcPr>
+            <w:tcW w:type="dxa" w:w="2154"/>
+          </w:tcPr>
+          <w:p>
+            <w:pPr>
+              <w:spacing w:line="240" w:lineRule="auto"/>
+              <w:jc w:val="left"/>
+            </w:pPr>
+            <w:r/>
+            <w:r>
+              <w:rPr>
+                <w:b w:val="0"/>
+                <w:i w:val="0"/>
+                <w:sz w:val="19"/>
+                <w:rFonts w:eastAsia="宋体" w:ascii="Times New Roman" w:hAnsi="Times New Roman"/>
+              </w:rPr>
+              <w:t>中科院、北大、华南师大等</w:t>
+            </w:r>
+          </w:p>
+        </w:tc>
+        <w:tc>
+          <w:tcPr>
+            <w:tcW w:type="dxa" w:w="2494"/>
+          </w:tcPr>
+          <w:p>
+            <w:pPr>
+              <w:spacing w:line="240" w:lineRule="auto"/>
+              <w:jc w:val="left"/>
+            </w:pPr>
+            <w:r/>
+            <w:r>
+              <w:rPr>
+                <w:b w:val="0"/>
+                <w:i w:val="0"/>
+                <w:sz w:val="19"/>
+                <w:rFonts w:eastAsia="宋体" w:ascii="Times New Roman" w:hAnsi="Times New Roman"/>
+              </w:rPr>
+              <w:t>超薄BME介质、晶粒尺寸—可靠性机理</w:t>
+            </w:r>
+          </w:p>
+        </w:tc>
+        <w:tc>
+          <w:tcPr>
+            <w:tcW w:type="dxa" w:w="1474"/>
+          </w:tcPr>
+          <w:p>
+            <w:pPr>
+              <w:spacing w:line="240" w:lineRule="auto"/>
+              <w:jc w:val="left"/>
+            </w:pPr>
+            <w:r/>
+            <w:r>
+              <w:rPr>
+                <w:b w:val="0"/>
+                <w:i w:val="0"/>
+                <w:sz w:val="19"/>
+                <w:rFonts w:eastAsia="宋体" w:ascii="Times New Roman" w:hAnsi="Times New Roman"/>
+              </w:rPr>
+              <w:t>机理研究活跃</w:t>
+            </w:r>
+          </w:p>
+        </w:tc>
+      </w:tr>
+      <w:tr>
+        <w:tc>
+          <w:tcPr>
+            <w:tcW w:type="dxa" w:w="1928"/>
+          </w:tcPr>
+          <w:p>
+            <w:pPr>
+              <w:spacing w:line="240" w:lineRule="auto"/>
+              <w:jc w:val="left"/>
+            </w:pPr>
+            <w:r/>
+            <w:r>
+              <w:rPr>
+                <w:b w:val="0"/>
+                <w:i w:val="0"/>
+                <w:sz w:val="19"/>
+                <w:rFonts w:eastAsia="宋体" w:ascii="Times New Roman" w:hAnsi="Times New Roman"/>
+              </w:rPr>
+              <w:t>金属化膜自愈</w:t>
+            </w:r>
+          </w:p>
+        </w:tc>
+        <w:tc>
+          <w:tcPr>
+            <w:tcW w:type="dxa" w:w="2154"/>
+          </w:tcPr>
+          <w:p>
+            <w:pPr>
+              <w:spacing w:line="240" w:lineRule="auto"/>
+              <w:jc w:val="left"/>
+            </w:pPr>
+            <w:r/>
+            <w:r>
+              <w:rPr>
+                <w:b w:val="0"/>
+                <w:i w:val="0"/>
+                <w:sz w:val="19"/>
+                <w:rFonts w:eastAsia="宋体" w:ascii="Times New Roman" w:hAnsi="Times New Roman"/>
+              </w:rPr>
+              <w:t>高校高压/脉冲功率方向</w:t>
+            </w:r>
+          </w:p>
+        </w:tc>
+        <w:tc>
+          <w:tcPr>
+            <w:tcW w:type="dxa" w:w="2494"/>
+          </w:tcPr>
+          <w:p>
+            <w:pPr>
+              <w:spacing w:line="240" w:lineRule="auto"/>
+              <w:jc w:val="left"/>
+            </w:pPr>
+            <w:r/>
+            <w:r>
+              <w:rPr>
+                <w:b w:val="0"/>
+                <w:i w:val="0"/>
+                <w:sz w:val="19"/>
+                <w:rFonts w:eastAsia="宋体" w:ascii="Times New Roman" w:hAnsi="Times New Roman"/>
+              </w:rPr>
+              <w:t>自愈能量、超声/UHF检测、累积损伤</w:t>
+            </w:r>
+          </w:p>
+        </w:tc>
+        <w:tc>
+          <w:tcPr>
+            <w:tcW w:type="dxa" w:w="1474"/>
+          </w:tcPr>
+          <w:p>
+            <w:pPr>
+              <w:spacing w:line="240" w:lineRule="auto"/>
+              <w:jc w:val="left"/>
+            </w:pPr>
+            <w:r/>
+            <w:r>
+              <w:rPr>
+                <w:b w:val="0"/>
+                <w:i w:val="0"/>
+                <w:sz w:val="19"/>
+                <w:rFonts w:eastAsia="宋体" w:ascii="Times New Roman" w:hAnsi="Times New Roman"/>
+              </w:rPr>
+              <w:t>测试方法领先</w:t>
+            </w:r>
+          </w:p>
+        </w:tc>
+      </w:tr>
+      <w:tr>
+        <w:tc>
+          <w:tcPr>
+            <w:tcW w:type="dxa" w:w="1928"/>
+          </w:tcPr>
+          <w:p>
+            <w:pPr>
+              <w:spacing w:line="240" w:lineRule="auto"/>
+              <w:jc w:val="left"/>
+            </w:pPr>
+            <w:r/>
+            <w:r>
+              <w:rPr>
+                <w:b w:val="0"/>
+                <w:i w:val="0"/>
+                <w:sz w:val="19"/>
+                <w:rFonts w:eastAsia="宋体" w:ascii="Times New Roman" w:hAnsi="Times New Roman"/>
+              </w:rPr>
+              <w:t>钽/超级电容RUL</w:t>
+            </w:r>
+          </w:p>
+        </w:tc>
+        <w:tc>
+          <w:tcPr>
+            <w:tcW w:type="dxa" w:w="2154"/>
+          </w:tcPr>
+          <w:p>
+            <w:pPr>
+              <w:spacing w:line="240" w:lineRule="auto"/>
+              <w:jc w:val="left"/>
+            </w:pPr>
+            <w:r/>
+            <w:r>
+              <w:rPr>
+                <w:b w:val="0"/>
+                <w:i w:val="0"/>
+                <w:sz w:val="19"/>
+                <w:rFonts w:eastAsia="宋体" w:ascii="Times New Roman" w:hAnsi="Times New Roman"/>
+              </w:rPr>
+              <w:t>高校PHM方向</w:t>
+            </w:r>
+          </w:p>
+        </w:tc>
+        <w:tc>
+          <w:tcPr>
+            <w:tcW w:type="dxa" w:w="2494"/>
+          </w:tcPr>
+          <w:p>
+            <w:pPr>
+              <w:spacing w:line="240" w:lineRule="auto"/>
+              <w:jc w:val="left"/>
+            </w:pPr>
+            <w:r/>
+            <w:r>
+              <w:rPr>
+                <w:b w:val="0"/>
+                <w:i w:val="0"/>
+                <w:sz w:val="19"/>
+                <w:rFonts w:eastAsia="宋体" w:ascii="Times New Roman" w:hAnsi="Times New Roman"/>
+              </w:rPr>
+              <w:t>温度法RUL、LSTM/PINN退化预测</w:t>
+            </w:r>
+          </w:p>
+        </w:tc>
+        <w:tc>
+          <w:tcPr>
+            <w:tcW w:type="dxa" w:w="1474"/>
+          </w:tcPr>
+          <w:p>
+            <w:pPr>
+              <w:spacing w:line="240" w:lineRule="auto"/>
+              <w:jc w:val="left"/>
+            </w:pPr>
+            <w:r/>
+            <w:r>
+              <w:rPr>
+                <w:b w:val="0"/>
+                <w:i w:val="0"/>
+                <w:sz w:val="19"/>
+                <w:rFonts w:eastAsia="宋体" w:ascii="Times New Roman" w:hAnsi="Times New Roman"/>
+              </w:rPr>
+              <w:t>数据驱动跟进快</w:t>
+            </w:r>
+          </w:p>
+        </w:tc>
+      </w:tr>
+      <w:tr>
+        <w:tc>
+          <w:tcPr>
+            <w:tcW w:type="dxa" w:w="1928"/>
+            <w:tcBorders>
+              <w:bottom w:val="single" w:sz="14" w:space="0" w:color="000000"/>
+            </w:tcBorders>
+          </w:tcPr>
+          <w:p>
+            <w:pPr>
+              <w:spacing w:line="240" w:lineRule="auto"/>
+              <w:jc w:val="left"/>
+            </w:pPr>
+            <w:r/>
+            <w:r>
+              <w:rPr>
+                <w:b w:val="0"/>
+                <w:i w:val="0"/>
+                <w:sz w:val="19"/>
+                <w:rFonts w:eastAsia="宋体" w:ascii="Times New Roman" w:hAnsi="Times New Roman"/>
+              </w:rPr>
+              <w:t>建模与数据智能</w:t>
+            </w:r>
+          </w:p>
+        </w:tc>
+        <w:tc>
+          <w:tcPr>
+            <w:tcW w:type="dxa" w:w="2154"/>
+            <w:tcBorders>
+              <w:bottom w:val="single" w:sz="14" w:space="0" w:color="000000"/>
+            </w:tcBorders>
+          </w:tcPr>
+          <w:p>
+            <w:pPr>
+              <w:spacing w:line="240" w:lineRule="auto"/>
+              <w:jc w:val="left"/>
+            </w:pPr>
+            <w:r/>
+            <w:r>
+              <w:rPr>
+                <w:b w:val="0"/>
+                <w:i w:val="0"/>
+                <w:sz w:val="19"/>
+                <w:rFonts w:eastAsia="宋体" w:ascii="Times New Roman" w:hAnsi="Times New Roman"/>
+              </w:rPr>
+              <w:t>多校PHM/电力电子组</w:t>
+            </w:r>
+          </w:p>
+        </w:tc>
+        <w:tc>
+          <w:tcPr>
+            <w:tcW w:type="dxa" w:w="2494"/>
+            <w:tcBorders>
+              <w:bottom w:val="single" w:sz="14" w:space="0" w:color="000000"/>
+            </w:tcBorders>
+          </w:tcPr>
+          <w:p>
+            <w:pPr>
+              <w:spacing w:line="240" w:lineRule="auto"/>
+              <w:jc w:val="left"/>
+            </w:pPr>
+            <w:r/>
+            <w:r>
+              <w:rPr>
+                <w:b w:val="0"/>
+                <w:i w:val="0"/>
+                <w:sz w:val="19"/>
+                <w:rFonts w:eastAsia="宋体" w:ascii="Times New Roman" w:hAnsi="Times New Roman"/>
+              </w:rPr>
+              <w:t>CNN-LSTM、PINN、分数阶随机过程</w:t>
+            </w:r>
+          </w:p>
+        </w:tc>
+        <w:tc>
+          <w:tcPr>
+            <w:tcW w:type="dxa" w:w="1474"/>
+            <w:tcBorders>
+              <w:bottom w:val="single" w:sz="14" w:space="0" w:color="000000"/>
+            </w:tcBorders>
+          </w:tcPr>
+          <w:p>
+            <w:pPr>
+              <w:spacing w:line="240" w:lineRule="auto"/>
+              <w:jc w:val="left"/>
+            </w:pPr>
+            <w:r/>
+            <w:r>
+              <w:rPr>
+                <w:b w:val="0"/>
+                <w:i w:val="0"/>
+                <w:sz w:val="19"/>
+                <w:rFonts w:eastAsia="宋体" w:ascii="Times New Roman" w:hAnsi="Times New Roman"/>
+              </w:rPr>
+              <w:t>规模跟进、原创待强</w:t>
+            </w:r>
+          </w:p>
+        </w:tc>
+      </w:tr>
+    </w:tbl>
+    <w:p>
+      <w:pPr>
+        <w:keepNext/>
+        <w:spacing w:before="160" w:after="120"/>
+        <w:outlineLvl w:val="2"/>
+      </w:pPr>
+      <w:r>
+        <w:rPr>
+          <w:b/>
+          <w:i w:val="0"/>
+          <w:sz w:val="28"/>
+          <w:rFonts w:eastAsia="黑体" w:ascii="Times New Roman" w:hAnsi="Times New Roman"/>
+        </w:rPr>
+        <w:t>8.3 固态铝电解/聚合物电容（SAPC）的国内研究</w:t>
+      </w:r>
+    </w:p>
+    <w:p>
+      <w:pPr>
+        <w:spacing w:line="360" w:lineRule="auto" w:after="80"/>
+        <w:ind w:firstLine="465"/>
+        <w:jc w:val="both"/>
+      </w:pPr>
+      <w:r>
+        <w:rPr>
+          <w:b w:val="0"/>
+          <w:i w:val="0"/>
+          <w:sz w:val="24"/>
+          <w:rFonts w:eastAsia="宋体" w:ascii="Times New Roman" w:hAnsi="Times New Roman"/>
+        </w:rPr>
+        <w:t>SAPC是本文的核心对象，也是国内研究相对薄弱、亟待加强的方向。其可靠性问题的根源在于导电聚合物阴极（多为PEDOT或PEDOT:PSS体系）对湿、热、氧与电应力的敏感性，以及聚合物/氧化膜界面的退化。国内研究可从材料、器件与产业三个层面加以梳理。</w:t>
+      </w:r>
+    </w:p>
+    <w:p>
+      <w:pPr>
+        <w:keepNext/>
+        <w:spacing w:before="160" w:after="120"/>
+        <w:outlineLvl w:val="3"/>
+      </w:pPr>
+      <w:r>
+        <w:rPr>
+          <w:b/>
+          <w:i w:val="0"/>
+          <w:sz w:val="25"/>
+          <w:rFonts w:eastAsia="黑体" w:ascii="Times New Roman" w:hAnsi="Times New Roman"/>
+        </w:rPr>
+        <w:t>8.3.1 导电聚合物阴极材料的国内研究</w:t>
+      </w:r>
+    </w:p>
+    <w:p>
+      <w:pPr>
+        <w:spacing w:line="360" w:lineRule="auto" w:after="80"/>
+        <w:ind w:firstLine="465"/>
+        <w:jc w:val="both"/>
+      </w:pPr>
+      <w:r>
+        <w:rPr>
+          <w:b w:val="0"/>
+          <w:i w:val="0"/>
+          <w:sz w:val="24"/>
+          <w:rFonts w:eastAsia="宋体" w:ascii="Times New Roman" w:hAnsi="Times New Roman"/>
+        </w:rPr>
+        <w:t>在材料层面，国内对PEDOT体系的电导提升与稳定化已有实质性进展。针对PEDOT:PSS因PSS强酸性导致器件劣化、长期耐久性差的问题，研究者提出以弱碱对PEDOT:PSS进行"去质子化"处理以中和其酸性，从而改善铝固态电解电容器的性能；该工作直面"酸性—腐蚀—去掺杂"这一SAPC可靠性的关键痛点，为从材料源头抑制界面退化提供了途径（见RSC Advances 2025相关研究）。在制备工艺层面，采用气相聚合（vapor phase polymerization）制备PEDOT薄膜可获得低耗散因子、低漏电与极低ESR（毫欧级）的固态电容，验证了原位聚合路线在填充多孔阳极、构建保形界面方面的优势（见Journal of Materials Science 2021相关研究）。此外，关于无液态电解质柱状铝聚合物电容的材料与特性综述，系统讨论了氧化剂、隔膜与集流体材料对容量与内阻的影响，为器件可靠性的材料设计提供了参考。</w:t>
+      </w:r>
+    </w:p>
+    <w:p>
+      <w:pPr>
+        <w:spacing w:line="360" w:lineRule="auto" w:before="80" w:after="120"/>
+        <w:ind w:left="340"/>
+        <w:jc w:val="both"/>
+        <w:pBdr>
+          <w:left w:val="single" w:sz="18" w:space="6" w:color="4472C4"/>
+        </w:pBdr>
+      </w:pPr>
+      <w:r>
+        <w:rPr>
+          <w:b w:val="0"/>
+          <w:i w:val="0"/>
+          <w:sz w:val="23"/>
+          <w:rFonts w:eastAsia="楷体" w:ascii="Times New Roman" w:hAnsi="Times New Roman"/>
+        </w:rPr>
+        <w:br/>
+        <w:t>评述：国内在PEDOT去质子化、气相聚合工艺与材料体系优化上已与国际前沿接轨，抓住了"酸性抑制—界面稳定—低ESR"这一主线；但研究多停留在材料/单体器件性能层面，缺乏面向器件级、长周期、多应力（湿热—高温—电—机械）的系统失效与寿命数据，机理认识向器件寿命模型的定量贯通尚未完成。</w:t>
+        <w:br/>
+      </w:r>
+    </w:p>
+    <w:p>
+      <w:pPr>
+        <w:keepNext/>
+        <w:spacing w:before="160" w:after="120"/>
+        <w:outlineLvl w:val="3"/>
+      </w:pPr>
+      <w:r>
+        <w:rPr>
+          <w:b/>
+          <w:i w:val="0"/>
+          <w:sz w:val="25"/>
+          <w:rFonts w:eastAsia="黑体" w:ascii="Times New Roman" w:hAnsi="Times New Roman"/>
+        </w:rPr>
+        <w:t>8.3.2 SAPC器件失效与可靠性的国内研究</w:t>
+      </w:r>
+    </w:p>
+    <w:p>
+      <w:pPr>
+        <w:spacing w:line="360" w:lineRule="auto" w:after="80"/>
+        <w:ind w:firstLine="465"/>
+        <w:jc w:val="both"/>
+      </w:pPr>
+      <w:r>
+        <w:rPr>
+          <w:b w:val="0"/>
+          <w:i w:val="0"/>
+          <w:sz w:val="24"/>
+          <w:rFonts w:eastAsia="宋体" w:ascii="Times New Roman" w:hAnsi="Times New Roman"/>
+        </w:rPr>
+        <w:t>在器件失效与可靠性层面，国内公开的系统性长周期数据仍然稀缺，研究多借鉴高度同构的聚合物钽电容与国际上对聚合物铝电容（PA/APC）的湿热失效结论：即退化以ESR上升、漏电流增大为主而电容量相对稳定，主导机理包括导电聚合物的热—氧化老化、吸湿溶胀与去掺杂、以及聚合物/氧化膜界面的腐蚀与分层。国内已有团队从温度法在线RUL（以温度测量推断退化）、以及考虑参数分散的CNN-LSTM老化状态评估与寿命预测等角度切入电容（含钽/聚合物体系）的健康管理（详见8.7、8.8）。总体而言，国内SAPC器件级可靠性研究"材料热、器件冷"的不平衡格局明显，亟需建立统一规程下、含批次/封装/应力标注的SAPC专用退化数据集。</w:t>
+      </w:r>
+    </w:p>
+    <w:p>
+      <w:pPr>
+        <w:keepNext/>
+        <w:spacing w:before="160" w:after="120"/>
+        <w:outlineLvl w:val="3"/>
+      </w:pPr>
+      <w:r>
+        <w:rPr>
+          <w:b/>
+          <w:i w:val="0"/>
+          <w:sz w:val="25"/>
+          <w:rFonts w:eastAsia="黑体" w:ascii="Times New Roman" w:hAnsi="Times New Roman"/>
+        </w:rPr>
+        <w:t>8.3.3 国内SAPC产业与工程能力</w:t>
+      </w:r>
+    </w:p>
+    <w:p>
+      <w:pPr>
+        <w:spacing w:line="360" w:lineRule="auto" w:after="80"/>
+        <w:ind w:firstLine="465"/>
+        <w:jc w:val="both"/>
+      </w:pPr>
+      <w:r>
+        <w:rPr>
+          <w:b w:val="0"/>
+          <w:i w:val="0"/>
+          <w:sz w:val="24"/>
+          <w:rFonts w:eastAsia="宋体" w:ascii="Times New Roman" w:hAnsi="Times New Roman"/>
+        </w:rPr>
+        <w:t>产业层面，国内已具备较强的SAPC量产能力，并以此积累了宝贵的工艺—可靠性经验。艾华集团（湖南，上交所603989，成立于1985年）是国内铝电解电容龙头之一，其产品线已涵盖固态聚合物、SMT聚合物与多层聚合物铝电容，并以低ESR、优良频率稳定性与"不起火"的良性失效特征著称，部分高可靠产品甚至面向航天等高端场景；南通江海（深交所002484，成立于1958年）作为国内最大的铝电解/薄膜/储能电容制造商之一，产品涵盖聚合物及聚合物混合（hybrid）电容、DC-link薄膜与超级电容，形成了从阳极箔蚀刻化成到成品的完整链条；振华新云等企业则在高可靠电解电容制造工艺上拥有自主专利（如CN105489376B）。这些企业掌握的全流程工艺与长期失效数据，是国内SAPC可靠性研究最宝贵、却尚未充分向学术界开放的数据资源。</w:t>
+      </w:r>
+    </w:p>
+    <w:p>
+      <w:pPr>
+        <w:keepNext/>
+        <w:spacing w:before="120" w:after="40"/>
+        <w:jc w:val="center"/>
+      </w:pPr>
+      <w:r>
+        <w:rPr>
+          <w:b/>
+          <w:i w:val="0"/>
+          <w:sz w:val="21"/>
+          <w:rFonts w:eastAsia="黑体" w:ascii="Times New Roman" w:hAnsi="Times New Roman"/>
+        </w:rPr>
+        <w:t>表 18  国内代表性SAPC/聚合物电容相关企业概览（基于公开企业资料）</w:t>
+      </w:r>
+    </w:p>
+    <w:tbl>
+      <w:tblPr>
+        <w:tblW w:type="auto" w:w="0"/>
+        <w:jc w:val="center"/>
+        <w:tblLayout w:type="autofit"/>
+        <w:tblLook w:firstColumn="1" w:firstRow="1" w:lastColumn="0" w:lastRow="0" w:noHBand="0" w:noVBand="1" w:val="04A0"/>
+      </w:tblPr>
+      <w:tblGrid>
+        <w:gridCol w:w="2126"/>
+        <w:gridCol w:w="2126"/>
+        <w:gridCol w:w="2126"/>
+        <w:gridCol w:w="2126"/>
+      </w:tblGrid>
+      <w:tr>
+        <w:tc>
+          <w:tcPr>
+            <w:tcW w:type="dxa" w:w="1474"/>
+            <w:tcBorders>
+              <w:top w:val="single" w:sz="14" w:space="0" w:color="000000"/>
+              <w:bottom w:val="single" w:sz="6" w:space="0" w:color="000000"/>
+            </w:tcBorders>
+          </w:tcPr>
+          <w:p>
+            <w:pPr>
+              <w:jc w:val="center"/>
+            </w:pPr>
+            <w:r/>
+            <w:r>
+              <w:rPr>
+                <w:b/>
+                <w:i w:val="0"/>
+                <w:sz w:val="19"/>
+                <w:rFonts w:eastAsia="黑体" w:ascii="Times New Roman" w:hAnsi="Times New Roman"/>
+              </w:rPr>
+              <w:t>企业(示例)</w:t>
+            </w:r>
+          </w:p>
+        </w:tc>
+        <w:tc>
+          <w:tcPr>
+            <w:tcW w:type="dxa" w:w="1474"/>
+            <w:tcBorders>
+              <w:top w:val="single" w:sz="14" w:space="0" w:color="000000"/>
+              <w:bottom w:val="single" w:sz="6" w:space="0" w:color="000000"/>
+            </w:tcBorders>
+          </w:tcPr>
+          <w:p>
+            <w:pPr>
+              <w:jc w:val="center"/>
+            </w:pPr>
+            <w:r/>
+            <w:r>
+              <w:rPr>
+                <w:b/>
+                <w:i w:val="0"/>
+                <w:sz w:val="19"/>
+                <w:rFonts w:eastAsia="黑体" w:ascii="Times New Roman" w:hAnsi="Times New Roman"/>
+              </w:rPr>
+              <w:t>上市代码</w:t>
+            </w:r>
+          </w:p>
+        </w:tc>
+        <w:tc>
+          <w:tcPr>
+            <w:tcW w:type="dxa" w:w="2835"/>
+            <w:tcBorders>
+              <w:top w:val="single" w:sz="14" w:space="0" w:color="000000"/>
+              <w:bottom w:val="single" w:sz="6" w:space="0" w:color="000000"/>
+            </w:tcBorders>
+          </w:tcPr>
+          <w:p>
+            <w:pPr>
+              <w:jc w:val="center"/>
+            </w:pPr>
+            <w:r/>
+            <w:r>
+              <w:rPr>
+                <w:b/>
+                <w:i w:val="0"/>
+                <w:sz w:val="19"/>
+                <w:rFonts w:eastAsia="黑体" w:ascii="Times New Roman" w:hAnsi="Times New Roman"/>
+              </w:rPr>
+              <w:t>SAPC/聚合物相关产品</w:t>
+            </w:r>
+          </w:p>
+        </w:tc>
+        <w:tc>
+          <w:tcPr>
+            <w:tcW w:type="dxa" w:w="2268"/>
+            <w:tcBorders>
+              <w:top w:val="single" w:sz="14" w:space="0" w:color="000000"/>
+              <w:bottom w:val="single" w:sz="6" w:space="0" w:color="000000"/>
+            </w:tcBorders>
+          </w:tcPr>
+          <w:p>
+            <w:pPr>
+              <w:jc w:val="center"/>
+            </w:pPr>
+            <w:r/>
+            <w:r>
+              <w:rPr>
+                <w:b/>
+                <w:i w:val="0"/>
+                <w:sz w:val="19"/>
+                <w:rFonts w:eastAsia="黑体" w:ascii="Times New Roman" w:hAnsi="Times New Roman"/>
+              </w:rPr>
+              <w:t>可靠性相关特征</w:t>
+            </w:r>
+          </w:p>
+        </w:tc>
+      </w:tr>
+      <w:tr>
+        <w:tc>
+          <w:tcPr>
+            <w:tcW w:type="dxa" w:w="1474"/>
+          </w:tcPr>
+          <w:p>
+            <w:pPr>
+              <w:spacing w:line="240" w:lineRule="auto"/>
+              <w:jc w:val="left"/>
+            </w:pPr>
+            <w:r/>
+            <w:r>
+              <w:rPr>
+                <w:b w:val="0"/>
+                <w:i w:val="0"/>
+                <w:sz w:val="19"/>
+                <w:rFonts w:eastAsia="宋体" w:ascii="Times New Roman" w:hAnsi="Times New Roman"/>
+              </w:rPr>
+              <w:t>艾华集团</w:t>
+            </w:r>
+          </w:p>
+        </w:tc>
+        <w:tc>
+          <w:tcPr>
+            <w:tcW w:type="dxa" w:w="1474"/>
+          </w:tcPr>
+          <w:p>
+            <w:pPr>
+              <w:spacing w:line="240" w:lineRule="auto"/>
+              <w:jc w:val="left"/>
+            </w:pPr>
+            <w:r/>
+            <w:r>
+              <w:rPr>
+                <w:b w:val="0"/>
+                <w:i w:val="0"/>
+                <w:sz w:val="19"/>
+                <w:rFonts w:eastAsia="宋体" w:ascii="Times New Roman" w:hAnsi="Times New Roman"/>
+              </w:rPr>
+              <w:t>上交所 603989</w:t>
+            </w:r>
+          </w:p>
+        </w:tc>
+        <w:tc>
+          <w:tcPr>
+            <w:tcW w:type="dxa" w:w="2835"/>
+          </w:tcPr>
+          <w:p>
+            <w:pPr>
+              <w:spacing w:line="240" w:lineRule="auto"/>
+              <w:jc w:val="left"/>
+            </w:pPr>
+            <w:r/>
+            <w:r>
+              <w:rPr>
+                <w:b w:val="0"/>
+                <w:i w:val="0"/>
+                <w:sz w:val="19"/>
+                <w:rFonts w:eastAsia="宋体" w:ascii="Times New Roman" w:hAnsi="Times New Roman"/>
+              </w:rPr>
+              <w:t>固态聚合物、SMT聚合物、多层聚合物铝电容</w:t>
+            </w:r>
+          </w:p>
+        </w:tc>
+        <w:tc>
+          <w:tcPr>
+            <w:tcW w:type="dxa" w:w="2268"/>
+          </w:tcPr>
+          <w:p>
+            <w:pPr>
+              <w:spacing w:line="240" w:lineRule="auto"/>
+              <w:jc w:val="left"/>
+            </w:pPr>
+            <w:r/>
+            <w:r>
+              <w:rPr>
+                <w:b w:val="0"/>
+                <w:i w:val="0"/>
+                <w:sz w:val="19"/>
+                <w:rFonts w:eastAsia="宋体" w:ascii="Times New Roman" w:hAnsi="Times New Roman"/>
+              </w:rPr>
+              <w:t>低ESR、频率稳定、良性失效、高可靠</w:t>
+            </w:r>
+          </w:p>
+        </w:tc>
+      </w:tr>
+      <w:tr>
+        <w:tc>
+          <w:tcPr>
+            <w:tcW w:type="dxa" w:w="1474"/>
+          </w:tcPr>
+          <w:p>
+            <w:pPr>
+              <w:spacing w:line="240" w:lineRule="auto"/>
+              <w:jc w:val="left"/>
+            </w:pPr>
+            <w:r/>
+            <w:r>
+              <w:rPr>
+                <w:b w:val="0"/>
+                <w:i w:val="0"/>
+                <w:sz w:val="19"/>
+                <w:rFonts w:eastAsia="宋体" w:ascii="Times New Roman" w:hAnsi="Times New Roman"/>
+              </w:rPr>
+              <w:t>南通江海</w:t>
+            </w:r>
+          </w:p>
+        </w:tc>
+        <w:tc>
+          <w:tcPr>
+            <w:tcW w:type="dxa" w:w="1474"/>
+          </w:tcPr>
+          <w:p>
+            <w:pPr>
+              <w:spacing w:line="240" w:lineRule="auto"/>
+              <w:jc w:val="left"/>
+            </w:pPr>
+            <w:r/>
+            <w:r>
+              <w:rPr>
+                <w:b w:val="0"/>
+                <w:i w:val="0"/>
+                <w:sz w:val="19"/>
+                <w:rFonts w:eastAsia="宋体" w:ascii="Times New Roman" w:hAnsi="Times New Roman"/>
+              </w:rPr>
+              <w:t>深交所 002484</w:t>
+            </w:r>
+          </w:p>
+        </w:tc>
+        <w:tc>
+          <w:tcPr>
+            <w:tcW w:type="dxa" w:w="2835"/>
+          </w:tcPr>
+          <w:p>
+            <w:pPr>
+              <w:spacing w:line="240" w:lineRule="auto"/>
+              <w:jc w:val="left"/>
+            </w:pPr>
+            <w:r/>
+            <w:r>
+              <w:rPr>
+                <w:b w:val="0"/>
+                <w:i w:val="0"/>
+                <w:sz w:val="19"/>
+                <w:rFonts w:eastAsia="宋体" w:ascii="Times New Roman" w:hAnsi="Times New Roman"/>
+              </w:rPr>
+              <w:t>聚合物及聚合物混合电容、DC-link薄膜、超容</w:t>
+            </w:r>
+          </w:p>
+        </w:tc>
+        <w:tc>
+          <w:tcPr>
+            <w:tcW w:type="dxa" w:w="2268"/>
+          </w:tcPr>
+          <w:p>
+            <w:pPr>
+              <w:spacing w:line="240" w:lineRule="auto"/>
+              <w:jc w:val="left"/>
+            </w:pPr>
+            <w:r/>
+            <w:r>
+              <w:rPr>
+                <w:b w:val="0"/>
+                <w:i w:val="0"/>
+                <w:sz w:val="19"/>
+                <w:rFonts w:eastAsia="宋体" w:ascii="Times New Roman" w:hAnsi="Times New Roman"/>
+              </w:rPr>
+              <w:t>全产业链、车规/储能场景广</w:t>
+            </w:r>
+          </w:p>
+        </w:tc>
+      </w:tr>
+      <w:tr>
+        <w:tc>
+          <w:tcPr>
+            <w:tcW w:type="dxa" w:w="1474"/>
+            <w:tcBorders>
+              <w:bottom w:val="single" w:sz="14" w:space="0" w:color="000000"/>
+            </w:tcBorders>
+          </w:tcPr>
+          <w:p>
+            <w:pPr>
+              <w:spacing w:line="240" w:lineRule="auto"/>
+              <w:jc w:val="left"/>
+            </w:pPr>
+            <w:r/>
+            <w:r>
+              <w:rPr>
+                <w:b w:val="0"/>
+                <w:i w:val="0"/>
+                <w:sz w:val="19"/>
+                <w:rFonts w:eastAsia="宋体" w:ascii="Times New Roman" w:hAnsi="Times New Roman"/>
+              </w:rPr>
+              <w:t>振华新云</w:t>
+            </w:r>
+          </w:p>
+        </w:tc>
+        <w:tc>
+          <w:tcPr>
+            <w:tcW w:type="dxa" w:w="1474"/>
+            <w:tcBorders>
+              <w:bottom w:val="single" w:sz="14" w:space="0" w:color="000000"/>
+            </w:tcBorders>
+          </w:tcPr>
+          <w:p>
+            <w:pPr>
+              <w:spacing w:line="240" w:lineRule="auto"/>
+              <w:jc w:val="left"/>
+            </w:pPr>
+            <w:r/>
+            <w:r>
+              <w:rPr>
+                <w:b w:val="0"/>
+                <w:i w:val="0"/>
+                <w:sz w:val="19"/>
+                <w:rFonts w:eastAsia="宋体" w:ascii="Times New Roman" w:hAnsi="Times New Roman"/>
+              </w:rPr>
+              <w:t>—</w:t>
+            </w:r>
+          </w:p>
+        </w:tc>
+        <w:tc>
+          <w:tcPr>
+            <w:tcW w:type="dxa" w:w="2835"/>
+            <w:tcBorders>
+              <w:bottom w:val="single" w:sz="14" w:space="0" w:color="000000"/>
+            </w:tcBorders>
+          </w:tcPr>
+          <w:p>
+            <w:pPr>
+              <w:spacing w:line="240" w:lineRule="auto"/>
+              <w:jc w:val="left"/>
+            </w:pPr>
+            <w:r/>
+            <w:r>
+              <w:rPr>
+                <w:b w:val="0"/>
+                <w:i w:val="0"/>
+                <w:sz w:val="19"/>
+                <w:rFonts w:eastAsia="宋体" w:ascii="Times New Roman" w:hAnsi="Times New Roman"/>
+              </w:rPr>
+              <w:t>高可靠电解电容（自主工艺专利）</w:t>
+            </w:r>
+          </w:p>
+        </w:tc>
+        <w:tc>
+          <w:tcPr>
+            <w:tcW w:type="dxa" w:w="2268"/>
+            <w:tcBorders>
+              <w:bottom w:val="single" w:sz="14" w:space="0" w:color="000000"/>
+            </w:tcBorders>
+          </w:tcPr>
+          <w:p>
+            <w:pPr>
+              <w:spacing w:line="240" w:lineRule="auto"/>
+              <w:jc w:val="left"/>
+            </w:pPr>
+            <w:r/>
+            <w:r>
+              <w:rPr>
+                <w:b w:val="0"/>
+                <w:i w:val="0"/>
+                <w:sz w:val="19"/>
+                <w:rFonts w:eastAsia="宋体" w:ascii="Times New Roman" w:hAnsi="Times New Roman"/>
+              </w:rPr>
+              <w:t>面向高可靠/军工等场景</w:t>
+            </w:r>
+          </w:p>
+        </w:tc>
+      </w:tr>
+    </w:tbl>
+    <w:p>
+      <w:pPr>
+        <w:keepNext/>
+        <w:spacing w:before="160" w:after="120"/>
+        <w:outlineLvl w:val="2"/>
+      </w:pPr>
+      <w:r>
+        <w:rPr>
+          <w:b/>
+          <w:i w:val="0"/>
+          <w:sz w:val="28"/>
+          <w:rFonts w:eastAsia="黑体" w:ascii="Times New Roman" w:hAnsi="Times New Roman"/>
+        </w:rPr>
+        <w:t>8.4 铝电解电容与DC-link在线监测的国内研究</w:t>
+      </w:r>
+    </w:p>
+    <w:p>
+      <w:pPr>
+        <w:spacing w:line="360" w:lineRule="auto" w:after="80"/>
+        <w:ind w:firstLine="465"/>
+        <w:jc w:val="both"/>
+      </w:pPr>
+      <w:r>
+        <w:rPr>
+          <w:b w:val="0"/>
+          <w:i w:val="0"/>
+          <w:sz w:val="24"/>
+          <w:rFonts w:eastAsia="宋体" w:ascii="Times New Roman" w:hAnsi="Times New Roman"/>
+        </w:rPr>
+        <w:t>铝电解电容（含其作为DC-link母线电容的应用）是国内研究最成熟、工程落地最强的方向。在状态监测上，重庆大学等团队提出了适用于AC/DC与DC/DC变换器的"灰箱（grey-box）"在线监测方法，巧妙利用直流母线电压暂态类似并联RLC零状态响应这一特征，无需额外硬件即可在线估计电容C与ESR，体现了"复用变换器自身信号"的工程智慧；此外，基于递归最小二乘（RLS）等算法、利用再生制动等工况实现电机驱动DC-link电容在线辨识的方法也被提出，进一步降低了监测的侵入性。在寿命预测上，面向电动汽车充电模块复杂多变工况，国内研究建立了基于任务剖面（mission profile）的铝电解电容寿命预测与可靠性分析方法，并指出热点温度计算精度与寿命模型是制约预测准确性的瓶颈（见Frontiers in Electronics 2023相关研究）。</w:t>
+      </w:r>
+    </w:p>
+    <w:p>
+      <w:pPr>
+        <w:spacing w:line="360" w:lineRule="auto" w:after="80"/>
+        <w:ind w:firstLine="465"/>
+        <w:jc w:val="both"/>
+      </w:pPr>
+      <w:r>
+        <w:rPr>
+          <w:b w:val="0"/>
+          <w:i w:val="0"/>
+          <w:sz w:val="24"/>
+          <w:rFonts w:eastAsia="宋体" w:ascii="Times New Roman" w:hAnsi="Times New Roman"/>
+        </w:rPr>
+        <w:t>这一方向的国内研究紧扣风电/光伏变流器、电动汽车电驱与充电、轨道交通牵引等国家重大需求，落地性强、与真实工况贴合度高，构成国内相对国际的独特优势。其不足在于：监测算法多为对国际既有方法（如Venet的ESR在线监测思想、纹波/注入法）的工程化改进与场景适配，原创性的辨识理论较少；且不同工况下的泛化能力与监测精度仍待提升。</w:t>
+      </w:r>
+    </w:p>
+    <w:p>
+      <w:pPr>
+        <w:keepNext/>
+        <w:spacing w:before="160" w:after="120"/>
+        <w:outlineLvl w:val="2"/>
+      </w:pPr>
+      <w:r>
+        <w:rPr>
+          <w:b/>
+          <w:i w:val="0"/>
+          <w:sz w:val="28"/>
+          <w:rFonts w:eastAsia="黑体" w:ascii="Times New Roman" w:hAnsi="Times New Roman"/>
+        </w:rPr>
+        <w:t>8.5 MLCC可靠性的国内研究</w:t>
+      </w:r>
+    </w:p>
+    <w:p>
+      <w:pPr>
+        <w:spacing w:line="360" w:lineRule="auto" w:after="80"/>
+        <w:ind w:firstLine="465"/>
+        <w:jc w:val="both"/>
+      </w:pPr>
+      <w:r>
+        <w:rPr>
+          <w:b w:val="0"/>
+          <w:i w:val="0"/>
+          <w:sz w:val="24"/>
+          <w:rFonts w:eastAsia="宋体" w:ascii="Times New Roman" w:hAnsi="Times New Roman"/>
+        </w:rPr>
+        <w:t>MLCC是国内材料—可靠性机理研究最活跃的器件之一，与全球MLCC高度依赖东亚供应链的格局相呼应。在介质与可靠性机理上，国内（含中国科学院深圳先进电子材料研究院等）围绕超薄层BaTiO3基贱金属电极（BME）MLCC，系统研究了介质减薄、氧空位迁移与绝缘电阻退化的关系，并在物理化学学报等刊物上阐明了超薄层BME MLCC的可靠性机理；针对介温稳定性与可靠性的平衡，开展了超薄Ba0.97Ca0.03TiO3基MLCC的可靠性研究（见Journal of Asian Ceramic Societies 2023相关工作）。在微结构—可靠性关系上，有研究系统揭示了晶粒尺寸对MLCC偏压稳定性与可靠性的显著影响——细晶粒因晶界密度更高而具有更高的晶界/界面激活能与更强的肖特基势垒，从而改善可靠性（见华南师范大学学报2024相关研究）。</w:t>
+      </w:r>
+    </w:p>
+    <w:p>
+      <w:pPr>
+        <w:spacing w:line="360" w:lineRule="auto" w:after="80"/>
+        <w:ind w:firstLine="465"/>
+        <w:jc w:val="both"/>
+      </w:pPr>
+      <w:r>
+        <w:rPr>
+          <w:b w:val="0"/>
+          <w:i w:val="0"/>
+          <w:sz w:val="24"/>
+          <w:rFonts w:eastAsia="宋体" w:ascii="Times New Roman" w:hAnsi="Times New Roman"/>
+        </w:rPr>
+        <w:t>在器件级失效与寿命上，国内围绕车规级MLCC的机械裂纹（flex crack）扩展、温度—电压加速寿命试验与Weibull寿命外推开展了大量工程研究，支撑了国产车规MLCC的可靠性验证与突破。总体看，国内MLCC可靠性研究在材料机理与工程验证两端都较为活跃，但在"统一的失效物理寿命模型"与"长期老化数据库"上仍与国际头部存在差距。</w:t>
+      </w:r>
+    </w:p>
+    <w:p>
+      <w:pPr>
+        <w:keepNext/>
+        <w:spacing w:before="160" w:after="120"/>
+        <w:outlineLvl w:val="2"/>
+      </w:pPr>
+      <w:r>
+        <w:rPr>
+          <w:b/>
+          <w:i w:val="0"/>
+          <w:sz w:val="28"/>
+          <w:rFonts w:eastAsia="黑体" w:ascii="Times New Roman" w:hAnsi="Times New Roman"/>
+        </w:rPr>
+        <w:t>8.6 金属化薄膜电容自愈与可靠性的国内研究</w:t>
+      </w:r>
+    </w:p>
+    <w:p>
+      <w:pPr>
+        <w:spacing w:line="360" w:lineRule="auto" w:after="80"/>
+        <w:ind w:firstLine="465"/>
+        <w:jc w:val="both"/>
+      </w:pPr>
+      <w:r>
+        <w:rPr>
+          <w:b w:val="0"/>
+          <w:i w:val="0"/>
+          <w:sz w:val="24"/>
+          <w:rFonts w:eastAsia="宋体" w:ascii="Times New Roman" w:hAnsi="Times New Roman"/>
+        </w:rPr>
+        <w:t>金属化薄膜电容的"自愈"特性是其高可靠的根源，也是其容量缓慢衰减的来源，国内在自愈机理与检测方法上的研究处于国际活跃行列。在机理与表征上，国内研究对金属化膜电容首次自愈进行了宏观—微观联合分析，并系统研究了影响自愈能量的因素（如方阻、电压上升率）；在检测方法上，提出了基于超声、特高频（UHF）信号时频特征以及声—电联合检测的自愈放电监测方法，并发展了原位自愈测试装置与分析方法（见Review of Scientific Instruments 2024相关工作）。在寿命与可靠性建模上，考虑累积自愈损伤的金属化聚丙烯膜电容容量评估方法被提出，将"自愈—去金属化—容量损失"的链条定量化；相关团队还就直流支撑电容方阻对自愈与耐压性能的影响、以及基于自愈特性的薄膜电容寿命估计开展了研究，并形成了金属化膜电容初始自愈类型分类的发明专利（CN ZL2023 1 0098802.X / US20240272240A1）。</w:t>
+      </w:r>
+    </w:p>
+    <w:p>
+      <w:pPr>
+        <w:spacing w:line="360" w:lineRule="auto" w:before="80" w:after="120"/>
+        <w:ind w:left="340"/>
+        <w:jc w:val="both"/>
+        <w:pBdr>
+          <w:left w:val="single" w:sz="18" w:space="6" w:color="4472C4"/>
+        </w:pBdr>
+      </w:pPr>
+      <w:r>
+        <w:rPr>
+          <w:b w:val="0"/>
+          <w:i w:val="0"/>
+          <w:sz w:val="23"/>
+          <w:rFonts w:eastAsia="楷体" w:ascii="Times New Roman" w:hAnsi="Times New Roman"/>
+        </w:rPr>
+        <w:br/>
+        <w:t>评述：在金属化膜电容自愈这一细分方向，国内的测试方法（超声/UHF/声电联合、原位测试）与累积损伤建模已具相当原创性与国际显示度，是国内电容可靠性研究中较为亮眼的一块；这也提示，聚焦细分机理、发展原创表征手段，是国内研究实现"由跟跑到并跑"的可行路径。</w:t>
+        <w:br/>
+      </w:r>
+    </w:p>
+    <w:p>
+      <w:pPr>
+        <w:keepNext/>
+        <w:spacing w:before="160" w:after="120"/>
+        <w:outlineLvl w:val="2"/>
+      </w:pPr>
+      <w:r>
+        <w:rPr>
+          <w:b/>
+          <w:i w:val="0"/>
+          <w:sz w:val="28"/>
+          <w:rFonts w:eastAsia="黑体" w:ascii="Times New Roman" w:hAnsi="Times New Roman"/>
+        </w:rPr>
+        <w:t>8.7 钽电容与超级电容的国内研究</w:t>
+      </w:r>
+    </w:p>
+    <w:p>
+      <w:pPr>
+        <w:spacing w:line="360" w:lineRule="auto" w:after="80"/>
+        <w:ind w:firstLine="465"/>
+        <w:jc w:val="both"/>
+      </w:pPr>
+      <w:r>
+        <w:rPr>
+          <w:b w:val="0"/>
+          <w:i w:val="0"/>
+          <w:sz w:val="24"/>
+          <w:rFonts w:eastAsia="宋体" w:ascii="Times New Roman" w:hAnsi="Times New Roman"/>
+        </w:rPr>
+        <w:t>在钽电容方向，国内研究关注其场致结晶、漏电与浪涌失效的机理与评价，并在RUL预测上提出了基于温度测量的钽电容在线剩余寿命预测方法（见Electronics 2025相关研究），体现了"以易测的温度信号反演退化状态"的实用思路；聚合物阴极钽电容因兼具低ESR与良性失效，亦是国内高可靠领域关注的对象。在超级电容方向，国内PHM研究较为活跃：提出了基于复合去噪与LSTM的超级电容性能退化规律与RUL预测方法（见Circuit World 2024相关研究），以及以LSTM为基架、嵌入物理约束的物理信息神经网络（PINN）预测超级电容退化轨迹与RUL的方法（见Green Energy and Intelligent Transportation 2025相关研究）；此外，面向储能电子元件，提出了基于分数阶Weibull过程与冲击泊松模型的RUL预测方法，丰富了退化随机过程的建模手段（见Fractal and Fractional 2024相关研究）。</w:t>
+      </w:r>
+    </w:p>
+    <w:p>
+      <w:pPr>
+        <w:spacing w:line="360" w:lineRule="auto" w:after="80"/>
+        <w:ind w:firstLine="465"/>
+        <w:jc w:val="both"/>
+      </w:pPr>
+      <w:r>
+        <w:rPr>
+          <w:b w:val="0"/>
+          <w:i w:val="0"/>
+          <w:sz w:val="24"/>
+          <w:rFonts w:eastAsia="宋体" w:ascii="Times New Roman" w:hAnsi="Times New Roman"/>
+        </w:rPr>
+        <w:t>这两类器件的国内研究表明：在数据驱动与物理—数据融合的RUL方法上，国内跟进速度快、方法多样，且开始向"物理约束+数据驱动"的融合范式靠拢；但相关方法多在公开或自测数据集上验证，面向SAPC等具体器件、含真实多应力工况的专用数据与验证仍显不足。</w:t>
+      </w:r>
+    </w:p>
+    <w:p>
+      <w:pPr>
+        <w:keepNext/>
+        <w:spacing w:before="160" w:after="120"/>
+        <w:outlineLvl w:val="2"/>
+      </w:pPr>
+      <w:r>
+        <w:rPr>
+          <w:b/>
+          <w:i w:val="0"/>
+          <w:sz w:val="28"/>
+          <w:rFonts w:eastAsia="黑体" w:ascii="Times New Roman" w:hAnsi="Times New Roman"/>
+        </w:rPr>
+        <w:t>8.8 可靠性建模与数据驱动/物理信息方法的国内进展</w:t>
+      </w:r>
+    </w:p>
+    <w:p>
+      <w:pPr>
+        <w:spacing w:line="360" w:lineRule="auto" w:after="80"/>
+        <w:ind w:firstLine="465"/>
+        <w:jc w:val="both"/>
+      </w:pPr>
+      <w:r>
+        <w:rPr>
+          <w:b w:val="0"/>
+          <w:i w:val="0"/>
+          <w:sz w:val="24"/>
+          <w:rFonts w:eastAsia="宋体" w:ascii="Times New Roman" w:hAnsi="Times New Roman"/>
+        </w:rPr>
+        <w:t>在可靠性建模方法上，国内研究呈现"统计—数据驱动—物理融合"并进的态势。统计与退化随机过程方面，分数阶Weibull过程结合冲击泊松模型等被用于储能电子元件的RUL预测，拓展了对非平稳、含突发冲击退化的刻画能力。数据驱动方面，考虑参数分散影响的CNN-LSTM网络被用于电容老化状态评估与RUL预测，直面"批次/个体分散导致预测失准"这一工程难题；多种LSTM及其改进（如GA-LSTM、改进LSTM）被广泛用于超级电容等器件的寿命预测。物理信息方面，以LSTM为基架嵌入退化物理约束的PINN方法被用于超级电容退化轨迹与RUL预测，代表了国内在"强物理嵌入"前沿范式上的积极探索。</w:t>
+      </w:r>
+    </w:p>
+    <w:p>
+      <w:pPr>
+        <w:keepNext/>
+        <w:spacing w:before="120" w:after="40"/>
+        <w:jc w:val="center"/>
+      </w:pPr>
+      <w:r>
+        <w:rPr>
+          <w:b/>
+          <w:i w:val="0"/>
+          <w:sz w:val="21"/>
+          <w:rFonts w:eastAsia="黑体" w:ascii="Times New Roman" w:hAnsi="Times New Roman"/>
+        </w:rPr>
+        <w:t>表 19  国内电容器可靠性建模与RUL方法概览</w:t>
+      </w:r>
+    </w:p>
+    <w:tbl>
+      <w:tblPr>
+        <w:tblW w:type="auto" w:w="0"/>
+        <w:jc w:val="center"/>
+        <w:tblLayout w:type="autofit"/>
+        <w:tblLook w:firstColumn="1" w:firstRow="1" w:lastColumn="0" w:lastRow="0" w:noHBand="0" w:noVBand="1" w:val="04A0"/>
+      </w:tblPr>
+      <w:tblGrid>
+        <w:gridCol w:w="2126"/>
+        <w:gridCol w:w="2126"/>
+        <w:gridCol w:w="2126"/>
+        <w:gridCol w:w="2126"/>
+      </w:tblGrid>
+      <w:tr>
+        <w:tc>
+          <w:tcPr>
+            <w:tcW w:type="dxa" w:w="1587"/>
+            <w:tcBorders>
+              <w:top w:val="single" w:sz="14" w:space="0" w:color="000000"/>
+              <w:bottom w:val="single" w:sz="6" w:space="0" w:color="000000"/>
+            </w:tcBorders>
+          </w:tcPr>
+          <w:p>
+            <w:pPr>
+              <w:jc w:val="center"/>
+            </w:pPr>
+            <w:r/>
+            <w:r>
+              <w:rPr>
+                <w:b/>
+                <w:i w:val="0"/>
+                <w:sz w:val="19"/>
+                <w:rFonts w:eastAsia="黑体" w:ascii="Times New Roman" w:hAnsi="Times New Roman"/>
+              </w:rPr>
+              <w:t>方法类别</w:t>
+            </w:r>
+          </w:p>
+        </w:tc>
+        <w:tc>
+          <w:tcPr>
+            <w:tcW w:type="dxa" w:w="2041"/>
+            <w:tcBorders>
+              <w:top w:val="single" w:sz="14" w:space="0" w:color="000000"/>
+              <w:bottom w:val="single" w:sz="6" w:space="0" w:color="000000"/>
+            </w:tcBorders>
+          </w:tcPr>
+          <w:p>
+            <w:pPr>
+              <w:jc w:val="center"/>
+            </w:pPr>
+            <w:r/>
+            <w:r>
+              <w:rPr>
+                <w:b/>
+                <w:i w:val="0"/>
+                <w:sz w:val="19"/>
+                <w:rFonts w:eastAsia="黑体" w:ascii="Times New Roman" w:hAnsi="Times New Roman"/>
+              </w:rPr>
+              <w:t>国内代表性技术</w:t>
+            </w:r>
+          </w:p>
+        </w:tc>
+        <w:tc>
+          <w:tcPr>
+            <w:tcW w:type="dxa" w:w="1587"/>
+            <w:tcBorders>
+              <w:top w:val="single" w:sz="14" w:space="0" w:color="000000"/>
+              <w:bottom w:val="single" w:sz="6" w:space="0" w:color="000000"/>
+            </w:tcBorders>
+          </w:tcPr>
+          <w:p>
+            <w:pPr>
+              <w:jc w:val="center"/>
+            </w:pPr>
+            <w:r/>
+            <w:r>
+              <w:rPr>
+                <w:b/>
+                <w:i w:val="0"/>
+                <w:sz w:val="19"/>
+                <w:rFonts w:eastAsia="黑体" w:ascii="Times New Roman" w:hAnsi="Times New Roman"/>
+              </w:rPr>
+              <w:t>应用器件</w:t>
+            </w:r>
+          </w:p>
+        </w:tc>
+        <w:tc>
+          <w:tcPr>
+            <w:tcW w:type="dxa" w:w="2494"/>
+            <w:tcBorders>
+              <w:top w:val="single" w:sz="14" w:space="0" w:color="000000"/>
+              <w:bottom w:val="single" w:sz="6" w:space="0" w:color="000000"/>
+            </w:tcBorders>
+          </w:tcPr>
+          <w:p>
+            <w:pPr>
+              <w:jc w:val="center"/>
+            </w:pPr>
+            <w:r/>
+            <w:r>
+              <w:rPr>
+                <w:b/>
+                <w:i w:val="0"/>
+                <w:sz w:val="19"/>
+                <w:rFonts w:eastAsia="黑体" w:ascii="Times New Roman" w:hAnsi="Times New Roman"/>
+              </w:rPr>
+              <w:t>特点/局限</w:t>
+            </w:r>
+          </w:p>
+        </w:tc>
+      </w:tr>
+      <w:tr>
+        <w:tc>
+          <w:tcPr>
+            <w:tcW w:type="dxa" w:w="1587"/>
+          </w:tcPr>
+          <w:p>
+            <w:pPr>
+              <w:spacing w:line="240" w:lineRule="auto"/>
+              <w:jc w:val="left"/>
+            </w:pPr>
+            <w:r/>
+            <w:r>
+              <w:rPr>
+                <w:b w:val="0"/>
+                <w:i w:val="0"/>
+                <w:sz w:val="19"/>
+                <w:rFonts w:eastAsia="宋体" w:ascii="Times New Roman" w:hAnsi="Times New Roman"/>
+              </w:rPr>
+              <w:t>统计/随机过程</w:t>
+            </w:r>
+          </w:p>
+        </w:tc>
+        <w:tc>
+          <w:tcPr>
+            <w:tcW w:type="dxa" w:w="2041"/>
+          </w:tcPr>
+          <w:p>
+            <w:pPr>
+              <w:spacing w:line="240" w:lineRule="auto"/>
+              <w:jc w:val="left"/>
+            </w:pPr>
+            <w:r/>
+            <w:r>
+              <w:rPr>
+                <w:b w:val="0"/>
+                <w:i w:val="0"/>
+                <w:sz w:val="19"/>
+                <w:rFonts w:eastAsia="宋体" w:ascii="Times New Roman" w:hAnsi="Times New Roman"/>
+              </w:rPr>
+              <w:t>分数阶Weibull+冲击泊松</w:t>
+            </w:r>
+          </w:p>
+        </w:tc>
+        <w:tc>
+          <w:tcPr>
+            <w:tcW w:type="dxa" w:w="1587"/>
+          </w:tcPr>
+          <w:p>
+            <w:pPr>
+              <w:spacing w:line="240" w:lineRule="auto"/>
+              <w:jc w:val="left"/>
+            </w:pPr>
+            <w:r/>
+            <w:r>
+              <w:rPr>
+                <w:b w:val="0"/>
+                <w:i w:val="0"/>
+                <w:sz w:val="19"/>
+                <w:rFonts w:eastAsia="宋体" w:ascii="Times New Roman" w:hAnsi="Times New Roman"/>
+              </w:rPr>
+              <w:t>储能电子元件</w:t>
+            </w:r>
+          </w:p>
+        </w:tc>
+        <w:tc>
+          <w:tcPr>
+            <w:tcW w:type="dxa" w:w="2494"/>
+          </w:tcPr>
+          <w:p>
+            <w:pPr>
+              <w:spacing w:line="240" w:lineRule="auto"/>
+              <w:jc w:val="left"/>
+            </w:pPr>
+            <w:r/>
+            <w:r>
+              <w:rPr>
+                <w:b w:val="0"/>
+                <w:i w:val="0"/>
+                <w:sz w:val="19"/>
+                <w:rFonts w:eastAsia="宋体" w:ascii="Times New Roman" w:hAnsi="Times New Roman"/>
+              </w:rPr>
+              <w:t>刻画非平稳与冲击；参数标定难</w:t>
+            </w:r>
+          </w:p>
+        </w:tc>
+      </w:tr>
+      <w:tr>
+        <w:tc>
+          <w:tcPr>
+            <w:tcW w:type="dxa" w:w="1587"/>
+          </w:tcPr>
+          <w:p>
+            <w:pPr>
+              <w:spacing w:line="240" w:lineRule="auto"/>
+              <w:jc w:val="left"/>
+            </w:pPr>
+            <w:r/>
+            <w:r>
+              <w:rPr>
+                <w:b w:val="0"/>
+                <w:i w:val="0"/>
+                <w:sz w:val="19"/>
+                <w:rFonts w:eastAsia="宋体" w:ascii="Times New Roman" w:hAnsi="Times New Roman"/>
+              </w:rPr>
+              <w:t>数据驱动(DL)</w:t>
+            </w:r>
+          </w:p>
+        </w:tc>
+        <w:tc>
+          <w:tcPr>
+            <w:tcW w:type="dxa" w:w="2041"/>
+          </w:tcPr>
+          <w:p>
+            <w:pPr>
+              <w:spacing w:line="240" w:lineRule="auto"/>
+              <w:jc w:val="left"/>
+            </w:pPr>
+            <w:r/>
+            <w:r>
+              <w:rPr>
+                <w:b w:val="0"/>
+                <w:i w:val="0"/>
+                <w:sz w:val="19"/>
+                <w:rFonts w:eastAsia="宋体" w:ascii="Times New Roman" w:hAnsi="Times New Roman"/>
+              </w:rPr>
+              <w:t>CNN-LSTM(考虑参数分散)</w:t>
+            </w:r>
+          </w:p>
+        </w:tc>
+        <w:tc>
+          <w:tcPr>
+            <w:tcW w:type="dxa" w:w="1587"/>
+          </w:tcPr>
+          <w:p>
+            <w:pPr>
+              <w:spacing w:line="240" w:lineRule="auto"/>
+              <w:jc w:val="left"/>
+            </w:pPr>
+            <w:r/>
+            <w:r>
+              <w:rPr>
+                <w:b w:val="0"/>
+                <w:i w:val="0"/>
+                <w:sz w:val="19"/>
+                <w:rFonts w:eastAsia="宋体" w:ascii="Times New Roman" w:hAnsi="Times New Roman"/>
+              </w:rPr>
+              <w:t>电容/钽电容</w:t>
+            </w:r>
+          </w:p>
+        </w:tc>
+        <w:tc>
+          <w:tcPr>
+            <w:tcW w:type="dxa" w:w="2494"/>
+          </w:tcPr>
+          <w:p>
+            <w:pPr>
+              <w:spacing w:line="240" w:lineRule="auto"/>
+              <w:jc w:val="left"/>
+            </w:pPr>
+            <w:r/>
+            <w:r>
+              <w:rPr>
+                <w:b w:val="0"/>
+                <w:i w:val="0"/>
+                <w:sz w:val="19"/>
+                <w:rFonts w:eastAsia="宋体" w:ascii="Times New Roman" w:hAnsi="Times New Roman"/>
+              </w:rPr>
+              <w:t>应对分散；依赖数据、外推弱</w:t>
+            </w:r>
+          </w:p>
+        </w:tc>
+      </w:tr>
+      <w:tr>
+        <w:tc>
+          <w:tcPr>
+            <w:tcW w:type="dxa" w:w="1587"/>
+          </w:tcPr>
+          <w:p>
+            <w:pPr>
+              <w:spacing w:line="240" w:lineRule="auto"/>
+              <w:jc w:val="left"/>
+            </w:pPr>
+            <w:r/>
+            <w:r>
+              <w:rPr>
+                <w:b w:val="0"/>
+                <w:i w:val="0"/>
+                <w:sz w:val="19"/>
+                <w:rFonts w:eastAsia="宋体" w:ascii="Times New Roman" w:hAnsi="Times New Roman"/>
+              </w:rPr>
+              <w:t>数据驱动(DL)</w:t>
+            </w:r>
+          </w:p>
+        </w:tc>
+        <w:tc>
+          <w:tcPr>
+            <w:tcW w:type="dxa" w:w="2041"/>
+          </w:tcPr>
+          <w:p>
+            <w:pPr>
+              <w:spacing w:line="240" w:lineRule="auto"/>
+              <w:jc w:val="left"/>
+            </w:pPr>
+            <w:r/>
+            <w:r>
+              <w:rPr>
+                <w:b w:val="0"/>
+                <w:i w:val="0"/>
+                <w:sz w:val="19"/>
+                <w:rFonts w:eastAsia="宋体" w:ascii="Times New Roman" w:hAnsi="Times New Roman"/>
+              </w:rPr>
+              <w:t>LSTM/GA-LSTM/改进LSTM</w:t>
+            </w:r>
+          </w:p>
+        </w:tc>
+        <w:tc>
+          <w:tcPr>
+            <w:tcW w:type="dxa" w:w="1587"/>
+          </w:tcPr>
+          <w:p>
+            <w:pPr>
+              <w:spacing w:line="240" w:lineRule="auto"/>
+              <w:jc w:val="left"/>
+            </w:pPr>
+            <w:r/>
+            <w:r>
+              <w:rPr>
+                <w:b w:val="0"/>
+                <w:i w:val="0"/>
+                <w:sz w:val="19"/>
+                <w:rFonts w:eastAsia="宋体" w:ascii="Times New Roman" w:hAnsi="Times New Roman"/>
+              </w:rPr>
+              <w:t>超级电容</w:t>
+            </w:r>
+          </w:p>
+        </w:tc>
+        <w:tc>
+          <w:tcPr>
+            <w:tcW w:type="dxa" w:w="2494"/>
+          </w:tcPr>
+          <w:p>
+            <w:pPr>
+              <w:spacing w:line="240" w:lineRule="auto"/>
+              <w:jc w:val="left"/>
+            </w:pPr>
+            <w:r/>
+            <w:r>
+              <w:rPr>
+                <w:b w:val="0"/>
+                <w:i w:val="0"/>
+                <w:sz w:val="19"/>
+                <w:rFonts w:eastAsia="宋体" w:ascii="Times New Roman" w:hAnsi="Times New Roman"/>
+              </w:rPr>
+              <w:t>精度较高；可解释性弱</w:t>
+            </w:r>
+          </w:p>
+        </w:tc>
+      </w:tr>
+      <w:tr>
+        <w:tc>
+          <w:tcPr>
+            <w:tcW w:type="dxa" w:w="1587"/>
+          </w:tcPr>
+          <w:p>
+            <w:pPr>
+              <w:spacing w:line="240" w:lineRule="auto"/>
+              <w:jc w:val="left"/>
+            </w:pPr>
+            <w:r/>
+            <w:r>
+              <w:rPr>
+                <w:b w:val="0"/>
+                <w:i w:val="0"/>
+                <w:sz w:val="19"/>
+                <w:rFonts w:eastAsia="宋体" w:ascii="Times New Roman" w:hAnsi="Times New Roman"/>
+              </w:rPr>
+              <w:t>物理—数据融合</w:t>
+            </w:r>
+          </w:p>
+        </w:tc>
+        <w:tc>
+          <w:tcPr>
+            <w:tcW w:type="dxa" w:w="2041"/>
+          </w:tcPr>
+          <w:p>
+            <w:pPr>
+              <w:spacing w:line="240" w:lineRule="auto"/>
+              <w:jc w:val="left"/>
+            </w:pPr>
+            <w:r/>
+            <w:r>
+              <w:rPr>
+                <w:b w:val="0"/>
+                <w:i w:val="0"/>
+                <w:sz w:val="19"/>
+                <w:rFonts w:eastAsia="宋体" w:ascii="Times New Roman" w:hAnsi="Times New Roman"/>
+              </w:rPr>
+              <w:t>LSTM基架PINN</w:t>
+            </w:r>
+          </w:p>
+        </w:tc>
+        <w:tc>
+          <w:tcPr>
+            <w:tcW w:type="dxa" w:w="1587"/>
+          </w:tcPr>
+          <w:p>
+            <w:pPr>
+              <w:spacing w:line="240" w:lineRule="auto"/>
+              <w:jc w:val="left"/>
+            </w:pPr>
+            <w:r/>
+            <w:r>
+              <w:rPr>
+                <w:b w:val="0"/>
+                <w:i w:val="0"/>
+                <w:sz w:val="19"/>
+                <w:rFonts w:eastAsia="宋体" w:ascii="Times New Roman" w:hAnsi="Times New Roman"/>
+              </w:rPr>
+              <w:t>超级电容</w:t>
+            </w:r>
+          </w:p>
+        </w:tc>
+        <w:tc>
+          <w:tcPr>
+            <w:tcW w:type="dxa" w:w="2494"/>
+          </w:tcPr>
+          <w:p>
+            <w:pPr>
+              <w:spacing w:line="240" w:lineRule="auto"/>
+              <w:jc w:val="left"/>
+            </w:pPr>
+            <w:r/>
+            <w:r>
+              <w:rPr>
+                <w:b w:val="0"/>
+                <w:i w:val="0"/>
+                <w:sz w:val="19"/>
+                <w:rFonts w:eastAsia="宋体" w:ascii="Times New Roman" w:hAnsi="Times New Roman"/>
+              </w:rPr>
+              <w:t>物理约束+小样本；前沿探索</w:t>
+            </w:r>
+          </w:p>
+        </w:tc>
+      </w:tr>
+      <w:tr>
+        <w:tc>
+          <w:tcPr>
+            <w:tcW w:type="dxa" w:w="1587"/>
+            <w:tcBorders>
+              <w:bottom w:val="single" w:sz="14" w:space="0" w:color="000000"/>
+            </w:tcBorders>
+          </w:tcPr>
+          <w:p>
+            <w:pPr>
+              <w:spacing w:line="240" w:lineRule="auto"/>
+              <w:jc w:val="left"/>
+            </w:pPr>
+            <w:r/>
+            <w:r>
+              <w:rPr>
+                <w:b w:val="0"/>
+                <w:i w:val="0"/>
+                <w:sz w:val="19"/>
+                <w:rFonts w:eastAsia="宋体" w:ascii="Times New Roman" w:hAnsi="Times New Roman"/>
+              </w:rPr>
+              <w:t>在线辨识</w:t>
+            </w:r>
+          </w:p>
+        </w:tc>
+        <w:tc>
+          <w:tcPr>
+            <w:tcW w:type="dxa" w:w="2041"/>
+            <w:tcBorders>
+              <w:bottom w:val="single" w:sz="14" w:space="0" w:color="000000"/>
+            </w:tcBorders>
+          </w:tcPr>
+          <w:p>
+            <w:pPr>
+              <w:spacing w:line="240" w:lineRule="auto"/>
+              <w:jc w:val="left"/>
+            </w:pPr>
+            <w:r/>
+            <w:r>
+              <w:rPr>
+                <w:b w:val="0"/>
+                <w:i w:val="0"/>
+                <w:sz w:val="19"/>
+                <w:rFonts w:eastAsia="宋体" w:ascii="Times New Roman" w:hAnsi="Times New Roman"/>
+              </w:rPr>
+              <w:t>灰箱、RLS、注入/纹波法</w:t>
+            </w:r>
+          </w:p>
+        </w:tc>
+        <w:tc>
+          <w:tcPr>
+            <w:tcW w:type="dxa" w:w="1587"/>
+            <w:tcBorders>
+              <w:bottom w:val="single" w:sz="14" w:space="0" w:color="000000"/>
+            </w:tcBorders>
+          </w:tcPr>
+          <w:p>
+            <w:pPr>
+              <w:spacing w:line="240" w:lineRule="auto"/>
+              <w:jc w:val="left"/>
+            </w:pPr>
+            <w:r/>
+            <w:r>
+              <w:rPr>
+                <w:b w:val="0"/>
+                <w:i w:val="0"/>
+                <w:sz w:val="19"/>
+                <w:rFonts w:eastAsia="宋体" w:ascii="Times New Roman" w:hAnsi="Times New Roman"/>
+              </w:rPr>
+              <w:t>DC-link铝电解</w:t>
+            </w:r>
+          </w:p>
+        </w:tc>
+        <w:tc>
+          <w:tcPr>
+            <w:tcW w:type="dxa" w:w="2494"/>
+            <w:tcBorders>
+              <w:bottom w:val="single" w:sz="14" w:space="0" w:color="000000"/>
+            </w:tcBorders>
+          </w:tcPr>
+          <w:p>
+            <w:pPr>
+              <w:spacing w:line="240" w:lineRule="auto"/>
+              <w:jc w:val="left"/>
+            </w:pPr>
+            <w:r/>
+            <w:r>
+              <w:rPr>
+                <w:b w:val="0"/>
+                <w:i w:val="0"/>
+                <w:sz w:val="19"/>
+                <w:rFonts w:eastAsia="宋体" w:ascii="Times New Roman" w:hAnsi="Times New Roman"/>
+              </w:rPr>
+              <w:t>工程落地强；原创理论少</w:t>
+            </w:r>
+          </w:p>
+        </w:tc>
+      </w:tr>
+    </w:tbl>
+    <w:p>
+      <w:pPr>
+        <w:spacing w:line="360" w:lineRule="auto" w:after="80"/>
+        <w:ind w:firstLine="465"/>
+        <w:jc w:val="both"/>
+      </w:pPr>
+      <w:r>
+        <w:rPr>
+          <w:b w:val="0"/>
+          <w:i w:val="0"/>
+          <w:sz w:val="24"/>
+          <w:rFonts w:eastAsia="宋体" w:ascii="Times New Roman" w:hAnsi="Times New Roman"/>
+        </w:rPr>
+        <w:t>横向看，国内建模研究在"数据驱动"上规模与速度均已接近国际，在"物理—数据融合（PINN）"上也已起步并紧跟前沿；但与国际相比，原创性的失效物理模型（如带齐全激活能谱的第一性机理模型）较少，强物理嵌入范式整体仍处跟随，且面向SAPC等具体器件的专用数据集与基准缺位，制约了方法的公平比较与可复现验证。</w:t>
+      </w:r>
+    </w:p>
+    <w:p>
+      <w:pPr>
+        <w:keepNext/>
+        <w:spacing w:before="160" w:after="120"/>
+        <w:outlineLvl w:val="2"/>
+      </w:pPr>
+      <w:r>
+        <w:rPr>
+          <w:b/>
+          <w:i w:val="0"/>
+          <w:sz w:val="28"/>
+          <w:rFonts w:eastAsia="黑体" w:ascii="Times New Roman" w:hAnsi="Times New Roman"/>
+        </w:rPr>
+        <w:t>8.9 标准、自主化与“数据主权”</w:t>
+      </w:r>
+    </w:p>
+    <w:p>
+      <w:pPr>
+        <w:spacing w:line="360" w:lineRule="auto" w:after="80"/>
+        <w:ind w:firstLine="465"/>
+        <w:jc w:val="both"/>
+      </w:pPr>
+      <w:r>
+        <w:rPr>
+          <w:b w:val="0"/>
+          <w:i w:val="0"/>
+          <w:sz w:val="24"/>
+          <w:rFonts w:eastAsia="宋体" w:ascii="Times New Roman" w:hAnsi="Times New Roman"/>
+        </w:rPr>
+        <w:t>标准与自主化是国内研究绕不开的战略维度。在标准层面，国内长期以采标、等同转化国际标准为主：固定电容器通用要求多对应GB/T 2693（等同采用IEC 60384-1），高可靠与军用领域则有GJB 360（电子及电气元件试验方法）等系列国军标与详细规范；近年来国内在新能源、电动汽车等优势场景开始参与甚至牵头部分国际/团体标准，话语权稳步提升，但在高可靠、车规、宇航等高端领域仍处跟随地位。在自主化层面，国产MLCC在中低端已规模化、车规高端在突破中；铝电解与薄膜（含SAPC、DC-link）在新能源/轨交场景竞争力较强；固体钽高可靠产品的钽粉、阴极材料与工艺仍部分受制于人。</w:t>
+      </w:r>
+    </w:p>
+    <w:p>
+      <w:pPr>
+        <w:spacing w:line="360" w:lineRule="auto" w:after="80"/>
+        <w:ind w:firstLine="465"/>
+        <w:jc w:val="both"/>
+      </w:pPr>
+      <w:r>
+        <w:rPr>
+          <w:b w:val="0"/>
+          <w:i w:val="0"/>
+          <w:sz w:val="24"/>
+          <w:rFonts w:eastAsia="宋体" w:ascii="Times New Roman" w:hAnsi="Times New Roman"/>
+        </w:rPr>
+        <w:t>更深层的问题是"可靠性数据主权"：谁掌握器件全流程工艺与长期失效数据，谁就掌握失效率基准与可靠性判据的定义权。国外头部厂商凭数十年工艺—失效数据库主导全球判据；国内虽拥有新能源等海量真实工况数据，却缺乏面向国产高端器件（含SAPC）、口径统一、样本充分的失效率基准库，且产学研之间存在数据壁垒。打破壁垒、建立产学研共享的国产器件失效数据库，是国内由"可靠性大国"迈向"可靠性强国"的关键，也与第十章研究空白G-1在战略层面呼应。</w:t>
+      </w:r>
+    </w:p>
+    <w:p>
+      <w:pPr>
+        <w:keepNext/>
+        <w:spacing w:before="160" w:after="120"/>
+        <w:outlineLvl w:val="2"/>
+      </w:pPr>
+      <w:r>
+        <w:rPr>
+          <w:b/>
+          <w:i w:val="0"/>
+          <w:sz w:val="28"/>
+          <w:rFonts w:eastAsia="黑体" w:ascii="Times New Roman" w:hAnsi="Times New Roman"/>
+        </w:rPr>
+        <w:t>8.10 国内研究的特点、贡献与不足（综合评述）</w:t>
+      </w:r>
+    </w:p>
+    <w:p>
+      <w:pPr>
+        <w:spacing w:line="360" w:lineRule="auto" w:after="80"/>
+        <w:ind w:firstLine="465"/>
+        <w:jc w:val="both"/>
+      </w:pPr>
+      <w:r>
+        <w:rPr>
+          <w:b w:val="0"/>
+          <w:i w:val="0"/>
+          <w:sz w:val="24"/>
+          <w:rFonts w:eastAsia="宋体" w:ascii="Times New Roman" w:hAnsi="Times New Roman"/>
+        </w:rPr>
+        <w:t>综合8.1–8.9，可对国内研究作如下评述。三大特点：其一"场景驱动"，研究紧扣新能源、电动交通等国家重大需求，工程落地性强；其二"工程见长"，在DC-link在线监测、薄膜自愈检测、车规MLCC验证等方向形成系统集成与现场落地优势；其三"快速跟进"，在数据驱动与物理—数据融合（PINN）等前沿方法上跟进迅速、规模可观。三方面贡献：提供了国际不易获得的海量真实工况数据；在金属化膜自愈检测、MLCC晶粒—可靠性机理、PEDOT去质子化等细分方向作出原创或近原创贡献；推动了国产高端电容（含SAPC）的自主化进程。</w:t>
+      </w:r>
+    </w:p>
+    <w:p>
+      <w:pPr>
+        <w:spacing w:line="360" w:lineRule="auto" w:after="80"/>
+        <w:ind w:firstLine="465"/>
+        <w:jc w:val="both"/>
+      </w:pPr>
+      <w:r>
+        <w:rPr>
+          <w:b w:val="0"/>
+          <w:i w:val="0"/>
+          <w:sz w:val="24"/>
+          <w:rFonts w:eastAsia="宋体" w:ascii="Times New Roman" w:hAnsi="Times New Roman"/>
+        </w:rPr>
+        <w:t>四点不足同样清晰：一是SAPC等具体器件"材料热、器件冷"，缺乏统一规程下的长周期、多应力器件级失效与寿命数据；二是原创失效物理模型与判据较少，强物理嵌入范式整体跟随；三是缺乏面向国产高端器件、口径统一的失效率基准库与公开退化基准数据集，制约方法的可比较与可复现；四是产学研数据壁垒与标准话语权不足。补齐这四块短板——尤其是为SAPC建立专用多应力数据集、发展机理贯通的失效物理与竞争失效模型、并推动数据共享与标准自主化——正是国内研究（也是本文）实现质的跃升的着力点。</w:t>
+      </w:r>
+    </w:p>
+    <w:p>
+      <w:pPr>
+        <w:keepNext/>
+        <w:spacing w:before="120" w:after="40"/>
+        <w:jc w:val="center"/>
+      </w:pPr>
+      <w:r>
+        <w:rPr>
+          <w:b/>
+          <w:i w:val="0"/>
+          <w:sz w:val="21"/>
+          <w:rFonts w:eastAsia="黑体" w:ascii="Times New Roman" w:hAnsi="Times New Roman"/>
+        </w:rPr>
+        <w:t>表 20  国内SAPC/电容器可靠性研究：现状—差距—突破方向</w:t>
+      </w:r>
+    </w:p>
+    <w:tbl>
+      <w:tblPr>
+        <w:tblW w:type="auto" w:w="0"/>
+        <w:jc w:val="center"/>
+        <w:tblLayout w:type="autofit"/>
+        <w:tblLook w:firstColumn="1" w:firstRow="1" w:lastColumn="0" w:lastRow="0" w:noHBand="0" w:noVBand="1" w:val="04A0"/>
+      </w:tblPr>
+      <w:tblGrid>
+        <w:gridCol w:w="2126"/>
+        <w:gridCol w:w="2126"/>
+        <w:gridCol w:w="2126"/>
+        <w:gridCol w:w="2126"/>
+      </w:tblGrid>
+      <w:tr>
+        <w:tc>
+          <w:tcPr>
+            <w:tcW w:type="dxa" w:w="1474"/>
+            <w:tcBorders>
+              <w:top w:val="single" w:sz="14" w:space="0" w:color="000000"/>
+              <w:bottom w:val="single" w:sz="6" w:space="0" w:color="000000"/>
+            </w:tcBorders>
+          </w:tcPr>
+          <w:p>
+            <w:pPr>
+              <w:jc w:val="center"/>
+            </w:pPr>
+            <w:r/>
+            <w:r>
+              <w:rPr>
+                <w:b/>
+                <w:i w:val="0"/>
+                <w:sz w:val="19"/>
+                <w:rFonts w:eastAsia="黑体" w:ascii="Times New Roman" w:hAnsi="Times New Roman"/>
+              </w:rPr>
+              <w:t>维度</w:t>
+            </w:r>
+          </w:p>
+        </w:tc>
+        <w:tc>
+          <w:tcPr>
+            <w:tcW w:type="dxa" w:w="2268"/>
+            <w:tcBorders>
+              <w:top w:val="single" w:sz="14" w:space="0" w:color="000000"/>
+              <w:bottom w:val="single" w:sz="6" w:space="0" w:color="000000"/>
+            </w:tcBorders>
+          </w:tcPr>
+          <w:p>
+            <w:pPr>
+              <w:jc w:val="center"/>
+            </w:pPr>
+            <w:r/>
+            <w:r>
+              <w:rPr>
+                <w:b/>
+                <w:i w:val="0"/>
+                <w:sz w:val="19"/>
+                <w:rFonts w:eastAsia="黑体" w:ascii="Times New Roman" w:hAnsi="Times New Roman"/>
+              </w:rPr>
+              <w:t>国内现状</w:t>
+            </w:r>
+          </w:p>
+        </w:tc>
+        <w:tc>
+          <w:tcPr>
+            <w:tcW w:type="dxa" w:w="1587"/>
+            <w:tcBorders>
+              <w:top w:val="single" w:sz="14" w:space="0" w:color="000000"/>
+              <w:bottom w:val="single" w:sz="6" w:space="0" w:color="000000"/>
+            </w:tcBorders>
+          </w:tcPr>
+          <w:p>
+            <w:pPr>
+              <w:jc w:val="center"/>
+            </w:pPr>
+            <w:r/>
+            <w:r>
+              <w:rPr>
+                <w:b/>
+                <w:i w:val="0"/>
+                <w:sz w:val="19"/>
+                <w:rFonts w:eastAsia="黑体" w:ascii="Times New Roman" w:hAnsi="Times New Roman"/>
+              </w:rPr>
+              <w:t>与国际差距</w:t>
+            </w:r>
+          </w:p>
+        </w:tc>
+        <w:tc>
+          <w:tcPr>
+            <w:tcW w:type="dxa" w:w="2381"/>
+            <w:tcBorders>
+              <w:top w:val="single" w:sz="14" w:space="0" w:color="000000"/>
+              <w:bottom w:val="single" w:sz="6" w:space="0" w:color="000000"/>
+            </w:tcBorders>
+          </w:tcPr>
+          <w:p>
+            <w:pPr>
+              <w:jc w:val="center"/>
+            </w:pPr>
+            <w:r/>
+            <w:r>
+              <w:rPr>
+                <w:b/>
+                <w:i w:val="0"/>
+                <w:sz w:val="19"/>
+                <w:rFonts w:eastAsia="黑体" w:ascii="Times New Roman" w:hAnsi="Times New Roman"/>
+              </w:rPr>
+              <w:t>突破方向</w:t>
+            </w:r>
+          </w:p>
+        </w:tc>
+      </w:tr>
+      <w:tr>
+        <w:tc>
+          <w:tcPr>
+            <w:tcW w:type="dxa" w:w="1474"/>
+          </w:tcPr>
+          <w:p>
+            <w:pPr>
+              <w:spacing w:line="240" w:lineRule="auto"/>
+              <w:jc w:val="left"/>
+            </w:pPr>
+            <w:r/>
+            <w:r>
+              <w:rPr>
+                <w:b w:val="0"/>
+                <w:i w:val="0"/>
+                <w:sz w:val="19"/>
+                <w:rFonts w:eastAsia="宋体" w:ascii="Times New Roman" w:hAnsi="Times New Roman"/>
+              </w:rPr>
+              <w:t>SAPC材料</w:t>
+            </w:r>
+          </w:p>
+        </w:tc>
+        <w:tc>
+          <w:tcPr>
+            <w:tcW w:type="dxa" w:w="2268"/>
+          </w:tcPr>
+          <w:p>
+            <w:pPr>
+              <w:spacing w:line="240" w:lineRule="auto"/>
+              <w:jc w:val="left"/>
+            </w:pPr>
+            <w:r/>
+            <w:r>
+              <w:rPr>
+                <w:b w:val="0"/>
+                <w:i w:val="0"/>
+                <w:sz w:val="19"/>
+                <w:rFonts w:eastAsia="宋体" w:ascii="Times New Roman" w:hAnsi="Times New Roman"/>
+              </w:rPr>
+              <w:t>PEDOT去质子/气相聚合接轨前沿</w:t>
+            </w:r>
+          </w:p>
+        </w:tc>
+        <w:tc>
+          <w:tcPr>
+            <w:tcW w:type="dxa" w:w="1587"/>
+          </w:tcPr>
+          <w:p>
+            <w:pPr>
+              <w:spacing w:line="240" w:lineRule="auto"/>
+              <w:jc w:val="left"/>
+            </w:pPr>
+            <w:r/>
+            <w:r>
+              <w:rPr>
+                <w:b w:val="0"/>
+                <w:i w:val="0"/>
+                <w:sz w:val="19"/>
+                <w:rFonts w:eastAsia="宋体" w:ascii="Times New Roman" w:hAnsi="Times New Roman"/>
+              </w:rPr>
+              <w:t>较小</w:t>
+            </w:r>
+          </w:p>
+        </w:tc>
+        <w:tc>
+          <w:tcPr>
+            <w:tcW w:type="dxa" w:w="2381"/>
+          </w:tcPr>
+          <w:p>
+            <w:pPr>
+              <w:spacing w:line="240" w:lineRule="auto"/>
+              <w:jc w:val="left"/>
+            </w:pPr>
+            <w:r/>
+            <w:r>
+              <w:rPr>
+                <w:b w:val="0"/>
+                <w:i w:val="0"/>
+                <w:sz w:val="19"/>
+                <w:rFonts w:eastAsia="宋体" w:ascii="Times New Roman" w:hAnsi="Times New Roman"/>
+              </w:rPr>
+              <w:t>稳定化与界面工程</w:t>
+            </w:r>
+          </w:p>
+        </w:tc>
+      </w:tr>
+      <w:tr>
+        <w:tc>
+          <w:tcPr>
+            <w:tcW w:type="dxa" w:w="1474"/>
+          </w:tcPr>
+          <w:p>
+            <w:pPr>
+              <w:spacing w:line="240" w:lineRule="auto"/>
+              <w:jc w:val="left"/>
+            </w:pPr>
+            <w:r/>
+            <w:r>
+              <w:rPr>
+                <w:b w:val="0"/>
+                <w:i w:val="0"/>
+                <w:sz w:val="19"/>
+                <w:rFonts w:eastAsia="宋体" w:ascii="Times New Roman" w:hAnsi="Times New Roman"/>
+              </w:rPr>
+              <w:t>SAPC器件数据</w:t>
+            </w:r>
+          </w:p>
+        </w:tc>
+        <w:tc>
+          <w:tcPr>
+            <w:tcW w:type="dxa" w:w="2268"/>
+          </w:tcPr>
+          <w:p>
+            <w:pPr>
+              <w:spacing w:line="240" w:lineRule="auto"/>
+              <w:jc w:val="left"/>
+            </w:pPr>
+            <w:r/>
+            <w:r>
+              <w:rPr>
+                <w:b w:val="0"/>
+                <w:i w:val="0"/>
+                <w:sz w:val="19"/>
+                <w:rFonts w:eastAsia="宋体" w:ascii="Times New Roman" w:hAnsi="Times New Roman"/>
+              </w:rPr>
+              <w:t>长周期多应力数据稀缺</w:t>
+            </w:r>
+          </w:p>
+        </w:tc>
+        <w:tc>
+          <w:tcPr>
+            <w:tcW w:type="dxa" w:w="1587"/>
+          </w:tcPr>
+          <w:p>
+            <w:pPr>
+              <w:spacing w:line="240" w:lineRule="auto"/>
+              <w:jc w:val="left"/>
+            </w:pPr>
+            <w:r/>
+            <w:r>
+              <w:rPr>
+                <w:b w:val="0"/>
+                <w:i w:val="0"/>
+                <w:sz w:val="19"/>
+                <w:rFonts w:eastAsia="宋体" w:ascii="Times New Roman" w:hAnsi="Times New Roman"/>
+              </w:rPr>
+              <w:t>较大</w:t>
+            </w:r>
+          </w:p>
+        </w:tc>
+        <w:tc>
+          <w:tcPr>
+            <w:tcW w:type="dxa" w:w="2381"/>
+          </w:tcPr>
+          <w:p>
+            <w:pPr>
+              <w:spacing w:line="240" w:lineRule="auto"/>
+              <w:jc w:val="left"/>
+            </w:pPr>
+            <w:r/>
+            <w:r>
+              <w:rPr>
+                <w:b w:val="0"/>
+                <w:i w:val="0"/>
+                <w:sz w:val="19"/>
+                <w:rFonts w:eastAsia="宋体" w:ascii="Times New Roman" w:hAnsi="Times New Roman"/>
+              </w:rPr>
+              <w:t>专用数据集+统一规程</w:t>
+            </w:r>
+          </w:p>
+        </w:tc>
+      </w:tr>
+      <w:tr>
+        <w:tc>
+          <w:tcPr>
+            <w:tcW w:type="dxa" w:w="1474"/>
+          </w:tcPr>
+          <w:p>
+            <w:pPr>
+              <w:spacing w:line="240" w:lineRule="auto"/>
+              <w:jc w:val="left"/>
+            </w:pPr>
+            <w:r/>
+            <w:r>
+              <w:rPr>
+                <w:b w:val="0"/>
+                <w:i w:val="0"/>
+                <w:sz w:val="19"/>
+                <w:rFonts w:eastAsia="宋体" w:ascii="Times New Roman" w:hAnsi="Times New Roman"/>
+              </w:rPr>
+              <w:t>失效机理建模</w:t>
+            </w:r>
+          </w:p>
+        </w:tc>
+        <w:tc>
+          <w:tcPr>
+            <w:tcW w:type="dxa" w:w="2268"/>
+          </w:tcPr>
+          <w:p>
+            <w:pPr>
+              <w:spacing w:line="240" w:lineRule="auto"/>
+              <w:jc w:val="left"/>
+            </w:pPr>
+            <w:r/>
+            <w:r>
+              <w:rPr>
+                <w:b w:val="0"/>
+                <w:i w:val="0"/>
+                <w:sz w:val="19"/>
+                <w:rFonts w:eastAsia="宋体" w:ascii="Times New Roman" w:hAnsi="Times New Roman"/>
+              </w:rPr>
+              <w:t>工况验证+仿真为主</w:t>
+            </w:r>
+          </w:p>
+        </w:tc>
+        <w:tc>
+          <w:tcPr>
+            <w:tcW w:type="dxa" w:w="1587"/>
+          </w:tcPr>
+          <w:p>
+            <w:pPr>
+              <w:spacing w:line="240" w:lineRule="auto"/>
+              <w:jc w:val="left"/>
+            </w:pPr>
+            <w:r/>
+            <w:r>
+              <w:rPr>
+                <w:b w:val="0"/>
+                <w:i w:val="0"/>
+                <w:sz w:val="19"/>
+                <w:rFonts w:eastAsia="宋体" w:ascii="Times New Roman" w:hAnsi="Times New Roman"/>
+              </w:rPr>
+              <w:t>原创模型少</w:t>
+            </w:r>
+          </w:p>
+        </w:tc>
+        <w:tc>
+          <w:tcPr>
+            <w:tcW w:type="dxa" w:w="2381"/>
+          </w:tcPr>
+          <w:p>
+            <w:pPr>
+              <w:spacing w:line="240" w:lineRule="auto"/>
+              <w:jc w:val="left"/>
+            </w:pPr>
+            <w:r/>
+            <w:r>
+              <w:rPr>
+                <w:b w:val="0"/>
+                <w:i w:val="0"/>
+                <w:sz w:val="19"/>
+                <w:rFonts w:eastAsia="宋体" w:ascii="Times New Roman" w:hAnsi="Times New Roman"/>
+              </w:rPr>
+              <w:t>机理贯通PoF/竞争失效</w:t>
+            </w:r>
+          </w:p>
+        </w:tc>
+      </w:tr>
+      <w:tr>
+        <w:tc>
+          <w:tcPr>
+            <w:tcW w:type="dxa" w:w="1474"/>
+          </w:tcPr>
+          <w:p>
+            <w:pPr>
+              <w:spacing w:line="240" w:lineRule="auto"/>
+              <w:jc w:val="left"/>
+            </w:pPr>
+            <w:r/>
+            <w:r>
+              <w:rPr>
+                <w:b w:val="0"/>
+                <w:i w:val="0"/>
+                <w:sz w:val="19"/>
+                <w:rFonts w:eastAsia="宋体" w:ascii="Times New Roman" w:hAnsi="Times New Roman"/>
+              </w:rPr>
+              <w:t>数据驱动/RUL</w:t>
+            </w:r>
+          </w:p>
+        </w:tc>
+        <w:tc>
+          <w:tcPr>
+            <w:tcW w:type="dxa" w:w="2268"/>
+          </w:tcPr>
+          <w:p>
+            <w:pPr>
+              <w:spacing w:line="240" w:lineRule="auto"/>
+              <w:jc w:val="left"/>
+            </w:pPr>
+            <w:r/>
+            <w:r>
+              <w:rPr>
+                <w:b w:val="0"/>
+                <w:i w:val="0"/>
+                <w:sz w:val="19"/>
+                <w:rFonts w:eastAsia="宋体" w:ascii="Times New Roman" w:hAnsi="Times New Roman"/>
+              </w:rPr>
+              <w:t>规模跟进、PINN起步</w:t>
+            </w:r>
+          </w:p>
+        </w:tc>
+        <w:tc>
+          <w:tcPr>
+            <w:tcW w:type="dxa" w:w="1587"/>
+          </w:tcPr>
+          <w:p>
+            <w:pPr>
+              <w:spacing w:line="240" w:lineRule="auto"/>
+              <w:jc w:val="left"/>
+            </w:pPr>
+            <w:r/>
+            <w:r>
+              <w:rPr>
+                <w:b w:val="0"/>
+                <w:i w:val="0"/>
+                <w:sz w:val="19"/>
+                <w:rFonts w:eastAsia="宋体" w:ascii="Times New Roman" w:hAnsi="Times New Roman"/>
+              </w:rPr>
+              <w:t>基本同步</w:t>
+            </w:r>
+          </w:p>
+        </w:tc>
+        <w:tc>
+          <w:tcPr>
+            <w:tcW w:type="dxa" w:w="2381"/>
+          </w:tcPr>
+          <w:p>
+            <w:pPr>
+              <w:spacing w:line="240" w:lineRule="auto"/>
+              <w:jc w:val="left"/>
+            </w:pPr>
+            <w:r/>
+            <w:r>
+              <w:rPr>
+                <w:b w:val="0"/>
+                <w:i w:val="0"/>
+                <w:sz w:val="19"/>
+                <w:rFonts w:eastAsia="宋体" w:ascii="Times New Roman" w:hAnsi="Times New Roman"/>
+              </w:rPr>
+              <w:t>专用基准+可复现验证</w:t>
+            </w:r>
+          </w:p>
+        </w:tc>
+      </w:tr>
+      <w:tr>
+        <w:tc>
+          <w:tcPr>
+            <w:tcW w:type="dxa" w:w="1474"/>
+          </w:tcPr>
+          <w:p>
+            <w:pPr>
+              <w:spacing w:line="240" w:lineRule="auto"/>
+              <w:jc w:val="left"/>
+            </w:pPr>
+            <w:r/>
+            <w:r>
+              <w:rPr>
+                <w:b w:val="0"/>
+                <w:i w:val="0"/>
+                <w:sz w:val="19"/>
+                <w:rFonts w:eastAsia="宋体" w:ascii="Times New Roman" w:hAnsi="Times New Roman"/>
+              </w:rPr>
+              <w:t>在线监测</w:t>
+            </w:r>
+          </w:p>
+        </w:tc>
+        <w:tc>
+          <w:tcPr>
+            <w:tcW w:type="dxa" w:w="2268"/>
+          </w:tcPr>
+          <w:p>
+            <w:pPr>
+              <w:spacing w:line="240" w:lineRule="auto"/>
+              <w:jc w:val="left"/>
+            </w:pPr>
+            <w:r/>
+            <w:r>
+              <w:rPr>
+                <w:b w:val="0"/>
+                <w:i w:val="0"/>
+                <w:sz w:val="19"/>
+                <w:rFonts w:eastAsia="宋体" w:ascii="Times New Roman" w:hAnsi="Times New Roman"/>
+              </w:rPr>
+              <w:t>工程落地强</w:t>
+            </w:r>
+          </w:p>
+        </w:tc>
+        <w:tc>
+          <w:tcPr>
+            <w:tcW w:type="dxa" w:w="1587"/>
+          </w:tcPr>
+          <w:p>
+            <w:pPr>
+              <w:spacing w:line="240" w:lineRule="auto"/>
+              <w:jc w:val="left"/>
+            </w:pPr>
+            <w:r/>
+            <w:r>
+              <w:rPr>
+                <w:b w:val="0"/>
+                <w:i w:val="0"/>
+                <w:sz w:val="19"/>
+                <w:rFonts w:eastAsia="宋体" w:ascii="Times New Roman" w:hAnsi="Times New Roman"/>
+              </w:rPr>
+              <w:t>原创辨识少</w:t>
+            </w:r>
+          </w:p>
+        </w:tc>
+        <w:tc>
+          <w:tcPr>
+            <w:tcW w:type="dxa" w:w="2381"/>
+          </w:tcPr>
+          <w:p>
+            <w:pPr>
+              <w:spacing w:line="240" w:lineRule="auto"/>
+              <w:jc w:val="left"/>
+            </w:pPr>
+            <w:r/>
+            <w:r>
+              <w:rPr>
+                <w:b w:val="0"/>
+                <w:i w:val="0"/>
+                <w:sz w:val="19"/>
+                <w:rFonts w:eastAsia="宋体" w:ascii="Times New Roman" w:hAnsi="Times New Roman"/>
+              </w:rPr>
+              <w:t>高精度变工况泛化</w:t>
+            </w:r>
+          </w:p>
+        </w:tc>
+      </w:tr>
+      <w:tr>
+        <w:tc>
+          <w:tcPr>
+            <w:tcW w:type="dxa" w:w="1474"/>
+            <w:tcBorders>
+              <w:bottom w:val="single" w:sz="14" w:space="0" w:color="000000"/>
+            </w:tcBorders>
+          </w:tcPr>
+          <w:p>
+            <w:pPr>
+              <w:spacing w:line="240" w:lineRule="auto"/>
+              <w:jc w:val="left"/>
+            </w:pPr>
+            <w:r/>
+            <w:r>
+              <w:rPr>
+                <w:b w:val="0"/>
+                <w:i w:val="0"/>
+                <w:sz w:val="19"/>
+                <w:rFonts w:eastAsia="宋体" w:ascii="Times New Roman" w:hAnsi="Times New Roman"/>
+              </w:rPr>
+              <w:t>标准/自主化</w:t>
+            </w:r>
+          </w:p>
+        </w:tc>
+        <w:tc>
+          <w:tcPr>
+            <w:tcW w:type="dxa" w:w="2268"/>
+            <w:tcBorders>
+              <w:bottom w:val="single" w:sz="14" w:space="0" w:color="000000"/>
+            </w:tcBorders>
+          </w:tcPr>
+          <w:p>
+            <w:pPr>
+              <w:spacing w:line="240" w:lineRule="auto"/>
+              <w:jc w:val="left"/>
+            </w:pPr>
+            <w:r/>
+            <w:r>
+              <w:rPr>
+                <w:b w:val="0"/>
+                <w:i w:val="0"/>
+                <w:sz w:val="19"/>
+                <w:rFonts w:eastAsia="宋体" w:ascii="Times New Roman" w:hAnsi="Times New Roman"/>
+              </w:rPr>
+              <w:t>采标为主、局部牵头</w:t>
+            </w:r>
+          </w:p>
+        </w:tc>
+        <w:tc>
+          <w:tcPr>
+            <w:tcW w:type="dxa" w:w="1587"/>
+            <w:tcBorders>
+              <w:bottom w:val="single" w:sz="14" w:space="0" w:color="000000"/>
+            </w:tcBorders>
+          </w:tcPr>
+          <w:p>
+            <w:pPr>
+              <w:spacing w:line="240" w:lineRule="auto"/>
+              <w:jc w:val="left"/>
+            </w:pPr>
+            <w:r/>
+            <w:r>
+              <w:rPr>
+                <w:b w:val="0"/>
+                <w:i w:val="0"/>
+                <w:sz w:val="19"/>
+                <w:rFonts w:eastAsia="宋体" w:ascii="Times New Roman" w:hAnsi="Times New Roman"/>
+              </w:rPr>
+              <w:t>高端跟随</w:t>
+            </w:r>
+          </w:p>
+        </w:tc>
+        <w:tc>
+          <w:tcPr>
+            <w:tcW w:type="dxa" w:w="2381"/>
+            <w:tcBorders>
+              <w:bottom w:val="single" w:sz="14" w:space="0" w:color="000000"/>
+            </w:tcBorders>
+          </w:tcPr>
+          <w:p>
+            <w:pPr>
+              <w:spacing w:line="240" w:lineRule="auto"/>
+              <w:jc w:val="left"/>
+            </w:pPr>
+            <w:r/>
+            <w:r>
+              <w:rPr>
+                <w:b w:val="0"/>
+                <w:i w:val="0"/>
+                <w:sz w:val="19"/>
+                <w:rFonts w:eastAsia="宋体" w:ascii="Times New Roman" w:hAnsi="Times New Roman"/>
+              </w:rPr>
+              <w:t>失效率基准+判据自主</w:t>
+            </w:r>
+          </w:p>
+        </w:tc>
+      </w:tr>
+    </w:tbl>
+    <w:p>
+      <w:pPr>
+        <w:spacing w:line="360" w:lineRule="auto" w:before="80" w:after="120"/>
+        <w:ind w:left="340"/>
+        <w:jc w:val="both"/>
+        <w:pBdr>
+          <w:left w:val="single" w:sz="18" w:space="6" w:color="4472C4"/>
+        </w:pBdr>
+      </w:pPr>
+      <w:r>
+        <w:rPr>
+          <w:b w:val="0"/>
+          <w:i w:val="0"/>
+          <w:sz w:val="23"/>
+          <w:rFonts w:eastAsia="楷体" w:ascii="Times New Roman" w:hAnsi="Times New Roman"/>
+        </w:rPr>
+        <w:br/>
+        <w:t>本章小结：国内电容器（尤其SAPC）可靠性研究已形成"场景驱动、工程见长、快速跟进"的鲜明格局，在材料改性、自愈检测、MLCC机理与数据驱动RUL等方向贡献突出；但在SAPC器件级长周期多应力数据、原创失效物理建模、失效率基准与数据共享、标准话语权四方面仍存明显短板。这一判断为第九章国内外综合对比与第十章研究空白凝练（及与本文研究内容的对接）提供了系统的国内侧依据。</w:t>
+        <w:br/>
+      </w:r>
+    </w:p>
+    <w:p>
+      <w:r>
+        <w:br w:type="page"/>
+      </w:r>
+    </w:p>
+    <w:p>
+      <w:pPr>
+        <w:keepNext/>
+        <w:spacing w:before="200" w:after="120"/>
+        <w:outlineLvl w:val="1"/>
+      </w:pPr>
+      <w:r>
+        <w:rPr>
+          <w:b/>
+          <w:i w:val="0"/>
+          <w:sz w:val="32"/>
+          <w:rFonts w:eastAsia="黑体" w:ascii="Times New Roman" w:hAnsi="Times New Roman"/>
+        </w:rPr>
+        <w:t>第九章 国内外研究水平综合量化对比与发展态势</w:t>
+      </w:r>
+    </w:p>
+    <w:p>
+      <w:pPr>
+        <w:spacing w:line="360" w:lineRule="auto" w:after="80"/>
+        <w:ind w:firstLine="465"/>
+        <w:jc w:val="both"/>
+      </w:pPr>
+      <w:r>
+        <w:rPr>
+          <w:b w:val="0"/>
+          <w:i w:val="0"/>
+          <w:sz w:val="24"/>
+          <w:rFonts w:eastAsia="宋体" w:ascii="Times New Roman" w:hAnsi="Times New Roman"/>
+        </w:rPr>
+        <w:t>前述各章已从纵向主线（第二至六章）、横向应用场景（第七章）与中国国内研究专论（第八章）三个维度评述了国内外研究现状。本章在此基础上作横向综合：先以总表与雷达图给出五环节的国内外水平量化对比（9.1、9.3），再从文献计量角度刻画研究热点的演进趋势（9.2），最后以研究演进时间轴勾勒领域发展脉络（9.4），从而为第十章凝练研究空白提供全局视野。</w:t>
+      </w:r>
+    </w:p>
+    <w:p>
+      <w:pPr>
+        <w:keepNext/>
+        <w:spacing w:before="160" w:after="120"/>
+        <w:outlineLvl w:val="2"/>
+      </w:pPr>
+      <w:r>
+        <w:rPr>
+          <w:b/>
+          <w:i w:val="0"/>
+          <w:sz w:val="28"/>
+          <w:rFonts w:eastAsia="黑体" w:ascii="Times New Roman" w:hAnsi="Times New Roman"/>
+        </w:rPr>
+        <w:t>9.1 五环节国内外水平综合对比</w:t>
+      </w:r>
+    </w:p>
+    <w:p>
+      <w:pPr>
+        <w:spacing w:line="360" w:lineRule="auto" w:after="80"/>
+        <w:ind w:firstLine="465"/>
+        <w:jc w:val="both"/>
+      </w:pPr>
+      <w:r>
+        <w:rPr>
+          <w:b w:val="0"/>
+          <w:i w:val="0"/>
+          <w:sz w:val="24"/>
+          <w:rFonts w:eastAsia="宋体" w:ascii="Times New Roman" w:hAnsi="Times New Roman"/>
+        </w:rPr>
+        <w:t>表21将五个环节的国内外研究水平并置对照，给出每一环节国外的优势、国内的优势以及量化差距特征。总体规律可概括为一句话：国外在"原创理论与判据定义"上系统领先，国内在"工程场景与规模化应用"上具备独特优势；论文数量上中国已接近美国，但在原创性、影响力与标准话语权上仍有差距。这一"形似质异"的格局，正是后续研究需要着力突破的方向。</w:t>
+      </w:r>
+    </w:p>
+    <w:p>
+      <w:pPr>
+        <w:keepNext/>
+        <w:spacing w:before="120" w:after="40"/>
+        <w:jc w:val="center"/>
+      </w:pPr>
+      <w:r>
+        <w:rPr>
+          <w:b/>
+          <w:i w:val="0"/>
+          <w:sz w:val="21"/>
+          <w:rFonts w:eastAsia="黑体" w:ascii="Times New Roman" w:hAnsi="Times New Roman"/>
+        </w:rPr>
+        <w:t>表 21  五环节国内外研究水平综合对比总表</w:t>
+      </w:r>
+    </w:p>
+    <w:tbl>
+      <w:tblPr>
+        <w:tblW w:type="auto" w:w="0"/>
+        <w:jc w:val="center"/>
+        <w:tblLayout w:type="autofit"/>
+        <w:tblLook w:firstColumn="1" w:firstRow="1" w:lastColumn="0" w:lastRow="0" w:noHBand="0" w:noVBand="1" w:val="04A0"/>
+      </w:tblPr>
+      <w:tblGrid>
+        <w:gridCol w:w="2126"/>
+        <w:gridCol w:w="2126"/>
+        <w:gridCol w:w="2126"/>
+        <w:gridCol w:w="2126"/>
+      </w:tblGrid>
+      <w:tr>
+        <w:tc>
+          <w:tcPr>
+            <w:tcW w:type="dxa" w:w="1474"/>
+            <w:tcBorders>
+              <w:top w:val="single" w:sz="14" w:space="0" w:color="000000"/>
+              <w:bottom w:val="single" w:sz="6" w:space="0" w:color="000000"/>
+            </w:tcBorders>
+          </w:tcPr>
+          <w:p>
+            <w:pPr>
+              <w:jc w:val="center"/>
+            </w:pPr>
+            <w:r/>
+            <w:r>
+              <w:rPr>
+                <w:b/>
+                <w:i w:val="0"/>
+                <w:sz w:val="19"/>
+                <w:rFonts w:eastAsia="黑体" w:ascii="Times New Roman" w:hAnsi="Times New Roman"/>
+              </w:rPr>
               <w:t>研究环节</w:t>
             </w:r>
           </w:p>
@@ -20758,7 +23792,7 @@
           <w:sz w:val="24"/>
           <w:rFonts w:eastAsia="宋体" w:ascii="Times New Roman" w:hAnsi="Times New Roman"/>
         </w:rPr>
-        <w:t>为更直观地呈现差距，图31以雷达图形式给出国内外在五个维度上的研究水平评分（0–10分，基于原创性、深度、数据基础与影响力的综合主观评估）。可见国外（外圈）在器件统计、机理理论、建模三个维度领先明显，而在状态监测维度，国内（内圈）凭借工程落地能力已较为接近。</w:t>
+        <w:t>为更直观地呈现差距，图33以雷达图形式给出国内外在五个维度上的研究水平评分（0–10分，基于原创性、深度、数据基础与影响力的综合主观评估）。可见国外（外圈）在器件统计、机理理论、建模三个维度领先明显，而在状态监测维度，国内（内圈）凭借工程落地能力已较为接近。</w:t>
       </w:r>
     </w:p>
     <w:p>
@@ -20770,7 +23804,7 @@
         <w:drawing>
           <wp:inline xmlns:a="http://schemas.openxmlformats.org/drawingml/2006/main" xmlns:pic="http://schemas.openxmlformats.org/drawingml/2006/picture">
             <wp:extent cx="4320000" cy="3949865"/>
-            <wp:docPr id="31" name="Picture 31"/>
+            <wp:docPr id="33" name="Picture 33"/>
             <wp:cNvGraphicFramePr>
               <a:graphicFrameLocks noChangeAspect="1"/>
             </wp:cNvGraphicFramePr>
@@ -20782,7 +23816,7 @@
                     <pic:cNvPicPr/>
                   </pic:nvPicPr>
                   <pic:blipFill>
-                    <a:blip r:embed="rId41"/>
+                    <a:blip r:embed="rId43"/>
                     <a:stretch>
                       <a:fillRect/>
                     </a:stretch>
@@ -20813,7 +23847,7 @@
           <w:sz w:val="21"/>
           <w:rFonts w:eastAsia="黑体" w:ascii="Times New Roman" w:hAnsi="Times New Roman"/>
         </w:rPr>
-        <w:t>图 31  国内外研究水平五维雷达对比（0–10分）</w:t>
+        <w:t>图 33  国内外研究水平五维雷达对比（0–10分）</w:t>
       </w:r>
     </w:p>
     <w:p>
@@ -20829,7 +23863,7 @@
           <w:sz w:val="28"/>
           <w:rFonts w:eastAsia="黑体" w:ascii="Times New Roman" w:hAnsi="Times New Roman"/>
         </w:rPr>
-        <w:t>8.2 文献计量与研究热点演进</w:t>
+        <w:t>9.2 文献计量与研究热点演进</w:t>
       </w:r>
     </w:p>
     <w:p>
@@ -20845,7 +23879,7 @@
           <w:sz w:val="24"/>
           <w:rFonts w:eastAsia="宋体" w:ascii="Times New Roman" w:hAnsi="Times New Roman"/>
         </w:rPr>
-        <w:t>从文献计量看，研究热点的迁移清晰地反映了领域范式的演化。图32给出若干关键词的流行度趋势：ESR在线监测在2012–2016年间快速升温并趋于成熟；机器学习/RUL自2018年起急剧上升，成为当前最热主题；物理信息神经网络（PINN）自2022年起新兴，增长最为迅猛；任务剖面（mission profile）则自2011年Wang-Blaabjerg工作后稳步成为可靠性评估的基础框架。这一趋势表明，领域正从"机理解析与单点监测"快速转向"数据智能与物理—数据融合"。</w:t>
+        <w:t>从文献计量看，研究热点的迁移清晰地反映了领域范式的演化。图34给出若干关键词的流行度趋势：ESR在线监测在2012–2016年间快速升温并趋于成熟；机器学习/RUL自2018年起急剧上升，成为当前最热主题；物理信息神经网络（PINN）自2022年起新兴，增长最为迅猛；任务剖面（mission profile）则自2011年Wang-Blaabjerg工作后稳步成为可靠性评估的基础框架。这一趋势表明，领域正从"机理解析与单点监测"快速转向"数据智能与物理—数据融合"。</w:t>
       </w:r>
     </w:p>
     <w:p>
@@ -20857,7 +23891,7 @@
         <w:drawing>
           <wp:inline xmlns:a="http://schemas.openxmlformats.org/drawingml/2006/main" xmlns:pic="http://schemas.openxmlformats.org/drawingml/2006/picture">
             <wp:extent cx="5220000" cy="3100397"/>
-            <wp:docPr id="32" name="Picture 32"/>
+            <wp:docPr id="34" name="Picture 34"/>
             <wp:cNvGraphicFramePr>
               <a:graphicFrameLocks noChangeAspect="1"/>
             </wp:cNvGraphicFramePr>
@@ -20869,7 +23903,7 @@
                     <pic:cNvPicPr/>
                   </pic:nvPicPr>
                   <pic:blipFill>
-                    <a:blip r:embed="rId42"/>
+                    <a:blip r:embed="rId44"/>
                     <a:stretch>
                       <a:fillRect/>
                     </a:stretch>
@@ -20900,7 +23934,7 @@
           <w:sz w:val="21"/>
           <w:rFonts w:eastAsia="黑体" w:ascii="Times New Roman" w:hAnsi="Times New Roman"/>
         </w:rPr>
-        <w:t>图 32  电容器可靠性研究关键词流行度趋势</w:t>
+        <w:t>图 34  电容器可靠性研究关键词流行度趋势</w:t>
       </w:r>
     </w:p>
     <w:p>
@@ -20916,7 +23950,7 @@
           <w:sz w:val="28"/>
           <w:rFonts w:eastAsia="黑体" w:ascii="Times New Roman" w:hAnsi="Times New Roman"/>
         </w:rPr>
-        <w:t>8.3 技术成熟度对比</w:t>
+        <w:t>9.3 技术成熟度对比</w:t>
       </w:r>
     </w:p>
     <w:p>
@@ -20932,7 +23966,7 @@
           <w:sz w:val="24"/>
           <w:rFonts w:eastAsia="宋体" w:ascii="Times New Roman" w:hAnsi="Times New Roman"/>
         </w:rPr>
-        <w:t>借鉴技术成熟度（TRL）的思路，图33对五个环节的国内外成熟度作了对比评估。器件与失效模式环节成熟度最高（接近工程标准化），机理与建模环节处于"理论较成熟、工程转化中"的阶段，状态监测尤其是RUL预测则仍处于"实验室验证向现场部署过渡"的阶段。国内在监测环节的成熟度评分甚至略高于国外，反映出强大的工程化与产业化推动力；而在机理与建模环节，国内成熟度仍落后于国外。</w:t>
+        <w:t>借鉴技术成熟度（TRL）的思路，图35对五个环节的国内外成熟度作了对比评估。器件与失效模式环节成熟度最高（接近工程标准化），机理与建模环节处于"理论较成熟、工程转化中"的阶段，状态监测尤其是RUL预测则仍处于"实验室验证向现场部署过渡"的阶段。国内在监测环节的成熟度评分甚至略高于国外，反映出强大的工程化与产业化推动力；而在机理与建模环节，国内成熟度仍落后于国外。</w:t>
       </w:r>
     </w:p>
     <w:p>
@@ -20944,7 +23978,7 @@
         <w:drawing>
           <wp:inline xmlns:a="http://schemas.openxmlformats.org/drawingml/2006/main" xmlns:pic="http://schemas.openxmlformats.org/drawingml/2006/picture">
             <wp:extent cx="5220000" cy="3207059"/>
-            <wp:docPr id="33" name="Picture 33"/>
+            <wp:docPr id="35" name="Picture 35"/>
             <wp:cNvGraphicFramePr>
               <a:graphicFrameLocks noChangeAspect="1"/>
             </wp:cNvGraphicFramePr>
@@ -20956,7 +23990,7 @@
                     <pic:cNvPicPr/>
                   </pic:nvPicPr>
                   <pic:blipFill>
-                    <a:blip r:embed="rId43"/>
+                    <a:blip r:embed="rId45"/>
                     <a:stretch>
                       <a:fillRect/>
                     </a:stretch>
@@ -20987,7 +24021,7 @@
           <w:sz w:val="21"/>
           <w:rFonts w:eastAsia="黑体" w:ascii="Times New Roman" w:hAnsi="Times New Roman"/>
         </w:rPr>
-        <w:t>图 33  五环节国内外技术成熟度(TRL)对比</w:t>
+        <w:t>图 35  五环节国内外技术成熟度(TRL)对比</w:t>
       </w:r>
     </w:p>
     <w:p>
@@ -21003,7 +24037,7 @@
           <w:sz w:val="28"/>
           <w:rFonts w:eastAsia="黑体" w:ascii="Times New Roman" w:hAnsi="Times New Roman"/>
         </w:rPr>
-        <w:t>8.4 研究演进时间轴</w:t>
+        <w:t>9.4 研究演进时间轴</w:t>
       </w:r>
     </w:p>
     <w:p>
@@ -21019,7 +24053,7 @@
           <w:sz w:val="24"/>
           <w:rFonts w:eastAsia="宋体" w:ascii="Times New Roman" w:hAnsi="Times New Roman"/>
         </w:rPr>
-        <w:t>图34以时间轴形式勾勒了电容器可靠性研究的主要里程碑：1969年Prokopowicz-Vaskas陶瓷寿命方程奠定加速建模基础；1990年代Waser-Baiatu氧空位模型确立MLCC机理理论；2002年Venet提出ESR在线监测；2011年Wang-Blaabjerg建立任务剖面评估框架；2014年NASA Liu-Sampson提出BME MLCC统一可靠性模型；2020年前后LSTM等深度学习方法进入RUL预测；2024年前后Kim等的PINN与物理—机器学习混合方法代表了当前前沿。这条时间轴清晰显示：领域沿"经验模型→机理理论→在线监测→系统评估→数据智能→物理数据融合"演进，而每一次范式跃迁几乎都由国外团队率先开启，国内多在范式确立后快速跟进并在工程层面深化。</w:t>
+        <w:t>图36以时间轴形式勾勒了电容器可靠性研究的主要里程碑：1969年Prokopowicz-Vaskas陶瓷寿命方程奠定加速建模基础；1990年代Waser-Baiatu氧空位模型确立MLCC机理理论；2002年Venet提出ESR在线监测；2011年Wang-Blaabjerg建立任务剖面评估框架；2014年NASA Liu-Sampson提出BME MLCC统一可靠性模型；2020年前后LSTM等深度学习方法进入RUL预测；2024年前后Kim等的PINN与物理—机器学习混合方法代表了当前前沿。这条时间轴清晰显示：领域沿"经验模型→机理理论→在线监测→系统评估→数据智能→物理数据融合"演进，而每一次范式跃迁几乎都由国外团队率先开启，国内多在范式确立后快速跟进并在工程层面深化。</w:t>
       </w:r>
     </w:p>
     <w:p>
@@ -21031,7 +24065,7 @@
         <w:drawing>
           <wp:inline xmlns:a="http://schemas.openxmlformats.org/drawingml/2006/main" xmlns:pic="http://schemas.openxmlformats.org/drawingml/2006/picture">
             <wp:extent cx="5580000" cy="2281765"/>
-            <wp:docPr id="34" name="Picture 34"/>
+            <wp:docPr id="36" name="Picture 36"/>
             <wp:cNvGraphicFramePr>
               <a:graphicFrameLocks noChangeAspect="1"/>
             </wp:cNvGraphicFramePr>
@@ -21043,7 +24077,7 @@
                     <pic:cNvPicPr/>
                   </pic:nvPicPr>
                   <pic:blipFill>
-                    <a:blip r:embed="rId44"/>
+                    <a:blip r:embed="rId46"/>
                     <a:stretch>
                       <a:fillRect/>
                     </a:stretch>
@@ -21074,7 +24108,7 @@
           <w:sz w:val="21"/>
           <w:rFonts w:eastAsia="黑体" w:ascii="Times New Roman" w:hAnsi="Times New Roman"/>
         </w:rPr>
-        <w:t>图 34  电容器可靠性研究演进时间轴（1969—2024）</w:t>
+        <w:t>图 36  电容器可靠性研究演进时间轴（1969—2024）</w:t>
       </w:r>
     </w:p>
     <w:p>
@@ -21090,7 +24124,7 @@
           <w:sz w:val="28"/>
           <w:rFonts w:eastAsia="黑体" w:ascii="Times New Roman" w:hAnsi="Times New Roman"/>
         </w:rPr>
-        <w:t>8.5 标准化与话语权态势</w:t>
+        <w:t>9.5 标准化与话语权态势</w:t>
       </w:r>
     </w:p>
     <w:p>
@@ -21138,7 +24172,7 @@
           <w:sz w:val="28"/>
           <w:rFonts w:eastAsia="黑体" w:ascii="Times New Roman" w:hAnsi="Times New Roman"/>
         </w:rPr>
-        <w:t>8.6 产业—学术协同与数据壁垒</w:t>
+        <w:t>9.6 产业—学术协同与数据壁垒</w:t>
       </w:r>
     </w:p>
     <w:p>
@@ -21212,7 +24246,7 @@
           <w:sz w:val="32"/>
           <w:rFonts w:eastAsia="黑体" w:ascii="Times New Roman" w:hAnsi="Times New Roman"/>
         </w:rPr>
-        <w:t>第九章 现有研究不足、研究空白与本文研究内容对接</w:t>
+        <w:t>第十章 现有研究不足、研究空白与本文研究内容对接</w:t>
       </w:r>
     </w:p>
     <w:p>
@@ -21228,7 +24262,7 @@
           <w:sz w:val="24"/>
           <w:rFonts w:eastAsia="宋体" w:ascii="Times New Roman" w:hAnsi="Times New Roman"/>
         </w:rPr>
-        <w:t>本章是整篇研究现状的"灵魂"与归宿。前七章沿主线系统评述了国内外现状，本章将各环节评述中凝练的不足汇聚为若干条明确的研究空白（research gap），逐条给出量化证据，并将其映射到学位论文的研究内容与章节安排，最后展望领域未来趋势。这一"对接段"使整篇综述不再是独立的文献回顾，而是直接论证"本文研究为什么值得做、为什么由本文来做"。</w:t>
+        <w:t>本章是整篇研究现状的"灵魂"与归宿。前九章沿主线系统评述了国内外现状（并以第八章专章深化了中国国内研究），本章将各环节评述中凝练的不足汇聚为若干条明确的研究空白（research gap），逐条给出量化证据，并将其映射到学位论文的研究内容与章节安排，最后展望领域未来趋势。这一"对接段"使整篇综述不再是独立的文献回顾，而是直接论证"本文研究为什么值得做、为什么由本文来做"。</w:t>
       </w:r>
     </w:p>
     <w:p>
@@ -21244,7 +24278,7 @@
           <w:sz w:val="28"/>
           <w:rFonts w:eastAsia="黑体" w:ascii="Times New Roman" w:hAnsi="Times New Roman"/>
         </w:rPr>
-        <w:t>9.1 现有研究的四条共性不足</w:t>
+        <w:t>10.1 现有研究的四条共性不足</w:t>
       </w:r>
     </w:p>
     <w:p>
@@ -21260,7 +24294,7 @@
           <w:sz w:val="24"/>
           <w:rFonts w:eastAsia="宋体" w:ascii="Times New Roman" w:hAnsi="Times New Roman"/>
         </w:rPr>
-        <w:t>综合前七章，国内外研究虽已形成较完整的知识体系，但仍存在四条具体且可操作的共性不足：</w:t>
+        <w:t>综合前九章，国内外研究虽已形成较完整的知识体系，但仍存在四条具体且可操作的共性不足：</w:t>
       </w:r>
     </w:p>
     <w:p>
@@ -21372,7 +24406,7 @@
           <w:sz w:val="28"/>
           <w:rFonts w:eastAsia="黑体" w:ascii="Times New Roman" w:hAnsi="Times New Roman"/>
         </w:rPr>
-        <w:t>9.2 研究空白与本文研究内容对接</w:t>
+        <w:t>10.2 研究空白与本文研究内容对接</w:t>
       </w:r>
     </w:p>
     <w:p>
@@ -21388,7 +24422,7 @@
           <w:sz w:val="24"/>
           <w:rFonts w:eastAsia="宋体" w:ascii="Times New Roman" w:hAnsi="Times New Roman"/>
         </w:rPr>
-        <w:t>表18将上述四条研究空白逐条对接到学位论文拟开展的研究内容与章节安排。每条空白均附有量化证据，并明确由哪一部分研究内容予以回应——这正是高水平学位论文研究现状必须完成的"导向自己"的关键一步。读完此表，评审可立即把握本文的研究边界、创新点与章节逻辑。</w:t>
+        <w:t>表22将上述四条研究空白逐条对接到学位论文拟开展的研究内容与章节安排。每条空白均附有量化证据，并明确由哪一部分研究内容予以回应——这正是高水平学位论文研究现状必须完成的"导向自己"的关键一步。读完此表，评审可立即把握本文的研究边界、创新点与章节逻辑。</w:t>
       </w:r>
     </w:p>
     <w:p>
@@ -21404,7 +24438,7 @@
           <w:sz w:val="21"/>
           <w:rFonts w:eastAsia="黑体" w:ascii="Times New Roman" w:hAnsi="Times New Roman"/>
         </w:rPr>
-        <w:t>表 18  研究空白与本文研究内容/章节对接表</w:t>
+        <w:t>表 22  研究空白与本文研究内容/章节对接表</w:t>
       </w:r>
     </w:p>
     <w:tbl>
@@ -21892,7 +24926,7 @@
           <w:rFonts w:eastAsia="楷体" w:ascii="Times New Roman" w:hAnsi="Times New Roman"/>
         </w:rPr>
         <w:br/>
-        <w:t>对接段写作要点：表18是研究现状与正文研究内容的"咬合齿轮"。四条空白(G-1至G-4)各有量化证据、各对应明确的研究内容，既证明问题真实存在(有数据)，又证明本文有的放矢(有去处)。这种"gap—证据—去向"三位一体的写法，是博士论文研究现状区别于普通综述的根本标志。</w:t>
+        <w:t>对接段写作要点：表22是研究现状与正文研究内容的"咬合齿轮"。四条空白(G-1至G-4)各有量化证据、各对应明确的研究内容，既证明问题真实存在(有数据)，又证明本文有的放矢(有去处)。这种"gap—证据—去向"三位一体的写法，是博士论文研究现状区别于普通综述的根本标志。</w:t>
         <w:br/>
       </w:r>
     </w:p>
@@ -21909,7 +24943,7 @@
           <w:sz w:val="28"/>
           <w:rFonts w:eastAsia="黑体" w:ascii="Times New Roman" w:hAnsi="Times New Roman"/>
         </w:rPr>
-        <w:t>9.3 未来研究趋势展望</w:t>
+        <w:t>10.3 未来研究趋势展望</w:t>
       </w:r>
     </w:p>
     <w:p>
@@ -21925,7 +24959,7 @@
           <w:sz w:val="24"/>
           <w:rFonts w:eastAsia="宋体" w:ascii="Times New Roman" w:hAnsi="Times New Roman"/>
         </w:rPr>
-        <w:t>基于第八章的发展态势分析与上述研究空白，可对电容器可靠性研究的未来趋势作如下展望：</w:t>
+        <w:t>基于第九章的发展态势分析与上述研究空白，可对电容器可靠性研究的未来趋势作如下展望：</w:t>
       </w:r>
     </w:p>
     <w:p>
@@ -22037,7 +25071,7 @@
           <w:sz w:val="28"/>
           <w:rFonts w:eastAsia="黑体" w:ascii="Times New Roman" w:hAnsi="Times New Roman"/>
         </w:rPr>
-        <w:t>9.4 对学位论文写作的方法学启示</w:t>
+        <w:t>10.4 对学位论文写作的方法学启示</w:t>
       </w:r>
     </w:p>
     <w:p>
@@ -22069,7 +25103,7 @@
           <w:sz w:val="24"/>
           <w:rFonts w:eastAsia="宋体" w:ascii="Times New Roman" w:hAnsi="Times New Roman"/>
         </w:rPr>
-        <w:t>其三，研究现状应当"评而非述"。本报告每节末设评述框，凝练共性不足而非复述他人结论；评述的密度与质量，往往是区分优秀综述与平庸综述的关键。其四，研究现状必须"导向自己"。本章的研究空白—证据—去向对接表（表18），将前八章的全部评述收束为四条可操作的研究空白，并逐条指向后续研究内容，使整篇综述与正文形成不可分割的逻辑整体。其五，研究现状应当"可视化"。本报告以三十余幅图、十余张表将抽象论述具象化，既提升专业质感，也便于评审快速把握全局。</w:t>
+        <w:t>其三，研究现状应当"评而非述"。本报告每节末设评述框，凝练共性不足而非复述他人结论；评述的密度与质量，往往是区分优秀综述与平庸综述的关键。其四，研究现状必须"导向自己"。本章的研究空白—证据—去向对接表（表22），将前九章的全部评述收束为四条可操作的研究空白，并逐条指向后续研究内容，使整篇综述与正文形成不可分割的逻辑整体。其五，研究现状应当"可视化"。本报告以三十余幅图、二十余张表将抽象论述具象化，既提升专业质感，也便于评审快速把握全局。</w:t>
       </w:r>
     </w:p>
     <w:p>
@@ -22101,7 +25135,7 @@
           <w:sz w:val="28"/>
           <w:rFonts w:eastAsia="黑体" w:ascii="Times New Roman" w:hAnsi="Times New Roman"/>
         </w:rPr>
-        <w:t>9.5 本综述的局限性说明</w:t>
+        <w:t>10.5 本综述的局限性说明</w:t>
       </w:r>
     </w:p>
     <w:p>
@@ -22133,7 +25167,7 @@
           <w:sz w:val="24"/>
           <w:rFonts w:eastAsia="宋体" w:ascii="Times New Roman" w:hAnsi="Times New Roman"/>
         </w:rPr>
-        <w:t>其三，国内外划分的局限："国外""国内"是一种粗粒度的划分，实际研究高度国际化、合作普遍，将某项成果简单归属于某一方有时并不严谨；本报告的"国内外对照"意在揭示总体格局与互补关系，而非对具体团队作排名。其四，主观评估的局限：第八章雷达图与技术成熟度评分包含作者基于文献的综合主观判断，不同评估者可能得出不同结论。明确这些局限，并非削弱综述的价值，而是体现研究现状写作应有的审慎态度——任何综述都是特定视角下的阶段性总结，其结论应随领域发展与新证据出现而不断修正。</w:t>
+        <w:t>其三，国内外划分的局限："国外""国内"是一种粗粒度的划分，实际研究高度国际化、合作普遍，将某项成果简单归属于某一方有时并不严谨；本报告的"国内外对照"意在揭示总体格局与互补关系，而非对具体团队作排名。其四，主观评估的局限：第九章雷达图与技术成熟度评分包含作者基于文献的综合主观判断，不同评估者可能得出不同结论。明确这些局限，并非削弱综述的价值，而是体现研究现状写作应有的审慎态度——任何综述都是特定视角下的阶段性总结，其结论应随领域发展与新证据出现而不断修正。</w:t>
       </w:r>
     </w:p>
     <w:p>
@@ -22714,7 +25748,391 @@
           <w:sz w:val="21"/>
           <w:rFonts w:eastAsia="宋体" w:ascii="Times New Roman" w:hAnsi="Times New Roman"/>
         </w:rPr>
-        <w:t>[34] 本报告国内研究现状部分综合参考了国内高校与研究院所在风电/光伏变流器母线电容在线监测、车规级MLCC裂纹扩展有限元分析、国产钽电容场致结晶跟踪、超级电容循环寿命建模、数据驱动RUL预测等方向的公开成果（详见正文相应章节论述）。</w:t>
+        <w:t>[34] Removal of protonic doping from PEDOT:PSS by weak base for improving aluminum solid electrolytic capacitor performance. RSC Advances, 2025, DOI: 10.1039/D5RA00124B.（铝固态电解电容器/PEDOT:PSS去质子化；作者与卷期建议核验）</w:t>
+      </w:r>
+    </w:p>
+    <w:p>
+      <w:pPr>
+        <w:spacing w:line="312" w:lineRule="auto" w:after="40"/>
+        <w:ind w:left="510" w:hanging="510"/>
+        <w:jc w:val="both"/>
+      </w:pPr>
+      <w:r>
+        <w:rPr>
+          <w:b w:val="0"/>
+          <w:i w:val="0"/>
+          <w:sz w:val="21"/>
+          <w:rFonts w:eastAsia="宋体" w:ascii="Times New Roman" w:hAnsi="Times New Roman"/>
+        </w:rPr>
+        <w:t>[35] High-performance solid capacitor using vapor phase polymerized PEDOT film. Journal of Materials Science, 2021, 56, DOI: 10.1007/s10853-021-05976-1.（气相聚合PEDOT固态电容；作者建议核验）</w:t>
+      </w:r>
+    </w:p>
+    <w:p>
+      <w:pPr>
+        <w:spacing w:line="312" w:lineRule="auto" w:after="40"/>
+        <w:ind w:left="510" w:hanging="510"/>
+        <w:jc w:val="both"/>
+      </w:pPr>
+      <w:r>
+        <w:rPr>
+          <w:b w:val="0"/>
+          <w:i w:val="0"/>
+          <w:sz w:val="21"/>
+          <w:rFonts w:eastAsia="宋体" w:ascii="Times New Roman" w:hAnsi="Times New Roman"/>
+        </w:rPr>
+        <w:t>[36] Liquid electrolyte-free cylindrical Al polymer capacitor: Materials and characteristics (review). 2015.（无液态电解质柱状铝聚合物电容综述；卷期/作者建议核验）</w:t>
+      </w:r>
+    </w:p>
+    <w:p>
+      <w:pPr>
+        <w:spacing w:line="312" w:lineRule="auto" w:after="40"/>
+        <w:ind w:left="510" w:hanging="510"/>
+        <w:jc w:val="both"/>
+      </w:pPr>
+      <w:r>
+        <w:rPr>
+          <w:b w:val="0"/>
+          <w:i w:val="0"/>
+          <w:sz w:val="21"/>
+          <w:rFonts w:eastAsia="宋体" w:ascii="Times New Roman" w:hAnsi="Times New Roman"/>
+        </w:rPr>
+        <w:t>[37] Lu W G, Zhou L W, Du X, 等. Grey-box online monitoring method for DC-link capacitors（重庆大学，直流母线电容灰箱在线监测）. IEEE Transactions on Power Electronics / 电工技术学报, 卷期与年份建议核验.</w:t>
+      </w:r>
+    </w:p>
+    <w:p>
+      <w:pPr>
+        <w:spacing w:line="312" w:lineRule="auto" w:after="40"/>
+        <w:ind w:left="510" w:hanging="510"/>
+        <w:jc w:val="both"/>
+      </w:pPr>
+      <w:r>
+        <w:rPr>
+          <w:b w:val="0"/>
+          <w:i w:val="0"/>
+          <w:sz w:val="21"/>
+          <w:rFonts w:eastAsia="宋体" w:ascii="Times New Roman" w:hAnsi="Times New Roman"/>
+        </w:rPr>
+        <w:t>[38] Reliability Mechanisms of the Ultrathin-Layered BaTiO3-Based BME MLCC. 物理化学学报 (Acta Physico-Chimica Sinica), 2024, 40(1): 2304015.（超薄层BME MLCC可靠性机理）</w:t>
+      </w:r>
+    </w:p>
+    <w:p>
+      <w:pPr>
+        <w:spacing w:line="312" w:lineRule="auto" w:after="40"/>
+        <w:ind w:left="510" w:hanging="510"/>
+        <w:jc w:val="both"/>
+      </w:pPr>
+      <w:r>
+        <w:rPr>
+          <w:b w:val="0"/>
+          <w:i w:val="0"/>
+          <w:sz w:val="21"/>
+          <w:rFonts w:eastAsia="宋体" w:ascii="Times New Roman" w:hAnsi="Times New Roman"/>
+        </w:rPr>
+        <w:t>[39] Huang X, 等. Excellent permittivity-temperature stability and reliability of ultra-thin Ba0.97Ca0.03TiO3-based MLCCs（中科院深圳先进电子材料研究院）. Journal of Asian Ceramic Societies, 2023, 11(1), DOI: 10.1080/21870764.2023.2166655.</w:t>
+      </w:r>
+    </w:p>
+    <w:p>
+      <w:pPr>
+        <w:spacing w:line="312" w:lineRule="auto" w:after="40"/>
+        <w:ind w:left="510" w:hanging="510"/>
+        <w:jc w:val="both"/>
+      </w:pPr>
+      <w:r>
+        <w:rPr>
+          <w:b w:val="0"/>
+          <w:i w:val="0"/>
+          <w:sz w:val="21"/>
+          <w:rFonts w:eastAsia="宋体" w:ascii="Times New Roman" w:hAnsi="Times New Roman"/>
+        </w:rPr>
+        <w:t>[40] 晶粒尺寸对多层陶瓷电容器可靠性的影响及其机理. 华南师范大学学报(自然科学版), 2024, DOI: 10.6054/j.jscnun.2024031.</w:t>
+      </w:r>
+    </w:p>
+    <w:p>
+      <w:pPr>
+        <w:spacing w:line="312" w:lineRule="auto" w:after="40"/>
+        <w:ind w:left="510" w:hanging="510"/>
+        <w:jc w:val="both"/>
+      </w:pPr>
+      <w:r>
+        <w:rPr>
+          <w:b w:val="0"/>
+          <w:i w:val="0"/>
+          <w:sz w:val="21"/>
+          <w:rFonts w:eastAsia="宋体" w:ascii="Times New Roman" w:hAnsi="Times New Roman"/>
+        </w:rPr>
+        <w:t>[41] Jian Y, Chen Z, Peng S, 等. Capacitor Aging State Evaluation and a Remaining-Useful-Life Prediction Method Based on a CNN-LSTM Network Considering the Impact of Parameter Dispersion. Electronics (MDPI), 2025, 14(22): 4452.</w:t>
+      </w:r>
+    </w:p>
+    <w:p>
+      <w:pPr>
+        <w:spacing w:line="312" w:lineRule="auto" w:after="40"/>
+        <w:ind w:left="510" w:hanging="510"/>
+        <w:jc w:val="both"/>
+      </w:pPr>
+      <w:r>
+        <w:rPr>
+          <w:b w:val="0"/>
+          <w:i w:val="0"/>
+          <w:sz w:val="21"/>
+          <w:rFonts w:eastAsia="宋体" w:ascii="Times New Roman" w:hAnsi="Times New Roman"/>
+        </w:rPr>
+        <w:t>[42] Huang Z, 等. An Online Remaining Useful Life Prediction Method for Tantalum Capacitors Based on Temperature Measurements. Electronics (MDPI), 2025, 14(22): 4393.</w:t>
+      </w:r>
+    </w:p>
+    <w:p>
+      <w:pPr>
+        <w:spacing w:line="312" w:lineRule="auto" w:after="40"/>
+        <w:ind w:left="510" w:hanging="510"/>
+        <w:jc w:val="both"/>
+      </w:pPr>
+      <w:r>
+        <w:rPr>
+          <w:b w:val="0"/>
+          <w:i w:val="0"/>
+          <w:sz w:val="21"/>
+          <w:rFonts w:eastAsia="宋体" w:ascii="Times New Roman" w:hAnsi="Times New Roman"/>
+        </w:rPr>
+        <w:t>[43] Composite denoising-based LSTM prediction method of supercapacitor performance degradation law and remaining useful life. Circuit World (Emerald), 2024, DOI: 10.1108/CW-12-2023-0459.（作者建议核验）</w:t>
+      </w:r>
+    </w:p>
+    <w:p>
+      <w:pPr>
+        <w:spacing w:line="312" w:lineRule="auto" w:after="40"/>
+        <w:ind w:left="510" w:hanging="510"/>
+        <w:jc w:val="both"/>
+      </w:pPr>
+      <w:r>
+        <w:rPr>
+          <w:b w:val="0"/>
+          <w:i w:val="0"/>
+          <w:sz w:val="21"/>
+          <w:rFonts w:eastAsia="宋体" w:ascii="Times New Roman" w:hAnsi="Times New Roman"/>
+        </w:rPr>
+        <w:t>[44] A physics-informed neural network-based method for predicting degradation trajectories and remaining useful life of supercapacitors. Green Energy and Intelligent Transportation, 2025, DOI: 10.1016/j.geits.2025.100291.</w:t>
+      </w:r>
+    </w:p>
+    <w:p>
+      <w:pPr>
+        <w:spacing w:line="312" w:lineRule="auto" w:after="40"/>
+        <w:ind w:left="510" w:hanging="510"/>
+        <w:jc w:val="both"/>
+      </w:pPr>
+      <w:r>
+        <w:rPr>
+          <w:b w:val="0"/>
+          <w:i w:val="0"/>
+          <w:sz w:val="21"/>
+          <w:rFonts w:eastAsia="宋体" w:ascii="Times New Roman" w:hAnsi="Times New Roman"/>
+        </w:rPr>
+        <w:t>[45] Lifetime prediction and reliability analysis for aluminum electrolytic capacitors in EV charging module based on mission profiles. Frontiers in Electronics, 2023, 4: 1226006, DOI: 10.3389/felec.2023.1226006.</w:t>
+      </w:r>
+    </w:p>
+    <w:p>
+      <w:pPr>
+        <w:spacing w:line="312" w:lineRule="auto" w:after="40"/>
+        <w:ind w:left="510" w:hanging="510"/>
+        <w:jc w:val="both"/>
+      </w:pPr>
+      <w:r>
+        <w:rPr>
+          <w:b w:val="0"/>
+          <w:i w:val="0"/>
+          <w:sz w:val="21"/>
+          <w:rFonts w:eastAsia="宋体" w:ascii="Times New Roman" w:hAnsi="Times New Roman"/>
+        </w:rPr>
+        <w:t>[46] Unveiling first self-healing in metallised film capacitor: A macro–micro analysis. High Voltage (CSEE/IET), 2025.（金属化膜电容自愈宏-微观分析；DOI/卷期建议核验）</w:t>
+      </w:r>
+    </w:p>
+    <w:p>
+      <w:pPr>
+        <w:spacing w:line="312" w:lineRule="auto" w:after="40"/>
+        <w:ind w:left="510" w:hanging="510"/>
+        <w:jc w:val="both"/>
+      </w:pPr>
+      <w:r>
+        <w:rPr>
+          <w:b w:val="0"/>
+          <w:i w:val="0"/>
+          <w:sz w:val="21"/>
+          <w:rFonts w:eastAsia="宋体" w:ascii="Times New Roman" w:hAnsi="Times New Roman"/>
+        </w:rPr>
+        <w:t>[47] Study of the in situ test setup and analysis methods for self-healing properties of metallized film capacitors. Review of Scientific Instruments, 2024, 95(4): 045105, DOI: 10.1063/5.0194057.</w:t>
+      </w:r>
+    </w:p>
+    <w:p>
+      <w:pPr>
+        <w:spacing w:line="312" w:lineRule="auto" w:after="40"/>
+        <w:ind w:left="510" w:hanging="510"/>
+        <w:jc w:val="both"/>
+      </w:pPr>
+      <w:r>
+        <w:rPr>
+          <w:b w:val="0"/>
+          <w:i w:val="0"/>
+          <w:sz w:val="21"/>
+          <w:rFonts w:eastAsia="宋体" w:ascii="Times New Roman" w:hAnsi="Times New Roman"/>
+        </w:rPr>
+        <w:t>[48] Capacitance Evaluation of Metallized Polypropylene Film Capacitors Considering Cumulative Self-Healing Damage. Electronics (MDPI), 2024, 13(14): 2886.</w:t>
+      </w:r>
+    </w:p>
+    <w:p>
+      <w:pPr>
+        <w:spacing w:line="312" w:lineRule="auto" w:after="40"/>
+        <w:ind w:left="510" w:hanging="510"/>
+        <w:jc w:val="both"/>
+      </w:pPr>
+      <w:r>
+        <w:rPr>
+          <w:b w:val="0"/>
+          <w:i w:val="0"/>
+          <w:sz w:val="21"/>
+          <w:rFonts w:eastAsia="宋体" w:ascii="Times New Roman" w:hAnsi="Times New Roman"/>
+        </w:rPr>
+        <w:t>[49] Ma Y, 等. Detection of Self-Healing Discharge in Metallized Film Capacitors Using an Ultrasonic Method. Electronics (MDPI), 2020, 9(11): 1893.</w:t>
+      </w:r>
+    </w:p>
+    <w:p>
+      <w:pPr>
+        <w:spacing w:line="312" w:lineRule="auto" w:after="40"/>
+        <w:ind w:left="510" w:hanging="510"/>
+        <w:jc w:val="both"/>
+      </w:pPr>
+      <w:r>
+        <w:rPr>
+          <w:b w:val="0"/>
+          <w:i w:val="0"/>
+          <w:sz w:val="21"/>
+          <w:rFonts w:eastAsia="宋体" w:ascii="Times New Roman" w:hAnsi="Times New Roman"/>
+        </w:rPr>
+        <w:t>[50] Song W, Yang X, Deng W, 等. Remaining Useful Life Prediction for Power Storage Electronic Components Based on Fractional Weibull Process and Shock Poisson Model. Fractal and Fractional (MDPI), 2024, 8(8): 485.</w:t>
+      </w:r>
+    </w:p>
+    <w:p>
+      <w:pPr>
+        <w:spacing w:line="312" w:lineRule="auto" w:after="40"/>
+        <w:ind w:left="510" w:hanging="510"/>
+        <w:jc w:val="both"/>
+      </w:pPr>
+      <w:r>
+        <w:rPr>
+          <w:b w:val="0"/>
+          <w:i w:val="0"/>
+          <w:sz w:val="21"/>
+          <w:rFonts w:eastAsia="宋体" w:ascii="Times New Roman" w:hAnsi="Times New Roman"/>
+        </w:rPr>
+        <w:t>[51] Challenges and New Trends in Power Electronic Devices Reliability (含中国学者). Electronics (MDPI), 2021, 10(8): 925.</w:t>
+      </w:r>
+    </w:p>
+    <w:p>
+      <w:pPr>
+        <w:spacing w:line="312" w:lineRule="auto" w:after="40"/>
+        <w:ind w:left="510" w:hanging="510"/>
+        <w:jc w:val="both"/>
+      </w:pPr>
+      <w:r>
+        <w:rPr>
+          <w:b w:val="0"/>
+          <w:i w:val="0"/>
+          <w:sz w:val="21"/>
+          <w:rFonts w:eastAsia="宋体" w:ascii="Times New Roman" w:hAnsi="Times New Roman"/>
+        </w:rPr>
+        <w:t>[52] 一种高可靠性电解电容器的制造方法. 中国振华集团新云电子元器件有限责任公司, 中国发明专利 CN105489376B, 2016.</w:t>
+      </w:r>
+    </w:p>
+    <w:p>
+      <w:pPr>
+        <w:spacing w:line="312" w:lineRule="auto" w:after="40"/>
+        <w:ind w:left="510" w:hanging="510"/>
+        <w:jc w:val="both"/>
+      </w:pPr>
+      <w:r>
+        <w:rPr>
+          <w:b w:val="0"/>
+          <w:i w:val="0"/>
+          <w:sz w:val="21"/>
+          <w:rFonts w:eastAsia="宋体" w:ascii="Times New Roman" w:hAnsi="Times New Roman"/>
+        </w:rPr>
+        <w:t>[53] 金属化膜电容器初始自愈类型分类方法与系统. 中国发明专利 CN ZL2023 1 0098802.X（对应 US20240272240A1）, 2023/2024.</w:t>
+      </w:r>
+    </w:p>
+    <w:p>
+      <w:pPr>
+        <w:spacing w:line="312" w:lineRule="auto" w:after="40"/>
+        <w:ind w:left="510" w:hanging="510"/>
+        <w:jc w:val="both"/>
+      </w:pPr>
+      <w:r>
+        <w:rPr>
+          <w:b w:val="0"/>
+          <w:i w:val="0"/>
+          <w:sz w:val="21"/>
+          <w:rFonts w:eastAsia="宋体" w:ascii="Times New Roman" w:hAnsi="Times New Roman"/>
+        </w:rPr>
+        <w:t>[54] 艾华集团（湖南，上交所 603989）. 固态聚合物/多层聚合物铝电解电容器产品与可靠性技术资料（低ESR、不起火良性失效）. 企业技术资料.</w:t>
+      </w:r>
+    </w:p>
+    <w:p>
+      <w:pPr>
+        <w:spacing w:line="312" w:lineRule="auto" w:after="40"/>
+        <w:ind w:left="510" w:hanging="510"/>
+        <w:jc w:val="both"/>
+      </w:pPr>
+      <w:r>
+        <w:rPr>
+          <w:b w:val="0"/>
+          <w:i w:val="0"/>
+          <w:sz w:val="21"/>
+          <w:rFonts w:eastAsia="宋体" w:ascii="Times New Roman" w:hAnsi="Times New Roman"/>
+        </w:rPr>
+        <w:t>[55] 南通江海电容器股份有限公司（深交所 002484）. 铝电解、薄膜（DC-link）、聚合物混合及超级电容器产品与可靠性技术资料. 企业技术资料.</w:t>
+      </w:r>
+    </w:p>
+    <w:p>
+      <w:pPr>
+        <w:spacing w:line="312" w:lineRule="auto" w:after="40"/>
+        <w:ind w:left="510" w:hanging="510"/>
+        <w:jc w:val="both"/>
+      </w:pPr>
+      <w:r>
+        <w:rPr>
+          <w:b w:val="0"/>
+          <w:i w:val="0"/>
+          <w:sz w:val="21"/>
+          <w:rFonts w:eastAsia="宋体" w:ascii="Times New Roman" w:hAnsi="Times New Roman"/>
+        </w:rPr>
+        <w:t>[56] GB/T 2693《电子设备用固定电容器 第1部分：总规范》(等同采用 IEC 60384-1). 中国国家标准（年代/版本建议核验）.</w:t>
+      </w:r>
+    </w:p>
+    <w:p>
+      <w:pPr>
+        <w:spacing w:line="312" w:lineRule="auto" w:after="40"/>
+        <w:ind w:left="510" w:hanging="510"/>
+        <w:jc w:val="both"/>
+      </w:pPr>
+      <w:r>
+        <w:rPr>
+          <w:b w:val="0"/>
+          <w:i w:val="0"/>
+          <w:sz w:val="21"/>
+          <w:rFonts w:eastAsia="宋体" w:ascii="Times New Roman" w:hAnsi="Times New Roman"/>
+        </w:rPr>
+        <w:t>[57] GJB 360《电子及电气元件试验方法》及 GJB 系列高可靠电容器详细规范. 中国国家军用标准（具体编号/年代建议核验）.</w:t>
+      </w:r>
+    </w:p>
+    <w:p>
+      <w:pPr>
+        <w:spacing w:line="312" w:lineRule="auto" w:after="40"/>
+        <w:ind w:left="510" w:hanging="510"/>
+        <w:jc w:val="both"/>
+      </w:pPr>
+      <w:r>
+        <w:rPr>
+          <w:b w:val="0"/>
+          <w:i w:val="0"/>
+          <w:sz w:val="21"/>
+          <w:rFonts w:eastAsia="宋体" w:ascii="Times New Roman" w:hAnsi="Times New Roman"/>
+        </w:rPr>
+        <w:t>[58] 本报告国内研究现状部分（第八章专论）在上述可溯源公开文献基础上撰写，并综合参考了国内高校与研究院所在风电/光伏变流器母线电容在线监测、车规级MLCC裂纹扩展与可靠性、国产固态铝/聚合物电容材料与工艺、金属化膜电容自愈、超级电容循环寿命建模、数据驱动与物理信息RUL预测等方向的公开成果；凡未能确证的DOI、卷期或作者信息均已标注“建议核验”，提交前请在 CNKI / Web of Science / IEEE Xplore 及出版商页面逐条复核并按GB/T 7714统一著录。</w:t>
       </w:r>
     </w:p>
     <w:sectPr>

</xml_diff>

<commit_message>
Redistribute China-domestic research into per-chapter '国内研究进展' subsections (ch2-7) with Chinese literature; remove dedicated chapter, restore original 9-chapter numbering
</commit_message>
<xml_diff>
--- a/电容器可靠性_国内外研究现状_专题综述.docx
+++ b/电容器可靠性_国内外研究现状_专题综述.docx
@@ -2265,7 +2265,7 @@
           <w:sz w:val="24"/>
           <w:rFonts w:eastAsia="宋体" w:ascii="Times New Roman" w:hAnsi="Times New Roman"/>
         </w:rPr>
-        <w:t>在每一个环节内部，本综述均采用"对照式"而非"分割式"写法：即在同一主题下同时呈现国外与国内的代表性进展，明确指出二者在起步时间、研究深度、原创程度、工程落地等方面的差异与互补，并以量化数据（激活能、电压指数、Weibull形状参数、监测精度、预测误差等）支撑对比结论。每一节末尾均设"评述"小段，凝练该环节的共性不足，最终在第十章将这些不足汇聚为若干条研究空白，并逐条对应到学位论文的研究内容。</w:t>
+        <w:t>在每一个环节内部，本综述均采用"对照式"而非"分割式"写法：即在同一主题下同时呈现国外与国内的代表性进展，明确指出二者在起步时间、研究深度、原创程度、工程落地等方面的差异与互补，并以量化数据（激活能、电压指数、Weibull形状参数、监测精度、预测误差等）支撑对比结论。每一节末尾均设"评述"小段，凝练该环节的共性不足，最终在第九章将这些不足汇聚为若干条研究空白，并逐条对应到学位论文的研究内容。</w:t>
       </w:r>
     </w:p>
     <w:p>
@@ -2281,7 +2281,7 @@
           <w:sz w:val="24"/>
           <w:rFonts w:eastAsia="宋体" w:ascii="Times New Roman" w:hAnsi="Times New Roman"/>
         </w:rPr>
-        <w:t>据此，本报告共分十章组织：第一章为引言与综述方法（即本章，承担"立坐标"功能）；第二章对应主线的"器件"环节，分析五类电容器的结构原理与其在系统中的可靠性地位；第三章对应"失效模式"环节；第四章对应"失效机理"环节，是篇幅最大、最具理论深度的一章；第五章对应"可靠性建模"环节；第六章对应"状态监测与寿命预测"环节；第七章从横向应用场景视角补充评述典型领域的可靠性研究现状；第八章设"中国国内研究现状专论"，以固态铝/聚合物电容（SAPC）为重点，集中、系统地梳理国内研究力量、各器件成果、产业自主化与标准化态势；第九章对国内外研究水平进行综合量化对比与发展态势分析；第十章凝练研究空白、给出与研究内容的对接关系并展望未来趋势。</w:t>
+        <w:t>据此，本报告共分九章组织：第一章为引言与综述方法（即本章，承担"立坐标"功能）；第二章对应主线的"器件"环节，分析五类电容器的结构原理与其在系统中的可靠性地位；第三章对应"失效模式"环节；第四章对应"失效机理"环节，是篇幅最大、最具理论深度的一章；第五章对应"可靠性建模"环节；第六章对应"状态监测与寿命预测"环节；第七章从横向应用场景视角补充评述典型领域的可靠性研究现状；第八章对国内外研究水平进行综合量化对比与发展态势分析；第九章凝练研究空白、给出与研究内容的对接关系并展望未来趋势。需特别说明的是，为体现对国内研究的充分重视，本报告在第二至第七章的每一环节均设有"国内研究进展"专节，集中补充中国本土的中文文献与深度分析（涵盖固态铝/聚合物电容、铝电解、MLCC、薄膜与超级电容等），使国内现状的呈现既分布于各环节、又与国际进展形成对照。</w:t>
       </w:r>
     </w:p>
     <w:p>
@@ -3715,7 +3715,7 @@
                 <w:sz w:val="19"/>
                 <w:rFonts w:eastAsia="宋体" w:ascii="Times New Roman" w:hAnsi="Times New Roman"/>
               </w:rPr>
-              <w:t>第十章表22</w:t>
+              <w:t>第九章表18</w:t>
             </w:r>
           </w:p>
         </w:tc>
@@ -5275,7 +5275,7 @@
           <w:sz w:val="24"/>
           <w:rFonts w:eastAsia="宋体" w:ascii="Times New Roman" w:hAnsi="Times New Roman"/>
         </w:rPr>
-        <w:t>然而也应客观看到国内研究的结构性短板。一方面，研究资源较多集中于"应用验证"与"在线监测"等贴近工程的环节，而对器件底层材料与工艺的可靠性物理研究投入相对不足，导致原创机理与判据较少；另一方面，产业界与学术界的数据共享机制尚不健全，器件厂商的工艺—失效数据、整机厂商的现场故障数据多分散且未标准化，制约了高质量可靠性数据库的形成。补齐这两块短板——从"用好器件"走向"理解并定义器件可靠性"，是国内研究实现质的跃升的关键。鉴于国内研究（尤其是与本文最相关的SAPC方向）体量大、特色鲜明，本报告专设第八章"中国国内研究现状专论"，对国内研究力量分布、各器件与各环节成果、产业自主化与标准化态势作集中、系统的梳理与评述。</w:t>
+        <w:t>然而也应客观看到国内研究的结构性短板。一方面，研究资源较多集中于"应用验证"与"在线监测"等贴近工程的环节，而对器件底层材料与工艺的可靠性物理研究投入相对不足，导致原创机理与判据较少；另一方面，产业界与学术界的数据共享机制尚不健全，器件厂商的工艺—失效数据、整机厂商的现场故障数据多分散且未标准化，制约了高质量可靠性数据库的形成。补齐这两块短板——从"用好器件"走向"理解并定义器件可靠性"，是国内研究实现质的跃升的关键。本报告在第三至第七章亦于各环节专设"国内研究进展"小节，对国内在失效模式、失效机理、可靠性建模、状态监测与典型应用等方面的中文文献与深度分析作分布式补充。</w:t>
       </w:r>
     </w:p>
     <w:p>
@@ -6564,7 +6564,7 @@
           <w:sz w:val="24"/>
           <w:rFonts w:eastAsia="宋体" w:ascii="Times New Roman" w:hAnsi="Times New Roman"/>
         </w:rPr>
-        <w:t>从可靠性研究的视角看，自主化不仅是产能问题，更是"可靠性数据主权"问题：谁掌握器件的全流程工艺与长期失效数据，谁就掌握失效率基准与可靠性判据的定义权。国外头部厂商凭借数十年积累的工艺—失效数据库，主导了全球可靠性判据；国内虽在新能源等场景拥有海量真实工况数据，但缺乏面向国产高端器件、口径统一、样本充分的失效率基准库。这一短板将在第十章作为研究空白G-1被明确提出，是国产高端电容可靠性保证体系建设的核心瓶颈之一。</w:t>
+        <w:t>从可靠性研究的视角看，自主化不仅是产能问题，更是"可靠性数据主权"问题：谁掌握器件的全流程工艺与长期失效数据，谁就掌握失效率基准与可靠性判据的定义权。国外头部厂商凭借数十年积累的工艺—失效数据库，主导了全球可靠性判据；国内虽在新能源等场景拥有海量真实工况数据，但缺乏面向国产高端器件、口径统一、样本充分的失效率基准库。这一短板将在第九章作为研究空白G-1被明确提出，是国产高端电容可靠性保证体系建设的核心瓶颈之一。</w:t>
       </w:r>
     </w:p>
     <w:p>
@@ -7968,6 +7968,107 @@
     </w:p>
     <w:p>
       <w:pPr>
+        <w:keepNext/>
+        <w:spacing w:before="160" w:after="120"/>
+        <w:outlineLvl w:val="2"/>
+      </w:pPr>
+      <w:r>
+        <w:rPr>
+          <w:b/>
+          <w:i w:val="0"/>
+          <w:sz w:val="28"/>
+          <w:rFonts w:eastAsia="黑体" w:ascii="Times New Roman" w:hAnsi="Times New Roman"/>
+        </w:rPr>
+        <w:t>3.7 国内研究进展（失效模式的中文文献与深度分析）</w:t>
+      </w:r>
+    </w:p>
+    <w:p>
+      <w:pPr>
+        <w:spacing w:line="360" w:lineRule="auto" w:after="80"/>
+        <w:ind w:firstLine="465"/>
+        <w:jc w:val="both"/>
+      </w:pPr>
+      <w:r>
+        <w:rPr>
+          <w:b w:val="0"/>
+          <w:i w:val="0"/>
+          <w:sz w:val="24"/>
+          <w:rFonts w:eastAsia="宋体" w:ascii="Times New Roman" w:hAnsi="Times New Roman"/>
+        </w:rPr>
+        <w:t>在失效模式环节，国内研究紧扣新能源与电动交通的真实工况，对各类电容器的表观失效形式作了大量场景化研究，并积累了宝贵的现场失效数据。下面按器件类别梳理国内的代表性进展与中文文献。</w:t>
+      </w:r>
+    </w:p>
+    <w:p>
+      <w:pPr>
+        <w:spacing w:line="360" w:lineRule="auto" w:after="80"/>
+        <w:ind w:firstLine="465"/>
+        <w:jc w:val="both"/>
+      </w:pPr>
+      <w:r>
+        <w:rPr>
+          <w:b w:val="0"/>
+          <w:i w:val="0"/>
+          <w:sz w:val="24"/>
+          <w:rFonts w:eastAsia="宋体" w:ascii="Times New Roman" w:hAnsi="Times New Roman"/>
+        </w:rPr>
+        <w:t>铝电解电容（含直流母线电容）方面，国内研究普遍以"电解液蒸发干涸导致容量下降、ESR上升，最终参数漂移失效；异常时防爆阀开启呈开路"为基本失效模式框架，并结合风电/光伏变流器、电动汽车充电模块等强纹波、宽温工况，研究失效时间分布与失效率。例如，面向电动汽车充电模块复杂多变工况的铝电解电容寿命预测与可靠性分析工作，明确指出热点温度计算与寿命模型精度是失效预测的关键瓶颈，体现了国内"以真实工况反推失效模式占比"的研究特色。</w:t>
+      </w:r>
+    </w:p>
+    <w:p>
+      <w:pPr>
+        <w:spacing w:line="360" w:lineRule="auto" w:after="80"/>
+        <w:ind w:firstLine="465"/>
+        <w:jc w:val="both"/>
+      </w:pPr>
+      <w:r>
+        <w:rPr>
+          <w:b w:val="0"/>
+          <w:i w:val="0"/>
+          <w:sz w:val="24"/>
+          <w:rFonts w:eastAsia="宋体" w:ascii="Times New Roman" w:hAnsi="Times New Roman"/>
+        </w:rPr>
+        <w:t>MLCC方面，国内（含高校与车规器件企业）对机械裂纹（flex crack）、绝缘电阻退化与热致开裂等失效模式开展了系统的工程研究，支撑了国产车规MLCC的可靠性验证；金属化薄膜电容方面，国内研究突出"自愈导致的容量缓降（去金属化）"这一独特失效模式，提出了考虑累积自愈损伤的金属化聚丙烯膜电容容量评估方法，并发展了超声、特高频（UHF）与声—电联合的自愈放电检测手段，将"自愈—去金属化—容量损失"的失效链定量化。</w:t>
+      </w:r>
+    </w:p>
+    <w:p>
+      <w:pPr>
+        <w:spacing w:line="360" w:lineRule="auto" w:after="80"/>
+        <w:ind w:firstLine="465"/>
+        <w:jc w:val="both"/>
+      </w:pPr>
+      <w:r>
+        <w:rPr>
+          <w:b w:val="0"/>
+          <w:i w:val="0"/>
+          <w:sz w:val="24"/>
+          <w:rFonts w:eastAsia="宋体" w:ascii="Times New Roman" w:hAnsi="Times New Roman"/>
+        </w:rPr>
+        <w:t>固态铝/聚合物电容（SAPC）方面，国内公开的器件级系统性失效统计仍较少，研究多借鉴高度同构的聚合物钽电容与国际上对聚合物铝（PA/APC）电容的湿热失效结论，即退化以ESR上升、漏电流增大为主而电容量相对稳定；在RUL视角下，国内已提出基于温度测量的钽电容在线剩余寿命预测等方法，为SAPC的失效表征与判据设定提供了可迁移思路。</w:t>
+      </w:r>
+    </w:p>
+    <w:p>
+      <w:pPr>
+        <w:spacing w:line="360" w:lineRule="auto" w:before="80" w:after="120"/>
+        <w:ind w:left="340"/>
+        <w:jc w:val="both"/>
+        <w:pBdr>
+          <w:left w:val="single" w:sz="18" w:space="6" w:color="4472C4"/>
+        </w:pBdr>
+      </w:pPr>
+      <w:r>
+        <w:rPr>
+          <w:b w:val="0"/>
+          <w:i w:val="0"/>
+          <w:sz w:val="23"/>
+          <w:rFonts w:eastAsia="楷体" w:ascii="Times New Roman" w:hAnsi="Times New Roman"/>
+        </w:rPr>
+        <w:br/>
+        <w:t>本节评述：国内失效模式研究"场景驱动、覆盖广、数据真"，在膜电容自愈失效与车规MLCC裂纹等方向尤为活跃；但与国际相比，跨品牌、跨批次的失效模式占比统计与失效阈值（EoL判据）共识仍显不足，尤其SAPC缺乏统一规程下的器件级失效统计，这与本报告G-1、G-2两条研究空白直接呼应。</w:t>
+        <w:br/>
+      </w:r>
+    </w:p>
+    <w:p>
+      <w:pPr>
         <w:spacing w:line="360" w:lineRule="auto" w:after="80"/>
         <w:ind w:firstLine="465"/>
         <w:jc w:val="both"/>
@@ -12403,6 +12504,107 @@
     </w:p>
     <w:p>
       <w:pPr>
+        <w:keepNext/>
+        <w:spacing w:before="160" w:after="120"/>
+        <w:outlineLvl w:val="2"/>
+      </w:pPr>
+      <w:r>
+        <w:rPr>
+          <w:b/>
+          <w:i w:val="0"/>
+          <w:sz w:val="28"/>
+          <w:rFonts w:eastAsia="黑体" w:ascii="Times New Roman" w:hAnsi="Times New Roman"/>
+        </w:rPr>
+        <w:t>4.9 国内研究进展（失效机理的中文文献与深度分析）</w:t>
+      </w:r>
+    </w:p>
+    <w:p>
+      <w:pPr>
+        <w:spacing w:line="360" w:lineRule="auto" w:after="80"/>
+        <w:ind w:firstLine="465"/>
+        <w:jc w:val="both"/>
+      </w:pPr>
+      <w:r>
+        <w:rPr>
+          <w:b w:val="0"/>
+          <w:i w:val="0"/>
+          <w:sz w:val="24"/>
+          <w:rFonts w:eastAsia="宋体" w:ascii="Times New Roman" w:hAnsi="Times New Roman"/>
+        </w:rPr>
+        <w:t>失效机理是国际上长期引领、而国内近年快速追赶并在若干细分方向作出原创贡献的环节。国内研究在MLCC介质机理、金属化膜自愈机理与导电聚合物（SAPC）退化机理三个方向尤为活跃，下面分别评述并给出中文/中国学者文献。</w:t>
+      </w:r>
+    </w:p>
+    <w:p>
+      <w:pPr>
+        <w:spacing w:line="360" w:lineRule="auto" w:after="80"/>
+        <w:ind w:firstLine="465"/>
+        <w:jc w:val="both"/>
+      </w:pPr>
+      <w:r>
+        <w:rPr>
+          <w:b w:val="0"/>
+          <w:i w:val="0"/>
+          <w:sz w:val="24"/>
+          <w:rFonts w:eastAsia="宋体" w:ascii="Times New Roman" w:hAnsi="Times New Roman"/>
+        </w:rPr>
+        <w:t>其一，MLCC的氧空位迁移与晶界机理。国内（以中国科学院深圳先进电子材料研究院、北京大学、华南师范大学等为代表）围绕超薄层BaTiO3基贱金属电极（BME）MLCC，系统研究了介质减薄、氧空位电迁移与绝缘电阻退化之间的关系，并阐明了超薄层BME MLCC的可靠性机理；针对介温稳定性与可靠性的平衡，开展了超薄Ba0.97Ca0.03TiO3基MLCC的可靠性研究。尤其值得一提的是关于晶粒尺寸—可靠性关系的研究：细晶粒MLCC因晶界密度更高，具有更高的晶界/界面激活能与更强的肖特基势垒，从而显著改善偏压稳定性与寿命——这一结论从微结构层面深化了对MLCC寿命机理的认识，是国内在该方向较有分量的原创性贡献。</w:t>
+      </w:r>
+    </w:p>
+    <w:p>
+      <w:pPr>
+        <w:spacing w:line="360" w:lineRule="auto" w:after="80"/>
+        <w:ind w:firstLine="465"/>
+        <w:jc w:val="both"/>
+      </w:pPr>
+      <w:r>
+        <w:rPr>
+          <w:b w:val="0"/>
+          <w:i w:val="0"/>
+          <w:sz w:val="24"/>
+          <w:rFonts w:eastAsia="宋体" w:ascii="Times New Roman" w:hAnsi="Times New Roman"/>
+        </w:rPr>
+        <w:t>其二，金属化薄膜电容的自愈机理。国内在该细分方向已具相当国际显示度：开展了金属化膜电容首次自愈的宏观—微观联合分析，系统研究了方阻、电压上升率等对自愈能量的影响，揭示了金属蒸发对自愈电弧的贡献，并发展了原位自愈测试装置与分析方法；进一步形成了金属化膜电容初始自愈类型分类的发明专利。这些工作把"自愈—去金属化—容量损失—寿命"的机理链不断细化，体现了国内"聚焦细分机理、发展原创表征手段"的研究路径。</w:t>
+      </w:r>
+    </w:p>
+    <w:p>
+      <w:pPr>
+        <w:spacing w:line="360" w:lineRule="auto" w:after="80"/>
+        <w:ind w:firstLine="465"/>
+        <w:jc w:val="both"/>
+      </w:pPr>
+      <w:r>
+        <w:rPr>
+          <w:b w:val="0"/>
+          <w:i w:val="0"/>
+          <w:sz w:val="24"/>
+          <w:rFonts w:eastAsia="宋体" w:ascii="Times New Roman" w:hAnsi="Times New Roman"/>
+        </w:rPr>
+        <w:t>其三，导电聚合物（SAPC）的退化机理。SAPC失效的微观根源在于PEDOT等导电聚合物对湿、热、氧与电应力的敏感性，以及聚合物/氧化膜界面的退化。国内在材料机理上已与国际前沿接轨：针对PEDOT:PSS因PSS强酸性导致器件劣化、长期耐久性差的问题，提出以弱碱对PEDOT:PSS进行"去质子化"以中和酸性、改善铝固态电解电容性能，直击"酸性—腐蚀—去掺杂"这一SAPC可靠性痛点；在工艺上，采用气相聚合制备PEDOT薄膜获得低耗散因子、低漏电与极低ESR的固态电容，验证了原位聚合在填充多孔阳极、构建保形界面方面的优势。这些机理认识为从材料源头抑制SAPC界面退化提供了途径。此外，国内对固体钽电容场致结晶、自愈与热失控竞争等机理亦有跟踪研究。</w:t>
+      </w:r>
+    </w:p>
+    <w:p>
+      <w:pPr>
+        <w:spacing w:line="360" w:lineRule="auto" w:before="80" w:after="120"/>
+        <w:ind w:left="340"/>
+        <w:jc w:val="both"/>
+        <w:pBdr>
+          <w:left w:val="single" w:sz="18" w:space="6" w:color="4472C4"/>
+        </w:pBdr>
+      </w:pPr>
+      <w:r>
+        <w:rPr>
+          <w:b w:val="0"/>
+          <w:i w:val="0"/>
+          <w:sz w:val="23"/>
+          <w:rFonts w:eastAsia="楷体" w:ascii="Times New Roman" w:hAnsi="Times New Roman"/>
+        </w:rPr>
+        <w:br/>
+        <w:t>本节评述：国内机理研究呈"覆盖广、细分深"特点——在MLCC晶粒/氧空位机理、金属化膜自愈机理与PEDOT去质子化等方向已作出原创或近原创贡献；但与国际相比，多应力（湿—热—电—机械）耦合下的机理交互仍以定性或仿真为主，缺乏经实验标定的定量交互项，尤其面向SAPC的"聚合物电导动力学—界面退化—器件ESR/漏电"贯通机理模型尚属空白，这与本报告研究空白G-3直接呼应。</w:t>
+        <w:br/>
+      </w:r>
+    </w:p>
+    <w:p>
+      <w:pPr>
         <w:spacing w:line="360" w:lineRule="auto" w:after="80"/>
         <w:ind w:firstLine="465"/>
         <w:jc w:val="both"/>
@@ -16087,6 +16289,107 @@
     </w:p>
     <w:p>
       <w:pPr>
+        <w:keepNext/>
+        <w:spacing w:before="160" w:after="120"/>
+        <w:outlineLvl w:val="2"/>
+      </w:pPr>
+      <w:r>
+        <w:rPr>
+          <w:b/>
+          <w:i w:val="0"/>
+          <w:sz w:val="28"/>
+          <w:rFonts w:eastAsia="黑体" w:ascii="Times New Roman" w:hAnsi="Times New Roman"/>
+        </w:rPr>
+        <w:t>5.9 国内研究进展（可靠性建模的中文文献与深度分析）</w:t>
+      </w:r>
+    </w:p>
+    <w:p>
+      <w:pPr>
+        <w:spacing w:line="360" w:lineRule="auto" w:after="80"/>
+        <w:ind w:firstLine="465"/>
+        <w:jc w:val="both"/>
+      </w:pPr>
+      <w:r>
+        <w:rPr>
+          <w:b w:val="0"/>
+          <w:i w:val="0"/>
+          <w:sz w:val="24"/>
+          <w:rFonts w:eastAsia="宋体" w:ascii="Times New Roman" w:hAnsi="Times New Roman"/>
+        </w:rPr>
+        <w:t>在可靠性建模环节，国内研究呈现"统计/随机过程—数据驱动—物理融合"三线并进、规模跟进迅速的态势，并在新能源场景的工程化建模上形成特色。下面分类梳理国内代表性工作。</w:t>
+      </w:r>
+    </w:p>
+    <w:p>
+      <w:pPr>
+        <w:spacing w:line="360" w:lineRule="auto" w:after="80"/>
+        <w:ind w:firstLine="465"/>
+        <w:jc w:val="both"/>
+      </w:pPr>
+      <w:r>
+        <w:rPr>
+          <w:b w:val="0"/>
+          <w:i w:val="0"/>
+          <w:sz w:val="24"/>
+          <w:rFonts w:eastAsia="宋体" w:ascii="Times New Roman" w:hAnsi="Times New Roman"/>
+        </w:rPr>
+        <w:t>统计与退化随机过程方面，国内将分数阶Weibull过程结合冲击泊松模型用于储能电子元件的剩余寿命预测，增强了对非平稳、含突发冲击退化过程的刻画能力，丰富了退化随机过程建模的工具箱。加速模型方面，国内在沿用Arrhenius、逆幂律、Peck（温湿）等经典模型的同时，结合任务剖面发展了面向电动汽车充电模块的铝电解电容寿命预测方法，并明确指出热点温度计算精度与寿命模型是制约预测准确性的核心瓶颈，体现了"经验模型+真实工况"的工程建模路线。</w:t>
+      </w:r>
+    </w:p>
+    <w:p>
+      <w:pPr>
+        <w:spacing w:line="360" w:lineRule="auto" w:after="80"/>
+        <w:ind w:firstLine="465"/>
+        <w:jc w:val="both"/>
+      </w:pPr>
+      <w:r>
+        <w:rPr>
+          <w:b w:val="0"/>
+          <w:i w:val="0"/>
+          <w:sz w:val="24"/>
+          <w:rFonts w:eastAsia="宋体" w:ascii="Times New Roman" w:hAnsi="Times New Roman"/>
+        </w:rPr>
+        <w:t>数据驱动方面，国内研究规模可观、方法多样：提出了考虑参数分散影响的CNN-LSTM网络用于电容老化状态评估与RUL预测，直面"批次/个体分散导致预测失准"这一工程难题；多种LSTM及其改进（如遗传算法优化的GA-LSTM、改进LSTM）被广泛用于超级电容等器件的寿命预测，并在不同温度等工况下验证了精度与鲁棒性。物理—数据融合方面，国内已起步并紧跟前沿：以LSTM为基架、嵌入退化物理约束的物理信息神经网络（PINN）被用于超级电容退化轨迹与RUL预测，代表了国内在"强物理嵌入"范式上的积极探索。</w:t>
+      </w:r>
+    </w:p>
+    <w:p>
+      <w:pPr>
+        <w:spacing w:line="360" w:lineRule="auto" w:after="80"/>
+        <w:ind w:firstLine="465"/>
+        <w:jc w:val="both"/>
+      </w:pPr>
+      <w:r>
+        <w:rPr>
+          <w:b w:val="0"/>
+          <w:i w:val="0"/>
+          <w:sz w:val="24"/>
+          <w:rFonts w:eastAsia="宋体" w:ascii="Times New Roman" w:hAnsi="Times New Roman"/>
+        </w:rPr>
+        <w:t>将上述工作横向归纳：国内建模研究在"数据驱动"维度的规模与速度已接近国际，在"物理—数据融合（PINN）"维度也已起步；但原创性的失效物理寿命模型（如带齐全激活能谱、可外推的第一性机理模型）较少，强物理嵌入范式整体仍处跟随，且面向SAPC等具体器件、含真实多应力工况的专用退化数据集与公开基准缺位，制约了方法的公平比较与可复现验证。</w:t>
+      </w:r>
+    </w:p>
+    <w:p>
+      <w:pPr>
+        <w:spacing w:line="360" w:lineRule="auto" w:before="80" w:after="120"/>
+        <w:ind w:left="340"/>
+        <w:jc w:val="both"/>
+        <w:pBdr>
+          <w:left w:val="single" w:sz="18" w:space="6" w:color="4472C4"/>
+        </w:pBdr>
+      </w:pPr>
+      <w:r>
+        <w:rPr>
+          <w:b w:val="0"/>
+          <w:i w:val="0"/>
+          <w:sz w:val="23"/>
+          <w:rFonts w:eastAsia="楷体" w:ascii="Times New Roman" w:hAnsi="Times New Roman"/>
+        </w:rPr>
+        <w:br/>
+        <w:t>本节评述：国内建模"工具箱同步、原创深度待强"。最突出的短板是缺乏面向SAPC的专用退化数据集与统一评价基准，使先进的随机过程/数据驱动/PINN方法难以在SAPC上充分标定与验证；同时多应力耦合的可辨识定量建模仍是国内外共同难点。这两点与本报告研究空白G-3、G-4直接呼应，指向"物理—数据混合、可解释、强泛化"的寿命建模方向。</w:t>
+        <w:br/>
+      </w:r>
+    </w:p>
+    <w:p>
+      <w:pPr>
         <w:spacing w:line="360" w:lineRule="auto" w:after="80"/>
         <w:ind w:firstLine="465"/>
         <w:jc w:val="both"/>
@@ -18720,6 +19023,107 @@
     </w:p>
     <w:p>
       <w:pPr>
+        <w:keepNext/>
+        <w:spacing w:before="160" w:after="120"/>
+        <w:outlineLvl w:val="2"/>
+      </w:pPr>
+      <w:r>
+        <w:rPr>
+          <w:b/>
+          <w:i w:val="0"/>
+          <w:sz w:val="28"/>
+          <w:rFonts w:eastAsia="黑体" w:ascii="Times New Roman" w:hAnsi="Times New Roman"/>
+        </w:rPr>
+        <w:t>6.7 国内研究进展（状态监测与寿命预测的中文文献与深度分析）</w:t>
+      </w:r>
+    </w:p>
+    <w:p>
+      <w:pPr>
+        <w:spacing w:line="360" w:lineRule="auto" w:after="80"/>
+        <w:ind w:firstLine="465"/>
+        <w:jc w:val="both"/>
+      </w:pPr>
+      <w:r>
+        <w:rPr>
+          <w:b w:val="0"/>
+          <w:i w:val="0"/>
+          <w:sz w:val="24"/>
+          <w:rFonts w:eastAsia="宋体" w:ascii="Times New Roman" w:hAnsi="Times New Roman"/>
+        </w:rPr>
+        <w:t>状态监测与寿命预测是国内研究工程落地最强的环节，得益于新能源、电动交通等场景对在线监测与预测性维护的迫切需求。国内研究在直流母线电容在线辨识、温度法RUL与数据驱动RUL等方向积累了丰富成果。</w:t>
+      </w:r>
+    </w:p>
+    <w:p>
+      <w:pPr>
+        <w:spacing w:line="360" w:lineRule="auto" w:after="80"/>
+        <w:ind w:firstLine="465"/>
+        <w:jc w:val="both"/>
+      </w:pPr>
+      <w:r>
+        <w:rPr>
+          <w:b w:val="0"/>
+          <w:i w:val="0"/>
+          <w:sz w:val="24"/>
+          <w:rFonts w:eastAsia="宋体" w:ascii="Times New Roman" w:hAnsi="Times New Roman"/>
+        </w:rPr>
+        <w:t>直流母线电容在线监测方面，重庆大学等团队提出了适用于AC/DC与DC/DC变换器的"灰箱（grey-box）"在线监测方法，巧妙利用直流母线电压暂态近似并联RLC零状态响应这一特征，无需额外硬件即可在线估计电容C与等效串联电阻ESR，体现了"复用变换器自身信号"的工程智慧；此外，基于递归最小二乘（RLS）等算法、利用电机驱动再生制动等工况实现DC-link电容在线辨识的方法也被提出，进一步降低了监测的侵入性。这些方法在风电/光伏变流器与电机驱动等场景具有良好的可部署性。</w:t>
+      </w:r>
+    </w:p>
+    <w:p>
+      <w:pPr>
+        <w:spacing w:line="360" w:lineRule="auto" w:after="80"/>
+        <w:ind w:firstLine="465"/>
+        <w:jc w:val="both"/>
+      </w:pPr>
+      <w:r>
+        <w:rPr>
+          <w:b w:val="0"/>
+          <w:i w:val="0"/>
+          <w:sz w:val="24"/>
+          <w:rFonts w:eastAsia="宋体" w:ascii="Times New Roman" w:hAnsi="Times New Roman"/>
+        </w:rPr>
+        <w:t>寿命预测方面，国内针对钽电容提出了基于温度测量的在线剩余寿命预测方法，体现"以易测温度信号反演退化状态"的实用思路；针对超级电容，提出了基于复合去噪与LSTM的性能退化规律与RUL预测、以及遗传算法优化LSTM（GA-LSTM）等方法，并以LSTM为基架嵌入物理约束的PINN方法预测退化轨迹与RUL。在工程集成上，国内在新能源场景推广了关键频点法与"边—云协同"的健康管理架构，强调监测系统的低侵入与现场可用性。</w:t>
+      </w:r>
+    </w:p>
+    <w:p>
+      <w:pPr>
+        <w:spacing w:line="360" w:lineRule="auto" w:after="80"/>
+        <w:ind w:firstLine="465"/>
+        <w:jc w:val="both"/>
+      </w:pPr>
+      <w:r>
+        <w:rPr>
+          <w:b w:val="0"/>
+          <w:i w:val="0"/>
+          <w:sz w:val="24"/>
+          <w:rFonts w:eastAsia="宋体" w:ascii="Times New Roman" w:hAnsi="Times New Roman"/>
+        </w:rPr>
+        <w:t>需要特别指出的是，SAPC因ESR基线极低（毫欧级），对在线辨识精度与温度/频率折算提出了更高要求——这是国内（也是国际）监测研究面向SAPC时尚未充分解决的难点；现有方法多在铝电解、薄膜或超容上验证，面向SAPC的高精度变工况在线辨识与稳健RUL预测仍待突破。</w:t>
+      </w:r>
+    </w:p>
+    <w:p>
+      <w:pPr>
+        <w:spacing w:line="360" w:lineRule="auto" w:before="80" w:after="120"/>
+        <w:ind w:left="340"/>
+        <w:jc w:val="both"/>
+        <w:pBdr>
+          <w:left w:val="single" w:sz="18" w:space="6" w:color="4472C4"/>
+        </w:pBdr>
+      </w:pPr>
+      <w:r>
+        <w:rPr>
+          <w:b w:val="0"/>
+          <w:i w:val="0"/>
+          <w:sz w:val="23"/>
+          <w:rFonts w:eastAsia="楷体" w:ascii="Times New Roman" w:hAnsi="Times New Roman"/>
+        </w:rPr>
+        <w:br/>
+        <w:t>本节评述：国内监测研究"工程落地强、场景覆盖广"，在灰箱/RLS在线辨识与边云协同部署上具备独特优势；但原创辨识理论相对较少，且面向SAPC极低ESR的高精度在线监测、以及跨工况/跨个体的RUL泛化能力仍显不足，这与本报告研究空白G-4直接呼应，指向"物理可解释、强泛化的混合寿命预测"方向。</w:t>
+        <w:br/>
+      </w:r>
+    </w:p>
+    <w:p>
+      <w:pPr>
         <w:spacing w:line="360" w:lineRule="auto" w:after="80"/>
         <w:ind w:firstLine="465"/>
         <w:jc w:val="both"/>
@@ -20092,6 +20496,22 @@
     </w:p>
     <w:p>
       <w:pPr>
+        <w:keepNext/>
+        <w:spacing w:before="160" w:after="120"/>
+        <w:outlineLvl w:val="2"/>
+      </w:pPr>
+      <w:r>
+        <w:rPr>
+          <w:b/>
+          <w:i w:val="0"/>
+          <w:sz w:val="28"/>
+          <w:rFonts w:eastAsia="黑体" w:ascii="Times New Roman" w:hAnsi="Times New Roman"/>
+        </w:rPr>
+        <w:t>7.7 国内研究进展（应用场景、产业与标准的中文文献与深度分析）</w:t>
+      </w:r>
+    </w:p>
+    <w:p>
+      <w:pPr>
         <w:spacing w:line="360" w:lineRule="auto" w:after="80"/>
         <w:ind w:firstLine="465"/>
         <w:jc w:val="both"/>
@@ -20103,6 +20523,91 @@
           <w:sz w:val="24"/>
           <w:rFonts w:eastAsia="宋体" w:ascii="Times New Roman" w:hAnsi="Times New Roman"/>
         </w:rPr>
+        <w:t>应用场景是国内研究最具优势的维度：依托全球规模最大的新能源与电动交通装机，国内积累了海量真实工况数据，并形成了较完整的电容器产业链与自主化能力。下面从应用研究、产业与标准三方面梳理国内进展。</w:t>
+      </w:r>
+    </w:p>
+    <w:p>
+      <w:pPr>
+        <w:spacing w:line="360" w:lineRule="auto" w:after="80"/>
+        <w:ind w:firstLine="465"/>
+        <w:jc w:val="both"/>
+      </w:pPr>
+      <w:r>
+        <w:rPr>
+          <w:b w:val="0"/>
+          <w:i w:val="0"/>
+          <w:sz w:val="24"/>
+          <w:rFonts w:eastAsia="宋体" w:ascii="Times New Roman" w:hAnsi="Times New Roman"/>
+        </w:rPr>
+        <w:t>应用研究方面，国内围绕风电/光伏变流器直流母线电容的在线监测与寿命评估、电动汽车电驱与充电模块的任务剖面寿命预测与温振耦合可靠性、轨道交通牵引用长寿命薄膜电容的健康管理等开展了大量工程研究；面向数据中心与消费电子，固态聚合物（SAPC）凭借低ESR、优良高频特性被广泛用于CPU/GPU供电去耦与固态硬盘。这些研究紧扣"长寿命、高可用、强工况"的应用诉求，落地性强。</w:t>
+      </w:r>
+    </w:p>
+    <w:p>
+      <w:pPr>
+        <w:spacing w:line="360" w:lineRule="auto" w:after="80"/>
+        <w:ind w:firstLine="465"/>
+        <w:jc w:val="both"/>
+      </w:pPr>
+      <w:r>
+        <w:rPr>
+          <w:b w:val="0"/>
+          <w:i w:val="0"/>
+          <w:sz w:val="24"/>
+          <w:rFonts w:eastAsia="宋体" w:ascii="Times New Roman" w:hAnsi="Times New Roman"/>
+        </w:rPr>
+        <w:t>产业与自主化方面，国内已形成以艾华集团（湖南，上交所603989，成立于1985年）、南通江海（深交所002484，成立于1958年）等为代表的龙头企业：艾华的产品线已涵盖固态聚合物、SMT聚合物与多层聚合物铝电容，以低ESR、优良频率稳定性与"不起火"的良性失效著称，部分高可靠产品面向航天等高端场景；江海作为国内最大的铝电解/薄膜/储能电容制造商之一，产品涵盖聚合物及聚合物混合电容、DC-link薄膜与超级电容，形成了从阳极箔蚀刻化成到成品的完整链条；振华新云等在高可靠电解电容制造工艺上拥有自主专利。这些企业掌握的全流程工艺与长期失效数据，是国内最宝贵、却尚未充分向学术界开放的可靠性数据资源。作为对照，国际上NASA对层叠铝聚合物电容（APC）替代片式钽的可靠性评估表明该类器件公开可靠性数据稀缺、且多集中于湿度影响——这一判断对国内SAPC研究同样适用。</w:t>
+      </w:r>
+    </w:p>
+    <w:p>
+      <w:pPr>
+        <w:spacing w:line="360" w:lineRule="auto" w:after="80"/>
+        <w:ind w:firstLine="465"/>
+        <w:jc w:val="both"/>
+      </w:pPr>
+      <w:r>
+        <w:rPr>
+          <w:b w:val="0"/>
+          <w:i w:val="0"/>
+          <w:sz w:val="24"/>
+          <w:rFonts w:eastAsia="宋体" w:ascii="Times New Roman" w:hAnsi="Times New Roman"/>
+        </w:rPr>
+        <w:t>标准与"数据主权"方面，国内长期以采标、等同转化国际标准为主：固定电容器通用要求多对应GB/T 2693（等同采用IEC 60384-1），高可靠与军用领域则有GJB 360（电子及电气元件试验方法）等国军标系列；近年国内在新能源、电动汽车等优势场景开始参与甚至牵头部分标准，话语权稳步提升，但在高可靠、车规、宇航等高端领域仍处跟随地位。更深层的问题是：谁掌握器件全流程工艺与长期失效数据，谁就掌握失效率基准与可靠性判据的定义权；国内虽拥有海量真实工况数据，却缺乏面向国产高端器件（含SAPC）、口径统一、样本充分的失效率基准库，且产学研之间存在数据壁垒。</w:t>
+      </w:r>
+    </w:p>
+    <w:p>
+      <w:pPr>
+        <w:spacing w:line="360" w:lineRule="auto" w:before="80" w:after="120"/>
+        <w:ind w:left="340"/>
+        <w:jc w:val="both"/>
+        <w:pBdr>
+          <w:left w:val="single" w:sz="18" w:space="6" w:color="4472C4"/>
+        </w:pBdr>
+      </w:pPr>
+      <w:r>
+        <w:rPr>
+          <w:b w:val="0"/>
+          <w:i w:val="0"/>
+          <w:sz w:val="23"/>
+          <w:rFonts w:eastAsia="楷体" w:ascii="Times New Roman" w:hAnsi="Times New Roman"/>
+        </w:rPr>
+        <w:br/>
+        <w:t>本节评述：应用层面，国内呈"海量数据在内、高后果规范在外"的格局——在新能源、电动交通、轨交等大规模场景的真实工况数据与工程落地上具备独特优势，但在航天/车规等高后果场景的可靠性保证规范、判据与失效率基准上仍跟随国际。建立产学研共享的国产器件（尤其SAPC）失效数据库与判据体系，是国内由"可靠性大国"迈向"可靠性强国"的关键，与研究空白G-1在战略层面呼应。</w:t>
+        <w:br/>
+      </w:r>
+    </w:p>
+    <w:p>
+      <w:pPr>
+        <w:spacing w:line="360" w:lineRule="auto" w:after="80"/>
+        <w:ind w:firstLine="465"/>
+        <w:jc w:val="both"/>
+      </w:pPr>
+      <w:r>
+        <w:rPr>
+          <w:b w:val="0"/>
+          <w:i w:val="0"/>
+          <w:sz w:val="24"/>
+          <w:rFonts w:eastAsia="宋体" w:ascii="Times New Roman" w:hAnsi="Times New Roman"/>
+        </w:rPr>
         <w:t>横向的应用场景评述与纵向的五环节主线相互补充，共同构成了电容器可靠性研究现状的完整图景。下一章将在纵横两个维度的基础上，对国内外研究水平作综合量化对比与发展态势分析。</w:t>
       </w:r>
     </w:p>
@@ -20124,7 +20629,7 @@
           <w:sz w:val="32"/>
           <w:rFonts w:eastAsia="黑体" w:ascii="Times New Roman" w:hAnsi="Times New Roman"/>
         </w:rPr>
-        <w:t>第八章 中国国内研究现状专论——以固态铝/聚合物电容（SAPC）为重点</w:t>
+        <w:t>第八章 国内外研究水平综合量化对比与发展态势</w:t>
       </w:r>
     </w:p>
     <w:p>
@@ -20140,7 +20645,7 @@
           <w:sz w:val="24"/>
           <w:rFonts w:eastAsia="宋体" w:ascii="Times New Roman" w:hAnsi="Times New Roman"/>
         </w:rPr>
-        <w:t>前述第二至第七章在每一环节均设有"国内研究进展"小节，但受篇幅与结构所限，国内现状的论述较为概要，对固态铝电解/聚合物电容（Solid Aluminum Polymer Capacitor，下文统称SAPC）这一与本文研究最直接相关的器件，国内文献的覆盖尤显不足。鉴于国内研究近十余年增长迅猛、且在新能源与电动交通的牵引下形成了鲜明特色，有必要单设专章，集中梳理中国国内的研究力量分布、各器件与各环节的代表性成果、产业自主化与标准化态势，并给出量化评述。本章的组织顺序为：先总览国内研究格局（8.1、8.2），再以SAPC为核心、兼及铝电解/MLCC/薄膜/钽/超容分器件评述（8.3–8.7），随后专论建模与数据驱动方法的国内进展（8.8）、标准与自主化（8.9），最后作特点—贡献—不足的综合评述（8.10）。</w:t>
+        <w:t>前述各章已从纵向主线（第二至六章）与横向应用场景（第七章）两个维度评述了国内外研究现状。本章在此基础上作横向综合：先以总表与雷达图给出五环节的国内外水平量化对比（8.1、8.3），再从文献计量角度刻画研究热点的演进趋势（8.2），最后以研究演进时间轴勾勒领域发展脉络（8.4），从而为第九章凝练研究空白提供全局视野。</w:t>
       </w:r>
     </w:p>
     <w:p>
@@ -20156,7 +20661,7 @@
           <w:sz w:val="28"/>
           <w:rFonts w:eastAsia="黑体" w:ascii="Times New Roman" w:hAnsi="Times New Roman"/>
         </w:rPr>
-        <w:t>8.1 为何需要专章梳理国内研究</w:t>
+        <w:t>8.1 五环节国内外水平综合对比</w:t>
       </w:r>
     </w:p>
     <w:p>
@@ -20172,181 +20677,7 @@
           <w:sz w:val="24"/>
           <w:rFonts w:eastAsia="宋体" w:ascii="Times New Roman" w:hAnsi="Times New Roman"/>
         </w:rPr>
-        <w:t>将国内研究单列专章，主要基于三点考虑。其一是相关性：SAPC以蚀刻铝箔/Al2O3为介质、以PEDOT等导电聚合物为固态阴极，兼具低ESR、优良高频与温度特性以及"不起火"的良性失效特征，是本文研究的核心对象；而国内在该器件上的材料、工艺、失效与可靠性研究散见于材料化学、电力电子与可靠性工程等不同学科，亟需系统整合。其二是体量与特色：国内研究在"双碳"目标与新能源装备需求牵引下呈爆发式增长，并形成了"海量真实工况数据+强工程落地"的独特优势，单设专章方能完整呈现这一格局。其三是问题导向：唯有把国内现状梳理清楚，才能准确识别国内研究相对国际前沿的差距与空白（第十章将据此凝练研究空白并对接本文研究内容）。</w:t>
-      </w:r>
-    </w:p>
-    <w:p>
-      <w:pPr>
-        <w:spacing w:line="360" w:lineRule="auto" w:after="80"/>
-        <w:ind w:firstLine="465"/>
-        <w:jc w:val="both"/>
-      </w:pPr>
-      <w:r>
-        <w:rPr>
-          <w:b w:val="0"/>
-          <w:i w:val="0"/>
-          <w:sz w:val="24"/>
-          <w:rFonts w:eastAsia="宋体" w:ascii="Times New Roman" w:hAnsi="Times New Roman"/>
-        </w:rPr>
-        <w:t>需要说明的是，本章坚持文献诚信：所引国内成果均以可溯源的公开文献、企业技术资料或国家/行业标准为依据，凡未能确证的DOI、卷期或作者信息，均在参考文献中标注"建议核验"，未作虚构；对以"高校/院所/企业"作概括描述之处，意在刻画研究格局而非为具体团队排名。</w:t>
-      </w:r>
-    </w:p>
-    <w:p>
-      <w:pPr>
-        <w:keepNext/>
-        <w:spacing w:before="160" w:after="120"/>
-        <w:outlineLvl w:val="2"/>
-      </w:pPr>
-      <w:r>
-        <w:rPr>
-          <w:b/>
-          <w:i w:val="0"/>
-          <w:sz w:val="28"/>
-          <w:rFonts w:eastAsia="黑体" w:ascii="Times New Roman" w:hAnsi="Times New Roman"/>
-        </w:rPr>
-        <w:t>8.2 国内研究力量分布与发展脉络</w:t>
-      </w:r>
-    </w:p>
-    <w:p>
-      <w:pPr>
-        <w:spacing w:line="360" w:lineRule="auto" w:after="80"/>
-        <w:ind w:firstLine="465"/>
-        <w:jc w:val="both"/>
-      </w:pPr>
-      <w:r>
-        <w:rPr>
-          <w:b w:val="0"/>
-          <w:i w:val="0"/>
-          <w:sz w:val="24"/>
-          <w:rFonts w:eastAsia="宋体" w:ascii="Times New Roman" w:hAnsi="Times New Roman"/>
-        </w:rPr>
-        <w:t>从研究力量看，国内电容器可靠性研究大致由三股力量构成、并相互支撑。一是高校与院所的基础与方法研究：在电力电子与可靠性方向，重庆大学、西安交通大学、华中科技大学、哈尔滨工业大学、浙江大学、清华大学、天津大学等在直流母线电容在线监测、寿命建模与状态评估方面积累深厚；在材料与器件方向，中国科学院相关研究院所（如深圳先进电子材料研究院）、北京大学、华南师范大学等在BaTiO3基MLCC介质与可靠性机理上贡献突出。二是企业与工程院所的器件与工艺研究：以艾华集团、南通江海、振华新云等为代表的电容器企业，以及电子元器件可靠性相关检测/认证机构，掌握着器件全流程工艺与长期失效数据。三是新能源与交通装备整机企业：在风电、光伏、电动汽车、轨道交通等场景中积累了海量真实工况与现场失效数据。三股力量的协同程度，直接决定国内研究能否从"用好器件"走向"理解并定义器件可靠性"（其分布示意见图31）。</w:t>
-      </w:r>
-    </w:p>
-    <w:p>
-      <w:pPr>
-        <w:spacing w:before="120" w:after="40"/>
-        <w:jc w:val="center"/>
-      </w:pPr>
-      <w:r>
-        <w:drawing>
-          <wp:inline xmlns:a="http://schemas.openxmlformats.org/drawingml/2006/main" xmlns:pic="http://schemas.openxmlformats.org/drawingml/2006/picture">
-            <wp:extent cx="5220000" cy="2012578"/>
-            <wp:docPr id="31" name="Picture 31"/>
-            <wp:cNvGraphicFramePr>
-              <a:graphicFrameLocks noChangeAspect="1"/>
-            </wp:cNvGraphicFramePr>
-            <a:graphic>
-              <a:graphicData uri="http://schemas.openxmlformats.org/drawingml/2006/picture">
-                <pic:pic>
-                  <pic:nvPicPr>
-                    <pic:cNvPr id="0" name="fig_cn_landscape.png"/>
-                    <pic:cNvPicPr/>
-                  </pic:nvPicPr>
-                  <pic:blipFill>
-                    <a:blip r:embed="rId41"/>
-                    <a:stretch>
-                      <a:fillRect/>
-                    </a:stretch>
-                  </pic:blipFill>
-                  <pic:spPr>
-                    <a:xfrm>
-                      <a:off x="0" y="0"/>
-                      <a:ext cx="5220000" cy="2012578"/>
-                    </a:xfrm>
-                    <a:prstGeom prst="rect"/>
-                  </pic:spPr>
-                </pic:pic>
-              </a:graphicData>
-            </a:graphic>
-          </wp:inline>
-        </w:drawing>
-      </w:r>
-    </w:p>
-    <w:p>
-      <w:pPr>
-        <w:spacing w:after="160"/>
-        <w:jc w:val="center"/>
-      </w:pPr>
-      <w:r>
-        <w:rPr>
-          <w:b/>
-          <w:i w:val="0"/>
-          <w:sz w:val="21"/>
-          <w:rFonts w:eastAsia="黑体" w:ascii="Times New Roman" w:hAnsi="Times New Roman"/>
-        </w:rPr>
-        <w:t>图 31  国内研究力量与研究主题活跃度示意（基于公开文献的定性归纳）</w:t>
-      </w:r>
-    </w:p>
-    <w:p>
-      <w:pPr>
-        <w:spacing w:line="360" w:lineRule="auto" w:after="80"/>
-        <w:ind w:firstLine="465"/>
-        <w:jc w:val="both"/>
-      </w:pPr>
-      <w:r>
-        <w:rPr>
-          <w:b w:val="0"/>
-          <w:i w:val="0"/>
-          <w:sz w:val="24"/>
-          <w:rFonts w:eastAsia="宋体" w:ascii="Times New Roman" w:hAnsi="Times New Roman"/>
-        </w:rPr>
-        <w:t>从发展脉络看，国内研究大体经历三个阶段：2010年前以跟踪国外方法、开展器件选型与降额应用为主；2010—2016年随新能源并网与电动交通起步，转向母线电容在线监测与寿命评估的工程化研究；2016年至今，在"双碳"与高端制造（如"中国制造2025"对关键基础元器件的部署）牵引下，研究在数据驱动RUL预测、物理信息神经网络（PINN）、国产固态/聚合物电容材料与工艺、MLCC可靠性机理等方向快速铺开，论文数量已接近国际先进水平（年度增长示意见图32）。这一脉络与全球"经验—机理—监测—数据智能"的范式演进基本同步，但国内在原创机理与判据定义上的起步明显晚于欧美日。</w:t>
-      </w:r>
-    </w:p>
-    <w:p>
-      <w:pPr>
-        <w:spacing w:before="120" w:after="40"/>
-        <w:jc w:val="center"/>
-      </w:pPr>
-      <w:r>
-        <w:drawing>
-          <wp:inline xmlns:a="http://schemas.openxmlformats.org/drawingml/2006/main" xmlns:pic="http://schemas.openxmlformats.org/drawingml/2006/picture">
-            <wp:extent cx="5220000" cy="3212308"/>
-            <wp:docPr id="32" name="Picture 32"/>
-            <wp:cNvGraphicFramePr>
-              <a:graphicFrameLocks noChangeAspect="1"/>
-            </wp:cNvGraphicFramePr>
-            <a:graphic>
-              <a:graphicData uri="http://schemas.openxmlformats.org/drawingml/2006/picture">
-                <pic:pic>
-                  <pic:nvPicPr>
-                    <pic:cNvPr id="0" name="fig_cn_growth.png"/>
-                    <pic:cNvPicPr/>
-                  </pic:nvPicPr>
-                  <pic:blipFill>
-                    <a:blip r:embed="rId42"/>
-                    <a:stretch>
-                      <a:fillRect/>
-                    </a:stretch>
-                  </pic:blipFill>
-                  <pic:spPr>
-                    <a:xfrm>
-                      <a:off x="0" y="0"/>
-                      <a:ext cx="5220000" cy="3212308"/>
-                    </a:xfrm>
-                    <a:prstGeom prst="rect"/>
-                  </pic:spPr>
-                </pic:pic>
-              </a:graphicData>
-            </a:graphic>
-          </wp:inline>
-        </w:drawing>
-      </w:r>
-    </w:p>
-    <w:p>
-      <w:pPr>
-        <w:spacing w:after="160"/>
-        <w:jc w:val="center"/>
-      </w:pPr>
-      <w:r>
-        <w:rPr>
-          <w:b/>
-          <w:i w:val="0"/>
-          <w:sz w:val="21"/>
-          <w:rFonts w:eastAsia="黑体" w:ascii="Times New Roman" w:hAnsi="Times New Roman"/>
-        </w:rPr>
-        <w:t>图 32  国内电容器可靠性相关公开成果的年度增长示意（定性趋势）</w:t>
+        <w:t>表17将五个环节的国内外研究水平并置对照，给出每一环节国外的优势、国内的优势以及量化差距特征。总体规律可概括为一句话：国外在"原创理论与判据定义"上系统领先，国内在"工程场景与规模化应用"上具备独特优势；论文数量上中国已接近美国，但在原创性、影响力与标准话语权上仍有差距。这一"形似质异"的格局，正是后续研究需要着力突破的方向。</w:t>
       </w:r>
     </w:p>
     <w:p>
@@ -20362,7 +20693,7 @@
           <w:sz w:val="21"/>
           <w:rFonts w:eastAsia="黑体" w:ascii="Times New Roman" w:hAnsi="Times New Roman"/>
         </w:rPr>
-        <w:t>表 17  国内电容器可靠性研究主题—力量—成果—成熟度概览</w:t>
+        <w:t>表 17  五环节国内外研究水平综合对比总表</w:t>
       </w:r>
     </w:p>
     <w:tbl>
@@ -20381,6 +20712,78 @@
       <w:tr>
         <w:tc>
           <w:tcPr>
+            <w:tcW w:type="dxa" w:w="1474"/>
+            <w:tcBorders>
+              <w:top w:val="single" w:sz="14" w:space="0" w:color="000000"/>
+              <w:bottom w:val="single" w:sz="6" w:space="0" w:color="000000"/>
+            </w:tcBorders>
+          </w:tcPr>
+          <w:p>
+            <w:pPr>
+              <w:jc w:val="center"/>
+            </w:pPr>
+            <w:r/>
+            <w:r>
+              <w:rPr>
+                <w:b/>
+                <w:i w:val="0"/>
+                <w:sz w:val="19"/>
+                <w:rFonts w:eastAsia="黑体" w:ascii="Times New Roman" w:hAnsi="Times New Roman"/>
+              </w:rPr>
+              <w:t>研究环节</w:t>
+            </w:r>
+          </w:p>
+        </w:tc>
+        <w:tc>
+          <w:tcPr>
+            <w:tcW w:type="dxa" w:w="2154"/>
+            <w:tcBorders>
+              <w:top w:val="single" w:sz="14" w:space="0" w:color="000000"/>
+              <w:bottom w:val="single" w:sz="6" w:space="0" w:color="000000"/>
+            </w:tcBorders>
+          </w:tcPr>
+          <w:p>
+            <w:pPr>
+              <w:jc w:val="center"/>
+            </w:pPr>
+            <w:r/>
+            <w:r>
+              <w:rPr>
+                <w:b/>
+                <w:i w:val="0"/>
+                <w:sz w:val="19"/>
+                <w:rFonts w:eastAsia="黑体" w:ascii="Times New Roman" w:hAnsi="Times New Roman"/>
+              </w:rPr>
+              <w:t>国外优势</w:t>
+            </w:r>
+          </w:p>
+        </w:tc>
+        <w:tc>
+          <w:tcPr>
+            <w:tcW w:type="dxa" w:w="2154"/>
+            <w:tcBorders>
+              <w:top w:val="single" w:sz="14" w:space="0" w:color="000000"/>
+              <w:bottom w:val="single" w:sz="6" w:space="0" w:color="000000"/>
+            </w:tcBorders>
+          </w:tcPr>
+          <w:p>
+            <w:pPr>
+              <w:jc w:val="center"/>
+            </w:pPr>
+            <w:r/>
+            <w:r>
+              <w:rPr>
+                <w:b/>
+                <w:i w:val="0"/>
+                <w:sz w:val="19"/>
+                <w:rFonts w:eastAsia="黑体" w:ascii="Times New Roman" w:hAnsi="Times New Roman"/>
+              </w:rPr>
+              <w:t>国内优势</w:t>
+            </w:r>
+          </w:p>
+        </w:tc>
+        <w:tc>
+          <w:tcPr>
             <w:tcW w:type="dxa" w:w="1928"/>
             <w:tcBorders>
               <w:top w:val="single" w:sz="14" w:space="0" w:color="000000"/>
@@ -20399,7 +20802,377 @@
                 <w:sz w:val="19"/>
                 <w:rFonts w:eastAsia="黑体" w:ascii="Times New Roman" w:hAnsi="Times New Roman"/>
               </w:rPr>
-              <w:t>研究主题</w:t>
+              <w:t>量化差距/特征</w:t>
+            </w:r>
+          </w:p>
+        </w:tc>
+      </w:tr>
+      <w:tr>
+        <w:tc>
+          <w:tcPr>
+            <w:tcW w:type="dxa" w:w="1474"/>
+          </w:tcPr>
+          <w:p>
+            <w:pPr>
+              <w:spacing w:line="240" w:lineRule="auto"/>
+              <w:jc w:val="left"/>
+            </w:pPr>
+            <w:r/>
+            <w:r>
+              <w:rPr>
+                <w:b w:val="0"/>
+                <w:i w:val="0"/>
+                <w:sz w:val="19"/>
+                <w:rFonts w:eastAsia="宋体" w:ascii="Times New Roman" w:hAnsi="Times New Roman"/>
+              </w:rPr>
+              <w:t>器件/故障归因</w:t>
+            </w:r>
+          </w:p>
+        </w:tc>
+        <w:tc>
+          <w:tcPr>
+            <w:tcW w:type="dxa" w:w="2154"/>
+          </w:tcPr>
+          <w:p>
+            <w:pPr>
+              <w:spacing w:line="240" w:lineRule="auto"/>
+              <w:jc w:val="left"/>
+            </w:pPr>
+            <w:r/>
+            <w:r>
+              <w:rPr>
+                <w:b w:val="0"/>
+                <w:i w:val="0"/>
+                <w:sz w:val="19"/>
+                <w:rFonts w:eastAsia="宋体" w:ascii="Times New Roman" w:hAnsi="Times New Roman"/>
+              </w:rPr>
+              <w:t>跨品牌长期数据库</w:t>
+            </w:r>
+          </w:p>
+        </w:tc>
+        <w:tc>
+          <w:tcPr>
+            <w:tcW w:type="dxa" w:w="2154"/>
+          </w:tcPr>
+          <w:p>
+            <w:pPr>
+              <w:spacing w:line="240" w:lineRule="auto"/>
+              <w:jc w:val="left"/>
+            </w:pPr>
+            <w:r/>
+            <w:r>
+              <w:rPr>
+                <w:b w:val="0"/>
+                <w:i w:val="0"/>
+                <w:sz w:val="19"/>
+                <w:rFonts w:eastAsia="宋体" w:ascii="Times New Roman" w:hAnsi="Times New Roman"/>
+              </w:rPr>
+              <w:t>新能源海量真实工况</w:t>
+            </w:r>
+          </w:p>
+        </w:tc>
+        <w:tc>
+          <w:tcPr>
+            <w:tcW w:type="dxa" w:w="1928"/>
+          </w:tcPr>
+          <w:p>
+            <w:pPr>
+              <w:spacing w:line="240" w:lineRule="auto"/>
+              <w:jc w:val="left"/>
+            </w:pPr>
+            <w:r/>
+            <w:r>
+              <w:rPr>
+                <w:b w:val="0"/>
+                <w:i w:val="0"/>
+                <w:sz w:val="19"/>
+                <w:rFonts w:eastAsia="宋体" w:ascii="Times New Roman" w:hAnsi="Times New Roman"/>
+              </w:rPr>
+              <w:t>样本规模差1–2数量级</w:t>
+            </w:r>
+          </w:p>
+        </w:tc>
+      </w:tr>
+      <w:tr>
+        <w:tc>
+          <w:tcPr>
+            <w:tcW w:type="dxa" w:w="1474"/>
+          </w:tcPr>
+          <w:p>
+            <w:pPr>
+              <w:spacing w:line="240" w:lineRule="auto"/>
+              <w:jc w:val="left"/>
+            </w:pPr>
+            <w:r/>
+            <w:r>
+              <w:rPr>
+                <w:b w:val="0"/>
+                <w:i w:val="0"/>
+                <w:sz w:val="19"/>
+                <w:rFonts w:eastAsia="宋体" w:ascii="Times New Roman" w:hAnsi="Times New Roman"/>
+              </w:rPr>
+              <w:t>失效模式</w:t>
+            </w:r>
+          </w:p>
+        </w:tc>
+        <w:tc>
+          <w:tcPr>
+            <w:tcW w:type="dxa" w:w="2154"/>
+          </w:tcPr>
+          <w:p>
+            <w:pPr>
+              <w:spacing w:line="240" w:lineRule="auto"/>
+              <w:jc w:val="left"/>
+            </w:pPr>
+            <w:r/>
+            <w:r>
+              <w:rPr>
+                <w:b w:val="0"/>
+                <w:i w:val="0"/>
+                <w:sz w:val="19"/>
+                <w:rFonts w:eastAsia="宋体" w:ascii="Times New Roman" w:hAnsi="Times New Roman"/>
+              </w:rPr>
+              <w:t>7大类标准体系、判据权</w:t>
+            </w:r>
+          </w:p>
+        </w:tc>
+        <w:tc>
+          <w:tcPr>
+            <w:tcW w:type="dxa" w:w="2154"/>
+          </w:tcPr>
+          <w:p>
+            <w:pPr>
+              <w:spacing w:line="240" w:lineRule="auto"/>
+              <w:jc w:val="left"/>
+            </w:pPr>
+            <w:r/>
+            <w:r>
+              <w:rPr>
+                <w:b w:val="0"/>
+                <w:i w:val="0"/>
+                <w:sz w:val="19"/>
+                <w:rFonts w:eastAsia="宋体" w:ascii="Times New Roman" w:hAnsi="Times New Roman"/>
+              </w:rPr>
+              <w:t>国产器件场景化归纳</w:t>
+            </w:r>
+          </w:p>
+        </w:tc>
+        <w:tc>
+          <w:tcPr>
+            <w:tcW w:type="dxa" w:w="1928"/>
+          </w:tcPr>
+          <w:p>
+            <w:pPr>
+              <w:spacing w:line="240" w:lineRule="auto"/>
+              <w:jc w:val="left"/>
+            </w:pPr>
+            <w:r/>
+            <w:r>
+              <w:rPr>
+                <w:b w:val="0"/>
+                <w:i w:val="0"/>
+                <w:sz w:val="19"/>
+                <w:rFonts w:eastAsia="宋体" w:ascii="Times New Roman" w:hAnsi="Times New Roman"/>
+              </w:rPr>
+              <w:t>长期老化数据积累不足</w:t>
+            </w:r>
+          </w:p>
+        </w:tc>
+      </w:tr>
+      <w:tr>
+        <w:tc>
+          <w:tcPr>
+            <w:tcW w:type="dxa" w:w="1474"/>
+          </w:tcPr>
+          <w:p>
+            <w:pPr>
+              <w:spacing w:line="240" w:lineRule="auto"/>
+              <w:jc w:val="left"/>
+            </w:pPr>
+            <w:r/>
+            <w:r>
+              <w:rPr>
+                <w:b w:val="0"/>
+                <w:i w:val="0"/>
+                <w:sz w:val="19"/>
+                <w:rFonts w:eastAsia="宋体" w:ascii="Times New Roman" w:hAnsi="Times New Roman"/>
+              </w:rPr>
+              <w:t>失效机理</w:t>
+            </w:r>
+          </w:p>
+        </w:tc>
+        <w:tc>
+          <w:tcPr>
+            <w:tcW w:type="dxa" w:w="2154"/>
+          </w:tcPr>
+          <w:p>
+            <w:pPr>
+              <w:spacing w:line="240" w:lineRule="auto"/>
+              <w:jc w:val="left"/>
+            </w:pPr>
+            <w:r/>
+            <w:r>
+              <w:rPr>
+                <w:b w:val="0"/>
+                <w:i w:val="0"/>
+                <w:sz w:val="19"/>
+                <w:rFonts w:eastAsia="宋体" w:ascii="Times New Roman" w:hAnsi="Times New Roman"/>
+              </w:rPr>
+              <w:t>第一性原创模型(Ea齐全)</w:t>
+            </w:r>
+          </w:p>
+        </w:tc>
+        <w:tc>
+          <w:tcPr>
+            <w:tcW w:type="dxa" w:w="2154"/>
+          </w:tcPr>
+          <w:p>
+            <w:pPr>
+              <w:spacing w:line="240" w:lineRule="auto"/>
+              <w:jc w:val="left"/>
+            </w:pPr>
+            <w:r/>
+            <w:r>
+              <w:rPr>
+                <w:b w:val="0"/>
+                <w:i w:val="0"/>
+                <w:sz w:val="19"/>
+                <w:rFonts w:eastAsia="宋体" w:ascii="Times New Roman" w:hAnsi="Times New Roman"/>
+              </w:rPr>
+              <w:t>工况验证+有限元仿真</w:t>
+            </w:r>
+          </w:p>
+        </w:tc>
+        <w:tc>
+          <w:tcPr>
+            <w:tcW w:type="dxa" w:w="1928"/>
+          </w:tcPr>
+          <w:p>
+            <w:pPr>
+              <w:spacing w:line="240" w:lineRule="auto"/>
+              <w:jc w:val="left"/>
+            </w:pPr>
+            <w:r/>
+            <w:r>
+              <w:rPr>
+                <w:b w:val="0"/>
+                <w:i w:val="0"/>
+                <w:sz w:val="19"/>
+                <w:rFonts w:eastAsia="宋体" w:ascii="Times New Roman" w:hAnsi="Times New Roman"/>
+              </w:rPr>
+              <w:t>原创物理模型较少</w:t>
+            </w:r>
+          </w:p>
+        </w:tc>
+      </w:tr>
+      <w:tr>
+        <w:tc>
+          <w:tcPr>
+            <w:tcW w:type="dxa" w:w="1474"/>
+          </w:tcPr>
+          <w:p>
+            <w:pPr>
+              <w:spacing w:line="240" w:lineRule="auto"/>
+              <w:jc w:val="left"/>
+            </w:pPr>
+            <w:r/>
+            <w:r>
+              <w:rPr>
+                <w:b w:val="0"/>
+                <w:i w:val="0"/>
+                <w:sz w:val="19"/>
+                <w:rFonts w:eastAsia="宋体" w:ascii="Times New Roman" w:hAnsi="Times New Roman"/>
+              </w:rPr>
+              <w:t>可靠性建模</w:t>
+            </w:r>
+          </w:p>
+        </w:tc>
+        <w:tc>
+          <w:tcPr>
+            <w:tcW w:type="dxa" w:w="2154"/>
+          </w:tcPr>
+          <w:p>
+            <w:pPr>
+              <w:spacing w:line="240" w:lineRule="auto"/>
+              <w:jc w:val="left"/>
+            </w:pPr>
+            <w:r/>
+            <w:r>
+              <w:rPr>
+                <w:b w:val="0"/>
+                <w:i w:val="0"/>
+                <w:sz w:val="19"/>
+                <w:rFonts w:eastAsia="宋体" w:ascii="Times New Roman" w:hAnsi="Times New Roman"/>
+              </w:rPr>
+              <w:t>PoF与PINN引领</w:t>
+            </w:r>
+          </w:p>
+        </w:tc>
+        <w:tc>
+          <w:tcPr>
+            <w:tcW w:type="dxa" w:w="2154"/>
+          </w:tcPr>
+          <w:p>
+            <w:pPr>
+              <w:spacing w:line="240" w:lineRule="auto"/>
+              <w:jc w:val="left"/>
+            </w:pPr>
+            <w:r/>
+            <w:r>
+              <w:rPr>
+                <w:b w:val="0"/>
+                <w:i w:val="0"/>
+                <w:sz w:val="19"/>
+                <w:rFonts w:eastAsia="宋体" w:ascii="Times New Roman" w:hAnsi="Times New Roman"/>
+              </w:rPr>
+              <w:t>数据驱动规模跟进</w:t>
+            </w:r>
+          </w:p>
+        </w:tc>
+        <w:tc>
+          <w:tcPr>
+            <w:tcW w:type="dxa" w:w="1928"/>
+          </w:tcPr>
+          <w:p>
+            <w:pPr>
+              <w:spacing w:line="240" w:lineRule="auto"/>
+              <w:jc w:val="left"/>
+            </w:pPr>
+            <w:r/>
+            <w:r>
+              <w:rPr>
+                <w:b w:val="0"/>
+                <w:i w:val="0"/>
+                <w:sz w:val="19"/>
+                <w:rFonts w:eastAsia="宋体" w:ascii="Times New Roman" w:hAnsi="Times New Roman"/>
+              </w:rPr>
+              <w:t>强物理嵌入范式落后</w:t>
+            </w:r>
+          </w:p>
+        </w:tc>
+      </w:tr>
+      <w:tr>
+        <w:tc>
+          <w:tcPr>
+            <w:tcW w:type="dxa" w:w="1474"/>
+            <w:tcBorders>
+              <w:bottom w:val="single" w:sz="14" w:space="0" w:color="000000"/>
+            </w:tcBorders>
+          </w:tcPr>
+          <w:p>
+            <w:pPr>
+              <w:spacing w:line="240" w:lineRule="auto"/>
+              <w:jc w:val="left"/>
+            </w:pPr>
+            <w:r/>
+            <w:r>
+              <w:rPr>
+                <w:b w:val="0"/>
+                <w:i w:val="0"/>
+                <w:sz w:val="19"/>
+                <w:rFonts w:eastAsia="宋体" w:ascii="Times New Roman" w:hAnsi="Times New Roman"/>
+              </w:rPr>
+              <w:t>状态监测</w:t>
             </w:r>
           </w:p>
         </w:tc>
@@ -20407,79 +21180,8 @@
           <w:tcPr>
             <w:tcW w:type="dxa" w:w="2154"/>
             <w:tcBorders>
-              <w:top w:val="single" w:sz="14" w:space="0" w:color="000000"/>
-              <w:bottom w:val="single" w:sz="6" w:space="0" w:color="000000"/>
+              <w:bottom w:val="single" w:sz="14" w:space="0" w:color="000000"/>
             </w:tcBorders>
-          </w:tcPr>
-          <w:p>
-            <w:pPr>
-              <w:jc w:val="center"/>
-            </w:pPr>
-            <w:r/>
-            <w:r>
-              <w:rPr>
-                <w:b/>
-                <w:i w:val="0"/>
-                <w:sz w:val="19"/>
-                <w:rFonts w:eastAsia="黑体" w:ascii="Times New Roman" w:hAnsi="Times New Roman"/>
-              </w:rPr>
-              <w:t>代表性国内力量（示例）</w:t>
-            </w:r>
-          </w:p>
-        </w:tc>
-        <w:tc>
-          <w:tcPr>
-            <w:tcW w:type="dxa" w:w="2494"/>
-            <w:tcBorders>
-              <w:top w:val="single" w:sz="14" w:space="0" w:color="000000"/>
-              <w:bottom w:val="single" w:sz="6" w:space="0" w:color="000000"/>
-            </w:tcBorders>
-          </w:tcPr>
-          <w:p>
-            <w:pPr>
-              <w:jc w:val="center"/>
-            </w:pPr>
-            <w:r/>
-            <w:r>
-              <w:rPr>
-                <w:b/>
-                <w:i w:val="0"/>
-                <w:sz w:val="19"/>
-                <w:rFonts w:eastAsia="黑体" w:ascii="Times New Roman" w:hAnsi="Times New Roman"/>
-              </w:rPr>
-              <w:t>典型成果方向</w:t>
-            </w:r>
-          </w:p>
-        </w:tc>
-        <w:tc>
-          <w:tcPr>
-            <w:tcW w:type="dxa" w:w="1474"/>
-            <w:tcBorders>
-              <w:top w:val="single" w:sz="14" w:space="0" w:color="000000"/>
-              <w:bottom w:val="single" w:sz="6" w:space="0" w:color="000000"/>
-            </w:tcBorders>
-          </w:tcPr>
-          <w:p>
-            <w:pPr>
-              <w:jc w:val="center"/>
-            </w:pPr>
-            <w:r/>
-            <w:r>
-              <w:rPr>
-                <w:b/>
-                <w:i w:val="0"/>
-                <w:sz w:val="19"/>
-                <w:rFonts w:eastAsia="黑体" w:ascii="Times New Roman" w:hAnsi="Times New Roman"/>
-              </w:rPr>
-              <w:t>成熟度</w:t>
-            </w:r>
-          </w:p>
-        </w:tc>
-      </w:tr>
-      <w:tr>
-        <w:tc>
-          <w:tcPr>
-            <w:tcW w:type="dxa" w:w="1928"/>
           </w:tcPr>
           <w:p>
             <w:pPr>
@@ -20494,13 +21196,16 @@
                 <w:sz w:val="19"/>
                 <w:rFonts w:eastAsia="宋体" w:ascii="Times New Roman" w:hAnsi="Times New Roman"/>
               </w:rPr>
-              <w:t>固态铝/聚合物电容(SAPC)</w:t>
+              <w:t>辨识算法原创、精度高</w:t>
             </w:r>
           </w:p>
         </w:tc>
         <w:tc>
           <w:tcPr>
             <w:tcW w:type="dxa" w:w="2154"/>
+            <w:tcBorders>
+              <w:bottom w:val="single" w:sz="14" w:space="0" w:color="000000"/>
+            </w:tcBorders>
           </w:tcPr>
           <w:p>
             <w:pPr>
@@ -20515,398 +21220,10 @@
                 <w:sz w:val="19"/>
                 <w:rFonts w:eastAsia="宋体" w:ascii="Times New Roman" w:hAnsi="Times New Roman"/>
               </w:rPr>
-              <w:t>高校材料组、艾华/江海等企业</w:t>
-            </w:r>
-          </w:p>
-        </w:tc>
-        <w:tc>
-          <w:tcPr>
-            <w:tcW w:type="dxa" w:w="2494"/>
-          </w:tcPr>
-          <w:p>
-            <w:pPr>
-              <w:spacing w:line="240" w:lineRule="auto"/>
-              <w:jc w:val="left"/>
-            </w:pPr>
-            <w:r/>
-            <w:r>
-              <w:rPr>
-                <w:b w:val="0"/>
-                <w:i w:val="0"/>
-                <w:sz w:val="19"/>
-                <w:rFonts w:eastAsia="宋体" w:ascii="Times New Roman" w:hAnsi="Times New Roman"/>
-              </w:rPr>
-              <w:t>PEDOT去质子化、气相聚合工艺、低ESR器件</w:t>
-            </w:r>
-          </w:p>
-        </w:tc>
-        <w:tc>
-          <w:tcPr>
-            <w:tcW w:type="dxa" w:w="1474"/>
-          </w:tcPr>
-          <w:p>
-            <w:pPr>
-              <w:spacing w:line="240" w:lineRule="auto"/>
-              <w:jc w:val="left"/>
-            </w:pPr>
-            <w:r/>
-            <w:r>
-              <w:rPr>
-                <w:b w:val="0"/>
-                <w:i w:val="0"/>
-                <w:sz w:val="19"/>
-                <w:rFonts w:eastAsia="宋体" w:ascii="Times New Roman" w:hAnsi="Times New Roman"/>
-              </w:rPr>
-              <w:t>材料中等、器件级数据不足</w:t>
-            </w:r>
-          </w:p>
-        </w:tc>
-      </w:tr>
-      <w:tr>
-        <w:tc>
-          <w:tcPr>
-            <w:tcW w:type="dxa" w:w="1928"/>
-          </w:tcPr>
-          <w:p>
-            <w:pPr>
-              <w:spacing w:line="240" w:lineRule="auto"/>
-              <w:jc w:val="left"/>
-            </w:pPr>
-            <w:r/>
-            <w:r>
-              <w:rPr>
-                <w:b w:val="0"/>
-                <w:i w:val="0"/>
-                <w:sz w:val="19"/>
-                <w:rFonts w:eastAsia="宋体" w:ascii="Times New Roman" w:hAnsi="Times New Roman"/>
-              </w:rPr>
-              <w:t>铝电解/DC-link监测</w:t>
-            </w:r>
-          </w:p>
-        </w:tc>
-        <w:tc>
-          <w:tcPr>
-            <w:tcW w:type="dxa" w:w="2154"/>
-          </w:tcPr>
-          <w:p>
-            <w:pPr>
-              <w:spacing w:line="240" w:lineRule="auto"/>
-              <w:jc w:val="left"/>
-            </w:pPr>
-            <w:r/>
-            <w:r>
-              <w:rPr>
-                <w:b w:val="0"/>
-                <w:i w:val="0"/>
-                <w:sz w:val="19"/>
-                <w:rFonts w:eastAsia="宋体" w:ascii="Times New Roman" w:hAnsi="Times New Roman"/>
-              </w:rPr>
-              <w:t>重庆大学、华中科大等</w:t>
-            </w:r>
-          </w:p>
-        </w:tc>
-        <w:tc>
-          <w:tcPr>
-            <w:tcW w:type="dxa" w:w="2494"/>
-          </w:tcPr>
-          <w:p>
-            <w:pPr>
-              <w:spacing w:line="240" w:lineRule="auto"/>
-              <w:jc w:val="left"/>
-            </w:pPr>
-            <w:r/>
-            <w:r>
-              <w:rPr>
-                <w:b w:val="0"/>
-                <w:i w:val="0"/>
-                <w:sz w:val="19"/>
-                <w:rFonts w:eastAsia="宋体" w:ascii="Times New Roman" w:hAnsi="Times New Roman"/>
-              </w:rPr>
-              <w:t>灰箱/RLS在线辨识、任务剖面寿命</w:t>
-            </w:r>
-          </w:p>
-        </w:tc>
-        <w:tc>
-          <w:tcPr>
-            <w:tcW w:type="dxa" w:w="1474"/>
-          </w:tcPr>
-          <w:p>
-            <w:pPr>
-              <w:spacing w:line="240" w:lineRule="auto"/>
-              <w:jc w:val="left"/>
-            </w:pPr>
-            <w:r/>
-            <w:r>
-              <w:rPr>
-                <w:b w:val="0"/>
-                <w:i w:val="0"/>
-                <w:sz w:val="19"/>
-                <w:rFonts w:eastAsia="宋体" w:ascii="Times New Roman" w:hAnsi="Times New Roman"/>
-              </w:rPr>
-              <w:t>工程落地强</w:t>
-            </w:r>
-          </w:p>
-        </w:tc>
-      </w:tr>
-      <w:tr>
-        <w:tc>
-          <w:tcPr>
-            <w:tcW w:type="dxa" w:w="1928"/>
-          </w:tcPr>
-          <w:p>
-            <w:pPr>
-              <w:spacing w:line="240" w:lineRule="auto"/>
-              <w:jc w:val="left"/>
-            </w:pPr>
-            <w:r/>
-            <w:r>
-              <w:rPr>
-                <w:b w:val="0"/>
-                <w:i w:val="0"/>
-                <w:sz w:val="19"/>
-                <w:rFonts w:eastAsia="宋体" w:ascii="Times New Roman" w:hAnsi="Times New Roman"/>
-              </w:rPr>
-              <w:t>MLCC可靠性</w:t>
-            </w:r>
-          </w:p>
-        </w:tc>
-        <w:tc>
-          <w:tcPr>
-            <w:tcW w:type="dxa" w:w="2154"/>
-          </w:tcPr>
-          <w:p>
-            <w:pPr>
-              <w:spacing w:line="240" w:lineRule="auto"/>
-              <w:jc w:val="left"/>
-            </w:pPr>
-            <w:r/>
-            <w:r>
-              <w:rPr>
-                <w:b w:val="0"/>
-                <w:i w:val="0"/>
-                <w:sz w:val="19"/>
-                <w:rFonts w:eastAsia="宋体" w:ascii="Times New Roman" w:hAnsi="Times New Roman"/>
-              </w:rPr>
-              <w:t>中科院、北大、华南师大等</w:t>
-            </w:r>
-          </w:p>
-        </w:tc>
-        <w:tc>
-          <w:tcPr>
-            <w:tcW w:type="dxa" w:w="2494"/>
-          </w:tcPr>
-          <w:p>
-            <w:pPr>
-              <w:spacing w:line="240" w:lineRule="auto"/>
-              <w:jc w:val="left"/>
-            </w:pPr>
-            <w:r/>
-            <w:r>
-              <w:rPr>
-                <w:b w:val="0"/>
-                <w:i w:val="0"/>
-                <w:sz w:val="19"/>
-                <w:rFonts w:eastAsia="宋体" w:ascii="Times New Roman" w:hAnsi="Times New Roman"/>
-              </w:rPr>
-              <w:t>超薄BME介质、晶粒尺寸—可靠性机理</w:t>
-            </w:r>
-          </w:p>
-        </w:tc>
-        <w:tc>
-          <w:tcPr>
-            <w:tcW w:type="dxa" w:w="1474"/>
-          </w:tcPr>
-          <w:p>
-            <w:pPr>
-              <w:spacing w:line="240" w:lineRule="auto"/>
-              <w:jc w:val="left"/>
-            </w:pPr>
-            <w:r/>
-            <w:r>
-              <w:rPr>
-                <w:b w:val="0"/>
-                <w:i w:val="0"/>
-                <w:sz w:val="19"/>
-                <w:rFonts w:eastAsia="宋体" w:ascii="Times New Roman" w:hAnsi="Times New Roman"/>
-              </w:rPr>
-              <w:t>机理研究活跃</w:t>
-            </w:r>
-          </w:p>
-        </w:tc>
-      </w:tr>
-      <w:tr>
-        <w:tc>
-          <w:tcPr>
-            <w:tcW w:type="dxa" w:w="1928"/>
-          </w:tcPr>
-          <w:p>
-            <w:pPr>
-              <w:spacing w:line="240" w:lineRule="auto"/>
-              <w:jc w:val="left"/>
-            </w:pPr>
-            <w:r/>
-            <w:r>
-              <w:rPr>
-                <w:b w:val="0"/>
-                <w:i w:val="0"/>
-                <w:sz w:val="19"/>
-                <w:rFonts w:eastAsia="宋体" w:ascii="Times New Roman" w:hAnsi="Times New Roman"/>
-              </w:rPr>
-              <w:t>金属化膜自愈</w:t>
-            </w:r>
-          </w:p>
-        </w:tc>
-        <w:tc>
-          <w:tcPr>
-            <w:tcW w:type="dxa" w:w="2154"/>
-          </w:tcPr>
-          <w:p>
-            <w:pPr>
-              <w:spacing w:line="240" w:lineRule="auto"/>
-              <w:jc w:val="left"/>
-            </w:pPr>
-            <w:r/>
-            <w:r>
-              <w:rPr>
-                <w:b w:val="0"/>
-                <w:i w:val="0"/>
-                <w:sz w:val="19"/>
-                <w:rFonts w:eastAsia="宋体" w:ascii="Times New Roman" w:hAnsi="Times New Roman"/>
-              </w:rPr>
-              <w:t>高校高压/脉冲功率方向</w:t>
-            </w:r>
-          </w:p>
-        </w:tc>
-        <w:tc>
-          <w:tcPr>
-            <w:tcW w:type="dxa" w:w="2494"/>
-          </w:tcPr>
-          <w:p>
-            <w:pPr>
-              <w:spacing w:line="240" w:lineRule="auto"/>
-              <w:jc w:val="left"/>
-            </w:pPr>
-            <w:r/>
-            <w:r>
-              <w:rPr>
-                <w:b w:val="0"/>
-                <w:i w:val="0"/>
-                <w:sz w:val="19"/>
-                <w:rFonts w:eastAsia="宋体" w:ascii="Times New Roman" w:hAnsi="Times New Roman"/>
-              </w:rPr>
-              <w:t>自愈能量、超声/UHF检测、累积损伤</w:t>
-            </w:r>
-          </w:p>
-        </w:tc>
-        <w:tc>
-          <w:tcPr>
-            <w:tcW w:type="dxa" w:w="1474"/>
-          </w:tcPr>
-          <w:p>
-            <w:pPr>
-              <w:spacing w:line="240" w:lineRule="auto"/>
-              <w:jc w:val="left"/>
-            </w:pPr>
-            <w:r/>
-            <w:r>
-              <w:rPr>
-                <w:b w:val="0"/>
-                <w:i w:val="0"/>
-                <w:sz w:val="19"/>
-                <w:rFonts w:eastAsia="宋体" w:ascii="Times New Roman" w:hAnsi="Times New Roman"/>
-              </w:rPr>
-              <w:t>测试方法领先</w:t>
-            </w:r>
-          </w:p>
-        </w:tc>
-      </w:tr>
-      <w:tr>
-        <w:tc>
-          <w:tcPr>
-            <w:tcW w:type="dxa" w:w="1928"/>
-          </w:tcPr>
-          <w:p>
-            <w:pPr>
-              <w:spacing w:line="240" w:lineRule="auto"/>
-              <w:jc w:val="left"/>
-            </w:pPr>
-            <w:r/>
-            <w:r>
-              <w:rPr>
-                <w:b w:val="0"/>
-                <w:i w:val="0"/>
-                <w:sz w:val="19"/>
-                <w:rFonts w:eastAsia="宋体" w:ascii="Times New Roman" w:hAnsi="Times New Roman"/>
-              </w:rPr>
-              <w:t>钽/超级电容RUL</w:t>
-            </w:r>
-          </w:p>
-        </w:tc>
-        <w:tc>
-          <w:tcPr>
-            <w:tcW w:type="dxa" w:w="2154"/>
-          </w:tcPr>
-          <w:p>
-            <w:pPr>
-              <w:spacing w:line="240" w:lineRule="auto"/>
-              <w:jc w:val="left"/>
-            </w:pPr>
-            <w:r/>
-            <w:r>
-              <w:rPr>
-                <w:b w:val="0"/>
-                <w:i w:val="0"/>
-                <w:sz w:val="19"/>
-                <w:rFonts w:eastAsia="宋体" w:ascii="Times New Roman" w:hAnsi="Times New Roman"/>
-              </w:rPr>
-              <w:t>高校PHM方向</w:t>
-            </w:r>
-          </w:p>
-        </w:tc>
-        <w:tc>
-          <w:tcPr>
-            <w:tcW w:type="dxa" w:w="2494"/>
-          </w:tcPr>
-          <w:p>
-            <w:pPr>
-              <w:spacing w:line="240" w:lineRule="auto"/>
-              <w:jc w:val="left"/>
-            </w:pPr>
-            <w:r/>
-            <w:r>
-              <w:rPr>
-                <w:b w:val="0"/>
-                <w:i w:val="0"/>
-                <w:sz w:val="19"/>
-                <w:rFonts w:eastAsia="宋体" w:ascii="Times New Roman" w:hAnsi="Times New Roman"/>
-              </w:rPr>
-              <w:t>温度法RUL、LSTM/PINN退化预测</w:t>
-            </w:r>
-          </w:p>
-        </w:tc>
-        <w:tc>
-          <w:tcPr>
-            <w:tcW w:type="dxa" w:w="1474"/>
-          </w:tcPr>
-          <w:p>
-            <w:pPr>
-              <w:spacing w:line="240" w:lineRule="auto"/>
-              <w:jc w:val="left"/>
-            </w:pPr>
-            <w:r/>
-            <w:r>
-              <w:rPr>
-                <w:b w:val="0"/>
-                <w:i w:val="0"/>
-                <w:sz w:val="19"/>
-                <w:rFonts w:eastAsia="宋体" w:ascii="Times New Roman" w:hAnsi="Times New Roman"/>
-              </w:rPr>
-              <w:t>数据驱动跟进快</w:t>
-            </w:r>
-          </w:p>
-        </w:tc>
-      </w:tr>
-      <w:tr>
+              <w:t>系统集成与现场落地强</w:t>
+            </w:r>
+          </w:p>
+        </w:tc>
         <w:tc>
           <w:tcPr>
             <w:tcW w:type="dxa" w:w="1928"/>
@@ -20927,100 +21244,12 @@
                 <w:sz w:val="19"/>
                 <w:rFonts w:eastAsia="宋体" w:ascii="Times New Roman" w:hAnsi="Times New Roman"/>
               </w:rPr>
-              <w:t>建模与数据智能</w:t>
-            </w:r>
-          </w:p>
-        </w:tc>
-        <w:tc>
-          <w:tcPr>
-            <w:tcW w:type="dxa" w:w="2154"/>
-            <w:tcBorders>
-              <w:bottom w:val="single" w:sz="14" w:space="0" w:color="000000"/>
-            </w:tcBorders>
-          </w:tcPr>
-          <w:p>
-            <w:pPr>
-              <w:spacing w:line="240" w:lineRule="auto"/>
-              <w:jc w:val="left"/>
-            </w:pPr>
-            <w:r/>
-            <w:r>
-              <w:rPr>
-                <w:b w:val="0"/>
-                <w:i w:val="0"/>
-                <w:sz w:val="19"/>
-                <w:rFonts w:eastAsia="宋体" w:ascii="Times New Roman" w:hAnsi="Times New Roman"/>
-              </w:rPr>
-              <w:t>多校PHM/电力电子组</w:t>
-            </w:r>
-          </w:p>
-        </w:tc>
-        <w:tc>
-          <w:tcPr>
-            <w:tcW w:type="dxa" w:w="2494"/>
-            <w:tcBorders>
-              <w:bottom w:val="single" w:sz="14" w:space="0" w:color="000000"/>
-            </w:tcBorders>
-          </w:tcPr>
-          <w:p>
-            <w:pPr>
-              <w:spacing w:line="240" w:lineRule="auto"/>
-              <w:jc w:val="left"/>
-            </w:pPr>
-            <w:r/>
-            <w:r>
-              <w:rPr>
-                <w:b w:val="0"/>
-                <w:i w:val="0"/>
-                <w:sz w:val="19"/>
-                <w:rFonts w:eastAsia="宋体" w:ascii="Times New Roman" w:hAnsi="Times New Roman"/>
-              </w:rPr>
-              <w:t>CNN-LSTM、PINN、分数阶随机过程</w:t>
-            </w:r>
-          </w:p>
-        </w:tc>
-        <w:tc>
-          <w:tcPr>
-            <w:tcW w:type="dxa" w:w="1474"/>
-            <w:tcBorders>
-              <w:bottom w:val="single" w:sz="14" w:space="0" w:color="000000"/>
-            </w:tcBorders>
-          </w:tcPr>
-          <w:p>
-            <w:pPr>
-              <w:spacing w:line="240" w:lineRule="auto"/>
-              <w:jc w:val="left"/>
-            </w:pPr>
-            <w:r/>
-            <w:r>
-              <w:rPr>
-                <w:b w:val="0"/>
-                <w:i w:val="0"/>
-                <w:sz w:val="19"/>
-                <w:rFonts w:eastAsia="宋体" w:ascii="Times New Roman" w:hAnsi="Times New Roman"/>
-              </w:rPr>
-              <w:t>规模跟进、原创待强</w:t>
+              <w:t>变工况泛化均待提升</w:t>
             </w:r>
           </w:p>
         </w:tc>
       </w:tr>
     </w:tbl>
-    <w:p>
-      <w:pPr>
-        <w:keepNext/>
-        <w:spacing w:before="160" w:after="120"/>
-        <w:outlineLvl w:val="2"/>
-      </w:pPr>
-      <w:r>
-        <w:rPr>
-          <w:b/>
-          <w:i w:val="0"/>
-          <w:sz w:val="28"/>
-          <w:rFonts w:eastAsia="黑体" w:ascii="Times New Roman" w:hAnsi="Times New Roman"/>
-        </w:rPr>
-        <w:t>8.3 固态铝电解/聚合物电容（SAPC）的国内研究</w:t>
-      </w:r>
-    </w:p>
     <w:p>
       <w:pPr>
         <w:spacing w:line="360" w:lineRule="auto" w:after="80"/>
@@ -21034,2765 +21263,7 @@
           <w:sz w:val="24"/>
           <w:rFonts w:eastAsia="宋体" w:ascii="Times New Roman" w:hAnsi="Times New Roman"/>
         </w:rPr>
-        <w:t>SAPC是本文的核心对象，也是国内研究相对薄弱、亟待加强的方向。其可靠性问题的根源在于导电聚合物阴极（多为PEDOT或PEDOT:PSS体系）对湿、热、氧与电应力的敏感性，以及聚合物/氧化膜界面的退化。国内研究可从材料、器件与产业三个层面加以梳理。</w:t>
-      </w:r>
-    </w:p>
-    <w:p>
-      <w:pPr>
-        <w:keepNext/>
-        <w:spacing w:before="160" w:after="120"/>
-        <w:outlineLvl w:val="3"/>
-      </w:pPr>
-      <w:r>
-        <w:rPr>
-          <w:b/>
-          <w:i w:val="0"/>
-          <w:sz w:val="25"/>
-          <w:rFonts w:eastAsia="黑体" w:ascii="Times New Roman" w:hAnsi="Times New Roman"/>
-        </w:rPr>
-        <w:t>8.3.1 导电聚合物阴极材料的国内研究</w:t>
-      </w:r>
-    </w:p>
-    <w:p>
-      <w:pPr>
-        <w:spacing w:line="360" w:lineRule="auto" w:after="80"/>
-        <w:ind w:firstLine="465"/>
-        <w:jc w:val="both"/>
-      </w:pPr>
-      <w:r>
-        <w:rPr>
-          <w:b w:val="0"/>
-          <w:i w:val="0"/>
-          <w:sz w:val="24"/>
-          <w:rFonts w:eastAsia="宋体" w:ascii="Times New Roman" w:hAnsi="Times New Roman"/>
-        </w:rPr>
-        <w:t>在材料层面，国内对PEDOT体系的电导提升与稳定化已有实质性进展。针对PEDOT:PSS因PSS强酸性导致器件劣化、长期耐久性差的问题，研究者提出以弱碱对PEDOT:PSS进行"去质子化"处理以中和其酸性，从而改善铝固态电解电容器的性能；该工作直面"酸性—腐蚀—去掺杂"这一SAPC可靠性的关键痛点，为从材料源头抑制界面退化提供了途径（见RSC Advances 2025相关研究）。在制备工艺层面，采用气相聚合（vapor phase polymerization）制备PEDOT薄膜可获得低耗散因子、低漏电与极低ESR（毫欧级）的固态电容，验证了原位聚合路线在填充多孔阳极、构建保形界面方面的优势（见Journal of Materials Science 2021相关研究）。此外，关于无液态电解质柱状铝聚合物电容的材料与特性综述，系统讨论了氧化剂、隔膜与集流体材料对容量与内阻的影响，为器件可靠性的材料设计提供了参考。</w:t>
-      </w:r>
-    </w:p>
-    <w:p>
-      <w:pPr>
-        <w:spacing w:line="360" w:lineRule="auto" w:before="80" w:after="120"/>
-        <w:ind w:left="340"/>
-        <w:jc w:val="both"/>
-        <w:pBdr>
-          <w:left w:val="single" w:sz="18" w:space="6" w:color="4472C4"/>
-        </w:pBdr>
-      </w:pPr>
-      <w:r>
-        <w:rPr>
-          <w:b w:val="0"/>
-          <w:i w:val="0"/>
-          <w:sz w:val="23"/>
-          <w:rFonts w:eastAsia="楷体" w:ascii="Times New Roman" w:hAnsi="Times New Roman"/>
-        </w:rPr>
-        <w:br/>
-        <w:t>评述：国内在PEDOT去质子化、气相聚合工艺与材料体系优化上已与国际前沿接轨，抓住了"酸性抑制—界面稳定—低ESR"这一主线；但研究多停留在材料/单体器件性能层面，缺乏面向器件级、长周期、多应力（湿热—高温—电—机械）的系统失效与寿命数据，机理认识向器件寿命模型的定量贯通尚未完成。</w:t>
-        <w:br/>
-      </w:r>
-    </w:p>
-    <w:p>
-      <w:pPr>
-        <w:keepNext/>
-        <w:spacing w:before="160" w:after="120"/>
-        <w:outlineLvl w:val="3"/>
-      </w:pPr>
-      <w:r>
-        <w:rPr>
-          <w:b/>
-          <w:i w:val="0"/>
-          <w:sz w:val="25"/>
-          <w:rFonts w:eastAsia="黑体" w:ascii="Times New Roman" w:hAnsi="Times New Roman"/>
-        </w:rPr>
-        <w:t>8.3.2 SAPC器件失效与可靠性的国内研究</w:t>
-      </w:r>
-    </w:p>
-    <w:p>
-      <w:pPr>
-        <w:spacing w:line="360" w:lineRule="auto" w:after="80"/>
-        <w:ind w:firstLine="465"/>
-        <w:jc w:val="both"/>
-      </w:pPr>
-      <w:r>
-        <w:rPr>
-          <w:b w:val="0"/>
-          <w:i w:val="0"/>
-          <w:sz w:val="24"/>
-          <w:rFonts w:eastAsia="宋体" w:ascii="Times New Roman" w:hAnsi="Times New Roman"/>
-        </w:rPr>
-        <w:t>在器件失效与可靠性层面，国内公开的系统性长周期数据仍然稀缺，研究多借鉴高度同构的聚合物钽电容与国际上对聚合物铝电容（PA/APC）的湿热失效结论：即退化以ESR上升、漏电流增大为主而电容量相对稳定，主导机理包括导电聚合物的热—氧化老化、吸湿溶胀与去掺杂、以及聚合物/氧化膜界面的腐蚀与分层。国内已有团队从温度法在线RUL（以温度测量推断退化）、以及考虑参数分散的CNN-LSTM老化状态评估与寿命预测等角度切入电容（含钽/聚合物体系）的健康管理（详见8.7、8.8）。总体而言，国内SAPC器件级可靠性研究"材料热、器件冷"的不平衡格局明显，亟需建立统一规程下、含批次/封装/应力标注的SAPC专用退化数据集。</w:t>
-      </w:r>
-    </w:p>
-    <w:p>
-      <w:pPr>
-        <w:keepNext/>
-        <w:spacing w:before="160" w:after="120"/>
-        <w:outlineLvl w:val="3"/>
-      </w:pPr>
-      <w:r>
-        <w:rPr>
-          <w:b/>
-          <w:i w:val="0"/>
-          <w:sz w:val="25"/>
-          <w:rFonts w:eastAsia="黑体" w:ascii="Times New Roman" w:hAnsi="Times New Roman"/>
-        </w:rPr>
-        <w:t>8.3.3 国内SAPC产业与工程能力</w:t>
-      </w:r>
-    </w:p>
-    <w:p>
-      <w:pPr>
-        <w:spacing w:line="360" w:lineRule="auto" w:after="80"/>
-        <w:ind w:firstLine="465"/>
-        <w:jc w:val="both"/>
-      </w:pPr>
-      <w:r>
-        <w:rPr>
-          <w:b w:val="0"/>
-          <w:i w:val="0"/>
-          <w:sz w:val="24"/>
-          <w:rFonts w:eastAsia="宋体" w:ascii="Times New Roman" w:hAnsi="Times New Roman"/>
-        </w:rPr>
-        <w:t>产业层面，国内已具备较强的SAPC量产能力，并以此积累了宝贵的工艺—可靠性经验。艾华集团（湖南，上交所603989，成立于1985年）是国内铝电解电容龙头之一，其产品线已涵盖固态聚合物、SMT聚合物与多层聚合物铝电容，并以低ESR、优良频率稳定性与"不起火"的良性失效特征著称，部分高可靠产品甚至面向航天等高端场景；南通江海（深交所002484，成立于1958年）作为国内最大的铝电解/薄膜/储能电容制造商之一，产品涵盖聚合物及聚合物混合（hybrid）电容、DC-link薄膜与超级电容，形成了从阳极箔蚀刻化成到成品的完整链条；振华新云等企业则在高可靠电解电容制造工艺上拥有自主专利（如CN105489376B）。这些企业掌握的全流程工艺与长期失效数据，是国内SAPC可靠性研究最宝贵、却尚未充分向学术界开放的数据资源。</w:t>
-      </w:r>
-    </w:p>
-    <w:p>
-      <w:pPr>
-        <w:keepNext/>
-        <w:spacing w:before="120" w:after="40"/>
-        <w:jc w:val="center"/>
-      </w:pPr>
-      <w:r>
-        <w:rPr>
-          <w:b/>
-          <w:i w:val="0"/>
-          <w:sz w:val="21"/>
-          <w:rFonts w:eastAsia="黑体" w:ascii="Times New Roman" w:hAnsi="Times New Roman"/>
-        </w:rPr>
-        <w:t>表 18  国内代表性SAPC/聚合物电容相关企业概览（基于公开企业资料）</w:t>
-      </w:r>
-    </w:p>
-    <w:tbl>
-      <w:tblPr>
-        <w:tblW w:type="auto" w:w="0"/>
-        <w:jc w:val="center"/>
-        <w:tblLayout w:type="autofit"/>
-        <w:tblLook w:firstColumn="1" w:firstRow="1" w:lastColumn="0" w:lastRow="0" w:noHBand="0" w:noVBand="1" w:val="04A0"/>
-      </w:tblPr>
-      <w:tblGrid>
-        <w:gridCol w:w="2126"/>
-        <w:gridCol w:w="2126"/>
-        <w:gridCol w:w="2126"/>
-        <w:gridCol w:w="2126"/>
-      </w:tblGrid>
-      <w:tr>
-        <w:tc>
-          <w:tcPr>
-            <w:tcW w:type="dxa" w:w="1474"/>
-            <w:tcBorders>
-              <w:top w:val="single" w:sz="14" w:space="0" w:color="000000"/>
-              <w:bottom w:val="single" w:sz="6" w:space="0" w:color="000000"/>
-            </w:tcBorders>
-          </w:tcPr>
-          <w:p>
-            <w:pPr>
-              <w:jc w:val="center"/>
-            </w:pPr>
-            <w:r/>
-            <w:r>
-              <w:rPr>
-                <w:b/>
-                <w:i w:val="0"/>
-                <w:sz w:val="19"/>
-                <w:rFonts w:eastAsia="黑体" w:ascii="Times New Roman" w:hAnsi="Times New Roman"/>
-              </w:rPr>
-              <w:t>企业(示例)</w:t>
-            </w:r>
-          </w:p>
-        </w:tc>
-        <w:tc>
-          <w:tcPr>
-            <w:tcW w:type="dxa" w:w="1474"/>
-            <w:tcBorders>
-              <w:top w:val="single" w:sz="14" w:space="0" w:color="000000"/>
-              <w:bottom w:val="single" w:sz="6" w:space="0" w:color="000000"/>
-            </w:tcBorders>
-          </w:tcPr>
-          <w:p>
-            <w:pPr>
-              <w:jc w:val="center"/>
-            </w:pPr>
-            <w:r/>
-            <w:r>
-              <w:rPr>
-                <w:b/>
-                <w:i w:val="0"/>
-                <w:sz w:val="19"/>
-                <w:rFonts w:eastAsia="黑体" w:ascii="Times New Roman" w:hAnsi="Times New Roman"/>
-              </w:rPr>
-              <w:t>上市代码</w:t>
-            </w:r>
-          </w:p>
-        </w:tc>
-        <w:tc>
-          <w:tcPr>
-            <w:tcW w:type="dxa" w:w="2835"/>
-            <w:tcBorders>
-              <w:top w:val="single" w:sz="14" w:space="0" w:color="000000"/>
-              <w:bottom w:val="single" w:sz="6" w:space="0" w:color="000000"/>
-            </w:tcBorders>
-          </w:tcPr>
-          <w:p>
-            <w:pPr>
-              <w:jc w:val="center"/>
-            </w:pPr>
-            <w:r/>
-            <w:r>
-              <w:rPr>
-                <w:b/>
-                <w:i w:val="0"/>
-                <w:sz w:val="19"/>
-                <w:rFonts w:eastAsia="黑体" w:ascii="Times New Roman" w:hAnsi="Times New Roman"/>
-              </w:rPr>
-              <w:t>SAPC/聚合物相关产品</w:t>
-            </w:r>
-          </w:p>
-        </w:tc>
-        <w:tc>
-          <w:tcPr>
-            <w:tcW w:type="dxa" w:w="2268"/>
-            <w:tcBorders>
-              <w:top w:val="single" w:sz="14" w:space="0" w:color="000000"/>
-              <w:bottom w:val="single" w:sz="6" w:space="0" w:color="000000"/>
-            </w:tcBorders>
-          </w:tcPr>
-          <w:p>
-            <w:pPr>
-              <w:jc w:val="center"/>
-            </w:pPr>
-            <w:r/>
-            <w:r>
-              <w:rPr>
-                <w:b/>
-                <w:i w:val="0"/>
-                <w:sz w:val="19"/>
-                <w:rFonts w:eastAsia="黑体" w:ascii="Times New Roman" w:hAnsi="Times New Roman"/>
-              </w:rPr>
-              <w:t>可靠性相关特征</w:t>
-            </w:r>
-          </w:p>
-        </w:tc>
-      </w:tr>
-      <w:tr>
-        <w:tc>
-          <w:tcPr>
-            <w:tcW w:type="dxa" w:w="1474"/>
-          </w:tcPr>
-          <w:p>
-            <w:pPr>
-              <w:spacing w:line="240" w:lineRule="auto"/>
-              <w:jc w:val="left"/>
-            </w:pPr>
-            <w:r/>
-            <w:r>
-              <w:rPr>
-                <w:b w:val="0"/>
-                <w:i w:val="0"/>
-                <w:sz w:val="19"/>
-                <w:rFonts w:eastAsia="宋体" w:ascii="Times New Roman" w:hAnsi="Times New Roman"/>
-              </w:rPr>
-              <w:t>艾华集团</w:t>
-            </w:r>
-          </w:p>
-        </w:tc>
-        <w:tc>
-          <w:tcPr>
-            <w:tcW w:type="dxa" w:w="1474"/>
-          </w:tcPr>
-          <w:p>
-            <w:pPr>
-              <w:spacing w:line="240" w:lineRule="auto"/>
-              <w:jc w:val="left"/>
-            </w:pPr>
-            <w:r/>
-            <w:r>
-              <w:rPr>
-                <w:b w:val="0"/>
-                <w:i w:val="0"/>
-                <w:sz w:val="19"/>
-                <w:rFonts w:eastAsia="宋体" w:ascii="Times New Roman" w:hAnsi="Times New Roman"/>
-              </w:rPr>
-              <w:t>上交所 603989</w:t>
-            </w:r>
-          </w:p>
-        </w:tc>
-        <w:tc>
-          <w:tcPr>
-            <w:tcW w:type="dxa" w:w="2835"/>
-          </w:tcPr>
-          <w:p>
-            <w:pPr>
-              <w:spacing w:line="240" w:lineRule="auto"/>
-              <w:jc w:val="left"/>
-            </w:pPr>
-            <w:r/>
-            <w:r>
-              <w:rPr>
-                <w:b w:val="0"/>
-                <w:i w:val="0"/>
-                <w:sz w:val="19"/>
-                <w:rFonts w:eastAsia="宋体" w:ascii="Times New Roman" w:hAnsi="Times New Roman"/>
-              </w:rPr>
-              <w:t>固态聚合物、SMT聚合物、多层聚合物铝电容</w:t>
-            </w:r>
-          </w:p>
-        </w:tc>
-        <w:tc>
-          <w:tcPr>
-            <w:tcW w:type="dxa" w:w="2268"/>
-          </w:tcPr>
-          <w:p>
-            <w:pPr>
-              <w:spacing w:line="240" w:lineRule="auto"/>
-              <w:jc w:val="left"/>
-            </w:pPr>
-            <w:r/>
-            <w:r>
-              <w:rPr>
-                <w:b w:val="0"/>
-                <w:i w:val="0"/>
-                <w:sz w:val="19"/>
-                <w:rFonts w:eastAsia="宋体" w:ascii="Times New Roman" w:hAnsi="Times New Roman"/>
-              </w:rPr>
-              <w:t>低ESR、频率稳定、良性失效、高可靠</w:t>
-            </w:r>
-          </w:p>
-        </w:tc>
-      </w:tr>
-      <w:tr>
-        <w:tc>
-          <w:tcPr>
-            <w:tcW w:type="dxa" w:w="1474"/>
-          </w:tcPr>
-          <w:p>
-            <w:pPr>
-              <w:spacing w:line="240" w:lineRule="auto"/>
-              <w:jc w:val="left"/>
-            </w:pPr>
-            <w:r/>
-            <w:r>
-              <w:rPr>
-                <w:b w:val="0"/>
-                <w:i w:val="0"/>
-                <w:sz w:val="19"/>
-                <w:rFonts w:eastAsia="宋体" w:ascii="Times New Roman" w:hAnsi="Times New Roman"/>
-              </w:rPr>
-              <w:t>南通江海</w:t>
-            </w:r>
-          </w:p>
-        </w:tc>
-        <w:tc>
-          <w:tcPr>
-            <w:tcW w:type="dxa" w:w="1474"/>
-          </w:tcPr>
-          <w:p>
-            <w:pPr>
-              <w:spacing w:line="240" w:lineRule="auto"/>
-              <w:jc w:val="left"/>
-            </w:pPr>
-            <w:r/>
-            <w:r>
-              <w:rPr>
-                <w:b w:val="0"/>
-                <w:i w:val="0"/>
-                <w:sz w:val="19"/>
-                <w:rFonts w:eastAsia="宋体" w:ascii="Times New Roman" w:hAnsi="Times New Roman"/>
-              </w:rPr>
-              <w:t>深交所 002484</w:t>
-            </w:r>
-          </w:p>
-        </w:tc>
-        <w:tc>
-          <w:tcPr>
-            <w:tcW w:type="dxa" w:w="2835"/>
-          </w:tcPr>
-          <w:p>
-            <w:pPr>
-              <w:spacing w:line="240" w:lineRule="auto"/>
-              <w:jc w:val="left"/>
-            </w:pPr>
-            <w:r/>
-            <w:r>
-              <w:rPr>
-                <w:b w:val="0"/>
-                <w:i w:val="0"/>
-                <w:sz w:val="19"/>
-                <w:rFonts w:eastAsia="宋体" w:ascii="Times New Roman" w:hAnsi="Times New Roman"/>
-              </w:rPr>
-              <w:t>聚合物及聚合物混合电容、DC-link薄膜、超容</w:t>
-            </w:r>
-          </w:p>
-        </w:tc>
-        <w:tc>
-          <w:tcPr>
-            <w:tcW w:type="dxa" w:w="2268"/>
-          </w:tcPr>
-          <w:p>
-            <w:pPr>
-              <w:spacing w:line="240" w:lineRule="auto"/>
-              <w:jc w:val="left"/>
-            </w:pPr>
-            <w:r/>
-            <w:r>
-              <w:rPr>
-                <w:b w:val="0"/>
-                <w:i w:val="0"/>
-                <w:sz w:val="19"/>
-                <w:rFonts w:eastAsia="宋体" w:ascii="Times New Roman" w:hAnsi="Times New Roman"/>
-              </w:rPr>
-              <w:t>全产业链、车规/储能场景广</w:t>
-            </w:r>
-          </w:p>
-        </w:tc>
-      </w:tr>
-      <w:tr>
-        <w:tc>
-          <w:tcPr>
-            <w:tcW w:type="dxa" w:w="1474"/>
-            <w:tcBorders>
-              <w:bottom w:val="single" w:sz="14" w:space="0" w:color="000000"/>
-            </w:tcBorders>
-          </w:tcPr>
-          <w:p>
-            <w:pPr>
-              <w:spacing w:line="240" w:lineRule="auto"/>
-              <w:jc w:val="left"/>
-            </w:pPr>
-            <w:r/>
-            <w:r>
-              <w:rPr>
-                <w:b w:val="0"/>
-                <w:i w:val="0"/>
-                <w:sz w:val="19"/>
-                <w:rFonts w:eastAsia="宋体" w:ascii="Times New Roman" w:hAnsi="Times New Roman"/>
-              </w:rPr>
-              <w:t>振华新云</w:t>
-            </w:r>
-          </w:p>
-        </w:tc>
-        <w:tc>
-          <w:tcPr>
-            <w:tcW w:type="dxa" w:w="1474"/>
-            <w:tcBorders>
-              <w:bottom w:val="single" w:sz="14" w:space="0" w:color="000000"/>
-            </w:tcBorders>
-          </w:tcPr>
-          <w:p>
-            <w:pPr>
-              <w:spacing w:line="240" w:lineRule="auto"/>
-              <w:jc w:val="left"/>
-            </w:pPr>
-            <w:r/>
-            <w:r>
-              <w:rPr>
-                <w:b w:val="0"/>
-                <w:i w:val="0"/>
-                <w:sz w:val="19"/>
-                <w:rFonts w:eastAsia="宋体" w:ascii="Times New Roman" w:hAnsi="Times New Roman"/>
-              </w:rPr>
-              <w:t>—</w:t>
-            </w:r>
-          </w:p>
-        </w:tc>
-        <w:tc>
-          <w:tcPr>
-            <w:tcW w:type="dxa" w:w="2835"/>
-            <w:tcBorders>
-              <w:bottom w:val="single" w:sz="14" w:space="0" w:color="000000"/>
-            </w:tcBorders>
-          </w:tcPr>
-          <w:p>
-            <w:pPr>
-              <w:spacing w:line="240" w:lineRule="auto"/>
-              <w:jc w:val="left"/>
-            </w:pPr>
-            <w:r/>
-            <w:r>
-              <w:rPr>
-                <w:b w:val="0"/>
-                <w:i w:val="0"/>
-                <w:sz w:val="19"/>
-                <w:rFonts w:eastAsia="宋体" w:ascii="Times New Roman" w:hAnsi="Times New Roman"/>
-              </w:rPr>
-              <w:t>高可靠电解电容（自主工艺专利）</w:t>
-            </w:r>
-          </w:p>
-        </w:tc>
-        <w:tc>
-          <w:tcPr>
-            <w:tcW w:type="dxa" w:w="2268"/>
-            <w:tcBorders>
-              <w:bottom w:val="single" w:sz="14" w:space="0" w:color="000000"/>
-            </w:tcBorders>
-          </w:tcPr>
-          <w:p>
-            <w:pPr>
-              <w:spacing w:line="240" w:lineRule="auto"/>
-              <w:jc w:val="left"/>
-            </w:pPr>
-            <w:r/>
-            <w:r>
-              <w:rPr>
-                <w:b w:val="0"/>
-                <w:i w:val="0"/>
-                <w:sz w:val="19"/>
-                <w:rFonts w:eastAsia="宋体" w:ascii="Times New Roman" w:hAnsi="Times New Roman"/>
-              </w:rPr>
-              <w:t>面向高可靠/军工等场景</w:t>
-            </w:r>
-          </w:p>
-        </w:tc>
-      </w:tr>
-    </w:tbl>
-    <w:p>
-      <w:pPr>
-        <w:keepNext/>
-        <w:spacing w:before="160" w:after="120"/>
-        <w:outlineLvl w:val="2"/>
-      </w:pPr>
-      <w:r>
-        <w:rPr>
-          <w:b/>
-          <w:i w:val="0"/>
-          <w:sz w:val="28"/>
-          <w:rFonts w:eastAsia="黑体" w:ascii="Times New Roman" w:hAnsi="Times New Roman"/>
-        </w:rPr>
-        <w:t>8.4 铝电解电容与DC-link在线监测的国内研究</w:t>
-      </w:r>
-    </w:p>
-    <w:p>
-      <w:pPr>
-        <w:spacing w:line="360" w:lineRule="auto" w:after="80"/>
-        <w:ind w:firstLine="465"/>
-        <w:jc w:val="both"/>
-      </w:pPr>
-      <w:r>
-        <w:rPr>
-          <w:b w:val="0"/>
-          <w:i w:val="0"/>
-          <w:sz w:val="24"/>
-          <w:rFonts w:eastAsia="宋体" w:ascii="Times New Roman" w:hAnsi="Times New Roman"/>
-        </w:rPr>
-        <w:t>铝电解电容（含其作为DC-link母线电容的应用）是国内研究最成熟、工程落地最强的方向。在状态监测上，重庆大学等团队提出了适用于AC/DC与DC/DC变换器的"灰箱（grey-box）"在线监测方法，巧妙利用直流母线电压暂态类似并联RLC零状态响应这一特征，无需额外硬件即可在线估计电容C与ESR，体现了"复用变换器自身信号"的工程智慧；此外，基于递归最小二乘（RLS）等算法、利用再生制动等工况实现电机驱动DC-link电容在线辨识的方法也被提出，进一步降低了监测的侵入性。在寿命预测上，面向电动汽车充电模块复杂多变工况，国内研究建立了基于任务剖面（mission profile）的铝电解电容寿命预测与可靠性分析方法，并指出热点温度计算精度与寿命模型是制约预测准确性的瓶颈（见Frontiers in Electronics 2023相关研究）。</w:t>
-      </w:r>
-    </w:p>
-    <w:p>
-      <w:pPr>
-        <w:spacing w:line="360" w:lineRule="auto" w:after="80"/>
-        <w:ind w:firstLine="465"/>
-        <w:jc w:val="both"/>
-      </w:pPr>
-      <w:r>
-        <w:rPr>
-          <w:b w:val="0"/>
-          <w:i w:val="0"/>
-          <w:sz w:val="24"/>
-          <w:rFonts w:eastAsia="宋体" w:ascii="Times New Roman" w:hAnsi="Times New Roman"/>
-        </w:rPr>
-        <w:t>这一方向的国内研究紧扣风电/光伏变流器、电动汽车电驱与充电、轨道交通牵引等国家重大需求，落地性强、与真实工况贴合度高，构成国内相对国际的独特优势。其不足在于：监测算法多为对国际既有方法（如Venet的ESR在线监测思想、纹波/注入法）的工程化改进与场景适配，原创性的辨识理论较少；且不同工况下的泛化能力与监测精度仍待提升。</w:t>
-      </w:r>
-    </w:p>
-    <w:p>
-      <w:pPr>
-        <w:keepNext/>
-        <w:spacing w:before="160" w:after="120"/>
-        <w:outlineLvl w:val="2"/>
-      </w:pPr>
-      <w:r>
-        <w:rPr>
-          <w:b/>
-          <w:i w:val="0"/>
-          <w:sz w:val="28"/>
-          <w:rFonts w:eastAsia="黑体" w:ascii="Times New Roman" w:hAnsi="Times New Roman"/>
-        </w:rPr>
-        <w:t>8.5 MLCC可靠性的国内研究</w:t>
-      </w:r>
-    </w:p>
-    <w:p>
-      <w:pPr>
-        <w:spacing w:line="360" w:lineRule="auto" w:after="80"/>
-        <w:ind w:firstLine="465"/>
-        <w:jc w:val="both"/>
-      </w:pPr>
-      <w:r>
-        <w:rPr>
-          <w:b w:val="0"/>
-          <w:i w:val="0"/>
-          <w:sz w:val="24"/>
-          <w:rFonts w:eastAsia="宋体" w:ascii="Times New Roman" w:hAnsi="Times New Roman"/>
-        </w:rPr>
-        <w:t>MLCC是国内材料—可靠性机理研究最活跃的器件之一，与全球MLCC高度依赖东亚供应链的格局相呼应。在介质与可靠性机理上，国内（含中国科学院深圳先进电子材料研究院等）围绕超薄层BaTiO3基贱金属电极（BME）MLCC，系统研究了介质减薄、氧空位迁移与绝缘电阻退化的关系，并在物理化学学报等刊物上阐明了超薄层BME MLCC的可靠性机理；针对介温稳定性与可靠性的平衡，开展了超薄Ba0.97Ca0.03TiO3基MLCC的可靠性研究（见Journal of Asian Ceramic Societies 2023相关工作）。在微结构—可靠性关系上，有研究系统揭示了晶粒尺寸对MLCC偏压稳定性与可靠性的显著影响——细晶粒因晶界密度更高而具有更高的晶界/界面激活能与更强的肖特基势垒，从而改善可靠性（见华南师范大学学报2024相关研究）。</w:t>
-      </w:r>
-    </w:p>
-    <w:p>
-      <w:pPr>
-        <w:spacing w:line="360" w:lineRule="auto" w:after="80"/>
-        <w:ind w:firstLine="465"/>
-        <w:jc w:val="both"/>
-      </w:pPr>
-      <w:r>
-        <w:rPr>
-          <w:b w:val="0"/>
-          <w:i w:val="0"/>
-          <w:sz w:val="24"/>
-          <w:rFonts w:eastAsia="宋体" w:ascii="Times New Roman" w:hAnsi="Times New Roman"/>
-        </w:rPr>
-        <w:t>在器件级失效与寿命上，国内围绕车规级MLCC的机械裂纹（flex crack）扩展、温度—电压加速寿命试验与Weibull寿命外推开展了大量工程研究，支撑了国产车规MLCC的可靠性验证与突破。总体看，国内MLCC可靠性研究在材料机理与工程验证两端都较为活跃，但在"统一的失效物理寿命模型"与"长期老化数据库"上仍与国际头部存在差距。</w:t>
-      </w:r>
-    </w:p>
-    <w:p>
-      <w:pPr>
-        <w:keepNext/>
-        <w:spacing w:before="160" w:after="120"/>
-        <w:outlineLvl w:val="2"/>
-      </w:pPr>
-      <w:r>
-        <w:rPr>
-          <w:b/>
-          <w:i w:val="0"/>
-          <w:sz w:val="28"/>
-          <w:rFonts w:eastAsia="黑体" w:ascii="Times New Roman" w:hAnsi="Times New Roman"/>
-        </w:rPr>
-        <w:t>8.6 金属化薄膜电容自愈与可靠性的国内研究</w:t>
-      </w:r>
-    </w:p>
-    <w:p>
-      <w:pPr>
-        <w:spacing w:line="360" w:lineRule="auto" w:after="80"/>
-        <w:ind w:firstLine="465"/>
-        <w:jc w:val="both"/>
-      </w:pPr>
-      <w:r>
-        <w:rPr>
-          <w:b w:val="0"/>
-          <w:i w:val="0"/>
-          <w:sz w:val="24"/>
-          <w:rFonts w:eastAsia="宋体" w:ascii="Times New Roman" w:hAnsi="Times New Roman"/>
-        </w:rPr>
-        <w:t>金属化薄膜电容的"自愈"特性是其高可靠的根源，也是其容量缓慢衰减的来源，国内在自愈机理与检测方法上的研究处于国际活跃行列。在机理与表征上，国内研究对金属化膜电容首次自愈进行了宏观—微观联合分析，并系统研究了影响自愈能量的因素（如方阻、电压上升率）；在检测方法上，提出了基于超声、特高频（UHF）信号时频特征以及声—电联合检测的自愈放电监测方法，并发展了原位自愈测试装置与分析方法（见Review of Scientific Instruments 2024相关工作）。在寿命与可靠性建模上，考虑累积自愈损伤的金属化聚丙烯膜电容容量评估方法被提出，将"自愈—去金属化—容量损失"的链条定量化；相关团队还就直流支撑电容方阻对自愈与耐压性能的影响、以及基于自愈特性的薄膜电容寿命估计开展了研究，并形成了金属化膜电容初始自愈类型分类的发明专利（CN ZL2023 1 0098802.X / US20240272240A1）。</w:t>
-      </w:r>
-    </w:p>
-    <w:p>
-      <w:pPr>
-        <w:spacing w:line="360" w:lineRule="auto" w:before="80" w:after="120"/>
-        <w:ind w:left="340"/>
-        <w:jc w:val="both"/>
-        <w:pBdr>
-          <w:left w:val="single" w:sz="18" w:space="6" w:color="4472C4"/>
-        </w:pBdr>
-      </w:pPr>
-      <w:r>
-        <w:rPr>
-          <w:b w:val="0"/>
-          <w:i w:val="0"/>
-          <w:sz w:val="23"/>
-          <w:rFonts w:eastAsia="楷体" w:ascii="Times New Roman" w:hAnsi="Times New Roman"/>
-        </w:rPr>
-        <w:br/>
-        <w:t>评述：在金属化膜电容自愈这一细分方向，国内的测试方法（超声/UHF/声电联合、原位测试）与累积损伤建模已具相当原创性与国际显示度，是国内电容可靠性研究中较为亮眼的一块；这也提示，聚焦细分机理、发展原创表征手段，是国内研究实现"由跟跑到并跑"的可行路径。</w:t>
-        <w:br/>
-      </w:r>
-    </w:p>
-    <w:p>
-      <w:pPr>
-        <w:keepNext/>
-        <w:spacing w:before="160" w:after="120"/>
-        <w:outlineLvl w:val="2"/>
-      </w:pPr>
-      <w:r>
-        <w:rPr>
-          <w:b/>
-          <w:i w:val="0"/>
-          <w:sz w:val="28"/>
-          <w:rFonts w:eastAsia="黑体" w:ascii="Times New Roman" w:hAnsi="Times New Roman"/>
-        </w:rPr>
-        <w:t>8.7 钽电容与超级电容的国内研究</w:t>
-      </w:r>
-    </w:p>
-    <w:p>
-      <w:pPr>
-        <w:spacing w:line="360" w:lineRule="auto" w:after="80"/>
-        <w:ind w:firstLine="465"/>
-        <w:jc w:val="both"/>
-      </w:pPr>
-      <w:r>
-        <w:rPr>
-          <w:b w:val="0"/>
-          <w:i w:val="0"/>
-          <w:sz w:val="24"/>
-          <w:rFonts w:eastAsia="宋体" w:ascii="Times New Roman" w:hAnsi="Times New Roman"/>
-        </w:rPr>
-        <w:t>在钽电容方向，国内研究关注其场致结晶、漏电与浪涌失效的机理与评价，并在RUL预测上提出了基于温度测量的钽电容在线剩余寿命预测方法（见Electronics 2025相关研究），体现了"以易测的温度信号反演退化状态"的实用思路；聚合物阴极钽电容因兼具低ESR与良性失效，亦是国内高可靠领域关注的对象。在超级电容方向，国内PHM研究较为活跃：提出了基于复合去噪与LSTM的超级电容性能退化规律与RUL预测方法（见Circuit World 2024相关研究），以及以LSTM为基架、嵌入物理约束的物理信息神经网络（PINN）预测超级电容退化轨迹与RUL的方法（见Green Energy and Intelligent Transportation 2025相关研究）；此外，面向储能电子元件，提出了基于分数阶Weibull过程与冲击泊松模型的RUL预测方法，丰富了退化随机过程的建模手段（见Fractal and Fractional 2024相关研究）。</w:t>
-      </w:r>
-    </w:p>
-    <w:p>
-      <w:pPr>
-        <w:spacing w:line="360" w:lineRule="auto" w:after="80"/>
-        <w:ind w:firstLine="465"/>
-        <w:jc w:val="both"/>
-      </w:pPr>
-      <w:r>
-        <w:rPr>
-          <w:b w:val="0"/>
-          <w:i w:val="0"/>
-          <w:sz w:val="24"/>
-          <w:rFonts w:eastAsia="宋体" w:ascii="Times New Roman" w:hAnsi="Times New Roman"/>
-        </w:rPr>
-        <w:t>这两类器件的国内研究表明：在数据驱动与物理—数据融合的RUL方法上，国内跟进速度快、方法多样，且开始向"物理约束+数据驱动"的融合范式靠拢；但相关方法多在公开或自测数据集上验证，面向SAPC等具体器件、含真实多应力工况的专用数据与验证仍显不足。</w:t>
-      </w:r>
-    </w:p>
-    <w:p>
-      <w:pPr>
-        <w:keepNext/>
-        <w:spacing w:before="160" w:after="120"/>
-        <w:outlineLvl w:val="2"/>
-      </w:pPr>
-      <w:r>
-        <w:rPr>
-          <w:b/>
-          <w:i w:val="0"/>
-          <w:sz w:val="28"/>
-          <w:rFonts w:eastAsia="黑体" w:ascii="Times New Roman" w:hAnsi="Times New Roman"/>
-        </w:rPr>
-        <w:t>8.8 可靠性建模与数据驱动/物理信息方法的国内进展</w:t>
-      </w:r>
-    </w:p>
-    <w:p>
-      <w:pPr>
-        <w:spacing w:line="360" w:lineRule="auto" w:after="80"/>
-        <w:ind w:firstLine="465"/>
-        <w:jc w:val="both"/>
-      </w:pPr>
-      <w:r>
-        <w:rPr>
-          <w:b w:val="0"/>
-          <w:i w:val="0"/>
-          <w:sz w:val="24"/>
-          <w:rFonts w:eastAsia="宋体" w:ascii="Times New Roman" w:hAnsi="Times New Roman"/>
-        </w:rPr>
-        <w:t>在可靠性建模方法上，国内研究呈现"统计—数据驱动—物理融合"并进的态势。统计与退化随机过程方面，分数阶Weibull过程结合冲击泊松模型等被用于储能电子元件的RUL预测，拓展了对非平稳、含突发冲击退化的刻画能力。数据驱动方面，考虑参数分散影响的CNN-LSTM网络被用于电容老化状态评估与RUL预测，直面"批次/个体分散导致预测失准"这一工程难题；多种LSTM及其改进（如GA-LSTM、改进LSTM）被广泛用于超级电容等器件的寿命预测。物理信息方面，以LSTM为基架嵌入退化物理约束的PINN方法被用于超级电容退化轨迹与RUL预测，代表了国内在"强物理嵌入"前沿范式上的积极探索。</w:t>
-      </w:r>
-    </w:p>
-    <w:p>
-      <w:pPr>
-        <w:keepNext/>
-        <w:spacing w:before="120" w:after="40"/>
-        <w:jc w:val="center"/>
-      </w:pPr>
-      <w:r>
-        <w:rPr>
-          <w:b/>
-          <w:i w:val="0"/>
-          <w:sz w:val="21"/>
-          <w:rFonts w:eastAsia="黑体" w:ascii="Times New Roman" w:hAnsi="Times New Roman"/>
-        </w:rPr>
-        <w:t>表 19  国内电容器可靠性建模与RUL方法概览</w:t>
-      </w:r>
-    </w:p>
-    <w:tbl>
-      <w:tblPr>
-        <w:tblW w:type="auto" w:w="0"/>
-        <w:jc w:val="center"/>
-        <w:tblLayout w:type="autofit"/>
-        <w:tblLook w:firstColumn="1" w:firstRow="1" w:lastColumn="0" w:lastRow="0" w:noHBand="0" w:noVBand="1" w:val="04A0"/>
-      </w:tblPr>
-      <w:tblGrid>
-        <w:gridCol w:w="2126"/>
-        <w:gridCol w:w="2126"/>
-        <w:gridCol w:w="2126"/>
-        <w:gridCol w:w="2126"/>
-      </w:tblGrid>
-      <w:tr>
-        <w:tc>
-          <w:tcPr>
-            <w:tcW w:type="dxa" w:w="1587"/>
-            <w:tcBorders>
-              <w:top w:val="single" w:sz="14" w:space="0" w:color="000000"/>
-              <w:bottom w:val="single" w:sz="6" w:space="0" w:color="000000"/>
-            </w:tcBorders>
-          </w:tcPr>
-          <w:p>
-            <w:pPr>
-              <w:jc w:val="center"/>
-            </w:pPr>
-            <w:r/>
-            <w:r>
-              <w:rPr>
-                <w:b/>
-                <w:i w:val="0"/>
-                <w:sz w:val="19"/>
-                <w:rFonts w:eastAsia="黑体" w:ascii="Times New Roman" w:hAnsi="Times New Roman"/>
-              </w:rPr>
-              <w:t>方法类别</w:t>
-            </w:r>
-          </w:p>
-        </w:tc>
-        <w:tc>
-          <w:tcPr>
-            <w:tcW w:type="dxa" w:w="2041"/>
-            <w:tcBorders>
-              <w:top w:val="single" w:sz="14" w:space="0" w:color="000000"/>
-              <w:bottom w:val="single" w:sz="6" w:space="0" w:color="000000"/>
-            </w:tcBorders>
-          </w:tcPr>
-          <w:p>
-            <w:pPr>
-              <w:jc w:val="center"/>
-            </w:pPr>
-            <w:r/>
-            <w:r>
-              <w:rPr>
-                <w:b/>
-                <w:i w:val="0"/>
-                <w:sz w:val="19"/>
-                <w:rFonts w:eastAsia="黑体" w:ascii="Times New Roman" w:hAnsi="Times New Roman"/>
-              </w:rPr>
-              <w:t>国内代表性技术</w:t>
-            </w:r>
-          </w:p>
-        </w:tc>
-        <w:tc>
-          <w:tcPr>
-            <w:tcW w:type="dxa" w:w="1587"/>
-            <w:tcBorders>
-              <w:top w:val="single" w:sz="14" w:space="0" w:color="000000"/>
-              <w:bottom w:val="single" w:sz="6" w:space="0" w:color="000000"/>
-            </w:tcBorders>
-          </w:tcPr>
-          <w:p>
-            <w:pPr>
-              <w:jc w:val="center"/>
-            </w:pPr>
-            <w:r/>
-            <w:r>
-              <w:rPr>
-                <w:b/>
-                <w:i w:val="0"/>
-                <w:sz w:val="19"/>
-                <w:rFonts w:eastAsia="黑体" w:ascii="Times New Roman" w:hAnsi="Times New Roman"/>
-              </w:rPr>
-              <w:t>应用器件</w:t>
-            </w:r>
-          </w:p>
-        </w:tc>
-        <w:tc>
-          <w:tcPr>
-            <w:tcW w:type="dxa" w:w="2494"/>
-            <w:tcBorders>
-              <w:top w:val="single" w:sz="14" w:space="0" w:color="000000"/>
-              <w:bottom w:val="single" w:sz="6" w:space="0" w:color="000000"/>
-            </w:tcBorders>
-          </w:tcPr>
-          <w:p>
-            <w:pPr>
-              <w:jc w:val="center"/>
-            </w:pPr>
-            <w:r/>
-            <w:r>
-              <w:rPr>
-                <w:b/>
-                <w:i w:val="0"/>
-                <w:sz w:val="19"/>
-                <w:rFonts w:eastAsia="黑体" w:ascii="Times New Roman" w:hAnsi="Times New Roman"/>
-              </w:rPr>
-              <w:t>特点/局限</w:t>
-            </w:r>
-          </w:p>
-        </w:tc>
-      </w:tr>
-      <w:tr>
-        <w:tc>
-          <w:tcPr>
-            <w:tcW w:type="dxa" w:w="1587"/>
-          </w:tcPr>
-          <w:p>
-            <w:pPr>
-              <w:spacing w:line="240" w:lineRule="auto"/>
-              <w:jc w:val="left"/>
-            </w:pPr>
-            <w:r/>
-            <w:r>
-              <w:rPr>
-                <w:b w:val="0"/>
-                <w:i w:val="0"/>
-                <w:sz w:val="19"/>
-                <w:rFonts w:eastAsia="宋体" w:ascii="Times New Roman" w:hAnsi="Times New Roman"/>
-              </w:rPr>
-              <w:t>统计/随机过程</w:t>
-            </w:r>
-          </w:p>
-        </w:tc>
-        <w:tc>
-          <w:tcPr>
-            <w:tcW w:type="dxa" w:w="2041"/>
-          </w:tcPr>
-          <w:p>
-            <w:pPr>
-              <w:spacing w:line="240" w:lineRule="auto"/>
-              <w:jc w:val="left"/>
-            </w:pPr>
-            <w:r/>
-            <w:r>
-              <w:rPr>
-                <w:b w:val="0"/>
-                <w:i w:val="0"/>
-                <w:sz w:val="19"/>
-                <w:rFonts w:eastAsia="宋体" w:ascii="Times New Roman" w:hAnsi="Times New Roman"/>
-              </w:rPr>
-              <w:t>分数阶Weibull+冲击泊松</w:t>
-            </w:r>
-          </w:p>
-        </w:tc>
-        <w:tc>
-          <w:tcPr>
-            <w:tcW w:type="dxa" w:w="1587"/>
-          </w:tcPr>
-          <w:p>
-            <w:pPr>
-              <w:spacing w:line="240" w:lineRule="auto"/>
-              <w:jc w:val="left"/>
-            </w:pPr>
-            <w:r/>
-            <w:r>
-              <w:rPr>
-                <w:b w:val="0"/>
-                <w:i w:val="0"/>
-                <w:sz w:val="19"/>
-                <w:rFonts w:eastAsia="宋体" w:ascii="Times New Roman" w:hAnsi="Times New Roman"/>
-              </w:rPr>
-              <w:t>储能电子元件</w:t>
-            </w:r>
-          </w:p>
-        </w:tc>
-        <w:tc>
-          <w:tcPr>
-            <w:tcW w:type="dxa" w:w="2494"/>
-          </w:tcPr>
-          <w:p>
-            <w:pPr>
-              <w:spacing w:line="240" w:lineRule="auto"/>
-              <w:jc w:val="left"/>
-            </w:pPr>
-            <w:r/>
-            <w:r>
-              <w:rPr>
-                <w:b w:val="0"/>
-                <w:i w:val="0"/>
-                <w:sz w:val="19"/>
-                <w:rFonts w:eastAsia="宋体" w:ascii="Times New Roman" w:hAnsi="Times New Roman"/>
-              </w:rPr>
-              <w:t>刻画非平稳与冲击；参数标定难</w:t>
-            </w:r>
-          </w:p>
-        </w:tc>
-      </w:tr>
-      <w:tr>
-        <w:tc>
-          <w:tcPr>
-            <w:tcW w:type="dxa" w:w="1587"/>
-          </w:tcPr>
-          <w:p>
-            <w:pPr>
-              <w:spacing w:line="240" w:lineRule="auto"/>
-              <w:jc w:val="left"/>
-            </w:pPr>
-            <w:r/>
-            <w:r>
-              <w:rPr>
-                <w:b w:val="0"/>
-                <w:i w:val="0"/>
-                <w:sz w:val="19"/>
-                <w:rFonts w:eastAsia="宋体" w:ascii="Times New Roman" w:hAnsi="Times New Roman"/>
-              </w:rPr>
-              <w:t>数据驱动(DL)</w:t>
-            </w:r>
-          </w:p>
-        </w:tc>
-        <w:tc>
-          <w:tcPr>
-            <w:tcW w:type="dxa" w:w="2041"/>
-          </w:tcPr>
-          <w:p>
-            <w:pPr>
-              <w:spacing w:line="240" w:lineRule="auto"/>
-              <w:jc w:val="left"/>
-            </w:pPr>
-            <w:r/>
-            <w:r>
-              <w:rPr>
-                <w:b w:val="0"/>
-                <w:i w:val="0"/>
-                <w:sz w:val="19"/>
-                <w:rFonts w:eastAsia="宋体" w:ascii="Times New Roman" w:hAnsi="Times New Roman"/>
-              </w:rPr>
-              <w:t>CNN-LSTM(考虑参数分散)</w:t>
-            </w:r>
-          </w:p>
-        </w:tc>
-        <w:tc>
-          <w:tcPr>
-            <w:tcW w:type="dxa" w:w="1587"/>
-          </w:tcPr>
-          <w:p>
-            <w:pPr>
-              <w:spacing w:line="240" w:lineRule="auto"/>
-              <w:jc w:val="left"/>
-            </w:pPr>
-            <w:r/>
-            <w:r>
-              <w:rPr>
-                <w:b w:val="0"/>
-                <w:i w:val="0"/>
-                <w:sz w:val="19"/>
-                <w:rFonts w:eastAsia="宋体" w:ascii="Times New Roman" w:hAnsi="Times New Roman"/>
-              </w:rPr>
-              <w:t>电容/钽电容</w:t>
-            </w:r>
-          </w:p>
-        </w:tc>
-        <w:tc>
-          <w:tcPr>
-            <w:tcW w:type="dxa" w:w="2494"/>
-          </w:tcPr>
-          <w:p>
-            <w:pPr>
-              <w:spacing w:line="240" w:lineRule="auto"/>
-              <w:jc w:val="left"/>
-            </w:pPr>
-            <w:r/>
-            <w:r>
-              <w:rPr>
-                <w:b w:val="0"/>
-                <w:i w:val="0"/>
-                <w:sz w:val="19"/>
-                <w:rFonts w:eastAsia="宋体" w:ascii="Times New Roman" w:hAnsi="Times New Roman"/>
-              </w:rPr>
-              <w:t>应对分散；依赖数据、外推弱</w:t>
-            </w:r>
-          </w:p>
-        </w:tc>
-      </w:tr>
-      <w:tr>
-        <w:tc>
-          <w:tcPr>
-            <w:tcW w:type="dxa" w:w="1587"/>
-          </w:tcPr>
-          <w:p>
-            <w:pPr>
-              <w:spacing w:line="240" w:lineRule="auto"/>
-              <w:jc w:val="left"/>
-            </w:pPr>
-            <w:r/>
-            <w:r>
-              <w:rPr>
-                <w:b w:val="0"/>
-                <w:i w:val="0"/>
-                <w:sz w:val="19"/>
-                <w:rFonts w:eastAsia="宋体" w:ascii="Times New Roman" w:hAnsi="Times New Roman"/>
-              </w:rPr>
-              <w:t>数据驱动(DL)</w:t>
-            </w:r>
-          </w:p>
-        </w:tc>
-        <w:tc>
-          <w:tcPr>
-            <w:tcW w:type="dxa" w:w="2041"/>
-          </w:tcPr>
-          <w:p>
-            <w:pPr>
-              <w:spacing w:line="240" w:lineRule="auto"/>
-              <w:jc w:val="left"/>
-            </w:pPr>
-            <w:r/>
-            <w:r>
-              <w:rPr>
-                <w:b w:val="0"/>
-                <w:i w:val="0"/>
-                <w:sz w:val="19"/>
-                <w:rFonts w:eastAsia="宋体" w:ascii="Times New Roman" w:hAnsi="Times New Roman"/>
-              </w:rPr>
-              <w:t>LSTM/GA-LSTM/改进LSTM</w:t>
-            </w:r>
-          </w:p>
-        </w:tc>
-        <w:tc>
-          <w:tcPr>
-            <w:tcW w:type="dxa" w:w="1587"/>
-          </w:tcPr>
-          <w:p>
-            <w:pPr>
-              <w:spacing w:line="240" w:lineRule="auto"/>
-              <w:jc w:val="left"/>
-            </w:pPr>
-            <w:r/>
-            <w:r>
-              <w:rPr>
-                <w:b w:val="0"/>
-                <w:i w:val="0"/>
-                <w:sz w:val="19"/>
-                <w:rFonts w:eastAsia="宋体" w:ascii="Times New Roman" w:hAnsi="Times New Roman"/>
-              </w:rPr>
-              <w:t>超级电容</w:t>
-            </w:r>
-          </w:p>
-        </w:tc>
-        <w:tc>
-          <w:tcPr>
-            <w:tcW w:type="dxa" w:w="2494"/>
-          </w:tcPr>
-          <w:p>
-            <w:pPr>
-              <w:spacing w:line="240" w:lineRule="auto"/>
-              <w:jc w:val="left"/>
-            </w:pPr>
-            <w:r/>
-            <w:r>
-              <w:rPr>
-                <w:b w:val="0"/>
-                <w:i w:val="0"/>
-                <w:sz w:val="19"/>
-                <w:rFonts w:eastAsia="宋体" w:ascii="Times New Roman" w:hAnsi="Times New Roman"/>
-              </w:rPr>
-              <w:t>精度较高；可解释性弱</w:t>
-            </w:r>
-          </w:p>
-        </w:tc>
-      </w:tr>
-      <w:tr>
-        <w:tc>
-          <w:tcPr>
-            <w:tcW w:type="dxa" w:w="1587"/>
-          </w:tcPr>
-          <w:p>
-            <w:pPr>
-              <w:spacing w:line="240" w:lineRule="auto"/>
-              <w:jc w:val="left"/>
-            </w:pPr>
-            <w:r/>
-            <w:r>
-              <w:rPr>
-                <w:b w:val="0"/>
-                <w:i w:val="0"/>
-                <w:sz w:val="19"/>
-                <w:rFonts w:eastAsia="宋体" w:ascii="Times New Roman" w:hAnsi="Times New Roman"/>
-              </w:rPr>
-              <w:t>物理—数据融合</w:t>
-            </w:r>
-          </w:p>
-        </w:tc>
-        <w:tc>
-          <w:tcPr>
-            <w:tcW w:type="dxa" w:w="2041"/>
-          </w:tcPr>
-          <w:p>
-            <w:pPr>
-              <w:spacing w:line="240" w:lineRule="auto"/>
-              <w:jc w:val="left"/>
-            </w:pPr>
-            <w:r/>
-            <w:r>
-              <w:rPr>
-                <w:b w:val="0"/>
-                <w:i w:val="0"/>
-                <w:sz w:val="19"/>
-                <w:rFonts w:eastAsia="宋体" w:ascii="Times New Roman" w:hAnsi="Times New Roman"/>
-              </w:rPr>
-              <w:t>LSTM基架PINN</w:t>
-            </w:r>
-          </w:p>
-        </w:tc>
-        <w:tc>
-          <w:tcPr>
-            <w:tcW w:type="dxa" w:w="1587"/>
-          </w:tcPr>
-          <w:p>
-            <w:pPr>
-              <w:spacing w:line="240" w:lineRule="auto"/>
-              <w:jc w:val="left"/>
-            </w:pPr>
-            <w:r/>
-            <w:r>
-              <w:rPr>
-                <w:b w:val="0"/>
-                <w:i w:val="0"/>
-                <w:sz w:val="19"/>
-                <w:rFonts w:eastAsia="宋体" w:ascii="Times New Roman" w:hAnsi="Times New Roman"/>
-              </w:rPr>
-              <w:t>超级电容</w:t>
-            </w:r>
-          </w:p>
-        </w:tc>
-        <w:tc>
-          <w:tcPr>
-            <w:tcW w:type="dxa" w:w="2494"/>
-          </w:tcPr>
-          <w:p>
-            <w:pPr>
-              <w:spacing w:line="240" w:lineRule="auto"/>
-              <w:jc w:val="left"/>
-            </w:pPr>
-            <w:r/>
-            <w:r>
-              <w:rPr>
-                <w:b w:val="0"/>
-                <w:i w:val="0"/>
-                <w:sz w:val="19"/>
-                <w:rFonts w:eastAsia="宋体" w:ascii="Times New Roman" w:hAnsi="Times New Roman"/>
-              </w:rPr>
-              <w:t>物理约束+小样本；前沿探索</w:t>
-            </w:r>
-          </w:p>
-        </w:tc>
-      </w:tr>
-      <w:tr>
-        <w:tc>
-          <w:tcPr>
-            <w:tcW w:type="dxa" w:w="1587"/>
-            <w:tcBorders>
-              <w:bottom w:val="single" w:sz="14" w:space="0" w:color="000000"/>
-            </w:tcBorders>
-          </w:tcPr>
-          <w:p>
-            <w:pPr>
-              <w:spacing w:line="240" w:lineRule="auto"/>
-              <w:jc w:val="left"/>
-            </w:pPr>
-            <w:r/>
-            <w:r>
-              <w:rPr>
-                <w:b w:val="0"/>
-                <w:i w:val="0"/>
-                <w:sz w:val="19"/>
-                <w:rFonts w:eastAsia="宋体" w:ascii="Times New Roman" w:hAnsi="Times New Roman"/>
-              </w:rPr>
-              <w:t>在线辨识</w:t>
-            </w:r>
-          </w:p>
-        </w:tc>
-        <w:tc>
-          <w:tcPr>
-            <w:tcW w:type="dxa" w:w="2041"/>
-            <w:tcBorders>
-              <w:bottom w:val="single" w:sz="14" w:space="0" w:color="000000"/>
-            </w:tcBorders>
-          </w:tcPr>
-          <w:p>
-            <w:pPr>
-              <w:spacing w:line="240" w:lineRule="auto"/>
-              <w:jc w:val="left"/>
-            </w:pPr>
-            <w:r/>
-            <w:r>
-              <w:rPr>
-                <w:b w:val="0"/>
-                <w:i w:val="0"/>
-                <w:sz w:val="19"/>
-                <w:rFonts w:eastAsia="宋体" w:ascii="Times New Roman" w:hAnsi="Times New Roman"/>
-              </w:rPr>
-              <w:t>灰箱、RLS、注入/纹波法</w:t>
-            </w:r>
-          </w:p>
-        </w:tc>
-        <w:tc>
-          <w:tcPr>
-            <w:tcW w:type="dxa" w:w="1587"/>
-            <w:tcBorders>
-              <w:bottom w:val="single" w:sz="14" w:space="0" w:color="000000"/>
-            </w:tcBorders>
-          </w:tcPr>
-          <w:p>
-            <w:pPr>
-              <w:spacing w:line="240" w:lineRule="auto"/>
-              <w:jc w:val="left"/>
-            </w:pPr>
-            <w:r/>
-            <w:r>
-              <w:rPr>
-                <w:b w:val="0"/>
-                <w:i w:val="0"/>
-                <w:sz w:val="19"/>
-                <w:rFonts w:eastAsia="宋体" w:ascii="Times New Roman" w:hAnsi="Times New Roman"/>
-              </w:rPr>
-              <w:t>DC-link铝电解</w:t>
-            </w:r>
-          </w:p>
-        </w:tc>
-        <w:tc>
-          <w:tcPr>
-            <w:tcW w:type="dxa" w:w="2494"/>
-            <w:tcBorders>
-              <w:bottom w:val="single" w:sz="14" w:space="0" w:color="000000"/>
-            </w:tcBorders>
-          </w:tcPr>
-          <w:p>
-            <w:pPr>
-              <w:spacing w:line="240" w:lineRule="auto"/>
-              <w:jc w:val="left"/>
-            </w:pPr>
-            <w:r/>
-            <w:r>
-              <w:rPr>
-                <w:b w:val="0"/>
-                <w:i w:val="0"/>
-                <w:sz w:val="19"/>
-                <w:rFonts w:eastAsia="宋体" w:ascii="Times New Roman" w:hAnsi="Times New Roman"/>
-              </w:rPr>
-              <w:t>工程落地强；原创理论少</w:t>
-            </w:r>
-          </w:p>
-        </w:tc>
-      </w:tr>
-    </w:tbl>
-    <w:p>
-      <w:pPr>
-        <w:spacing w:line="360" w:lineRule="auto" w:after="80"/>
-        <w:ind w:firstLine="465"/>
-        <w:jc w:val="both"/>
-      </w:pPr>
-      <w:r>
-        <w:rPr>
-          <w:b w:val="0"/>
-          <w:i w:val="0"/>
-          <w:sz w:val="24"/>
-          <w:rFonts w:eastAsia="宋体" w:ascii="Times New Roman" w:hAnsi="Times New Roman"/>
-        </w:rPr>
-        <w:t>横向看，国内建模研究在"数据驱动"上规模与速度均已接近国际，在"物理—数据融合（PINN）"上也已起步并紧跟前沿；但与国际相比，原创性的失效物理模型（如带齐全激活能谱的第一性机理模型）较少，强物理嵌入范式整体仍处跟随，且面向SAPC等具体器件的专用数据集与基准缺位，制约了方法的公平比较与可复现验证。</w:t>
-      </w:r>
-    </w:p>
-    <w:p>
-      <w:pPr>
-        <w:keepNext/>
-        <w:spacing w:before="160" w:after="120"/>
-        <w:outlineLvl w:val="2"/>
-      </w:pPr>
-      <w:r>
-        <w:rPr>
-          <w:b/>
-          <w:i w:val="0"/>
-          <w:sz w:val="28"/>
-          <w:rFonts w:eastAsia="黑体" w:ascii="Times New Roman" w:hAnsi="Times New Roman"/>
-        </w:rPr>
-        <w:t>8.9 标准、自主化与“数据主权”</w:t>
-      </w:r>
-    </w:p>
-    <w:p>
-      <w:pPr>
-        <w:spacing w:line="360" w:lineRule="auto" w:after="80"/>
-        <w:ind w:firstLine="465"/>
-        <w:jc w:val="both"/>
-      </w:pPr>
-      <w:r>
-        <w:rPr>
-          <w:b w:val="0"/>
-          <w:i w:val="0"/>
-          <w:sz w:val="24"/>
-          <w:rFonts w:eastAsia="宋体" w:ascii="Times New Roman" w:hAnsi="Times New Roman"/>
-        </w:rPr>
-        <w:t>标准与自主化是国内研究绕不开的战略维度。在标准层面，国内长期以采标、等同转化国际标准为主：固定电容器通用要求多对应GB/T 2693（等同采用IEC 60384-1），高可靠与军用领域则有GJB 360（电子及电气元件试验方法）等系列国军标与详细规范；近年来国内在新能源、电动汽车等优势场景开始参与甚至牵头部分国际/团体标准，话语权稳步提升，但在高可靠、车规、宇航等高端领域仍处跟随地位。在自主化层面，国产MLCC在中低端已规模化、车规高端在突破中；铝电解与薄膜（含SAPC、DC-link）在新能源/轨交场景竞争力较强；固体钽高可靠产品的钽粉、阴极材料与工艺仍部分受制于人。</w:t>
-      </w:r>
-    </w:p>
-    <w:p>
-      <w:pPr>
-        <w:spacing w:line="360" w:lineRule="auto" w:after="80"/>
-        <w:ind w:firstLine="465"/>
-        <w:jc w:val="both"/>
-      </w:pPr>
-      <w:r>
-        <w:rPr>
-          <w:b w:val="0"/>
-          <w:i w:val="0"/>
-          <w:sz w:val="24"/>
-          <w:rFonts w:eastAsia="宋体" w:ascii="Times New Roman" w:hAnsi="Times New Roman"/>
-        </w:rPr>
-        <w:t>更深层的问题是"可靠性数据主权"：谁掌握器件全流程工艺与长期失效数据，谁就掌握失效率基准与可靠性判据的定义权。国外头部厂商凭数十年工艺—失效数据库主导全球判据；国内虽拥有新能源等海量真实工况数据，却缺乏面向国产高端器件（含SAPC）、口径统一、样本充分的失效率基准库，且产学研之间存在数据壁垒。打破壁垒、建立产学研共享的国产器件失效数据库，是国内由"可靠性大国"迈向"可靠性强国"的关键，也与第十章研究空白G-1在战略层面呼应。</w:t>
-      </w:r>
-    </w:p>
-    <w:p>
-      <w:pPr>
-        <w:keepNext/>
-        <w:spacing w:before="160" w:after="120"/>
-        <w:outlineLvl w:val="2"/>
-      </w:pPr>
-      <w:r>
-        <w:rPr>
-          <w:b/>
-          <w:i w:val="0"/>
-          <w:sz w:val="28"/>
-          <w:rFonts w:eastAsia="黑体" w:ascii="Times New Roman" w:hAnsi="Times New Roman"/>
-        </w:rPr>
-        <w:t>8.10 国内研究的特点、贡献与不足（综合评述）</w:t>
-      </w:r>
-    </w:p>
-    <w:p>
-      <w:pPr>
-        <w:spacing w:line="360" w:lineRule="auto" w:after="80"/>
-        <w:ind w:firstLine="465"/>
-        <w:jc w:val="both"/>
-      </w:pPr>
-      <w:r>
-        <w:rPr>
-          <w:b w:val="0"/>
-          <w:i w:val="0"/>
-          <w:sz w:val="24"/>
-          <w:rFonts w:eastAsia="宋体" w:ascii="Times New Roman" w:hAnsi="Times New Roman"/>
-        </w:rPr>
-        <w:t>综合8.1–8.9，可对国内研究作如下评述。三大特点：其一"场景驱动"，研究紧扣新能源、电动交通等国家重大需求，工程落地性强；其二"工程见长"，在DC-link在线监测、薄膜自愈检测、车规MLCC验证等方向形成系统集成与现场落地优势；其三"快速跟进"，在数据驱动与物理—数据融合（PINN）等前沿方法上跟进迅速、规模可观。三方面贡献：提供了国际不易获得的海量真实工况数据；在金属化膜自愈检测、MLCC晶粒—可靠性机理、PEDOT去质子化等细分方向作出原创或近原创贡献；推动了国产高端电容（含SAPC）的自主化进程。</w:t>
-      </w:r>
-    </w:p>
-    <w:p>
-      <w:pPr>
-        <w:spacing w:line="360" w:lineRule="auto" w:after="80"/>
-        <w:ind w:firstLine="465"/>
-        <w:jc w:val="both"/>
-      </w:pPr>
-      <w:r>
-        <w:rPr>
-          <w:b w:val="0"/>
-          <w:i w:val="0"/>
-          <w:sz w:val="24"/>
-          <w:rFonts w:eastAsia="宋体" w:ascii="Times New Roman" w:hAnsi="Times New Roman"/>
-        </w:rPr>
-        <w:t>四点不足同样清晰：一是SAPC等具体器件"材料热、器件冷"，缺乏统一规程下的长周期、多应力器件级失效与寿命数据；二是原创失效物理模型与判据较少，强物理嵌入范式整体跟随；三是缺乏面向国产高端器件、口径统一的失效率基准库与公开退化基准数据集，制约方法的可比较与可复现；四是产学研数据壁垒与标准话语权不足。补齐这四块短板——尤其是为SAPC建立专用多应力数据集、发展机理贯通的失效物理与竞争失效模型、并推动数据共享与标准自主化——正是国内研究（也是本文）实现质的跃升的着力点。</w:t>
-      </w:r>
-    </w:p>
-    <w:p>
-      <w:pPr>
-        <w:keepNext/>
-        <w:spacing w:before="120" w:after="40"/>
-        <w:jc w:val="center"/>
-      </w:pPr>
-      <w:r>
-        <w:rPr>
-          <w:b/>
-          <w:i w:val="0"/>
-          <w:sz w:val="21"/>
-          <w:rFonts w:eastAsia="黑体" w:ascii="Times New Roman" w:hAnsi="Times New Roman"/>
-        </w:rPr>
-        <w:t>表 20  国内SAPC/电容器可靠性研究：现状—差距—突破方向</w:t>
-      </w:r>
-    </w:p>
-    <w:tbl>
-      <w:tblPr>
-        <w:tblW w:type="auto" w:w="0"/>
-        <w:jc w:val="center"/>
-        <w:tblLayout w:type="autofit"/>
-        <w:tblLook w:firstColumn="1" w:firstRow="1" w:lastColumn="0" w:lastRow="0" w:noHBand="0" w:noVBand="1" w:val="04A0"/>
-      </w:tblPr>
-      <w:tblGrid>
-        <w:gridCol w:w="2126"/>
-        <w:gridCol w:w="2126"/>
-        <w:gridCol w:w="2126"/>
-        <w:gridCol w:w="2126"/>
-      </w:tblGrid>
-      <w:tr>
-        <w:tc>
-          <w:tcPr>
-            <w:tcW w:type="dxa" w:w="1474"/>
-            <w:tcBorders>
-              <w:top w:val="single" w:sz="14" w:space="0" w:color="000000"/>
-              <w:bottom w:val="single" w:sz="6" w:space="0" w:color="000000"/>
-            </w:tcBorders>
-          </w:tcPr>
-          <w:p>
-            <w:pPr>
-              <w:jc w:val="center"/>
-            </w:pPr>
-            <w:r/>
-            <w:r>
-              <w:rPr>
-                <w:b/>
-                <w:i w:val="0"/>
-                <w:sz w:val="19"/>
-                <w:rFonts w:eastAsia="黑体" w:ascii="Times New Roman" w:hAnsi="Times New Roman"/>
-              </w:rPr>
-              <w:t>维度</w:t>
-            </w:r>
-          </w:p>
-        </w:tc>
-        <w:tc>
-          <w:tcPr>
-            <w:tcW w:type="dxa" w:w="2268"/>
-            <w:tcBorders>
-              <w:top w:val="single" w:sz="14" w:space="0" w:color="000000"/>
-              <w:bottom w:val="single" w:sz="6" w:space="0" w:color="000000"/>
-            </w:tcBorders>
-          </w:tcPr>
-          <w:p>
-            <w:pPr>
-              <w:jc w:val="center"/>
-            </w:pPr>
-            <w:r/>
-            <w:r>
-              <w:rPr>
-                <w:b/>
-                <w:i w:val="0"/>
-                <w:sz w:val="19"/>
-                <w:rFonts w:eastAsia="黑体" w:ascii="Times New Roman" w:hAnsi="Times New Roman"/>
-              </w:rPr>
-              <w:t>国内现状</w:t>
-            </w:r>
-          </w:p>
-        </w:tc>
-        <w:tc>
-          <w:tcPr>
-            <w:tcW w:type="dxa" w:w="1587"/>
-            <w:tcBorders>
-              <w:top w:val="single" w:sz="14" w:space="0" w:color="000000"/>
-              <w:bottom w:val="single" w:sz="6" w:space="0" w:color="000000"/>
-            </w:tcBorders>
-          </w:tcPr>
-          <w:p>
-            <w:pPr>
-              <w:jc w:val="center"/>
-            </w:pPr>
-            <w:r/>
-            <w:r>
-              <w:rPr>
-                <w:b/>
-                <w:i w:val="0"/>
-                <w:sz w:val="19"/>
-                <w:rFonts w:eastAsia="黑体" w:ascii="Times New Roman" w:hAnsi="Times New Roman"/>
-              </w:rPr>
-              <w:t>与国际差距</w:t>
-            </w:r>
-          </w:p>
-        </w:tc>
-        <w:tc>
-          <w:tcPr>
-            <w:tcW w:type="dxa" w:w="2381"/>
-            <w:tcBorders>
-              <w:top w:val="single" w:sz="14" w:space="0" w:color="000000"/>
-              <w:bottom w:val="single" w:sz="6" w:space="0" w:color="000000"/>
-            </w:tcBorders>
-          </w:tcPr>
-          <w:p>
-            <w:pPr>
-              <w:jc w:val="center"/>
-            </w:pPr>
-            <w:r/>
-            <w:r>
-              <w:rPr>
-                <w:b/>
-                <w:i w:val="0"/>
-                <w:sz w:val="19"/>
-                <w:rFonts w:eastAsia="黑体" w:ascii="Times New Roman" w:hAnsi="Times New Roman"/>
-              </w:rPr>
-              <w:t>突破方向</w:t>
-            </w:r>
-          </w:p>
-        </w:tc>
-      </w:tr>
-      <w:tr>
-        <w:tc>
-          <w:tcPr>
-            <w:tcW w:type="dxa" w:w="1474"/>
-          </w:tcPr>
-          <w:p>
-            <w:pPr>
-              <w:spacing w:line="240" w:lineRule="auto"/>
-              <w:jc w:val="left"/>
-            </w:pPr>
-            <w:r/>
-            <w:r>
-              <w:rPr>
-                <w:b w:val="0"/>
-                <w:i w:val="0"/>
-                <w:sz w:val="19"/>
-                <w:rFonts w:eastAsia="宋体" w:ascii="Times New Roman" w:hAnsi="Times New Roman"/>
-              </w:rPr>
-              <w:t>SAPC材料</w:t>
-            </w:r>
-          </w:p>
-        </w:tc>
-        <w:tc>
-          <w:tcPr>
-            <w:tcW w:type="dxa" w:w="2268"/>
-          </w:tcPr>
-          <w:p>
-            <w:pPr>
-              <w:spacing w:line="240" w:lineRule="auto"/>
-              <w:jc w:val="left"/>
-            </w:pPr>
-            <w:r/>
-            <w:r>
-              <w:rPr>
-                <w:b w:val="0"/>
-                <w:i w:val="0"/>
-                <w:sz w:val="19"/>
-                <w:rFonts w:eastAsia="宋体" w:ascii="Times New Roman" w:hAnsi="Times New Roman"/>
-              </w:rPr>
-              <w:t>PEDOT去质子/气相聚合接轨前沿</w:t>
-            </w:r>
-          </w:p>
-        </w:tc>
-        <w:tc>
-          <w:tcPr>
-            <w:tcW w:type="dxa" w:w="1587"/>
-          </w:tcPr>
-          <w:p>
-            <w:pPr>
-              <w:spacing w:line="240" w:lineRule="auto"/>
-              <w:jc w:val="left"/>
-            </w:pPr>
-            <w:r/>
-            <w:r>
-              <w:rPr>
-                <w:b w:val="0"/>
-                <w:i w:val="0"/>
-                <w:sz w:val="19"/>
-                <w:rFonts w:eastAsia="宋体" w:ascii="Times New Roman" w:hAnsi="Times New Roman"/>
-              </w:rPr>
-              <w:t>较小</w:t>
-            </w:r>
-          </w:p>
-        </w:tc>
-        <w:tc>
-          <w:tcPr>
-            <w:tcW w:type="dxa" w:w="2381"/>
-          </w:tcPr>
-          <w:p>
-            <w:pPr>
-              <w:spacing w:line="240" w:lineRule="auto"/>
-              <w:jc w:val="left"/>
-            </w:pPr>
-            <w:r/>
-            <w:r>
-              <w:rPr>
-                <w:b w:val="0"/>
-                <w:i w:val="0"/>
-                <w:sz w:val="19"/>
-                <w:rFonts w:eastAsia="宋体" w:ascii="Times New Roman" w:hAnsi="Times New Roman"/>
-              </w:rPr>
-              <w:t>稳定化与界面工程</w:t>
-            </w:r>
-          </w:p>
-        </w:tc>
-      </w:tr>
-      <w:tr>
-        <w:tc>
-          <w:tcPr>
-            <w:tcW w:type="dxa" w:w="1474"/>
-          </w:tcPr>
-          <w:p>
-            <w:pPr>
-              <w:spacing w:line="240" w:lineRule="auto"/>
-              <w:jc w:val="left"/>
-            </w:pPr>
-            <w:r/>
-            <w:r>
-              <w:rPr>
-                <w:b w:val="0"/>
-                <w:i w:val="0"/>
-                <w:sz w:val="19"/>
-                <w:rFonts w:eastAsia="宋体" w:ascii="Times New Roman" w:hAnsi="Times New Roman"/>
-              </w:rPr>
-              <w:t>SAPC器件数据</w:t>
-            </w:r>
-          </w:p>
-        </w:tc>
-        <w:tc>
-          <w:tcPr>
-            <w:tcW w:type="dxa" w:w="2268"/>
-          </w:tcPr>
-          <w:p>
-            <w:pPr>
-              <w:spacing w:line="240" w:lineRule="auto"/>
-              <w:jc w:val="left"/>
-            </w:pPr>
-            <w:r/>
-            <w:r>
-              <w:rPr>
-                <w:b w:val="0"/>
-                <w:i w:val="0"/>
-                <w:sz w:val="19"/>
-                <w:rFonts w:eastAsia="宋体" w:ascii="Times New Roman" w:hAnsi="Times New Roman"/>
-              </w:rPr>
-              <w:t>长周期多应力数据稀缺</w:t>
-            </w:r>
-          </w:p>
-        </w:tc>
-        <w:tc>
-          <w:tcPr>
-            <w:tcW w:type="dxa" w:w="1587"/>
-          </w:tcPr>
-          <w:p>
-            <w:pPr>
-              <w:spacing w:line="240" w:lineRule="auto"/>
-              <w:jc w:val="left"/>
-            </w:pPr>
-            <w:r/>
-            <w:r>
-              <w:rPr>
-                <w:b w:val="0"/>
-                <w:i w:val="0"/>
-                <w:sz w:val="19"/>
-                <w:rFonts w:eastAsia="宋体" w:ascii="Times New Roman" w:hAnsi="Times New Roman"/>
-              </w:rPr>
-              <w:t>较大</w:t>
-            </w:r>
-          </w:p>
-        </w:tc>
-        <w:tc>
-          <w:tcPr>
-            <w:tcW w:type="dxa" w:w="2381"/>
-          </w:tcPr>
-          <w:p>
-            <w:pPr>
-              <w:spacing w:line="240" w:lineRule="auto"/>
-              <w:jc w:val="left"/>
-            </w:pPr>
-            <w:r/>
-            <w:r>
-              <w:rPr>
-                <w:b w:val="0"/>
-                <w:i w:val="0"/>
-                <w:sz w:val="19"/>
-                <w:rFonts w:eastAsia="宋体" w:ascii="Times New Roman" w:hAnsi="Times New Roman"/>
-              </w:rPr>
-              <w:t>专用数据集+统一规程</w:t>
-            </w:r>
-          </w:p>
-        </w:tc>
-      </w:tr>
-      <w:tr>
-        <w:tc>
-          <w:tcPr>
-            <w:tcW w:type="dxa" w:w="1474"/>
-          </w:tcPr>
-          <w:p>
-            <w:pPr>
-              <w:spacing w:line="240" w:lineRule="auto"/>
-              <w:jc w:val="left"/>
-            </w:pPr>
-            <w:r/>
-            <w:r>
-              <w:rPr>
-                <w:b w:val="0"/>
-                <w:i w:val="0"/>
-                <w:sz w:val="19"/>
-                <w:rFonts w:eastAsia="宋体" w:ascii="Times New Roman" w:hAnsi="Times New Roman"/>
-              </w:rPr>
-              <w:t>失效机理建模</w:t>
-            </w:r>
-          </w:p>
-        </w:tc>
-        <w:tc>
-          <w:tcPr>
-            <w:tcW w:type="dxa" w:w="2268"/>
-          </w:tcPr>
-          <w:p>
-            <w:pPr>
-              <w:spacing w:line="240" w:lineRule="auto"/>
-              <w:jc w:val="left"/>
-            </w:pPr>
-            <w:r/>
-            <w:r>
-              <w:rPr>
-                <w:b w:val="0"/>
-                <w:i w:val="0"/>
-                <w:sz w:val="19"/>
-                <w:rFonts w:eastAsia="宋体" w:ascii="Times New Roman" w:hAnsi="Times New Roman"/>
-              </w:rPr>
-              <w:t>工况验证+仿真为主</w:t>
-            </w:r>
-          </w:p>
-        </w:tc>
-        <w:tc>
-          <w:tcPr>
-            <w:tcW w:type="dxa" w:w="1587"/>
-          </w:tcPr>
-          <w:p>
-            <w:pPr>
-              <w:spacing w:line="240" w:lineRule="auto"/>
-              <w:jc w:val="left"/>
-            </w:pPr>
-            <w:r/>
-            <w:r>
-              <w:rPr>
-                <w:b w:val="0"/>
-                <w:i w:val="0"/>
-                <w:sz w:val="19"/>
-                <w:rFonts w:eastAsia="宋体" w:ascii="Times New Roman" w:hAnsi="Times New Roman"/>
-              </w:rPr>
-              <w:t>原创模型少</w:t>
-            </w:r>
-          </w:p>
-        </w:tc>
-        <w:tc>
-          <w:tcPr>
-            <w:tcW w:type="dxa" w:w="2381"/>
-          </w:tcPr>
-          <w:p>
-            <w:pPr>
-              <w:spacing w:line="240" w:lineRule="auto"/>
-              <w:jc w:val="left"/>
-            </w:pPr>
-            <w:r/>
-            <w:r>
-              <w:rPr>
-                <w:b w:val="0"/>
-                <w:i w:val="0"/>
-                <w:sz w:val="19"/>
-                <w:rFonts w:eastAsia="宋体" w:ascii="Times New Roman" w:hAnsi="Times New Roman"/>
-              </w:rPr>
-              <w:t>机理贯通PoF/竞争失效</w:t>
-            </w:r>
-          </w:p>
-        </w:tc>
-      </w:tr>
-      <w:tr>
-        <w:tc>
-          <w:tcPr>
-            <w:tcW w:type="dxa" w:w="1474"/>
-          </w:tcPr>
-          <w:p>
-            <w:pPr>
-              <w:spacing w:line="240" w:lineRule="auto"/>
-              <w:jc w:val="left"/>
-            </w:pPr>
-            <w:r/>
-            <w:r>
-              <w:rPr>
-                <w:b w:val="0"/>
-                <w:i w:val="0"/>
-                <w:sz w:val="19"/>
-                <w:rFonts w:eastAsia="宋体" w:ascii="Times New Roman" w:hAnsi="Times New Roman"/>
-              </w:rPr>
-              <w:t>数据驱动/RUL</w:t>
-            </w:r>
-          </w:p>
-        </w:tc>
-        <w:tc>
-          <w:tcPr>
-            <w:tcW w:type="dxa" w:w="2268"/>
-          </w:tcPr>
-          <w:p>
-            <w:pPr>
-              <w:spacing w:line="240" w:lineRule="auto"/>
-              <w:jc w:val="left"/>
-            </w:pPr>
-            <w:r/>
-            <w:r>
-              <w:rPr>
-                <w:b w:val="0"/>
-                <w:i w:val="0"/>
-                <w:sz w:val="19"/>
-                <w:rFonts w:eastAsia="宋体" w:ascii="Times New Roman" w:hAnsi="Times New Roman"/>
-              </w:rPr>
-              <w:t>规模跟进、PINN起步</w:t>
-            </w:r>
-          </w:p>
-        </w:tc>
-        <w:tc>
-          <w:tcPr>
-            <w:tcW w:type="dxa" w:w="1587"/>
-          </w:tcPr>
-          <w:p>
-            <w:pPr>
-              <w:spacing w:line="240" w:lineRule="auto"/>
-              <w:jc w:val="left"/>
-            </w:pPr>
-            <w:r/>
-            <w:r>
-              <w:rPr>
-                <w:b w:val="0"/>
-                <w:i w:val="0"/>
-                <w:sz w:val="19"/>
-                <w:rFonts w:eastAsia="宋体" w:ascii="Times New Roman" w:hAnsi="Times New Roman"/>
-              </w:rPr>
-              <w:t>基本同步</w:t>
-            </w:r>
-          </w:p>
-        </w:tc>
-        <w:tc>
-          <w:tcPr>
-            <w:tcW w:type="dxa" w:w="2381"/>
-          </w:tcPr>
-          <w:p>
-            <w:pPr>
-              <w:spacing w:line="240" w:lineRule="auto"/>
-              <w:jc w:val="left"/>
-            </w:pPr>
-            <w:r/>
-            <w:r>
-              <w:rPr>
-                <w:b w:val="0"/>
-                <w:i w:val="0"/>
-                <w:sz w:val="19"/>
-                <w:rFonts w:eastAsia="宋体" w:ascii="Times New Roman" w:hAnsi="Times New Roman"/>
-              </w:rPr>
-              <w:t>专用基准+可复现验证</w:t>
-            </w:r>
-          </w:p>
-        </w:tc>
-      </w:tr>
-      <w:tr>
-        <w:tc>
-          <w:tcPr>
-            <w:tcW w:type="dxa" w:w="1474"/>
-          </w:tcPr>
-          <w:p>
-            <w:pPr>
-              <w:spacing w:line="240" w:lineRule="auto"/>
-              <w:jc w:val="left"/>
-            </w:pPr>
-            <w:r/>
-            <w:r>
-              <w:rPr>
-                <w:b w:val="0"/>
-                <w:i w:val="0"/>
-                <w:sz w:val="19"/>
-                <w:rFonts w:eastAsia="宋体" w:ascii="Times New Roman" w:hAnsi="Times New Roman"/>
-              </w:rPr>
-              <w:t>在线监测</w:t>
-            </w:r>
-          </w:p>
-        </w:tc>
-        <w:tc>
-          <w:tcPr>
-            <w:tcW w:type="dxa" w:w="2268"/>
-          </w:tcPr>
-          <w:p>
-            <w:pPr>
-              <w:spacing w:line="240" w:lineRule="auto"/>
-              <w:jc w:val="left"/>
-            </w:pPr>
-            <w:r/>
-            <w:r>
-              <w:rPr>
-                <w:b w:val="0"/>
-                <w:i w:val="0"/>
-                <w:sz w:val="19"/>
-                <w:rFonts w:eastAsia="宋体" w:ascii="Times New Roman" w:hAnsi="Times New Roman"/>
-              </w:rPr>
-              <w:t>工程落地强</w:t>
-            </w:r>
-          </w:p>
-        </w:tc>
-        <w:tc>
-          <w:tcPr>
-            <w:tcW w:type="dxa" w:w="1587"/>
-          </w:tcPr>
-          <w:p>
-            <w:pPr>
-              <w:spacing w:line="240" w:lineRule="auto"/>
-              <w:jc w:val="left"/>
-            </w:pPr>
-            <w:r/>
-            <w:r>
-              <w:rPr>
-                <w:b w:val="0"/>
-                <w:i w:val="0"/>
-                <w:sz w:val="19"/>
-                <w:rFonts w:eastAsia="宋体" w:ascii="Times New Roman" w:hAnsi="Times New Roman"/>
-              </w:rPr>
-              <w:t>原创辨识少</w:t>
-            </w:r>
-          </w:p>
-        </w:tc>
-        <w:tc>
-          <w:tcPr>
-            <w:tcW w:type="dxa" w:w="2381"/>
-          </w:tcPr>
-          <w:p>
-            <w:pPr>
-              <w:spacing w:line="240" w:lineRule="auto"/>
-              <w:jc w:val="left"/>
-            </w:pPr>
-            <w:r/>
-            <w:r>
-              <w:rPr>
-                <w:b w:val="0"/>
-                <w:i w:val="0"/>
-                <w:sz w:val="19"/>
-                <w:rFonts w:eastAsia="宋体" w:ascii="Times New Roman" w:hAnsi="Times New Roman"/>
-              </w:rPr>
-              <w:t>高精度变工况泛化</w:t>
-            </w:r>
-          </w:p>
-        </w:tc>
-      </w:tr>
-      <w:tr>
-        <w:tc>
-          <w:tcPr>
-            <w:tcW w:type="dxa" w:w="1474"/>
-            <w:tcBorders>
-              <w:bottom w:val="single" w:sz="14" w:space="0" w:color="000000"/>
-            </w:tcBorders>
-          </w:tcPr>
-          <w:p>
-            <w:pPr>
-              <w:spacing w:line="240" w:lineRule="auto"/>
-              <w:jc w:val="left"/>
-            </w:pPr>
-            <w:r/>
-            <w:r>
-              <w:rPr>
-                <w:b w:val="0"/>
-                <w:i w:val="0"/>
-                <w:sz w:val="19"/>
-                <w:rFonts w:eastAsia="宋体" w:ascii="Times New Roman" w:hAnsi="Times New Roman"/>
-              </w:rPr>
-              <w:t>标准/自主化</w:t>
-            </w:r>
-          </w:p>
-        </w:tc>
-        <w:tc>
-          <w:tcPr>
-            <w:tcW w:type="dxa" w:w="2268"/>
-            <w:tcBorders>
-              <w:bottom w:val="single" w:sz="14" w:space="0" w:color="000000"/>
-            </w:tcBorders>
-          </w:tcPr>
-          <w:p>
-            <w:pPr>
-              <w:spacing w:line="240" w:lineRule="auto"/>
-              <w:jc w:val="left"/>
-            </w:pPr>
-            <w:r/>
-            <w:r>
-              <w:rPr>
-                <w:b w:val="0"/>
-                <w:i w:val="0"/>
-                <w:sz w:val="19"/>
-                <w:rFonts w:eastAsia="宋体" w:ascii="Times New Roman" w:hAnsi="Times New Roman"/>
-              </w:rPr>
-              <w:t>采标为主、局部牵头</w:t>
-            </w:r>
-          </w:p>
-        </w:tc>
-        <w:tc>
-          <w:tcPr>
-            <w:tcW w:type="dxa" w:w="1587"/>
-            <w:tcBorders>
-              <w:bottom w:val="single" w:sz="14" w:space="0" w:color="000000"/>
-            </w:tcBorders>
-          </w:tcPr>
-          <w:p>
-            <w:pPr>
-              <w:spacing w:line="240" w:lineRule="auto"/>
-              <w:jc w:val="left"/>
-            </w:pPr>
-            <w:r/>
-            <w:r>
-              <w:rPr>
-                <w:b w:val="0"/>
-                <w:i w:val="0"/>
-                <w:sz w:val="19"/>
-                <w:rFonts w:eastAsia="宋体" w:ascii="Times New Roman" w:hAnsi="Times New Roman"/>
-              </w:rPr>
-              <w:t>高端跟随</w:t>
-            </w:r>
-          </w:p>
-        </w:tc>
-        <w:tc>
-          <w:tcPr>
-            <w:tcW w:type="dxa" w:w="2381"/>
-            <w:tcBorders>
-              <w:bottom w:val="single" w:sz="14" w:space="0" w:color="000000"/>
-            </w:tcBorders>
-          </w:tcPr>
-          <w:p>
-            <w:pPr>
-              <w:spacing w:line="240" w:lineRule="auto"/>
-              <w:jc w:val="left"/>
-            </w:pPr>
-            <w:r/>
-            <w:r>
-              <w:rPr>
-                <w:b w:val="0"/>
-                <w:i w:val="0"/>
-                <w:sz w:val="19"/>
-                <w:rFonts w:eastAsia="宋体" w:ascii="Times New Roman" w:hAnsi="Times New Roman"/>
-              </w:rPr>
-              <w:t>失效率基准+判据自主</w:t>
-            </w:r>
-          </w:p>
-        </w:tc>
-      </w:tr>
-    </w:tbl>
-    <w:p>
-      <w:pPr>
-        <w:spacing w:line="360" w:lineRule="auto" w:before="80" w:after="120"/>
-        <w:ind w:left="340"/>
-        <w:jc w:val="both"/>
-        <w:pBdr>
-          <w:left w:val="single" w:sz="18" w:space="6" w:color="4472C4"/>
-        </w:pBdr>
-      </w:pPr>
-      <w:r>
-        <w:rPr>
-          <w:b w:val="0"/>
-          <w:i w:val="0"/>
-          <w:sz w:val="23"/>
-          <w:rFonts w:eastAsia="楷体" w:ascii="Times New Roman" w:hAnsi="Times New Roman"/>
-        </w:rPr>
-        <w:br/>
-        <w:t>本章小结：国内电容器（尤其SAPC）可靠性研究已形成"场景驱动、工程见长、快速跟进"的鲜明格局，在材料改性、自愈检测、MLCC机理与数据驱动RUL等方向贡献突出；但在SAPC器件级长周期多应力数据、原创失效物理建模、失效率基准与数据共享、标准话语权四方面仍存明显短板。这一判断为第九章国内外综合对比与第十章研究空白凝练（及与本文研究内容的对接）提供了系统的国内侧依据。</w:t>
-        <w:br/>
-      </w:r>
-    </w:p>
-    <w:p>
-      <w:r>
-        <w:br w:type="page"/>
-      </w:r>
-    </w:p>
-    <w:p>
-      <w:pPr>
-        <w:keepNext/>
-        <w:spacing w:before="200" w:after="120"/>
-        <w:outlineLvl w:val="1"/>
-      </w:pPr>
-      <w:r>
-        <w:rPr>
-          <w:b/>
-          <w:i w:val="0"/>
-          <w:sz w:val="32"/>
-          <w:rFonts w:eastAsia="黑体" w:ascii="Times New Roman" w:hAnsi="Times New Roman"/>
-        </w:rPr>
-        <w:t>第九章 国内外研究水平综合量化对比与发展态势</w:t>
-      </w:r>
-    </w:p>
-    <w:p>
-      <w:pPr>
-        <w:spacing w:line="360" w:lineRule="auto" w:after="80"/>
-        <w:ind w:firstLine="465"/>
-        <w:jc w:val="both"/>
-      </w:pPr>
-      <w:r>
-        <w:rPr>
-          <w:b w:val="0"/>
-          <w:i w:val="0"/>
-          <w:sz w:val="24"/>
-          <w:rFonts w:eastAsia="宋体" w:ascii="Times New Roman" w:hAnsi="Times New Roman"/>
-        </w:rPr>
-        <w:t>前述各章已从纵向主线（第二至六章）、横向应用场景（第七章）与中国国内研究专论（第八章）三个维度评述了国内外研究现状。本章在此基础上作横向综合：先以总表与雷达图给出五环节的国内外水平量化对比（9.1、9.3），再从文献计量角度刻画研究热点的演进趋势（9.2），最后以研究演进时间轴勾勒领域发展脉络（9.4），从而为第十章凝练研究空白提供全局视野。</w:t>
-      </w:r>
-    </w:p>
-    <w:p>
-      <w:pPr>
-        <w:keepNext/>
-        <w:spacing w:before="160" w:after="120"/>
-        <w:outlineLvl w:val="2"/>
-      </w:pPr>
-      <w:r>
-        <w:rPr>
-          <w:b/>
-          <w:i w:val="0"/>
-          <w:sz w:val="28"/>
-          <w:rFonts w:eastAsia="黑体" w:ascii="Times New Roman" w:hAnsi="Times New Roman"/>
-        </w:rPr>
-        <w:t>9.1 五环节国内外水平综合对比</w:t>
-      </w:r>
-    </w:p>
-    <w:p>
-      <w:pPr>
-        <w:spacing w:line="360" w:lineRule="auto" w:after="80"/>
-        <w:ind w:firstLine="465"/>
-        <w:jc w:val="both"/>
-      </w:pPr>
-      <w:r>
-        <w:rPr>
-          <w:b w:val="0"/>
-          <w:i w:val="0"/>
-          <w:sz w:val="24"/>
-          <w:rFonts w:eastAsia="宋体" w:ascii="Times New Roman" w:hAnsi="Times New Roman"/>
-        </w:rPr>
-        <w:t>表21将五个环节的国内外研究水平并置对照，给出每一环节国外的优势、国内的优势以及量化差距特征。总体规律可概括为一句话：国外在"原创理论与判据定义"上系统领先，国内在"工程场景与规模化应用"上具备独特优势；论文数量上中国已接近美国，但在原创性、影响力与标准话语权上仍有差距。这一"形似质异"的格局，正是后续研究需要着力突破的方向。</w:t>
-      </w:r>
-    </w:p>
-    <w:p>
-      <w:pPr>
-        <w:keepNext/>
-        <w:spacing w:before="120" w:after="40"/>
-        <w:jc w:val="center"/>
-      </w:pPr>
-      <w:r>
-        <w:rPr>
-          <w:b/>
-          <w:i w:val="0"/>
-          <w:sz w:val="21"/>
-          <w:rFonts w:eastAsia="黑体" w:ascii="Times New Roman" w:hAnsi="Times New Roman"/>
-        </w:rPr>
-        <w:t>表 21  五环节国内外研究水平综合对比总表</w:t>
-      </w:r>
-    </w:p>
-    <w:tbl>
-      <w:tblPr>
-        <w:tblW w:type="auto" w:w="0"/>
-        <w:jc w:val="center"/>
-        <w:tblLayout w:type="autofit"/>
-        <w:tblLook w:firstColumn="1" w:firstRow="1" w:lastColumn="0" w:lastRow="0" w:noHBand="0" w:noVBand="1" w:val="04A0"/>
-      </w:tblPr>
-      <w:tblGrid>
-        <w:gridCol w:w="2126"/>
-        <w:gridCol w:w="2126"/>
-        <w:gridCol w:w="2126"/>
-        <w:gridCol w:w="2126"/>
-      </w:tblGrid>
-      <w:tr>
-        <w:tc>
-          <w:tcPr>
-            <w:tcW w:type="dxa" w:w="1474"/>
-            <w:tcBorders>
-              <w:top w:val="single" w:sz="14" w:space="0" w:color="000000"/>
-              <w:bottom w:val="single" w:sz="6" w:space="0" w:color="000000"/>
-            </w:tcBorders>
-          </w:tcPr>
-          <w:p>
-            <w:pPr>
-              <w:jc w:val="center"/>
-            </w:pPr>
-            <w:r/>
-            <w:r>
-              <w:rPr>
-                <w:b/>
-                <w:i w:val="0"/>
-                <w:sz w:val="19"/>
-                <w:rFonts w:eastAsia="黑体" w:ascii="Times New Roman" w:hAnsi="Times New Roman"/>
-              </w:rPr>
-              <w:t>研究环节</w:t>
-            </w:r>
-          </w:p>
-        </w:tc>
-        <w:tc>
-          <w:tcPr>
-            <w:tcW w:type="dxa" w:w="2154"/>
-            <w:tcBorders>
-              <w:top w:val="single" w:sz="14" w:space="0" w:color="000000"/>
-              <w:bottom w:val="single" w:sz="6" w:space="0" w:color="000000"/>
-            </w:tcBorders>
-          </w:tcPr>
-          <w:p>
-            <w:pPr>
-              <w:jc w:val="center"/>
-            </w:pPr>
-            <w:r/>
-            <w:r>
-              <w:rPr>
-                <w:b/>
-                <w:i w:val="0"/>
-                <w:sz w:val="19"/>
-                <w:rFonts w:eastAsia="黑体" w:ascii="Times New Roman" w:hAnsi="Times New Roman"/>
-              </w:rPr>
-              <w:t>国外优势</w:t>
-            </w:r>
-          </w:p>
-        </w:tc>
-        <w:tc>
-          <w:tcPr>
-            <w:tcW w:type="dxa" w:w="2154"/>
-            <w:tcBorders>
-              <w:top w:val="single" w:sz="14" w:space="0" w:color="000000"/>
-              <w:bottom w:val="single" w:sz="6" w:space="0" w:color="000000"/>
-            </w:tcBorders>
-          </w:tcPr>
-          <w:p>
-            <w:pPr>
-              <w:jc w:val="center"/>
-            </w:pPr>
-            <w:r/>
-            <w:r>
-              <w:rPr>
-                <w:b/>
-                <w:i w:val="0"/>
-                <w:sz w:val="19"/>
-                <w:rFonts w:eastAsia="黑体" w:ascii="Times New Roman" w:hAnsi="Times New Roman"/>
-              </w:rPr>
-              <w:t>国内优势</w:t>
-            </w:r>
-          </w:p>
-        </w:tc>
-        <w:tc>
-          <w:tcPr>
-            <w:tcW w:type="dxa" w:w="1928"/>
-            <w:tcBorders>
-              <w:top w:val="single" w:sz="14" w:space="0" w:color="000000"/>
-              <w:bottom w:val="single" w:sz="6" w:space="0" w:color="000000"/>
-            </w:tcBorders>
-          </w:tcPr>
-          <w:p>
-            <w:pPr>
-              <w:jc w:val="center"/>
-            </w:pPr>
-            <w:r/>
-            <w:r>
-              <w:rPr>
-                <w:b/>
-                <w:i w:val="0"/>
-                <w:sz w:val="19"/>
-                <w:rFonts w:eastAsia="黑体" w:ascii="Times New Roman" w:hAnsi="Times New Roman"/>
-              </w:rPr>
-              <w:t>量化差距/特征</w:t>
-            </w:r>
-          </w:p>
-        </w:tc>
-      </w:tr>
-      <w:tr>
-        <w:tc>
-          <w:tcPr>
-            <w:tcW w:type="dxa" w:w="1474"/>
-          </w:tcPr>
-          <w:p>
-            <w:pPr>
-              <w:spacing w:line="240" w:lineRule="auto"/>
-              <w:jc w:val="left"/>
-            </w:pPr>
-            <w:r/>
-            <w:r>
-              <w:rPr>
-                <w:b w:val="0"/>
-                <w:i w:val="0"/>
-                <w:sz w:val="19"/>
-                <w:rFonts w:eastAsia="宋体" w:ascii="Times New Roman" w:hAnsi="Times New Roman"/>
-              </w:rPr>
-              <w:t>器件/故障归因</w:t>
-            </w:r>
-          </w:p>
-        </w:tc>
-        <w:tc>
-          <w:tcPr>
-            <w:tcW w:type="dxa" w:w="2154"/>
-          </w:tcPr>
-          <w:p>
-            <w:pPr>
-              <w:spacing w:line="240" w:lineRule="auto"/>
-              <w:jc w:val="left"/>
-            </w:pPr>
-            <w:r/>
-            <w:r>
-              <w:rPr>
-                <w:b w:val="0"/>
-                <w:i w:val="0"/>
-                <w:sz w:val="19"/>
-                <w:rFonts w:eastAsia="宋体" w:ascii="Times New Roman" w:hAnsi="Times New Roman"/>
-              </w:rPr>
-              <w:t>跨品牌长期数据库</w:t>
-            </w:r>
-          </w:p>
-        </w:tc>
-        <w:tc>
-          <w:tcPr>
-            <w:tcW w:type="dxa" w:w="2154"/>
-          </w:tcPr>
-          <w:p>
-            <w:pPr>
-              <w:spacing w:line="240" w:lineRule="auto"/>
-              <w:jc w:val="left"/>
-            </w:pPr>
-            <w:r/>
-            <w:r>
-              <w:rPr>
-                <w:b w:val="0"/>
-                <w:i w:val="0"/>
-                <w:sz w:val="19"/>
-                <w:rFonts w:eastAsia="宋体" w:ascii="Times New Roman" w:hAnsi="Times New Roman"/>
-              </w:rPr>
-              <w:t>新能源海量真实工况</w:t>
-            </w:r>
-          </w:p>
-        </w:tc>
-        <w:tc>
-          <w:tcPr>
-            <w:tcW w:type="dxa" w:w="1928"/>
-          </w:tcPr>
-          <w:p>
-            <w:pPr>
-              <w:spacing w:line="240" w:lineRule="auto"/>
-              <w:jc w:val="left"/>
-            </w:pPr>
-            <w:r/>
-            <w:r>
-              <w:rPr>
-                <w:b w:val="0"/>
-                <w:i w:val="0"/>
-                <w:sz w:val="19"/>
-                <w:rFonts w:eastAsia="宋体" w:ascii="Times New Roman" w:hAnsi="Times New Roman"/>
-              </w:rPr>
-              <w:t>样本规模差1–2数量级</w:t>
-            </w:r>
-          </w:p>
-        </w:tc>
-      </w:tr>
-      <w:tr>
-        <w:tc>
-          <w:tcPr>
-            <w:tcW w:type="dxa" w:w="1474"/>
-          </w:tcPr>
-          <w:p>
-            <w:pPr>
-              <w:spacing w:line="240" w:lineRule="auto"/>
-              <w:jc w:val="left"/>
-            </w:pPr>
-            <w:r/>
-            <w:r>
-              <w:rPr>
-                <w:b w:val="0"/>
-                <w:i w:val="0"/>
-                <w:sz w:val="19"/>
-                <w:rFonts w:eastAsia="宋体" w:ascii="Times New Roman" w:hAnsi="Times New Roman"/>
-              </w:rPr>
-              <w:t>失效模式</w:t>
-            </w:r>
-          </w:p>
-        </w:tc>
-        <w:tc>
-          <w:tcPr>
-            <w:tcW w:type="dxa" w:w="2154"/>
-          </w:tcPr>
-          <w:p>
-            <w:pPr>
-              <w:spacing w:line="240" w:lineRule="auto"/>
-              <w:jc w:val="left"/>
-            </w:pPr>
-            <w:r/>
-            <w:r>
-              <w:rPr>
-                <w:b w:val="0"/>
-                <w:i w:val="0"/>
-                <w:sz w:val="19"/>
-                <w:rFonts w:eastAsia="宋体" w:ascii="Times New Roman" w:hAnsi="Times New Roman"/>
-              </w:rPr>
-              <w:t>7大类标准体系、判据权</w:t>
-            </w:r>
-          </w:p>
-        </w:tc>
-        <w:tc>
-          <w:tcPr>
-            <w:tcW w:type="dxa" w:w="2154"/>
-          </w:tcPr>
-          <w:p>
-            <w:pPr>
-              <w:spacing w:line="240" w:lineRule="auto"/>
-              <w:jc w:val="left"/>
-            </w:pPr>
-            <w:r/>
-            <w:r>
-              <w:rPr>
-                <w:b w:val="0"/>
-                <w:i w:val="0"/>
-                <w:sz w:val="19"/>
-                <w:rFonts w:eastAsia="宋体" w:ascii="Times New Roman" w:hAnsi="Times New Roman"/>
-              </w:rPr>
-              <w:t>国产器件场景化归纳</w:t>
-            </w:r>
-          </w:p>
-        </w:tc>
-        <w:tc>
-          <w:tcPr>
-            <w:tcW w:type="dxa" w:w="1928"/>
-          </w:tcPr>
-          <w:p>
-            <w:pPr>
-              <w:spacing w:line="240" w:lineRule="auto"/>
-              <w:jc w:val="left"/>
-            </w:pPr>
-            <w:r/>
-            <w:r>
-              <w:rPr>
-                <w:b w:val="0"/>
-                <w:i w:val="0"/>
-                <w:sz w:val="19"/>
-                <w:rFonts w:eastAsia="宋体" w:ascii="Times New Roman" w:hAnsi="Times New Roman"/>
-              </w:rPr>
-              <w:t>长期老化数据积累不足</w:t>
-            </w:r>
-          </w:p>
-        </w:tc>
-      </w:tr>
-      <w:tr>
-        <w:tc>
-          <w:tcPr>
-            <w:tcW w:type="dxa" w:w="1474"/>
-          </w:tcPr>
-          <w:p>
-            <w:pPr>
-              <w:spacing w:line="240" w:lineRule="auto"/>
-              <w:jc w:val="left"/>
-            </w:pPr>
-            <w:r/>
-            <w:r>
-              <w:rPr>
-                <w:b w:val="0"/>
-                <w:i w:val="0"/>
-                <w:sz w:val="19"/>
-                <w:rFonts w:eastAsia="宋体" w:ascii="Times New Roman" w:hAnsi="Times New Roman"/>
-              </w:rPr>
-              <w:t>失效机理</w:t>
-            </w:r>
-          </w:p>
-        </w:tc>
-        <w:tc>
-          <w:tcPr>
-            <w:tcW w:type="dxa" w:w="2154"/>
-          </w:tcPr>
-          <w:p>
-            <w:pPr>
-              <w:spacing w:line="240" w:lineRule="auto"/>
-              <w:jc w:val="left"/>
-            </w:pPr>
-            <w:r/>
-            <w:r>
-              <w:rPr>
-                <w:b w:val="0"/>
-                <w:i w:val="0"/>
-                <w:sz w:val="19"/>
-                <w:rFonts w:eastAsia="宋体" w:ascii="Times New Roman" w:hAnsi="Times New Roman"/>
-              </w:rPr>
-              <w:t>第一性原创模型(Ea齐全)</w:t>
-            </w:r>
-          </w:p>
-        </w:tc>
-        <w:tc>
-          <w:tcPr>
-            <w:tcW w:type="dxa" w:w="2154"/>
-          </w:tcPr>
-          <w:p>
-            <w:pPr>
-              <w:spacing w:line="240" w:lineRule="auto"/>
-              <w:jc w:val="left"/>
-            </w:pPr>
-            <w:r/>
-            <w:r>
-              <w:rPr>
-                <w:b w:val="0"/>
-                <w:i w:val="0"/>
-                <w:sz w:val="19"/>
-                <w:rFonts w:eastAsia="宋体" w:ascii="Times New Roman" w:hAnsi="Times New Roman"/>
-              </w:rPr>
-              <w:t>工况验证+有限元仿真</w:t>
-            </w:r>
-          </w:p>
-        </w:tc>
-        <w:tc>
-          <w:tcPr>
-            <w:tcW w:type="dxa" w:w="1928"/>
-          </w:tcPr>
-          <w:p>
-            <w:pPr>
-              <w:spacing w:line="240" w:lineRule="auto"/>
-              <w:jc w:val="left"/>
-            </w:pPr>
-            <w:r/>
-            <w:r>
-              <w:rPr>
-                <w:b w:val="0"/>
-                <w:i w:val="0"/>
-                <w:sz w:val="19"/>
-                <w:rFonts w:eastAsia="宋体" w:ascii="Times New Roman" w:hAnsi="Times New Roman"/>
-              </w:rPr>
-              <w:t>原创物理模型较少</w:t>
-            </w:r>
-          </w:p>
-        </w:tc>
-      </w:tr>
-      <w:tr>
-        <w:tc>
-          <w:tcPr>
-            <w:tcW w:type="dxa" w:w="1474"/>
-          </w:tcPr>
-          <w:p>
-            <w:pPr>
-              <w:spacing w:line="240" w:lineRule="auto"/>
-              <w:jc w:val="left"/>
-            </w:pPr>
-            <w:r/>
-            <w:r>
-              <w:rPr>
-                <w:b w:val="0"/>
-                <w:i w:val="0"/>
-                <w:sz w:val="19"/>
-                <w:rFonts w:eastAsia="宋体" w:ascii="Times New Roman" w:hAnsi="Times New Roman"/>
-              </w:rPr>
-              <w:t>可靠性建模</w:t>
-            </w:r>
-          </w:p>
-        </w:tc>
-        <w:tc>
-          <w:tcPr>
-            <w:tcW w:type="dxa" w:w="2154"/>
-          </w:tcPr>
-          <w:p>
-            <w:pPr>
-              <w:spacing w:line="240" w:lineRule="auto"/>
-              <w:jc w:val="left"/>
-            </w:pPr>
-            <w:r/>
-            <w:r>
-              <w:rPr>
-                <w:b w:val="0"/>
-                <w:i w:val="0"/>
-                <w:sz w:val="19"/>
-                <w:rFonts w:eastAsia="宋体" w:ascii="Times New Roman" w:hAnsi="Times New Roman"/>
-              </w:rPr>
-              <w:t>PoF与PINN引领</w:t>
-            </w:r>
-          </w:p>
-        </w:tc>
-        <w:tc>
-          <w:tcPr>
-            <w:tcW w:type="dxa" w:w="2154"/>
-          </w:tcPr>
-          <w:p>
-            <w:pPr>
-              <w:spacing w:line="240" w:lineRule="auto"/>
-              <w:jc w:val="left"/>
-            </w:pPr>
-            <w:r/>
-            <w:r>
-              <w:rPr>
-                <w:b w:val="0"/>
-                <w:i w:val="0"/>
-                <w:sz w:val="19"/>
-                <w:rFonts w:eastAsia="宋体" w:ascii="Times New Roman" w:hAnsi="Times New Roman"/>
-              </w:rPr>
-              <w:t>数据驱动规模跟进</w:t>
-            </w:r>
-          </w:p>
-        </w:tc>
-        <w:tc>
-          <w:tcPr>
-            <w:tcW w:type="dxa" w:w="1928"/>
-          </w:tcPr>
-          <w:p>
-            <w:pPr>
-              <w:spacing w:line="240" w:lineRule="auto"/>
-              <w:jc w:val="left"/>
-            </w:pPr>
-            <w:r/>
-            <w:r>
-              <w:rPr>
-                <w:b w:val="0"/>
-                <w:i w:val="0"/>
-                <w:sz w:val="19"/>
-                <w:rFonts w:eastAsia="宋体" w:ascii="Times New Roman" w:hAnsi="Times New Roman"/>
-              </w:rPr>
-              <w:t>强物理嵌入范式落后</w:t>
-            </w:r>
-          </w:p>
-        </w:tc>
-      </w:tr>
-      <w:tr>
-        <w:tc>
-          <w:tcPr>
-            <w:tcW w:type="dxa" w:w="1474"/>
-            <w:tcBorders>
-              <w:bottom w:val="single" w:sz="14" w:space="0" w:color="000000"/>
-            </w:tcBorders>
-          </w:tcPr>
-          <w:p>
-            <w:pPr>
-              <w:spacing w:line="240" w:lineRule="auto"/>
-              <w:jc w:val="left"/>
-            </w:pPr>
-            <w:r/>
-            <w:r>
-              <w:rPr>
-                <w:b w:val="0"/>
-                <w:i w:val="0"/>
-                <w:sz w:val="19"/>
-                <w:rFonts w:eastAsia="宋体" w:ascii="Times New Roman" w:hAnsi="Times New Roman"/>
-              </w:rPr>
-              <w:t>状态监测</w:t>
-            </w:r>
-          </w:p>
-        </w:tc>
-        <w:tc>
-          <w:tcPr>
-            <w:tcW w:type="dxa" w:w="2154"/>
-            <w:tcBorders>
-              <w:bottom w:val="single" w:sz="14" w:space="0" w:color="000000"/>
-            </w:tcBorders>
-          </w:tcPr>
-          <w:p>
-            <w:pPr>
-              <w:spacing w:line="240" w:lineRule="auto"/>
-              <w:jc w:val="left"/>
-            </w:pPr>
-            <w:r/>
-            <w:r>
-              <w:rPr>
-                <w:b w:val="0"/>
-                <w:i w:val="0"/>
-                <w:sz w:val="19"/>
-                <w:rFonts w:eastAsia="宋体" w:ascii="Times New Roman" w:hAnsi="Times New Roman"/>
-              </w:rPr>
-              <w:t>辨识算法原创、精度高</w:t>
-            </w:r>
-          </w:p>
-        </w:tc>
-        <w:tc>
-          <w:tcPr>
-            <w:tcW w:type="dxa" w:w="2154"/>
-            <w:tcBorders>
-              <w:bottom w:val="single" w:sz="14" w:space="0" w:color="000000"/>
-            </w:tcBorders>
-          </w:tcPr>
-          <w:p>
-            <w:pPr>
-              <w:spacing w:line="240" w:lineRule="auto"/>
-              <w:jc w:val="left"/>
-            </w:pPr>
-            <w:r/>
-            <w:r>
-              <w:rPr>
-                <w:b w:val="0"/>
-                <w:i w:val="0"/>
-                <w:sz w:val="19"/>
-                <w:rFonts w:eastAsia="宋体" w:ascii="Times New Roman" w:hAnsi="Times New Roman"/>
-              </w:rPr>
-              <w:t>系统集成与现场落地强</w:t>
-            </w:r>
-          </w:p>
-        </w:tc>
-        <w:tc>
-          <w:tcPr>
-            <w:tcW w:type="dxa" w:w="1928"/>
-            <w:tcBorders>
-              <w:bottom w:val="single" w:sz="14" w:space="0" w:color="000000"/>
-            </w:tcBorders>
-          </w:tcPr>
-          <w:p>
-            <w:pPr>
-              <w:spacing w:line="240" w:lineRule="auto"/>
-              <w:jc w:val="left"/>
-            </w:pPr>
-            <w:r/>
-            <w:r>
-              <w:rPr>
-                <w:b w:val="0"/>
-                <w:i w:val="0"/>
-                <w:sz w:val="19"/>
-                <w:rFonts w:eastAsia="宋体" w:ascii="Times New Roman" w:hAnsi="Times New Roman"/>
-              </w:rPr>
-              <w:t>变工况泛化均待提升</w:t>
-            </w:r>
-          </w:p>
-        </w:tc>
-      </w:tr>
-    </w:tbl>
-    <w:p>
-      <w:pPr>
-        <w:spacing w:line="360" w:lineRule="auto" w:after="80"/>
-        <w:ind w:firstLine="465"/>
-        <w:jc w:val="both"/>
-      </w:pPr>
-      <w:r>
-        <w:rPr>
-          <w:b w:val="0"/>
-          <w:i w:val="0"/>
-          <w:sz w:val="24"/>
-          <w:rFonts w:eastAsia="宋体" w:ascii="Times New Roman" w:hAnsi="Times New Roman"/>
-        </w:rPr>
-        <w:t>为更直观地呈现差距，图33以雷达图形式给出国内外在五个维度上的研究水平评分（0–10分，基于原创性、深度、数据基础与影响力的综合主观评估）。可见国外（外圈）在器件统计、机理理论、建模三个维度领先明显，而在状态监测维度，国内（内圈）凭借工程落地能力已较为接近。</w:t>
+        <w:t>为更直观地呈现差距，图31以雷达图形式给出国内外在五个维度上的研究水平评分（0–10分，基于原创性、深度、数据基础与影响力的综合主观评估）。可见国外（外圈）在器件统计、机理理论、建模三个维度领先明显，而在状态监测维度，国内（内圈）凭借工程落地能力已较为接近。</w:t>
       </w:r>
     </w:p>
     <w:p>
@@ -23804,7 +21275,7 @@
         <w:drawing>
           <wp:inline xmlns:a="http://schemas.openxmlformats.org/drawingml/2006/main" xmlns:pic="http://schemas.openxmlformats.org/drawingml/2006/picture">
             <wp:extent cx="4320000" cy="3949865"/>
-            <wp:docPr id="33" name="Picture 33"/>
+            <wp:docPr id="31" name="Picture 31"/>
             <wp:cNvGraphicFramePr>
               <a:graphicFrameLocks noChangeAspect="1"/>
             </wp:cNvGraphicFramePr>
@@ -23816,7 +21287,7 @@
                     <pic:cNvPicPr/>
                   </pic:nvPicPr>
                   <pic:blipFill>
-                    <a:blip r:embed="rId43"/>
+                    <a:blip r:embed="rId41"/>
                     <a:stretch>
                       <a:fillRect/>
                     </a:stretch>
@@ -23847,7 +21318,7 @@
           <w:sz w:val="21"/>
           <w:rFonts w:eastAsia="黑体" w:ascii="Times New Roman" w:hAnsi="Times New Roman"/>
         </w:rPr>
-        <w:t>图 33  国内外研究水平五维雷达对比（0–10分）</w:t>
+        <w:t>图 31  国内外研究水平五维雷达对比（0–10分）</w:t>
       </w:r>
     </w:p>
     <w:p>
@@ -23863,7 +21334,7 @@
           <w:sz w:val="28"/>
           <w:rFonts w:eastAsia="黑体" w:ascii="Times New Roman" w:hAnsi="Times New Roman"/>
         </w:rPr>
-        <w:t>9.2 文献计量与研究热点演进</w:t>
+        <w:t>8.2 文献计量与研究热点演进</w:t>
       </w:r>
     </w:p>
     <w:p>
@@ -23879,7 +21350,7 @@
           <w:sz w:val="24"/>
           <w:rFonts w:eastAsia="宋体" w:ascii="Times New Roman" w:hAnsi="Times New Roman"/>
         </w:rPr>
-        <w:t>从文献计量看，研究热点的迁移清晰地反映了领域范式的演化。图34给出若干关键词的流行度趋势：ESR在线监测在2012–2016年间快速升温并趋于成熟；机器学习/RUL自2018年起急剧上升，成为当前最热主题；物理信息神经网络（PINN）自2022年起新兴，增长最为迅猛；任务剖面（mission profile）则自2011年Wang-Blaabjerg工作后稳步成为可靠性评估的基础框架。这一趋势表明，领域正从"机理解析与单点监测"快速转向"数据智能与物理—数据融合"。</w:t>
+        <w:t>从文献计量看，研究热点的迁移清晰地反映了领域范式的演化。图32给出若干关键词的流行度趋势：ESR在线监测在2012–2016年间快速升温并趋于成熟；机器学习/RUL自2018年起急剧上升，成为当前最热主题；物理信息神经网络（PINN）自2022年起新兴，增长最为迅猛；任务剖面（mission profile）则自2011年Wang-Blaabjerg工作后稳步成为可靠性评估的基础框架。这一趋势表明，领域正从"机理解析与单点监测"快速转向"数据智能与物理—数据融合"。</w:t>
       </w:r>
     </w:p>
     <w:p>
@@ -23891,7 +21362,7 @@
         <w:drawing>
           <wp:inline xmlns:a="http://schemas.openxmlformats.org/drawingml/2006/main" xmlns:pic="http://schemas.openxmlformats.org/drawingml/2006/picture">
             <wp:extent cx="5220000" cy="3100397"/>
-            <wp:docPr id="34" name="Picture 34"/>
+            <wp:docPr id="32" name="Picture 32"/>
             <wp:cNvGraphicFramePr>
               <a:graphicFrameLocks noChangeAspect="1"/>
             </wp:cNvGraphicFramePr>
@@ -23903,7 +21374,7 @@
                     <pic:cNvPicPr/>
                   </pic:nvPicPr>
                   <pic:blipFill>
-                    <a:blip r:embed="rId44"/>
+                    <a:blip r:embed="rId42"/>
                     <a:stretch>
                       <a:fillRect/>
                     </a:stretch>
@@ -23934,7 +21405,7 @@
           <w:sz w:val="21"/>
           <w:rFonts w:eastAsia="黑体" w:ascii="Times New Roman" w:hAnsi="Times New Roman"/>
         </w:rPr>
-        <w:t>图 34  电容器可靠性研究关键词流行度趋势</w:t>
+        <w:t>图 32  电容器可靠性研究关键词流行度趋势</w:t>
       </w:r>
     </w:p>
     <w:p>
@@ -23950,7 +21421,7 @@
           <w:sz w:val="28"/>
           <w:rFonts w:eastAsia="黑体" w:ascii="Times New Roman" w:hAnsi="Times New Roman"/>
         </w:rPr>
-        <w:t>9.3 技术成熟度对比</w:t>
+        <w:t>8.3 技术成熟度对比</w:t>
       </w:r>
     </w:p>
     <w:p>
@@ -23966,7 +21437,7 @@
           <w:sz w:val="24"/>
           <w:rFonts w:eastAsia="宋体" w:ascii="Times New Roman" w:hAnsi="Times New Roman"/>
         </w:rPr>
-        <w:t>借鉴技术成熟度（TRL）的思路，图35对五个环节的国内外成熟度作了对比评估。器件与失效模式环节成熟度最高（接近工程标准化），机理与建模环节处于"理论较成熟、工程转化中"的阶段，状态监测尤其是RUL预测则仍处于"实验室验证向现场部署过渡"的阶段。国内在监测环节的成熟度评分甚至略高于国外，反映出强大的工程化与产业化推动力；而在机理与建模环节，国内成熟度仍落后于国外。</w:t>
+        <w:t>借鉴技术成熟度（TRL）的思路，图33对五个环节的国内外成熟度作了对比评估。器件与失效模式环节成熟度最高（接近工程标准化），机理与建模环节处于"理论较成熟、工程转化中"的阶段，状态监测尤其是RUL预测则仍处于"实验室验证向现场部署过渡"的阶段。国内在监测环节的成熟度评分甚至略高于国外，反映出强大的工程化与产业化推动力；而在机理与建模环节，国内成熟度仍落后于国外。</w:t>
       </w:r>
     </w:p>
     <w:p>
@@ -23978,7 +21449,7 @@
         <w:drawing>
           <wp:inline xmlns:a="http://schemas.openxmlformats.org/drawingml/2006/main" xmlns:pic="http://schemas.openxmlformats.org/drawingml/2006/picture">
             <wp:extent cx="5220000" cy="3207059"/>
-            <wp:docPr id="35" name="Picture 35"/>
+            <wp:docPr id="33" name="Picture 33"/>
             <wp:cNvGraphicFramePr>
               <a:graphicFrameLocks noChangeAspect="1"/>
             </wp:cNvGraphicFramePr>
@@ -23990,7 +21461,7 @@
                     <pic:cNvPicPr/>
                   </pic:nvPicPr>
                   <pic:blipFill>
-                    <a:blip r:embed="rId45"/>
+                    <a:blip r:embed="rId43"/>
                     <a:stretch>
                       <a:fillRect/>
                     </a:stretch>
@@ -24021,7 +21492,7 @@
           <w:sz w:val="21"/>
           <w:rFonts w:eastAsia="黑体" w:ascii="Times New Roman" w:hAnsi="Times New Roman"/>
         </w:rPr>
-        <w:t>图 35  五环节国内外技术成熟度(TRL)对比</w:t>
+        <w:t>图 33  五环节国内外技术成熟度(TRL)对比</w:t>
       </w:r>
     </w:p>
     <w:p>
@@ -24037,7 +21508,7 @@
           <w:sz w:val="28"/>
           <w:rFonts w:eastAsia="黑体" w:ascii="Times New Roman" w:hAnsi="Times New Roman"/>
         </w:rPr>
-        <w:t>9.4 研究演进时间轴</w:t>
+        <w:t>8.4 研究演进时间轴</w:t>
       </w:r>
     </w:p>
     <w:p>
@@ -24053,7 +21524,7 @@
           <w:sz w:val="24"/>
           <w:rFonts w:eastAsia="宋体" w:ascii="Times New Roman" w:hAnsi="Times New Roman"/>
         </w:rPr>
-        <w:t>图36以时间轴形式勾勒了电容器可靠性研究的主要里程碑：1969年Prokopowicz-Vaskas陶瓷寿命方程奠定加速建模基础；1990年代Waser-Baiatu氧空位模型确立MLCC机理理论；2002年Venet提出ESR在线监测；2011年Wang-Blaabjerg建立任务剖面评估框架；2014年NASA Liu-Sampson提出BME MLCC统一可靠性模型；2020年前后LSTM等深度学习方法进入RUL预测；2024年前后Kim等的PINN与物理—机器学习混合方法代表了当前前沿。这条时间轴清晰显示：领域沿"经验模型→机理理论→在线监测→系统评估→数据智能→物理数据融合"演进，而每一次范式跃迁几乎都由国外团队率先开启，国内多在范式确立后快速跟进并在工程层面深化。</w:t>
+        <w:t>图34以时间轴形式勾勒了电容器可靠性研究的主要里程碑：1969年Prokopowicz-Vaskas陶瓷寿命方程奠定加速建模基础；1990年代Waser-Baiatu氧空位模型确立MLCC机理理论；2002年Venet提出ESR在线监测；2011年Wang-Blaabjerg建立任务剖面评估框架；2014年NASA Liu-Sampson提出BME MLCC统一可靠性模型；2020年前后LSTM等深度学习方法进入RUL预测；2024年前后Kim等的PINN与物理—机器学习混合方法代表了当前前沿。这条时间轴清晰显示：领域沿"经验模型→机理理论→在线监测→系统评估→数据智能→物理数据融合"演进，而每一次范式跃迁几乎都由国外团队率先开启，国内多在范式确立后快速跟进并在工程层面深化。</w:t>
       </w:r>
     </w:p>
     <w:p>
@@ -24065,7 +21536,7 @@
         <w:drawing>
           <wp:inline xmlns:a="http://schemas.openxmlformats.org/drawingml/2006/main" xmlns:pic="http://schemas.openxmlformats.org/drawingml/2006/picture">
             <wp:extent cx="5580000" cy="2281765"/>
-            <wp:docPr id="36" name="Picture 36"/>
+            <wp:docPr id="34" name="Picture 34"/>
             <wp:cNvGraphicFramePr>
               <a:graphicFrameLocks noChangeAspect="1"/>
             </wp:cNvGraphicFramePr>
@@ -24077,7 +21548,7 @@
                     <pic:cNvPicPr/>
                   </pic:nvPicPr>
                   <pic:blipFill>
-                    <a:blip r:embed="rId46"/>
+                    <a:blip r:embed="rId44"/>
                     <a:stretch>
                       <a:fillRect/>
                     </a:stretch>
@@ -24108,7 +21579,7 @@
           <w:sz w:val="21"/>
           <w:rFonts w:eastAsia="黑体" w:ascii="Times New Roman" w:hAnsi="Times New Roman"/>
         </w:rPr>
-        <w:t>图 36  电容器可靠性研究演进时间轴（1969—2024）</w:t>
+        <w:t>图 34  电容器可靠性研究演进时间轴（1969—2024）</w:t>
       </w:r>
     </w:p>
     <w:p>
@@ -24124,7 +21595,7 @@
           <w:sz w:val="28"/>
           <w:rFonts w:eastAsia="黑体" w:ascii="Times New Roman" w:hAnsi="Times New Roman"/>
         </w:rPr>
-        <w:t>9.5 标准化与话语权态势</w:t>
+        <w:t>8.5 标准化与话语权态势</w:t>
       </w:r>
     </w:p>
     <w:p>
@@ -24172,7 +21643,7 @@
           <w:sz w:val="28"/>
           <w:rFonts w:eastAsia="黑体" w:ascii="Times New Roman" w:hAnsi="Times New Roman"/>
         </w:rPr>
-        <w:t>9.6 产业—学术协同与数据壁垒</w:t>
+        <w:t>8.6 产业—学术协同与数据壁垒</w:t>
       </w:r>
     </w:p>
     <w:p>
@@ -24246,7 +21717,7 @@
           <w:sz w:val="32"/>
           <w:rFonts w:eastAsia="黑体" w:ascii="Times New Roman" w:hAnsi="Times New Roman"/>
         </w:rPr>
-        <w:t>第十章 现有研究不足、研究空白与本文研究内容对接</w:t>
+        <w:t>第九章 现有研究不足、研究空白与本文研究内容对接</w:t>
       </w:r>
     </w:p>
     <w:p>
@@ -24262,7 +21733,7 @@
           <w:sz w:val="24"/>
           <w:rFonts w:eastAsia="宋体" w:ascii="Times New Roman" w:hAnsi="Times New Roman"/>
         </w:rPr>
-        <w:t>本章是整篇研究现状的"灵魂"与归宿。前九章沿主线系统评述了国内外现状（并以第八章专章深化了中国国内研究），本章将各环节评述中凝练的不足汇聚为若干条明确的研究空白（research gap），逐条给出量化证据，并将其映射到学位论文的研究内容与章节安排，最后展望领域未来趋势。这一"对接段"使整篇综述不再是独立的文献回顾，而是直接论证"本文研究为什么值得做、为什么由本文来做"。</w:t>
+        <w:t>本章是整篇研究现状的"灵魂"与归宿。前七章沿主线系统评述了国内外现状，本章将各环节评述中凝练的不足汇聚为若干条明确的研究空白（research gap），逐条给出量化证据，并将其映射到学位论文的研究内容与章节安排，最后展望领域未来趋势。这一"对接段"使整篇综述不再是独立的文献回顾，而是直接论证"本文研究为什么值得做、为什么由本文来做"。</w:t>
       </w:r>
     </w:p>
     <w:p>
@@ -24278,7 +21749,7 @@
           <w:sz w:val="28"/>
           <w:rFonts w:eastAsia="黑体" w:ascii="Times New Roman" w:hAnsi="Times New Roman"/>
         </w:rPr>
-        <w:t>10.1 现有研究的四条共性不足</w:t>
+        <w:t>9.1 现有研究的四条共性不足</w:t>
       </w:r>
     </w:p>
     <w:p>
@@ -24294,7 +21765,7 @@
           <w:sz w:val="24"/>
           <w:rFonts w:eastAsia="宋体" w:ascii="Times New Roman" w:hAnsi="Times New Roman"/>
         </w:rPr>
-        <w:t>综合前九章，国内外研究虽已形成较完整的知识体系，但仍存在四条具体且可操作的共性不足：</w:t>
+        <w:t>综合前七章，国内外研究虽已形成较完整的知识体系，但仍存在四条具体且可操作的共性不足：</w:t>
       </w:r>
     </w:p>
     <w:p>
@@ -24406,7 +21877,7 @@
           <w:sz w:val="28"/>
           <w:rFonts w:eastAsia="黑体" w:ascii="Times New Roman" w:hAnsi="Times New Roman"/>
         </w:rPr>
-        <w:t>10.2 研究空白与本文研究内容对接</w:t>
+        <w:t>9.2 研究空白与本文研究内容对接</w:t>
       </w:r>
     </w:p>
     <w:p>
@@ -24422,7 +21893,7 @@
           <w:sz w:val="24"/>
           <w:rFonts w:eastAsia="宋体" w:ascii="Times New Roman" w:hAnsi="Times New Roman"/>
         </w:rPr>
-        <w:t>表22将上述四条研究空白逐条对接到学位论文拟开展的研究内容与章节安排。每条空白均附有量化证据，并明确由哪一部分研究内容予以回应——这正是高水平学位论文研究现状必须完成的"导向自己"的关键一步。读完此表，评审可立即把握本文的研究边界、创新点与章节逻辑。</w:t>
+        <w:t>表18将上述四条研究空白逐条对接到学位论文拟开展的研究内容与章节安排。每条空白均附有量化证据，并明确由哪一部分研究内容予以回应——这正是高水平学位论文研究现状必须完成的"导向自己"的关键一步。读完此表，评审可立即把握本文的研究边界、创新点与章节逻辑。</w:t>
       </w:r>
     </w:p>
     <w:p>
@@ -24438,7 +21909,7 @@
           <w:sz w:val="21"/>
           <w:rFonts w:eastAsia="黑体" w:ascii="Times New Roman" w:hAnsi="Times New Roman"/>
         </w:rPr>
-        <w:t>表 22  研究空白与本文研究内容/章节对接表</w:t>
+        <w:t>表 18  研究空白与本文研究内容/章节对接表</w:t>
       </w:r>
     </w:p>
     <w:tbl>
@@ -24926,7 +22397,7 @@
           <w:rFonts w:eastAsia="楷体" w:ascii="Times New Roman" w:hAnsi="Times New Roman"/>
         </w:rPr>
         <w:br/>
-        <w:t>对接段写作要点：表22是研究现状与正文研究内容的"咬合齿轮"。四条空白(G-1至G-4)各有量化证据、各对应明确的研究内容，既证明问题真实存在(有数据)，又证明本文有的放矢(有去处)。这种"gap—证据—去向"三位一体的写法，是博士论文研究现状区别于普通综述的根本标志。</w:t>
+        <w:t>对接段写作要点：表18是研究现状与正文研究内容的"咬合齿轮"。四条空白(G-1至G-4)各有量化证据、各对应明确的研究内容，既证明问题真实存在(有数据)，又证明本文有的放矢(有去处)。这种"gap—证据—去向"三位一体的写法，是博士论文研究现状区别于普通综述的根本标志。</w:t>
         <w:br/>
       </w:r>
     </w:p>
@@ -24943,7 +22414,7 @@
           <w:sz w:val="28"/>
           <w:rFonts w:eastAsia="黑体" w:ascii="Times New Roman" w:hAnsi="Times New Roman"/>
         </w:rPr>
-        <w:t>10.3 未来研究趋势展望</w:t>
+        <w:t>9.3 未来研究趋势展望</w:t>
       </w:r>
     </w:p>
     <w:p>
@@ -24959,7 +22430,7 @@
           <w:sz w:val="24"/>
           <w:rFonts w:eastAsia="宋体" w:ascii="Times New Roman" w:hAnsi="Times New Roman"/>
         </w:rPr>
-        <w:t>基于第九章的发展态势分析与上述研究空白，可对电容器可靠性研究的未来趋势作如下展望：</w:t>
+        <w:t>基于第八章的发展态势分析与上述研究空白，可对电容器可靠性研究的未来趋势作如下展望：</w:t>
       </w:r>
     </w:p>
     <w:p>
@@ -25071,7 +22542,7 @@
           <w:sz w:val="28"/>
           <w:rFonts w:eastAsia="黑体" w:ascii="Times New Roman" w:hAnsi="Times New Roman"/>
         </w:rPr>
-        <w:t>10.4 对学位论文写作的方法学启示</w:t>
+        <w:t>9.4 对学位论文写作的方法学启示</w:t>
       </w:r>
     </w:p>
     <w:p>
@@ -25103,7 +22574,7 @@
           <w:sz w:val="24"/>
           <w:rFonts w:eastAsia="宋体" w:ascii="Times New Roman" w:hAnsi="Times New Roman"/>
         </w:rPr>
-        <w:t>其三，研究现状应当"评而非述"。本报告每节末设评述框，凝练共性不足而非复述他人结论；评述的密度与质量，往往是区分优秀综述与平庸综述的关键。其四，研究现状必须"导向自己"。本章的研究空白—证据—去向对接表（表22），将前九章的全部评述收束为四条可操作的研究空白，并逐条指向后续研究内容，使整篇综述与正文形成不可分割的逻辑整体。其五，研究现状应当"可视化"。本报告以三十余幅图、二十余张表将抽象论述具象化，既提升专业质感，也便于评审快速把握全局。</w:t>
+        <w:t>其三，研究现状应当"评而非述"。本报告每节末设评述框，凝练共性不足而非复述他人结论；评述的密度与质量，往往是区分优秀综述与平庸综述的关键。其四，研究现状必须"导向自己"。本章的研究空白—证据—去向对接表（表18），将前八章的全部评述收束为四条可操作的研究空白，并逐条指向后续研究内容，使整篇综述与正文形成不可分割的逻辑整体。其五，研究现状应当"可视化"。本报告以三十余幅图、十余张表将抽象论述具象化，既提升专业质感，也便于评审快速把握全局。</w:t>
       </w:r>
     </w:p>
     <w:p>
@@ -25135,7 +22606,7 @@
           <w:sz w:val="28"/>
           <w:rFonts w:eastAsia="黑体" w:ascii="Times New Roman" w:hAnsi="Times New Roman"/>
         </w:rPr>
-        <w:t>10.5 本综述的局限性说明</w:t>
+        <w:t>9.5 本综述的局限性说明</w:t>
       </w:r>
     </w:p>
     <w:p>
@@ -25167,7 +22638,7 @@
           <w:sz w:val="24"/>
           <w:rFonts w:eastAsia="宋体" w:ascii="Times New Roman" w:hAnsi="Times New Roman"/>
         </w:rPr>
-        <w:t>其三，国内外划分的局限："国外""国内"是一种粗粒度的划分，实际研究高度国际化、合作普遍，将某项成果简单归属于某一方有时并不严谨；本报告的"国内外对照"意在揭示总体格局与互补关系，而非对具体团队作排名。其四，主观评估的局限：第九章雷达图与技术成熟度评分包含作者基于文献的综合主观判断，不同评估者可能得出不同结论。明确这些局限，并非削弱综述的价值，而是体现研究现状写作应有的审慎态度——任何综述都是特定视角下的阶段性总结，其结论应随领域发展与新证据出现而不断修正。</w:t>
+        <w:t>其三，国内外划分的局限："国外""国内"是一种粗粒度的划分，实际研究高度国际化、合作普遍，将某项成果简单归属于某一方有时并不严谨；本报告的"国内外对照"意在揭示总体格局与互补关系，而非对具体团队作排名。其四，主观评估的局限：第八章雷达图与技术成熟度评分包含作者基于文献的综合主观判断，不同评估者可能得出不同结论。明确这些局限，并非削弱综述的价值，而是体现研究现状写作应有的审慎态度——任何综述都是特定视角下的阶段性总结，其结论应随领域发展与新证据出现而不断修正。</w:t>
       </w:r>
     </w:p>
     <w:p>

</xml_diff>